<commit_message>
Update two-part audit with linked screenshot findings
</commit_message>
<xml_diff>
--- a/report.docx
+++ b/report.docx
@@ -26,7 +26,7 @@
           <w:b w:val="0"/>
           <w:sz w:val="18"/>
         </w:rPr>
-        <w:t>Work in progress  |  Updated 8 October 2026 at 03:02 UTC</w:t>
+        <w:t>Work in progress  |  Updated 8 October 2026 at 03:31 UTC</w:t>
       </w:r>
     </w:p>
     <w:p>
@@ -102,6 +102,28 @@
         <w:rPr>
           <w:b/>
         </w:rPr>
+        <w:t>Give empty states a next step.</w:t>
+      </w:r>
+      <w:r>
+        <w:rPr>
+          <w:b w:val="0"/>
+        </w:rPr>
+        <w:t xml:space="preserve"> The authenticated manual route is visible and prevents starting without a service, but the empty service/environment sections do not explain setup recovery.</w:t>
+      </w:r>
+    </w:p>
+    <w:p>
+      <w:pPr>
+        <w:pStyle w:val="ListBullet"/>
+      </w:pPr>
+      <w:r>
+        <w:rPr>
+          <w:b w:val="0"/>
+        </w:rPr>
+      </w:r>
+      <w:r>
+        <w:rPr>
+          <w:b/>
+        </w:rPr>
         <w:t>Explain the first irreversible decision.</w:t>
       </w:r>
       <w:r>
@@ -117,7 +139,7 @@
           <w:b w:val="0"/>
           <w:sz w:val="18"/>
         </w:rPr>
-        <w:t>Severity index below: HIGH 0 · MEDIUM 1 · LOW 2. Click a finding ID to jump to its detail page.</w:t>
+        <w:t>Severity index below: HIGH 0 · MEDIUM 1 · LOW 3. Click a finding ID to jump to its detail page.</w:t>
       </w:r>
     </w:p>
     <w:p>
@@ -146,6 +168,14 @@
         <w:t>A documented prerequisite is not proof that it worked. This report distinguishes directly observed behavior, local reproduction, UX recommendations, and tests not run. Real capture, exact source revision, authorization boundaries, expiry, and cleanup require separate evidence.</w:t>
       </w:r>
     </w:p>
+    <w:p>
+      <w:pPr>
+        <w:pStyle w:val="Heading2"/>
+      </w:pPr>
+      <w:r>
+        <w:t>Severity ranked finding index</w:t>
+      </w:r>
+    </w:p>
     <w:tbl>
       <w:tblPr>
         <w:tblW w:type="auto" w:w="0"/>
@@ -162,9 +192,10 @@
         </w:tblBorders>
       </w:tblPr>
       <w:tblGrid>
-        <w:gridCol w:w="1080"/>
-        <w:gridCol w:w="2160"/>
-        <w:gridCol w:w="6984"/>
+        <w:gridCol w:w="1008"/>
+        <w:gridCol w:w="1944"/>
+        <w:gridCol w:w="6480"/>
+        <w:gridCol w:w="792"/>
       </w:tblGrid>
       <w:tr>
         <w:trPr>
@@ -172,7 +203,7 @@
         </w:trPr>
         <w:tc>
           <w:tcPr>
-            <w:tcW w:type="dxa" w:w="1080"/>
+            <w:tcW w:type="dxa" w:w="1008"/>
             <w:vAlign w:val="center"/>
             <w:tcMar>
               <w:top w:w="85" w:type="dxa"/>
@@ -198,7 +229,7 @@
         </w:tc>
         <w:tc>
           <w:tcPr>
-            <w:tcW w:type="dxa" w:w="2160"/>
+            <w:tcW w:type="dxa" w:w="1944"/>
             <w:vAlign w:val="center"/>
             <w:tcMar>
               <w:top w:w="85" w:type="dxa"/>
@@ -224,7 +255,7 @@
         </w:tc>
         <w:tc>
           <w:tcPr>
-            <w:tcW w:type="dxa" w:w="6984"/>
+            <w:tcW w:type="dxa" w:w="6480"/>
             <w:vAlign w:val="center"/>
             <w:tcMar>
               <w:top w:w="85" w:type="dxa"/>
@@ -248,6 +279,32 @@
             </w:r>
           </w:p>
         </w:tc>
+        <w:tc>
+          <w:tcPr>
+            <w:tcW w:type="dxa" w:w="792"/>
+            <w:vAlign w:val="center"/>
+            <w:tcMar>
+              <w:top w:w="85" w:type="dxa"/>
+              <w:left w:w="85" w:type="dxa"/>
+              <w:bottom w:w="85" w:type="dxa"/>
+              <w:right w:w="85" w:type="dxa"/>
+            </w:tcMar>
+            <w:shd w:fill="24384B"/>
+          </w:tcPr>
+          <w:p>
+            <w:pPr>
+              <w:spacing w:after="20" w:before="20" w:line="240" w:lineRule="auto"/>
+            </w:pPr>
+            <w:r>
+              <w:rPr>
+                <w:b/>
+                <w:color w:val="FFFFFF"/>
+                <w:sz w:val="18"/>
+              </w:rPr>
+              <w:t>Part</w:t>
+            </w:r>
+          </w:p>
+        </w:tc>
       </w:tr>
       <w:tr>
         <w:trPr>
@@ -255,7 +312,7 @@
         </w:trPr>
         <w:tc>
           <w:tcPr>
-            <w:tcW w:type="dxa" w:w="1080"/>
+            <w:tcW w:type="dxa" w:w="1008"/>
             <w:vAlign w:val="center"/>
             <w:tcMar>
               <w:top w:w="85" w:type="dxa"/>
@@ -281,7 +338,7 @@
         </w:tc>
         <w:tc>
           <w:tcPr>
-            <w:tcW w:type="dxa" w:w="2160"/>
+            <w:tcW w:type="dxa" w:w="1944"/>
             <w:vAlign w:val="center"/>
             <w:tcMar>
               <w:top w:w="85" w:type="dxa"/>
@@ -307,7 +364,7 @@
         </w:tc>
         <w:tc>
           <w:tcPr>
-            <w:tcW w:type="dxa" w:w="6984"/>
+            <w:tcW w:type="dxa" w:w="6480"/>
             <w:vAlign w:val="center"/>
             <w:tcMar>
               <w:top w:w="85" w:type="dxa"/>
@@ -331,6 +388,32 @@
             </w:r>
           </w:p>
         </w:tc>
+        <w:tc>
+          <w:tcPr>
+            <w:tcW w:type="dxa" w:w="792"/>
+            <w:vAlign w:val="center"/>
+            <w:tcMar>
+              <w:top w:w="85" w:type="dxa"/>
+              <w:left w:w="85" w:type="dxa"/>
+              <w:bottom w:w="85" w:type="dxa"/>
+              <w:right w:w="85" w:type="dxa"/>
+            </w:tcMar>
+            <w:shd w:fill="FFFFFF"/>
+          </w:tcPr>
+          <w:p>
+            <w:pPr>
+              <w:spacing w:after="20" w:before="20" w:line="240" w:lineRule="auto"/>
+            </w:pPr>
+            <w:r>
+              <w:rPr>
+                <w:b w:val="0"/>
+                <w:color w:val="000000"/>
+                <w:sz w:val="18"/>
+              </w:rPr>
+              <w:t>2</w:t>
+            </w:r>
+          </w:p>
+        </w:tc>
       </w:tr>
       <w:tr>
         <w:trPr>
@@ -338,7 +421,7 @@
         </w:trPr>
         <w:tc>
           <w:tcPr>
-            <w:tcW w:type="dxa" w:w="1080"/>
+            <w:tcW w:type="dxa" w:w="1008"/>
             <w:vAlign w:val="center"/>
             <w:tcMar>
               <w:top w:w="85" w:type="dxa"/>
@@ -364,7 +447,7 @@
         </w:tc>
         <w:tc>
           <w:tcPr>
-            <w:tcW w:type="dxa" w:w="2160"/>
+            <w:tcW w:type="dxa" w:w="1944"/>
             <w:vAlign w:val="center"/>
             <w:tcMar>
               <w:top w:w="85" w:type="dxa"/>
@@ -390,7 +473,7 @@
         </w:tc>
         <w:tc>
           <w:tcPr>
-            <w:tcW w:type="dxa" w:w="6984"/>
+            <w:tcW w:type="dxa" w:w="6480"/>
             <w:vAlign w:val="center"/>
             <w:tcMar>
               <w:top w:w="85" w:type="dxa"/>
@@ -414,6 +497,32 @@
             </w:r>
           </w:p>
         </w:tc>
+        <w:tc>
+          <w:tcPr>
+            <w:tcW w:type="dxa" w:w="792"/>
+            <w:vAlign w:val="center"/>
+            <w:tcMar>
+              <w:top w:w="85" w:type="dxa"/>
+              <w:left w:w="85" w:type="dxa"/>
+              <w:bottom w:w="85" w:type="dxa"/>
+              <w:right w:w="85" w:type="dxa"/>
+            </w:tcMar>
+            <w:shd w:fill="F3F5F7"/>
+          </w:tcPr>
+          <w:p>
+            <w:pPr>
+              <w:spacing w:after="20" w:before="20" w:line="240" w:lineRule="auto"/>
+            </w:pPr>
+            <w:r>
+              <w:rPr>
+                <w:b w:val="0"/>
+                <w:color w:val="000000"/>
+                <w:sz w:val="18"/>
+              </w:rPr>
+              <w:t>1</w:t>
+            </w:r>
+          </w:p>
+        </w:tc>
       </w:tr>
       <w:tr>
         <w:trPr>
@@ -421,7 +530,7 @@
         </w:trPr>
         <w:tc>
           <w:tcPr>
-            <w:tcW w:type="dxa" w:w="1080"/>
+            <w:tcW w:type="dxa" w:w="1008"/>
             <w:vAlign w:val="center"/>
             <w:tcMar>
               <w:top w:w="85" w:type="dxa"/>
@@ -447,7 +556,7 @@
         </w:tc>
         <w:tc>
           <w:tcPr>
-            <w:tcW w:type="dxa" w:w="2160"/>
+            <w:tcW w:type="dxa" w:w="1944"/>
             <w:vAlign w:val="center"/>
             <w:tcMar>
               <w:top w:w="85" w:type="dxa"/>
@@ -473,7 +582,7 @@
         </w:tc>
         <w:tc>
           <w:tcPr>
-            <w:tcW w:type="dxa" w:w="6984"/>
+            <w:tcW w:type="dxa" w:w="6480"/>
             <w:vAlign w:val="center"/>
             <w:tcMar>
               <w:top w:w="85" w:type="dxa"/>
@@ -494,6 +603,141 @@
                 <w:sz w:val="18"/>
               </w:rPr>
               <w:t>Permanent region choice precedes explanatory context</w:t>
+            </w:r>
+          </w:p>
+        </w:tc>
+        <w:tc>
+          <w:tcPr>
+            <w:tcW w:type="dxa" w:w="792"/>
+            <w:vAlign w:val="center"/>
+            <w:tcMar>
+              <w:top w:w="85" w:type="dxa"/>
+              <w:left w:w="85" w:type="dxa"/>
+              <w:bottom w:w="85" w:type="dxa"/>
+              <w:right w:w="85" w:type="dxa"/>
+            </w:tcMar>
+            <w:shd w:fill="FFFFFF"/>
+          </w:tcPr>
+          <w:p>
+            <w:pPr>
+              <w:spacing w:after="20" w:before="20" w:line="240" w:lineRule="auto"/>
+            </w:pPr>
+            <w:r>
+              <w:rPr>
+                <w:b w:val="0"/>
+                <w:color w:val="000000"/>
+                <w:sz w:val="18"/>
+              </w:rPr>
+              <w:t>1</w:t>
+            </w:r>
+          </w:p>
+        </w:tc>
+      </w:tr>
+      <w:tr>
+        <w:trPr>
+          <w:cantSplit/>
+        </w:trPr>
+        <w:tc>
+          <w:tcPr>
+            <w:tcW w:type="dxa" w:w="1008"/>
+            <w:vAlign w:val="center"/>
+            <w:tcMar>
+              <w:top w:w="85" w:type="dxa"/>
+              <w:left w:w="85" w:type="dxa"/>
+              <w:bottom w:w="85" w:type="dxa"/>
+              <w:right w:w="85" w:type="dxa"/>
+            </w:tcMar>
+            <w:shd w:fill="F3F5F7"/>
+          </w:tcPr>
+          <w:p>
+            <w:pPr>
+              <w:spacing w:after="20" w:before="20" w:line="240" w:lineRule="auto"/>
+            </w:pPr>
+            <w:hyperlink w:anchor="UX02">
+              <w:r>
+                <w:rPr>
+                  <w:color w:val="164F80"/>
+                </w:rPr>
+                <w:t>UX02</w:t>
+              </w:r>
+            </w:hyperlink>
+          </w:p>
+        </w:tc>
+        <w:tc>
+          <w:tcPr>
+            <w:tcW w:type="dxa" w:w="1944"/>
+            <w:vAlign w:val="center"/>
+            <w:tcMar>
+              <w:top w:w="85" w:type="dxa"/>
+              <w:left w:w="85" w:type="dxa"/>
+              <w:bottom w:w="85" w:type="dxa"/>
+              <w:right w:w="85" w:type="dxa"/>
+            </w:tcMar>
+            <w:shd w:fill="F3F5F7"/>
+          </w:tcPr>
+          <w:p>
+            <w:pPr>
+              <w:spacing w:after="20" w:before="20" w:line="240" w:lineRule="auto"/>
+            </w:pPr>
+            <w:r>
+              <w:rPr>
+                <w:b w:val="0"/>
+                <w:color w:val="000000"/>
+                <w:sz w:val="18"/>
+              </w:rPr>
+              <w:t>LOW · UX</w:t>
+            </w:r>
+          </w:p>
+        </w:tc>
+        <w:tc>
+          <w:tcPr>
+            <w:tcW w:type="dxa" w:w="6480"/>
+            <w:vAlign w:val="center"/>
+            <w:tcMar>
+              <w:top w:w="85" w:type="dxa"/>
+              <w:left w:w="85" w:type="dxa"/>
+              <w:bottom w:w="85" w:type="dxa"/>
+              <w:right w:w="85" w:type="dxa"/>
+            </w:tcMar>
+            <w:shd w:fill="F3F5F7"/>
+          </w:tcPr>
+          <w:p>
+            <w:pPr>
+              <w:spacing w:after="20" w:before="20" w:line="240" w:lineRule="auto"/>
+            </w:pPr>
+            <w:r>
+              <w:rPr>
+                <w:b w:val="0"/>
+                <w:color w:val="000000"/>
+                <w:sz w:val="18"/>
+              </w:rPr>
+              <w:t>Empty services and environments need a concrete setup recovery step</w:t>
+            </w:r>
+          </w:p>
+        </w:tc>
+        <w:tc>
+          <w:tcPr>
+            <w:tcW w:type="dxa" w:w="792"/>
+            <w:vAlign w:val="center"/>
+            <w:tcMar>
+              <w:top w:w="85" w:type="dxa"/>
+              <w:left w:w="85" w:type="dxa"/>
+              <w:bottom w:w="85" w:type="dxa"/>
+              <w:right w:w="85" w:type="dxa"/>
+            </w:tcMar>
+            <w:shd w:fill="F3F5F7"/>
+          </w:tcPr>
+          <w:p>
+            <w:pPr>
+              <w:spacing w:after="20" w:before="20" w:line="240" w:lineRule="auto"/>
+            </w:pPr>
+            <w:r>
+              <w:rPr>
+                <w:b w:val="0"/>
+                <w:color w:val="000000"/>
+                <w:sz w:val="18"/>
+              </w:rPr>
+              <w:t>1</w:t>
             </w:r>
           </w:p>
         </w:tc>
@@ -940,7 +1184,7 @@
           <w:b w:val="0"/>
           <w:sz w:val="18"/>
         </w:rPr>
-        <w:t>TRACK ONE</w:t>
+        <w:t>BRAND NEW TO DATADOG AND APM</w:t>
       </w:r>
     </w:p>
     <w:p>
@@ -948,7 +1192,15 @@
         <w:pStyle w:val="Heading1"/>
       </w:pPr>
       <w:r>
-        <w:t>The beginner journey</w:t>
+        <w:t>Part 1 New user usability study</w:t>
+      </w:r>
+    </w:p>
+    <w:p>
+      <w:r>
+        <w:rPr>
+          <w:b w:val="0"/>
+        </w:rPr>
+        <w:t>This is a structured walkthrough from a complete beginner’s perspective, rather than a recruited-participant study. It records what the interface explains, where prerequisite knowledge is assumed, and how recovery is presented. No population-wide usability rate or aggregate time-on-task claim is made.</w:t>
       </w:r>
     </w:p>
     <w:tbl>
@@ -1215,7 +1467,7 @@
                 <w:color w:val="000000"/>
                 <w:sz w:val="18"/>
               </w:rPr>
-              <w:t>Authenticated path still under review</w:t>
+              <w:t>Debugger entry and manual route observed; independent first-path discoverability still under review</w:t>
             </w:r>
           </w:p>
         </w:tc>
@@ -1381,7 +1633,7 @@
                 <w:color w:val="000000"/>
                 <w:sz w:val="18"/>
               </w:rPr>
-              <w:t>Runtime path still under review</w:t>
+              <w:t>No services/environments shown; session start safely disabled; actual capture remains unverified</w:t>
             </w:r>
           </w:p>
         </w:tc>
@@ -1464,7 +1716,7 @@
                 <w:color w:val="000000"/>
                 <w:sz w:val="18"/>
               </w:rPr>
-              <w:t>Integration path still under review</w:t>
+              <w:t>Source integration is recommended; manual entry is available without a source connection</w:t>
             </w:r>
           </w:p>
         </w:tc>
@@ -1593,6 +1845,16 @@
       </w:r>
     </w:p>
     <w:p>
+      <w:hyperlink w:anchor="DOC01">
+        <w:r>
+          <w:rPr>
+            <w:color w:val="164F80"/>
+          </w:rPr>
+          <w:t>See the reproducible Python command finding in Part 2</w:t>
+        </w:r>
+      </w:hyperlink>
+    </w:p>
+    <w:p>
       <w:r>
         <w:br w:type="page"/>
       </w:r>
@@ -1603,25 +1865,25 @@
           <w:b w:val="0"/>
           <w:sz w:val="18"/>
         </w:rPr>
-        <w:t>DOC01  |  MEDIUM  |  CONFIRMED</w:t>
+        <w:t>PART 1  |  UX01  |  LOW  |  UX RECOMMENDATION</w:t>
       </w:r>
     </w:p>
     <w:p>
-      <w:bookmarkStart w:id="1041" w:name="DOC01"/>
+      <w:bookmarkStart w:id="1045" w:name="UX01"/>
       <w:pPr>
         <w:pStyle w:val="Heading1"/>
       </w:pPr>
       <w:r>
-        <w:t>Python quickstart contains an invalid module command</w:t>
+        <w:t>A permanent region choice needs decision support</w:t>
       </w:r>
-      <w:bookmarkEnd w:id="1041"/>
+      <w:bookmarkEnd w:id="1045"/>
     </w:p>
     <w:p>
       <w:r>
         <w:rPr>
           <w:b w:val="0"/>
         </w:rPr>
-        <w:t>The launch example uses python -m myapp.py. Python’s module switch expects a module name rather than a script filename.</w:t>
+        <w:t>The signup form clearly warns that the selected region cannot be changed later. The captured form does not explain what should drive that choice.</w:t>
       </w:r>
     </w:p>
     <w:p>
@@ -1631,8 +1893,8 @@
       <w:r>
         <w:drawing>
           <wp:inline xmlns:a="http://schemas.openxmlformats.org/drawingml/2006/main" xmlns:pic="http://schemas.openxmlformats.org/drawingml/2006/picture">
-            <wp:extent cx="6492240" cy="4162835"/>
-            <wp:docPr id="1" name="Picture 1" descr="Datadog Python setup example with a red border around the invalid launch command"/>
+            <wp:extent cx="6492240" cy="4869180"/>
+            <wp:docPr id="1" name="Picture 1" descr="Actual blank Datadog signup video frame with red border around permanent region selection"/>
             <wp:cNvGraphicFramePr>
               <a:graphicFrameLocks noChangeAspect="1"/>
             </wp:cNvGraphicFramePr>
@@ -1643,14 +1905,14 @@
                   <wpg:grpSpPr>
                     <a:xfrm>
                       <a:off x="0" y="0"/>
-                      <a:ext cx="6492240" cy="4162835"/>
+                      <a:ext cx="6492240" cy="4869180"/>
                       <a:chOff x="0" y="0"/>
-                      <a:chExt cx="6492240" cy="4162835"/>
+                      <a:chExt cx="6492240" cy="4869180"/>
                     </a:xfrm>
                   </wpg:grpSpPr>
                   <pic:pic>
                     <pic:nvPicPr>
-                      <pic:cNvPr id="0" name="04-python-launch-command.jpg"/>
+                      <pic:cNvPr id="0" name="08-public-signup-blank-video-frame.png"/>
                       <pic:cNvPicPr/>
                     </pic:nvPicPr>
                     <pic:blipFill>
@@ -1662,7 +1924,7 @@
                     <pic:spPr>
                       <a:xfrm>
                         <a:off x="0" y="0"/>
-                        <a:ext cx="6492240" cy="4162835"/>
+                        <a:ext cx="6492240" cy="4869180"/>
                       </a:xfrm>
                       <a:prstGeom prst="rect"/>
                     </pic:spPr>
@@ -1671,8 +1933,8 @@
                     <wps:cNvSpPr/>
                     <wps:spPr>
                       <a:xfrm>
-                        <a:off x="2011758" y="2557887"/>
-                        <a:ext cx="2897824" cy="200619"/>
+                        <a:off x="1937528" y="973836"/>
+                        <a:ext cx="2556320" cy="481846"/>
                       </a:xfrm>
                       <a:prstGeom prst="rect">
                         <a:avLst/>
@@ -1699,7 +1961,7 @@
         <w:pStyle w:val="Caption"/>
       </w:pPr>
       <w:r>
-        <w:t>E04 · Official Live Debugger documentation, Python tab · Screenshot file 02:20:19 UTC. Red outline identifies the launch command.</w:t>
+        <w:t>E08 · Actual edited-video frame at 00:20, sourced from raw capture 00:50, about 02:15:17 UTC. All identity fields are blank.</w:t>
       </w:r>
     </w:p>
     <w:p>
@@ -1708,7 +1970,7 @@
           <w:rPr>
             <w:color w:val="164F80"/>
           </w:rPr>
-          <w:t>Video evidence 00:58 to 01:20</w:t>
+          <w:t>Video evidence 00:20 to 00:34</w:t>
         </w:r>
       </w:hyperlink>
     </w:p>
@@ -1723,7 +1985,7 @@
         <w:rPr>
           <w:b w:val="0"/>
         </w:rPr>
-        <w:t>Open Live Debugger docs, select Python, then Enable with environment variables. Follow the final launch line with an ordinary myapp.py script.</w:t>
+        <w:t>Start a fresh trial and inspect Select a Region before submitting the form.</w:t>
       </w:r>
     </w:p>
     <w:p>
@@ -1731,13 +1993,13 @@
         <w:rPr>
           <w:b/>
         </w:rPr>
-        <w:t xml:space="preserve">Expected </w:t>
+        <w:t xml:space="preserve">Recommended experience </w:t>
       </w:r>
       <w:r>
         <w:rPr>
           <w:b w:val="0"/>
         </w:rPr>
-        <w:t>A copied quickstart command starts the intended Python application without a module-resolution error.</w:t>
+        <w:t>Give a short explanation or linked chooser covering account location and relevant selection criteria before the irreversible step.</w:t>
       </w:r>
     </w:p>
     <w:p>
@@ -1745,13 +2007,13 @@
         <w:rPr>
           <w:b/>
         </w:rPr>
-        <w:t xml:space="preserve">Actual </w:t>
+        <w:t xml:space="preserve">Assessment </w:t>
       </w:r>
       <w:r>
         <w:rPr>
           <w:b w:val="0"/>
         </w:rPr>
-        <w:t>The Python portion exits 1 for a minimal script. Import-time code runs before the error, so this check does not imply that no application code executes.</w:t>
+        <w:t>The permanent-choice warning is explicit and useful. Additional decision support would reduce guesswork for a complete beginner.</w:t>
       </w:r>
     </w:p>
     <w:p>
@@ -1759,13 +2021,13 @@
         <w:rPr>
           <w:b/>
         </w:rPr>
-        <w:t xml:space="preserve">Fix and retest </w:t>
+        <w:t xml:space="preserve">Boundary </w:t>
       </w:r>
       <w:r>
         <w:rPr>
           <w:b w:val="0"/>
         </w:rPr>
-        <w:t>Use ddtrace-run python myapp.py for a script, or ddtrace-run python -m myapp for a module. Add a quickstart smoke test that asserts successful process startup.</w:t>
+        <w:t>This is an onboarding recommendation. No wrong-region account, data loss, or failed submission was demonstrated.</w:t>
       </w:r>
     </w:p>
     <w:p>
@@ -1779,18 +2041,18 @@
           <w:b w:val="0"/>
           <w:sz w:val="18"/>
         </w:rPr>
-        <w:t>DOC02  |  LOW  |  CONFIRMED</w:t>
+        <w:t>PART 1  |  DOC02  |  LOW  |  CONFIRMED BUG</w:t>
       </w:r>
     </w:p>
     <w:p>
-      <w:bookmarkStart w:id="1052" w:name="DOC02"/>
+      <w:bookmarkStart w:id="1056" w:name="DOC02"/>
       <w:pPr>
         <w:pStyle w:val="Heading1"/>
       </w:pPr>
       <w:r>
         <w:t>Documentation navigation breaks words at desktop width</w:t>
       </w:r>
-      <w:bookmarkEnd w:id="1052"/>
+      <w:bookmarkEnd w:id="1056"/>
     </w:p>
     <w:p>
       <w:r>
@@ -1955,25 +2217,25 @@
           <w:b w:val="0"/>
           <w:sz w:val="18"/>
         </w:rPr>
-        <w:t>UX01  |  LOW  |  UX RECOMMENDATION</w:t>
+        <w:t>PART 1  |  UX02  |  LOW  |  UX RECOMMENDATION</w:t>
       </w:r>
     </w:p>
     <w:p>
-      <w:bookmarkStart w:id="1063" w:name="UX01"/>
+      <w:bookmarkStart w:id="1067" w:name="UX02"/>
       <w:pPr>
         <w:pStyle w:val="Heading1"/>
       </w:pPr>
       <w:r>
-        <w:t>A permanent region choice needs decision support</w:t>
+        <w:t>Empty service states do not explain setup recovery</w:t>
       </w:r>
-      <w:bookmarkEnd w:id="1063"/>
+      <w:bookmarkEnd w:id="1067"/>
     </w:p>
     <w:p>
       <w:r>
         <w:rPr>
           <w:b w:val="0"/>
         </w:rPr>
-        <w:t>The signup form clearly warns that the selected region cannot be changed later. The captured form does not explain what should drive that choice.</w:t>
+        <w:t>A fresh account reaches a manual-debugging path, but unavailable services and environments leave a newcomer without a concrete next step in the captured setup section.</w:t>
       </w:r>
     </w:p>
     <w:p>
@@ -1983,8 +2245,8 @@
       <w:r>
         <w:drawing>
           <wp:inline xmlns:a="http://schemas.openxmlformats.org/drawingml/2006/main" xmlns:pic="http://schemas.openxmlformats.org/drawingml/2006/picture">
-            <wp:extent cx="6492240" cy="4869180"/>
-            <wp:docPr id="3" name="Picture 3" descr="Actual blank Datadog signup video frame with red border around permanent region selection"/>
+            <wp:extent cx="6492240" cy="3588843"/>
+            <wp:docPr id="3" name="Picture 3" descr="Actual empty Live Debugger service dropdown with red border and account greeting cropped out"/>
             <wp:cNvGraphicFramePr>
               <a:graphicFrameLocks noChangeAspect="1"/>
             </wp:cNvGraphicFramePr>
@@ -1995,14 +2257,14 @@
                   <wpg:grpSpPr>
                     <a:xfrm>
                       <a:off x="0" y="0"/>
-                      <a:ext cx="6492240" cy="4869180"/>
+                      <a:ext cx="6492240" cy="3588843"/>
                       <a:chOff x="0" y="0"/>
-                      <a:chExt cx="6492240" cy="4869180"/>
+                      <a:chExt cx="6492240" cy="3588843"/>
                     </a:xfrm>
                   </wpg:grpSpPr>
                   <pic:pic>
                     <pic:nvPicPr>
-                      <pic:cNvPr id="0" name="08-public-signup-blank-video-frame.png"/>
+                      <pic:cNvPr id="0" name="10-live-debugger-service-list-public.png"/>
                       <pic:cNvPicPr/>
                     </pic:nvPicPr>
                     <pic:blipFill>
@@ -2014,7 +2276,7 @@
                     <pic:spPr>
                       <a:xfrm>
                         <a:off x="0" y="0"/>
-                        <a:ext cx="6492240" cy="4869180"/>
+                        <a:ext cx="6492240" cy="3588843"/>
                       </a:xfrm>
                       <a:prstGeom prst="rect"/>
                     </pic:spPr>
@@ -2023,8 +2285,8 @@
                     <wps:cNvSpPr/>
                     <wps:spPr>
                       <a:xfrm>
-                        <a:off x="1937528" y="973836"/>
-                        <a:ext cx="2556320" cy="481846"/>
+                        <a:off x="1515785" y="1933740"/>
+                        <a:ext cx="2106495" cy="362228"/>
                       </a:xfrm>
                       <a:prstGeom prst="rect">
                         <a:avLst/>
@@ -2051,16 +2313,16 @@
         <w:pStyle w:val="Caption"/>
       </w:pPr>
       <w:r>
-        <w:t>E08 · Actual edited-video frame at 00:20, sourced from raw capture 00:50, about 02:15:17 UTC. All identity fields are blank.</w:t>
+        <w:t>E10 · 03:21:54 UTC · Actual screenshot with top 76 pixels removed to exclude the account greeting. Remaining UI pixels are unchanged beneath the red border.</w:t>
       </w:r>
     </w:p>
     <w:p>
-      <w:hyperlink r:id="rId12">
+      <w:hyperlink r:id="rId15">
         <w:r>
           <w:rPr>
             <w:color w:val="164F80"/>
           </w:rPr>
-          <w:t>Video evidence 00:20 to 00:34</w:t>
+          <w:t>Online finding with both annotated screenshots</w:t>
         </w:r>
       </w:hyperlink>
     </w:p>
@@ -2075,7 +2337,7 @@
         <w:rPr>
           <w:b w:val="0"/>
         </w:rPr>
-        <w:t>Start a fresh trial and inspect Select a Region before submitting the form.</w:t>
+        <w:t>Open New Session, inspect the empty service picker, enter the manual logpoint modal, close it, then inspect Configuration. The setup section reports No environments found.</w:t>
       </w:r>
     </w:p>
     <w:p>
@@ -2089,7 +2351,7 @@
         <w:rPr>
           <w:b w:val="0"/>
         </w:rPr>
-        <w:t>Give a short explanation or linked chooser covering account location and relevant selection criteria before the irreversible step.</w:t>
+        <w:t>The empty state should offer a concrete route to connect or troubleshoot the first service and explain which prerequisites are missing or not yet known.</w:t>
       </w:r>
     </w:p>
     <w:p>
@@ -2097,13 +2359,13 @@
         <w:rPr>
           <w:b/>
         </w:rPr>
-        <w:t xml:space="preserve">Assessment </w:t>
+        <w:t xml:space="preserve">Positive controls </w:t>
       </w:r>
       <w:r>
         <w:rPr>
           <w:b w:val="0"/>
         </w:rPr>
-        <w:t>The permanent-choice warning is explicit and useful. Additional decision support would reduce guesswork for a complete beginner.</w:t>
+        <w:t>The modal requires a service and safely disables Start Debug Session. Close returns correctly. Manual debugging remains visible without source integration.</w:t>
       </w:r>
     </w:p>
     <w:p>
@@ -2117,7 +2379,7 @@
         <w:rPr>
           <w:b w:val="0"/>
         </w:rPr>
-        <w:t>This is an onboarding recommendation. No wrong-region account, data loss, or failed submission was demonstrated.</w:t>
+        <w:t>The missing-service cause was under separate runtime/Remote Configuration investigation. This is a guidance recommendation, not evidence that a configured service is incorrectly absent. A privacy-reviewed authenticated video excerpt is pending.</w:t>
       </w:r>
     </w:p>
     <w:p>
@@ -2131,7 +2393,7 @@
           <w:b w:val="0"/>
           <w:sz w:val="18"/>
         </w:rPr>
-        <w:t>TRACK TWO</w:t>
+        <w:t>LIVE DEBUGGER AND SOURCE CODE INTEGRATION</w:t>
       </w:r>
     </w:p>
     <w:p>
@@ -2139,7 +2401,7 @@
         <w:pStyle w:val="Heading1"/>
       </w:pPr>
       <w:r>
-        <w:t>Professional QA coverage</w:t>
+        <w:t>Part 2 Professional QA</w:t>
       </w:r>
     </w:p>
     <w:p>
@@ -2147,7 +2409,15 @@
         <w:rPr>
           <w:b w:val="0"/>
         </w:rPr>
-        <w:t>QA_MATRIX.md contains 54 baseline cases and nine supplementary edge cases, all planned. They describe intended coverage, not tests executed. Each case remains NOT RUN until direct evidence establishes a result; the confirmed documentation findings and local tests are reported separately.</w:t>
+        <w:t>This part evaluates correctness and recovery using explicit preconditions, a known sample oracle, expected versus actual results, and reproducible evidence. The shared index links each confirmed finding to its detail page. Planned scenarios stay separate from executed outcomes.</w:t>
+      </w:r>
+    </w:p>
+    <w:p>
+      <w:r>
+        <w:rPr>
+          <w:b w:val="0"/>
+        </w:rPr>
+        <w:t>The 63-case plan is tracked in QA_MATRIX.md. This checkpoint establishes two scoped matrix outcomes: B02 records UX02, and B04 passes manual-route discoverability without source integration. F14 has one observed Close variant and remains open. No runtime capture or source-mapping pass is claimed.</w:t>
       </w:r>
     </w:p>
     <w:tbl>
@@ -2166,9 +2436,9 @@
         </w:tblBorders>
       </w:tblPr>
       <w:tblGrid>
-        <w:gridCol w:w="1656"/>
-        <w:gridCol w:w="3600"/>
-        <w:gridCol w:w="4968"/>
+        <w:gridCol w:w="1440"/>
+        <w:gridCol w:w="2880"/>
+        <w:gridCol w:w="5904"/>
       </w:tblGrid>
       <w:tr>
         <w:trPr>
@@ -2176,7 +2446,7 @@
         </w:trPr>
         <w:tc>
           <w:tcPr>
-            <w:tcW w:type="dxa" w:w="1656"/>
+            <w:tcW w:type="dxa" w:w="1440"/>
             <w:vAlign w:val="center"/>
             <w:tcMar>
               <w:top w:w="85" w:type="dxa"/>
@@ -2196,13 +2466,13 @@
                 <w:color w:val="FFFFFF"/>
                 <w:sz w:val="18"/>
               </w:rPr>
-              <w:t>Area</w:t>
+              <w:t>Check</w:t>
             </w:r>
           </w:p>
         </w:tc>
         <w:tc>
           <w:tcPr>
-            <w:tcW w:type="dxa" w:w="3600"/>
+            <w:tcW w:type="dxa" w:w="2880"/>
             <w:vAlign w:val="center"/>
             <w:tcMar>
               <w:top w:w="85" w:type="dxa"/>
@@ -2222,13 +2492,13 @@
                 <w:color w:val="FFFFFF"/>
                 <w:sz w:val="18"/>
               </w:rPr>
-              <w:t>Evidence established</w:t>
+              <w:t>Observed outcome</w:t>
             </w:r>
           </w:p>
         </w:tc>
         <w:tc>
           <w:tcPr>
-            <w:tcW w:type="dxa" w:w="4968"/>
+            <w:tcW w:type="dxa" w:w="5904"/>
             <w:vAlign w:val="center"/>
             <w:tcMar>
               <w:top w:w="85" w:type="dxa"/>
@@ -2248,7 +2518,7 @@
                 <w:color w:val="FFFFFF"/>
                 <w:sz w:val="18"/>
               </w:rPr>
-              <w:t>Still needs end to end validation</w:t>
+              <w:t>Scope and remaining work</w:t>
             </w:r>
           </w:p>
         </w:tc>
@@ -2259,7 +2529,7 @@
         </w:trPr>
         <w:tc>
           <w:tcPr>
-            <w:tcW w:type="dxa" w:w="1656"/>
+            <w:tcW w:type="dxa" w:w="1440"/>
             <w:vAlign w:val="center"/>
             <w:tcMar>
               <w:top w:w="85" w:type="dxa"/>
@@ -2279,13 +2549,13 @@
                 <w:color w:val="000000"/>
                 <w:sz w:val="18"/>
               </w:rPr>
-              <w:t>Documentation</w:t>
+              <w:t>B02</w:t>
             </w:r>
           </w:p>
         </w:tc>
         <w:tc>
           <w:tcPr>
-            <w:tcW w:type="dxa" w:w="3600"/>
+            <w:tcW w:type="dxa" w:w="2880"/>
             <w:vAlign w:val="center"/>
             <w:tcMar>
               <w:top w:w="85" w:type="dxa"/>
@@ -2305,13 +2575,13 @@
                 <w:color w:val="000000"/>
                 <w:sz w:val="18"/>
               </w:rPr>
-              <w:t>Invalid Python module invocation; cramped contents rail</w:t>
+              <w:t>FINDING UX02 · LOW UX</w:t>
             </w:r>
           </w:p>
         </w:tc>
         <w:tc>
           <w:tcPr>
-            <w:tcW w:type="dxa" w:w="4968"/>
+            <w:tcW w:type="dxa" w:w="5904"/>
             <w:vAlign w:val="center"/>
             <w:tcMar>
               <w:top w:w="85" w:type="dxa"/>
@@ -2331,7 +2601,7 @@
                 <w:color w:val="000000"/>
                 <w:sz w:val="18"/>
               </w:rPr>
-              <w:t>Fresh instrumented quickstart after correction</w:t>
+              <w:t>Natural first-run no-service/no-environment states lack contextual recovery steps in the captured section</w:t>
             </w:r>
           </w:p>
         </w:tc>
@@ -2342,7 +2612,7 @@
         </w:trPr>
         <w:tc>
           <w:tcPr>
-            <w:tcW w:type="dxa" w:w="1656"/>
+            <w:tcW w:type="dxa" w:w="1440"/>
             <w:vAlign w:val="center"/>
             <w:tcMar>
               <w:top w:w="85" w:type="dxa"/>
@@ -2362,13 +2632,13 @@
                 <w:color w:val="000000"/>
                 <w:sz w:val="18"/>
               </w:rPr>
-              <w:t>Runtime fixture</w:t>
+              <w:t>B04</w:t>
             </w:r>
           </w:p>
         </w:tc>
         <w:tc>
           <w:tcPr>
-            <w:tcW w:type="dxa" w:w="3600"/>
+            <w:tcW w:type="dxa" w:w="2880"/>
             <w:vAlign w:val="center"/>
             <w:tcMar>
               <w:top w:w="85" w:type="dxa"/>
@@ -2388,13 +2658,13 @@
                 <w:color w:val="000000"/>
                 <w:sz w:val="18"/>
               </w:rPr>
-              <w:t>8 passing local tests; 1 expected failure for the planted bug</w:t>
+              <w:t>PASS · discoverability only</w:t>
             </w:r>
           </w:p>
         </w:tc>
         <w:tc>
           <w:tcPr>
-            <w:tcW w:type="dxa" w:w="4968"/>
+            <w:tcW w:type="dxa" w:w="5904"/>
             <w:vAlign w:val="center"/>
             <w:tcMar>
               <w:top w:w="85" w:type="dxa"/>
@@ -2414,7 +2684,7 @@
                 <w:color w:val="000000"/>
                 <w:sz w:val="18"/>
               </w:rPr>
-              <w:t>Agent/SDK integration, real service discovery and captured locals</w:t>
+              <w:t>Manual route visible and enterable without SCI; successful session/capture not tested</w:t>
             </w:r>
           </w:p>
         </w:tc>
@@ -2425,7 +2695,7 @@
         </w:trPr>
         <w:tc>
           <w:tcPr>
-            <w:tcW w:type="dxa" w:w="1656"/>
+            <w:tcW w:type="dxa" w:w="1440"/>
             <w:vAlign w:val="center"/>
             <w:tcMar>
               <w:top w:w="85" w:type="dxa"/>
@@ -2445,13 +2715,13 @@
                 <w:color w:val="000000"/>
                 <w:sz w:val="18"/>
               </w:rPr>
-              <w:t>Source identity</w:t>
+              <w:t>F14</w:t>
             </w:r>
           </w:p>
         </w:tc>
         <w:tc>
           <w:tcPr>
-            <w:tcW w:type="dxa" w:w="3600"/>
+            <w:tcW w:type="dxa" w:w="2880"/>
             <w:vAlign w:val="center"/>
             <w:tcMar>
               <w:top w:w="85" w:type="dxa"/>
@@ -2471,13 +2741,13 @@
                 <w:color w:val="000000"/>
                 <w:sz w:val="18"/>
               </w:rPr>
-              <w:t>Exact source and commit checks specified</w:t>
+              <w:t>OPEN · partial observation</w:t>
             </w:r>
           </w:p>
         </w:tc>
         <w:tc>
           <w:tcPr>
-            <w:tcW w:type="dxa" w:w="4968"/>
+            <w:tcW w:type="dxa" w:w="5904"/>
             <w:vAlign w:val="center"/>
             <w:tcMar>
               <w:top w:w="85" w:type="dxa"/>
@@ -2497,7 +2767,7 @@
                 <w:color w:val="000000"/>
                 <w:sz w:val="18"/>
               </w:rPr>
-              <w:t>Deployed SHA, path/line, branch drift and mixed versions</w:t>
+              <w:t>Close returns without a created session; Escape, Back, Forward, refresh and saved-state variants remain open</w:t>
             </w:r>
           </w:p>
         </w:tc>
@@ -2508,7 +2778,7 @@
         </w:trPr>
         <w:tc>
           <w:tcPr>
-            <w:tcW w:type="dxa" w:w="1656"/>
+            <w:tcW w:type="dxa" w:w="1440"/>
             <w:vAlign w:val="center"/>
             <w:tcMar>
               <w:top w:w="85" w:type="dxa"/>
@@ -2528,13 +2798,13 @@
                 <w:color w:val="000000"/>
                 <w:sz w:val="18"/>
               </w:rPr>
-              <w:t>Access boundaries</w:t>
+              <w:t>Runtime</w:t>
             </w:r>
           </w:p>
         </w:tc>
         <w:tc>
           <w:tcPr>
-            <w:tcW w:type="dxa" w:w="3600"/>
+            <w:tcW w:type="dxa" w:w="2880"/>
             <w:vAlign w:val="center"/>
             <w:tcMar>
               <w:top w:w="85" w:type="dxa"/>
@@ -2554,13 +2824,13 @@
                 <w:color w:val="000000"/>
                 <w:sz w:val="18"/>
               </w:rPr>
-              <w:t>A-only grant and never-granted B test specified</w:t>
+              <w:t>SETUP IN PROGRESS</w:t>
             </w:r>
           </w:p>
         </w:tc>
         <w:tc>
           <w:tcPr>
-            <w:tcW w:type="dxa" w:w="4968"/>
+            <w:tcW w:type="dxa" w:w="5904"/>
             <w:vAlign w:val="center"/>
             <w:tcMar>
               <w:top w:w="85" w:type="dxa"/>
@@ -2580,7 +2850,7 @@
                 <w:color w:val="000000"/>
                 <w:sz w:val="18"/>
               </w:rPr>
-              <w:t>Repository scope, stale grants and independent roles</w:t>
+              <w:t>Agent/service readiness does not prove ingestion; first captured values remain unverified</w:t>
             </w:r>
           </w:p>
         </w:tc>
@@ -2591,7 +2861,7 @@
         </w:trPr>
         <w:tc>
           <w:tcPr>
-            <w:tcW w:type="dxa" w:w="1656"/>
+            <w:tcW w:type="dxa" w:w="1440"/>
             <w:vAlign w:val="center"/>
             <w:tcMar>
               <w:top w:w="85" w:type="dxa"/>
@@ -2611,13 +2881,13 @@
                 <w:color w:val="000000"/>
                 <w:sz w:val="18"/>
               </w:rPr>
-              <w:t>Session lifecycle</w:t>
+              <w:t>Source and access</w:t>
             </w:r>
           </w:p>
         </w:tc>
         <w:tc>
           <w:tcPr>
-            <w:tcW w:type="dxa" w:w="3600"/>
+            <w:tcW w:type="dxa" w:w="2880"/>
             <w:vAlign w:val="center"/>
             <w:tcMar>
               <w:top w:w="85" w:type="dxa"/>
@@ -2637,13 +2907,13 @@
                 <w:color w:val="000000"/>
                 <w:sz w:val="18"/>
               </w:rPr>
-              <w:t>Expiry and cleanup test oracles specified</w:t>
+              <w:t>IN PROGRESS</w:t>
             </w:r>
           </w:p>
         </w:tc>
         <w:tc>
           <w:tcPr>
-            <w:tcW w:type="dxa" w:w="4968"/>
+            <w:tcW w:type="dxa" w:w="5904"/>
             <w:vAlign w:val="center"/>
             <w:tcMar>
               <w:top w:w="85" w:type="dxa"/>
@@ -2663,7 +2933,7 @@
                 <w:color w:val="000000"/>
                 <w:sz w:val="18"/>
               </w:rPr>
-              <w:t>Actual expiry, stop, re-enable and event timestamps</w:t>
+              <w:t>Setup path inspected; exact deployed SHA, repository boundaries and role tests remain unverified</w:t>
             </w:r>
           </w:p>
         </w:tc>
@@ -2674,7 +2944,7 @@
         </w:trPr>
         <w:tc>
           <w:tcPr>
-            <w:tcW w:type="dxa" w:w="1656"/>
+            <w:tcW w:type="dxa" w:w="1440"/>
             <w:vAlign w:val="center"/>
             <w:tcMar>
               <w:top w:w="85" w:type="dxa"/>
@@ -2694,13 +2964,13 @@
                 <w:color w:val="000000"/>
                 <w:sz w:val="18"/>
               </w:rPr>
-              <w:t>Robustness</w:t>
+              <w:t>Other planned cases</w:t>
             </w:r>
           </w:p>
         </w:tc>
         <w:tc>
           <w:tcPr>
-            <w:tcW w:type="dxa" w:w="3600"/>
+            <w:tcW w:type="dxa" w:w="2880"/>
             <w:vAlign w:val="center"/>
             <w:tcMar>
               <w:top w:w="85" w:type="dxa"/>
@@ -2720,13 +2990,13 @@
                 <w:color w:val="000000"/>
                 <w:sz w:val="18"/>
               </w:rPr>
-              <w:t>Negative cases prioritized</w:t>
+              <w:t>NOT RUN</w:t>
             </w:r>
           </w:p>
         </w:tc>
         <w:tc>
           <w:tcPr>
-            <w:tcW w:type="dxa" w:w="4968"/>
+            <w:tcW w:type="dxa" w:w="5904"/>
             <w:vAlign w:val="center"/>
             <w:tcMar>
               <w:top w:w="85" w:type="dxa"/>
@@ -2746,7 +3016,7 @@
                 <w:color w:val="000000"/>
                 <w:sz w:val="18"/>
               </w:rPr>
-              <w:t>Malformed input, stale tabs, duplicate submission, failure recovery</w:t>
+              <w:t>Remain individually tracked; no inferred passes from the two scoped outcomes</w:t>
             </w:r>
           </w:p>
         </w:tc>
@@ -2825,6 +3095,192 @@
           <w:b w:val="0"/>
         </w:rPr>
         <w:t>Reload after stopping and verify every created test session/logpoint is inactive.</w:t>
+      </w:r>
+    </w:p>
+    <w:p>
+      <w:hyperlink w:anchor="DOC02">
+        <w:r>
+          <w:rPr>
+            <w:color w:val="164F80"/>
+          </w:rPr>
+          <w:t>See the beginner documentation navigation finding in Part 1</w:t>
+        </w:r>
+      </w:hyperlink>
+    </w:p>
+    <w:p>
+      <w:r>
+        <w:br w:type="page"/>
+      </w:r>
+    </w:p>
+    <w:p>
+      <w:r>
+        <w:rPr>
+          <w:b w:val="0"/>
+          <w:sz w:val="18"/>
+        </w:rPr>
+        <w:t>PART 2  |  DOC01  |  MEDIUM  |  CONFIRMED BUG</w:t>
+      </w:r>
+    </w:p>
+    <w:p>
+      <w:bookmarkStart w:id="1092" w:name="DOC01"/>
+      <w:pPr>
+        <w:pStyle w:val="Heading1"/>
+      </w:pPr>
+      <w:r>
+        <w:t>Python quickstart contains an invalid module command</w:t>
+      </w:r>
+      <w:bookmarkEnd w:id="1092"/>
+    </w:p>
+    <w:p>
+      <w:r>
+        <w:rPr>
+          <w:b w:val="0"/>
+        </w:rPr>
+        <w:t>The launch example uses python -m myapp.py. Python’s module switch expects a module name rather than a script filename.</w:t>
+      </w:r>
+    </w:p>
+    <w:p>
+      <w:pPr>
+        <w:spacing w:after="100"/>
+      </w:pPr>
+      <w:r>
+        <w:drawing>
+          <wp:inline xmlns:a="http://schemas.openxmlformats.org/drawingml/2006/main" xmlns:pic="http://schemas.openxmlformats.org/drawingml/2006/picture">
+            <wp:extent cx="6492240" cy="4162835"/>
+            <wp:docPr id="4" name="Picture 4" descr="Datadog Python setup example with a red border around the invalid launch command"/>
+            <wp:cNvGraphicFramePr>
+              <a:graphicFrameLocks noChangeAspect="1"/>
+            </wp:cNvGraphicFramePr>
+            <a:graphic>
+              <a:graphicData uri="http://schemas.microsoft.com/office/word/2010/wordprocessingGroup">
+                <wpg:wgp>
+                  <wpg:cNvGrpSpPr/>
+                  <wpg:grpSpPr>
+                    <a:xfrm>
+                      <a:off x="0" y="0"/>
+                      <a:ext cx="6492240" cy="4162835"/>
+                      <a:chOff x="0" y="0"/>
+                      <a:chExt cx="6492240" cy="4162835"/>
+                    </a:xfrm>
+                  </wpg:grpSpPr>
+                  <pic:pic>
+                    <pic:nvPicPr>
+                      <pic:cNvPr id="0" name="04-python-launch-command.jpg"/>
+                      <pic:cNvPicPr/>
+                    </pic:nvPicPr>
+                    <pic:blipFill>
+                      <a:blip r:embed="rId16"/>
+                      <a:stretch>
+                        <a:fillRect/>
+                      </a:stretch>
+                    </pic:blipFill>
+                    <pic:spPr>
+                      <a:xfrm>
+                        <a:off x="0" y="0"/>
+                        <a:ext cx="6492240" cy="4162835"/>
+                      </a:xfrm>
+                      <a:prstGeom prst="rect"/>
+                    </pic:spPr>
+                  </pic:pic>
+                  <wps:wsp>
+                    <wps:cNvSpPr/>
+                    <wps:spPr>
+                      <a:xfrm>
+                        <a:off x="2011758" y="2557887"/>
+                        <a:ext cx="2897824" cy="200619"/>
+                      </a:xfrm>
+                      <a:prstGeom prst="rect">
+                        <a:avLst/>
+                      </a:prstGeom>
+                      <a:noFill/>
+                      <a:ln w="22860">
+                        <a:solidFill>
+                          <a:srgbClr val="D82D36"/>
+                        </a:solidFill>
+                        <a:prstDash val="solid"/>
+                      </a:ln>
+                    </wps:spPr>
+                    <wps:bodyPr/>
+                  </wps:wsp>
+                </wpg:wgp>
+              </a:graphicData>
+            </a:graphic>
+          </wp:inline>
+        </w:drawing>
+      </w:r>
+    </w:p>
+    <w:p>
+      <w:pPr>
+        <w:pStyle w:val="Caption"/>
+      </w:pPr>
+      <w:r>
+        <w:t>E04 · Official Live Debugger documentation, Python tab · Screenshot file 02:20:19 UTC. Red outline identifies the launch command.</w:t>
+      </w:r>
+    </w:p>
+    <w:p>
+      <w:hyperlink r:id="rId12">
+        <w:r>
+          <w:rPr>
+            <w:color w:val="164F80"/>
+          </w:rPr>
+          <w:t>Video evidence 00:58 to 01:20</w:t>
+        </w:r>
+      </w:hyperlink>
+    </w:p>
+    <w:p>
+      <w:r>
+        <w:rPr>
+          <w:b/>
+        </w:rPr>
+        <w:t xml:space="preserve">Reproduce </w:t>
+      </w:r>
+      <w:r>
+        <w:rPr>
+          <w:b w:val="0"/>
+        </w:rPr>
+        <w:t>Open Live Debugger docs, select Python, then Enable with environment variables. Follow the final launch line with an ordinary myapp.py script.</w:t>
+      </w:r>
+    </w:p>
+    <w:p>
+      <w:r>
+        <w:rPr>
+          <w:b/>
+        </w:rPr>
+        <w:t xml:space="preserve">Expected </w:t>
+      </w:r>
+      <w:r>
+        <w:rPr>
+          <w:b w:val="0"/>
+        </w:rPr>
+        <w:t>A copied quickstart command starts the intended Python application without a module-resolution error.</w:t>
+      </w:r>
+    </w:p>
+    <w:p>
+      <w:r>
+        <w:rPr>
+          <w:b/>
+        </w:rPr>
+        <w:t xml:space="preserve">Actual </w:t>
+      </w:r>
+      <w:r>
+        <w:rPr>
+          <w:b w:val="0"/>
+        </w:rPr>
+        <w:t>The Python portion exits 1 for a minimal script. Import-time code runs before the error, so this check does not imply that no application code executes.</w:t>
+      </w:r>
+    </w:p>
+    <w:p>
+      <w:r>
+        <w:rPr>
+          <w:b/>
+        </w:rPr>
+        <w:t xml:space="preserve">Fix and retest </w:t>
+      </w:r>
+      <w:r>
+        <w:rPr>
+          <w:b w:val="0"/>
+        </w:rPr>
+        <w:t>Use ddtrace-run python myapp.py for a script, or ddtrace-run python -m myapp for a module. Add a quickstart smoke test that asserts successful process startup.</w:t>
       </w:r>
     </w:p>
     <w:p>
@@ -3663,6 +4119,172 @@
                 <w:color w:val="000000"/>
                 <w:sz w:val="18"/>
               </w:rPr>
+              <w:t>E10</w:t>
+            </w:r>
+          </w:p>
+        </w:tc>
+        <w:tc>
+          <w:tcPr>
+            <w:tcW w:type="dxa" w:w="4464"/>
+            <w:vAlign w:val="center"/>
+            <w:tcMar>
+              <w:top w:w="85" w:type="dxa"/>
+              <w:left w:w="85" w:type="dxa"/>
+              <w:bottom w:w="85" w:type="dxa"/>
+              <w:right w:w="85" w:type="dxa"/>
+            </w:tcMar>
+            <w:shd w:fill="FFFFFF"/>
+          </w:tcPr>
+          <w:p>
+            <w:pPr>
+              <w:spacing w:after="20" w:before="20" w:line="240" w:lineRule="auto"/>
+            </w:pPr>
+            <w:r>
+              <w:rPr>
+                <w:b w:val="0"/>
+                <w:color w:val="000000"/>
+                <w:sz w:val="18"/>
+              </w:rPr>
+              <w:t>Empty service picker evidence crop</w:t>
+            </w:r>
+          </w:p>
+        </w:tc>
+        <w:tc>
+          <w:tcPr>
+            <w:tcW w:type="dxa" w:w="4968"/>
+            <w:vAlign w:val="center"/>
+            <w:tcMar>
+              <w:top w:w="85" w:type="dxa"/>
+              <w:left w:w="85" w:type="dxa"/>
+              <w:bottom w:w="85" w:type="dxa"/>
+              <w:right w:w="85" w:type="dxa"/>
+            </w:tcMar>
+            <w:shd w:fill="FFFFFF"/>
+          </w:tcPr>
+          <w:p>
+            <w:pPr>
+              <w:spacing w:after="20" w:before="20" w:line="240" w:lineRule="auto"/>
+            </w:pPr>
+            <w:r>
+              <w:rPr>
+                <w:b w:val="0"/>
+                <w:color w:val="000000"/>
+                <w:sz w:val="18"/>
+              </w:rPr>
+              <w:t>03:21:54 UTC; account greeting excluded</w:t>
+            </w:r>
+          </w:p>
+        </w:tc>
+      </w:tr>
+      <w:tr>
+        <w:trPr>
+          <w:cantSplit/>
+        </w:trPr>
+        <w:tc>
+          <w:tcPr>
+            <w:tcW w:type="dxa" w:w="792"/>
+            <w:vAlign w:val="center"/>
+            <w:tcMar>
+              <w:top w:w="85" w:type="dxa"/>
+              <w:left w:w="85" w:type="dxa"/>
+              <w:bottom w:w="85" w:type="dxa"/>
+              <w:right w:w="85" w:type="dxa"/>
+            </w:tcMar>
+            <w:shd w:fill="F3F5F7"/>
+          </w:tcPr>
+          <w:p>
+            <w:pPr>
+              <w:spacing w:after="20" w:before="20" w:line="240" w:lineRule="auto"/>
+            </w:pPr>
+            <w:r>
+              <w:rPr>
+                <w:b w:val="0"/>
+                <w:color w:val="000000"/>
+                <w:sz w:val="18"/>
+              </w:rPr>
+              <w:t>E13</w:t>
+            </w:r>
+          </w:p>
+        </w:tc>
+        <w:tc>
+          <w:tcPr>
+            <w:tcW w:type="dxa" w:w="4464"/>
+            <w:vAlign w:val="center"/>
+            <w:tcMar>
+              <w:top w:w="85" w:type="dxa"/>
+              <w:left w:w="85" w:type="dxa"/>
+              <w:bottom w:w="85" w:type="dxa"/>
+              <w:right w:w="85" w:type="dxa"/>
+            </w:tcMar>
+            <w:shd w:fill="F3F5F7"/>
+          </w:tcPr>
+          <w:p>
+            <w:pPr>
+              <w:spacing w:after="20" w:before="20" w:line="240" w:lineRule="auto"/>
+            </w:pPr>
+            <w:r>
+              <w:rPr>
+                <w:b w:val="0"/>
+                <w:color w:val="000000"/>
+                <w:sz w:val="18"/>
+              </w:rPr>
+              <w:t>No environments found configuration</w:t>
+            </w:r>
+          </w:p>
+        </w:tc>
+        <w:tc>
+          <w:tcPr>
+            <w:tcW w:type="dxa" w:w="4968"/>
+            <w:vAlign w:val="center"/>
+            <w:tcMar>
+              <w:top w:w="85" w:type="dxa"/>
+              <w:left w:w="85" w:type="dxa"/>
+              <w:bottom w:w="85" w:type="dxa"/>
+              <w:right w:w="85" w:type="dxa"/>
+            </w:tcMar>
+            <w:shd w:fill="F3F5F7"/>
+          </w:tcPr>
+          <w:p>
+            <w:pPr>
+              <w:spacing w:after="20" w:before="20" w:line="240" w:lineRule="auto"/>
+            </w:pPr>
+            <w:r>
+              <w:rPr>
+                <w:b w:val="0"/>
+                <w:color w:val="000000"/>
+                <w:sz w:val="18"/>
+              </w:rPr>
+              <w:t>03:23:59 UTC; clean scrolled screenshot</w:t>
+            </w:r>
+          </w:p>
+        </w:tc>
+      </w:tr>
+      <w:tr>
+        <w:trPr>
+          <w:cantSplit/>
+        </w:trPr>
+        <w:tc>
+          <w:tcPr>
+            <w:tcW w:type="dxa" w:w="792"/>
+            <w:vAlign w:val="center"/>
+            <w:tcMar>
+              <w:top w:w="85" w:type="dxa"/>
+              <w:left w:w="85" w:type="dxa"/>
+              <w:bottom w:w="85" w:type="dxa"/>
+              <w:right w:w="85" w:type="dxa"/>
+            </w:tcMar>
+            <w:shd w:fill="FFFFFF"/>
+          </w:tcPr>
+          <w:p>
+            <w:pPr>
+              <w:spacing w:after="20" w:before="20" w:line="240" w:lineRule="auto"/>
+            </w:pPr>
+            <w:r>
+              <w:rPr>
+                <w:b w:val="0"/>
+                <w:color w:val="000000"/>
+                <w:sz w:val="18"/>
+              </w:rPr>
               <w:t>E08</w:t>
             </w:r>
           </w:p>
@@ -4085,7 +4707,7 @@
       </w:r>
     </w:p>
     <w:p>
-      <w:hyperlink r:id="rId15">
+      <w:hyperlink r:id="rId17">
         <w:r>
           <w:rPr>
             <w:color w:val="164F80"/>
@@ -4095,7 +4717,7 @@
       </w:hyperlink>
     </w:p>
     <w:p>
-      <w:hyperlink r:id="rId16">
+      <w:hyperlink r:id="rId18">
         <w:r>
           <w:rPr>
             <w:color w:val="164F80"/>
@@ -4105,7 +4727,7 @@
       </w:hyperlink>
     </w:p>
     <w:p>
-      <w:hyperlink r:id="rId17">
+      <w:hyperlink r:id="rId19">
         <w:r>
           <w:rPr>
             <w:color w:val="164F80"/>
@@ -4115,7 +4737,7 @@
       </w:hyperlink>
     </w:p>
     <w:p>
-      <w:hyperlink r:id="rId18">
+      <w:hyperlink r:id="rId20">
         <w:r>
           <w:rPr>
             <w:color w:val="164F80"/>
@@ -4125,7 +4747,7 @@
       </w:hyperlink>
     </w:p>
     <w:p>
-      <w:hyperlink r:id="rId19">
+      <w:hyperlink r:id="rId21">
         <w:r>
           <w:rPr>
             <w:color w:val="164F80"/>
@@ -4169,7 +4791,7 @@
         <w:rPr>
           <w:b w:val="0"/>
         </w:rPr>
-        <w:t>The baseline matrix contains 54 cases. The following groups explain the intended coverage in plain language; their outcomes remain NOT RUN until evidence is recorded. P0 is test priority, not defect severity.</w:t>
+        <w:t>The baseline matrix contains 54 cases. B02 and B04 have scoped outcomes; F14 and S01 are partially in progress. The groups below describe planned coverage, not blanket completion. P0 is test priority, not defect severity.</w:t>
       </w:r>
     </w:p>
     <w:tbl>

</xml_diff>

<commit_message>
Publish 05:45 QA checkpoint and complete recording inventory
</commit_message>
<xml_diff>
--- a/report.docx
+++ b/report.docx
@@ -26,7 +26,7 @@
           <w:b w:val="0"/>
           <w:sz w:val="18"/>
         </w:rPr>
-        <w:t>Overnight checkpoint  |  8 October 2026 at 04:23 UTC  |  00:23 New York</w:t>
+        <w:t>Continuation checkpoint  |  8 October 2026 at 05:45 UTC  |  01:45 New York</w:t>
       </w:r>
     </w:p>
     <w:p>
@@ -42,7 +42,29 @@
         <w:rPr>
           <w:b w:val="0"/>
         </w:rPr>
-        <w:t>The public onboarding path contains a reproducible Python command defect and a desktop documentation layout defect. Runtime and source testing are paused at explicit authorization gates. This report records verified UI and local results, and gives every original case a concrete checkpoint outcome.</w:t>
+        <w:t>The audit has two Medium findings: an invalid Python quickstart command and an interrupted GitHub connection that cannot recover through Connect. Service discovery and runtime readiness were observed, but no live debugger capture or source association is verified. Every original case has a scoped result or concrete blocker.</w:t>
+      </w:r>
+    </w:p>
+    <w:p>
+      <w:pPr>
+        <w:pStyle w:val="ListBullet"/>
+      </w:pPr>
+      <w:r>
+        <w:rPr>
+          <w:b w:val="0"/>
+        </w:rPr>
+      </w:r>
+      <w:r>
+        <w:rPr>
+          <w:b/>
+        </w:rPr>
+        <w:t>Recover interrupted source connections.</w:t>
+      </w:r>
+      <w:r>
+        <w:rPr>
+          <w:b w:val="0"/>
+        </w:rPr>
+        <w:t xml:space="preserve"> GitHub shows the approved A-only App installation and user authorization, while Datadog remains unconnected and its Connect retry makes no progress. The form had been paused about 75 minutes; fresh-install behavior is unproven.</w:t>
       </w:r>
     </w:p>
     <w:p>
@@ -139,7 +161,7 @@
           <w:b w:val="0"/>
           <w:sz w:val="18"/>
         </w:rPr>
-        <w:t>Severity index below: HIGH 0 · MEDIUM 1 · LOW 3. Click a finding ID to jump to its detail page.</w:t>
+        <w:t>Severity index below: HIGH 0 · MEDIUM 2 · LOW 3. Click a finding ID to jump to its detail page.</w:t>
       </w:r>
     </w:p>
     <w:p>
@@ -158,7 +180,7 @@
           <w:b w:val="0"/>
           <w:sz w:val="18"/>
         </w:rPr>
-        <w:t>63 original cases: 2 scoped PASS, 2 FINDING, 59 BLOCKED. Separate executed subchecks preserve genuine UI observations without implying full runtime coverage.</w:t>
+        <w:t>63 original cases: 2 scoped PASS, 3 FINDING, 58 BLOCKED. Separate executed subchecks preserve genuine UI observations without implying full runtime coverage.</w:t>
       </w:r>
     </w:p>
     <w:p>
@@ -444,6 +466,115 @@
             <w:pPr>
               <w:spacing w:after="20" w:before="20" w:line="240" w:lineRule="auto"/>
             </w:pPr>
+            <w:hyperlink w:anchor="SCI01">
+              <w:r>
+                <w:rPr>
+                  <w:color w:val="164F80"/>
+                </w:rPr>
+                <w:t>SCI01</w:t>
+              </w:r>
+            </w:hyperlink>
+          </w:p>
+        </w:tc>
+        <w:tc>
+          <w:tcPr>
+            <w:tcW w:type="dxa" w:w="1944"/>
+            <w:vAlign w:val="center"/>
+            <w:tcMar>
+              <w:top w:w="85" w:type="dxa"/>
+              <w:left w:w="85" w:type="dxa"/>
+              <w:bottom w:w="85" w:type="dxa"/>
+              <w:right w:w="85" w:type="dxa"/>
+            </w:tcMar>
+            <w:shd w:fill="F3F5F7"/>
+          </w:tcPr>
+          <w:p>
+            <w:pPr>
+              <w:spacing w:after="20" w:before="20" w:line="240" w:lineRule="auto"/>
+            </w:pPr>
+            <w:r>
+              <w:rPr>
+                <w:b w:val="0"/>
+                <w:color w:val="000000"/>
+                <w:sz w:val="18"/>
+              </w:rPr>
+              <w:t>MEDIUM · recovery</w:t>
+            </w:r>
+          </w:p>
+        </w:tc>
+        <w:tc>
+          <w:tcPr>
+            <w:tcW w:type="dxa" w:w="6480"/>
+            <w:vAlign w:val="center"/>
+            <w:tcMar>
+              <w:top w:w="85" w:type="dxa"/>
+              <w:left w:w="85" w:type="dxa"/>
+              <w:bottom w:w="85" w:type="dxa"/>
+              <w:right w:w="85" w:type="dxa"/>
+            </w:tcMar>
+            <w:shd w:fill="F3F5F7"/>
+          </w:tcPr>
+          <w:p>
+            <w:pPr>
+              <w:spacing w:after="20" w:before="20" w:line="240" w:lineRule="auto"/>
+            </w:pPr>
+            <w:r>
+              <w:rPr>
+                <w:b w:val="0"/>
+                <w:color w:val="000000"/>
+                <w:sz w:val="18"/>
+              </w:rPr>
+              <w:t>Interrupted GitHub connection cannot recover through the offered route</w:t>
+            </w:r>
+          </w:p>
+        </w:tc>
+        <w:tc>
+          <w:tcPr>
+            <w:tcW w:type="dxa" w:w="792"/>
+            <w:vAlign w:val="center"/>
+            <w:tcMar>
+              <w:top w:w="85" w:type="dxa"/>
+              <w:left w:w="85" w:type="dxa"/>
+              <w:bottom w:w="85" w:type="dxa"/>
+              <w:right w:w="85" w:type="dxa"/>
+            </w:tcMar>
+            <w:shd w:fill="F3F5F7"/>
+          </w:tcPr>
+          <w:p>
+            <w:pPr>
+              <w:spacing w:after="20" w:before="20" w:line="240" w:lineRule="auto"/>
+            </w:pPr>
+            <w:r>
+              <w:rPr>
+                <w:b w:val="0"/>
+                <w:color w:val="000000"/>
+                <w:sz w:val="18"/>
+              </w:rPr>
+              <w:t>2</w:t>
+            </w:r>
+          </w:p>
+        </w:tc>
+      </w:tr>
+      <w:tr>
+        <w:trPr>
+          <w:cantSplit/>
+        </w:trPr>
+        <w:tc>
+          <w:tcPr>
+            <w:tcW w:type="dxa" w:w="1008"/>
+            <w:vAlign w:val="center"/>
+            <w:tcMar>
+              <w:top w:w="85" w:type="dxa"/>
+              <w:left w:w="85" w:type="dxa"/>
+              <w:bottom w:w="85" w:type="dxa"/>
+              <w:right w:w="85" w:type="dxa"/>
+            </w:tcMar>
+            <w:shd w:fill="FFFFFF"/>
+          </w:tcPr>
+          <w:p>
+            <w:pPr>
+              <w:spacing w:after="20" w:before="20" w:line="240" w:lineRule="auto"/>
+            </w:pPr>
             <w:hyperlink w:anchor="DOC02">
               <w:r>
                 <w:rPr>
@@ -464,7 +595,7 @@
               <w:bottom w:w="85" w:type="dxa"/>
               <w:right w:w="85" w:type="dxa"/>
             </w:tcMar>
-            <w:shd w:fill="F3F5F7"/>
+            <w:shd w:fill="FFFFFF"/>
           </w:tcPr>
           <w:p>
             <w:pPr>
@@ -490,7 +621,7 @@
               <w:bottom w:w="85" w:type="dxa"/>
               <w:right w:w="85" w:type="dxa"/>
             </w:tcMar>
-            <w:shd w:fill="F3F5F7"/>
+            <w:shd w:fill="FFFFFF"/>
           </w:tcPr>
           <w:p>
             <w:pPr>
@@ -516,7 +647,7 @@
               <w:bottom w:w="85" w:type="dxa"/>
               <w:right w:w="85" w:type="dxa"/>
             </w:tcMar>
-            <w:shd w:fill="F3F5F7"/>
+            <w:shd w:fill="FFFFFF"/>
           </w:tcPr>
           <w:p>
             <w:pPr>
@@ -547,7 +678,7 @@
               <w:bottom w:w="85" w:type="dxa"/>
               <w:right w:w="85" w:type="dxa"/>
             </w:tcMar>
-            <w:shd w:fill="FFFFFF"/>
+            <w:shd w:fill="F3F5F7"/>
           </w:tcPr>
           <w:p>
             <w:pPr>
@@ -573,7 +704,7 @@
               <w:bottom w:w="85" w:type="dxa"/>
               <w:right w:w="85" w:type="dxa"/>
             </w:tcMar>
-            <w:shd w:fill="FFFFFF"/>
+            <w:shd w:fill="F3F5F7"/>
           </w:tcPr>
           <w:p>
             <w:pPr>
@@ -599,7 +730,7 @@
               <w:bottom w:w="85" w:type="dxa"/>
               <w:right w:w="85" w:type="dxa"/>
             </w:tcMar>
-            <w:shd w:fill="FFFFFF"/>
+            <w:shd w:fill="F3F5F7"/>
           </w:tcPr>
           <w:p>
             <w:pPr>
@@ -625,7 +756,7 @@
               <w:bottom w:w="85" w:type="dxa"/>
               <w:right w:w="85" w:type="dxa"/>
             </w:tcMar>
-            <w:shd w:fill="FFFFFF"/>
+            <w:shd w:fill="F3F5F7"/>
           </w:tcPr>
           <w:p>
             <w:pPr>
@@ -656,7 +787,7 @@
               <w:bottom w:w="85" w:type="dxa"/>
               <w:right w:w="85" w:type="dxa"/>
             </w:tcMar>
-            <w:shd w:fill="F3F5F7"/>
+            <w:shd w:fill="FFFFFF"/>
           </w:tcPr>
           <w:p>
             <w:pPr>
@@ -682,7 +813,7 @@
               <w:bottom w:w="85" w:type="dxa"/>
               <w:right w:w="85" w:type="dxa"/>
             </w:tcMar>
-            <w:shd w:fill="F3F5F7"/>
+            <w:shd w:fill="FFFFFF"/>
           </w:tcPr>
           <w:p>
             <w:pPr>
@@ -708,7 +839,7 @@
               <w:bottom w:w="85" w:type="dxa"/>
               <w:right w:w="85" w:type="dxa"/>
             </w:tcMar>
-            <w:shd w:fill="F3F5F7"/>
+            <w:shd w:fill="FFFFFF"/>
           </w:tcPr>
           <w:p>
             <w:pPr>
@@ -734,7 +865,7 @@
               <w:bottom w:w="85" w:type="dxa"/>
               <w:right w:w="85" w:type="dxa"/>
             </w:tcMar>
-            <w:shd w:fill="F3F5F7"/>
+            <w:shd w:fill="FFFFFF"/>
           </w:tcPr>
           <w:p>
             <w:pPr>
@@ -757,22 +888,6 @@
         <w:rPr>
           <w:b w:val="0"/>
         </w:rPr>
-      </w:r>
-    </w:p>
-    <w:p>
-      <w:pPr>
-        <w:pStyle w:val="Heading2"/>
-      </w:pPr>
-      <w:r>
-        <w:t>Highest value retests</w:t>
-      </w:r>
-    </w:p>
-    <w:p>
-      <w:r>
-        <w:rPr>
-          <w:b w:val="0"/>
-        </w:rPr>
-        <w:t>After the command fix, run one clean Python quickstart through first real variable capture. Then verify the exact deployed commit in source view, an A-only repository grant, stop/expiry behavior, and safe recovery from missing prerequisites.</w:t>
       </w:r>
     </w:p>
     <w:p>
@@ -1096,7 +1211,7 @@
                 <w:color w:val="000000"/>
                 <w:sz w:val="18"/>
               </w:rPr>
-              <w:t>Material task failure or misleading behavior with a practical workaround</w:t>
+              <w:t>Material task failure or misleading behavior with bounded demonstrated impact</w:t>
             </w:r>
           </w:p>
         </w:tc>
@@ -1179,7 +1294,7 @@
         <w:rPr>
           <w:b w:val="0"/>
         </w:rPr>
-        <w:t>Cloud desktop browser; approximately 1180 × 757 page viewport at default zoom. Documentation evidence images are 1165 × 747 pixels. Local reproduction uses Python 3.12.14. A dedicated synthetic sample contains no real customer data. No successful runtime capture was established. Agent/sample processes are stopped; the official GitHub App installation was not submitted. The exact runtime build is therefore not a validated test environment.</w:t>
+        <w:t>Cloud desktop browser; approximately 1180 × 757 page viewport at default zoom. Documentation evidence images are 1165 × 747 pixels. Local reproduction uses Python 3.12.14. A dedicated synthetic sample contains no real customer data. Runtime snapshots used Agent/trace-agent 7.84.2, ddtrace 4.11.0 and Python 3.13.5. Datadog UI build 35.143254999. Runtime later stopped at an additional-destination boundary; source association remains unconnected despite verified GitHub installation and authorization. No captured event.</w:t>
       </w:r>
     </w:p>
     <w:p>
@@ -1642,7 +1757,7 @@
                 <w:color w:val="000000"/>
                 <w:sz w:val="18"/>
               </w:rPr>
-              <w:t>No services/environments shown; session start safely disabled; actual capture remains unverified</w:t>
+              <w:t>Service discovered after approval; wildcard setup guidance and draft validation checked; actual capture unverified</w:t>
             </w:r>
           </w:p>
         </w:tc>
@@ -1725,7 +1840,7 @@
                 <w:color w:val="000000"/>
                 <w:sz w:val="18"/>
               </w:rPr>
-              <w:t>Source integration is recommended; manual entry is available without a source connection</w:t>
+              <w:t>Manual entry available; installed/authorized GitHub link cannot recover in the interrupted state</w:t>
             </w:r>
           </w:p>
         </w:tc>
@@ -1878,14 +1993,14 @@
       </w:r>
     </w:p>
     <w:p>
-      <w:bookmarkStart w:id="1046" w:name="UX01"/>
+      <w:bookmarkStart w:id="1045" w:name="UX01"/>
       <w:pPr>
         <w:pStyle w:val="Heading1"/>
       </w:pPr>
       <w:r>
         <w:t>A permanent region choice needs decision support</w:t>
       </w:r>
-      <w:bookmarkEnd w:id="1046"/>
+      <w:bookmarkEnd w:id="1045"/>
     </w:p>
     <w:p>
       <w:r>
@@ -2054,14 +2169,14 @@
       </w:r>
     </w:p>
     <w:p>
-      <w:bookmarkStart w:id="1057" w:name="DOC02"/>
+      <w:bookmarkStart w:id="1056" w:name="DOC02"/>
       <w:pPr>
         <w:pStyle w:val="Heading1"/>
       </w:pPr>
       <w:r>
         <w:t>Documentation navigation breaks words at desktop width</w:t>
       </w:r>
-      <w:bookmarkEnd w:id="1057"/>
+      <w:bookmarkEnd w:id="1056"/>
     </w:p>
     <w:p>
       <w:r>
@@ -2230,14 +2345,14 @@
       </w:r>
     </w:p>
     <w:p>
-      <w:bookmarkStart w:id="1068" w:name="UX02"/>
+      <w:bookmarkStart w:id="1067" w:name="UX02"/>
       <w:pPr>
         <w:pStyle w:val="Heading1"/>
       </w:pPr>
       <w:r>
         <w:t>Empty service states do not explain setup recovery</w:t>
       </w:r>
-      <w:bookmarkEnd w:id="1068"/>
+      <w:bookmarkEnd w:id="1067"/>
     </w:p>
     <w:p>
       <w:r>
@@ -2388,7 +2503,7 @@
         <w:rPr>
           <w:b w:val="0"/>
         </w:rPr>
-        <w:t>Runtime telemetry is paused pending explicit payload approval. This is a guidance recommendation, not evidence that a healthy service is incorrectly absent. The evidence index distinguishes screenshots from published motion footage.</w:t>
+        <w:t>This earlier observation concerns a genuinely empty account. After service discovery, the wildcard-environment warning provides useful setup guidance. The finding is not evidence that a healthy service is incorrectly absent.</w:t>
       </w:r>
     </w:p>
     <w:p>
@@ -2426,7 +2541,7 @@
         <w:rPr>
           <w:b w:val="0"/>
         </w:rPr>
-        <w:t>All 63 original cases are accounted for: 2 scoped PASS, 2 FINDING and 59 BLOCKED. B04 and S01 pass only the route and pre-install scopes stated below. The appendix lists every case; the online matrix preserves full preconditions, steps, expected results and cleanup. No runtime capture or source-mapping pass is claimed.</w:t>
+        <w:t>All 63 original cases are accounted for: 2 scoped PASS, 3 FINDING and 58 BLOCKED. B04 and S01 pass only the route and pre-install scopes stated below. The appendix lists every case; the online matrix preserves full preconditions, steps, expected results and cleanup. No runtime capture or source-mapping pass is claimed.</w:t>
       </w:r>
     </w:p>
     <w:tbl>
@@ -2558,7 +2673,7 @@
                 <w:color w:val="000000"/>
                 <w:sz w:val="18"/>
               </w:rPr>
-              <w:t>B02/B03</w:t>
+              <w:t>B02/B03/S11</w:t>
             </w:r>
           </w:p>
         </w:tc>
@@ -2610,7 +2725,7 @@
                 <w:color w:val="000000"/>
                 <w:sz w:val="18"/>
               </w:rPr>
-              <w:t>UX02 first-run guidance and DOC01 Python command; other prerequisite causes remain untested</w:t>
+              <w:t>UX02 guidance, DOC01 command and SCI01 interrupted source-connection recovery</w:t>
             </w:r>
           </w:p>
         </w:tc>
@@ -2776,7 +2891,7 @@
                 <w:color w:val="000000"/>
                 <w:sz w:val="18"/>
               </w:rPr>
-              <w:t>Pre-install permissions and cancel/reload; no App grant or source retrieval</w:t>
+              <w:t>Pre-install permission/cancel checks; later App grant verified separately, source association failed</w:t>
             </w:r>
           </w:p>
         </w:tc>
@@ -2859,7 +2974,7 @@
                 <w:color w:val="000000"/>
                 <w:sz w:val="18"/>
               </w:rPr>
-              <w:t>Modal zoom, focus, Escape/history/refresh checks passed; editor and saved-state variants unavailable</w:t>
+              <w:t>Modal and draft navigation checks passed; remaining accessibility and saved-entity variants untested</w:t>
             </w:r>
           </w:p>
         </w:tc>
@@ -3025,7 +3140,7 @@
                 <w:color w:val="000000"/>
                 <w:sz w:val="18"/>
               </w:rPr>
-              <w:t>Synthetic payload and A-only App-install approvals pending; role and deployment gates also required</w:t>
+              <w:t>Initial approvals received; additional-destination boundary stopped runtime. Source association failure recorded in SCI01</w:t>
             </w:r>
           </w:p>
         </w:tc>
@@ -3036,6 +3151,15 @@
         <w:rPr>
           <w:b w:val="0"/>
         </w:rPr>
+      </w:r>
+    </w:p>
+    <w:p>
+      <w:r>
+        <w:rPr>
+          <w:b w:val="0"/>
+          <w:sz w:val="18"/>
+        </w:rPr>
+        <w:t>Two baseline submissions, including a plain-message control, returned a visible instrumentation-invalid toast and HTTP 400. The fresh unfiltered list remained All 0 / Active 0 / Inactive 0. Wildcard-environment/runtime prerequisites remain unresolved; no cause or runtime defect is inferred.</w:t>
       </w:r>
     </w:p>
     <w:p>
@@ -3303,6 +3427,182 @@
           <w:b w:val="0"/>
           <w:sz w:val="18"/>
         </w:rPr>
+        <w:t>PART 2  |  SCI01  |  MEDIUM  |  SCOPED RECOVERY ISSUE</w:t>
+      </w:r>
+    </w:p>
+    <w:p>
+      <w:bookmarkStart w:id="1104" w:name="SCI01"/>
+      <w:pPr>
+        <w:pStyle w:val="Heading1"/>
+      </w:pPr>
+      <w:r>
+        <w:t>Interrupted GitHub setup does not recover through Connect</w:t>
+      </w:r>
+      <w:bookmarkEnd w:id="1104"/>
+    </w:p>
+    <w:p>
+      <w:r>
+        <w:rPr>
+          <w:b w:val="0"/>
+        </w:rPr>
+        <w:t>GitHub verifies the approved A-only App installation and user authorization. Datadog remains unconnected, and its offered Connect action returns to unchanged installation settings without a usable completion route.</w:t>
+      </w:r>
+    </w:p>
+    <w:p>
+      <w:pPr>
+        <w:spacing w:after="100"/>
+      </w:pPr>
+      <w:r>
+        <w:drawing>
+          <wp:inline xmlns:a="http://schemas.openxmlformats.org/drawingml/2006/main" xmlns:pic="http://schemas.openxmlformats.org/drawingml/2006/picture">
+            <wp:extent cx="6126480" cy="3591799"/>
+            <wp:docPr id="5" name="Picture 5" descr="Actual Datadog unconnected GitHub setup after callback, with account areas excluded"/>
+            <wp:cNvGraphicFramePr>
+              <a:graphicFrameLocks noChangeAspect="1"/>
+            </wp:cNvGraphicFramePr>
+            <a:graphic>
+              <a:graphicData uri="http://schemas.microsoft.com/office/word/2010/wordprocessingGroup">
+                <wpg:wgp>
+                  <wpg:cNvGrpSpPr/>
+                  <wpg:grpSpPr>
+                    <a:xfrm>
+                      <a:off x="0" y="0"/>
+                      <a:ext cx="6126480" cy="3591799"/>
+                      <a:chOff x="0" y="0"/>
+                      <a:chExt cx="6126480" cy="3591799"/>
+                    </a:xfrm>
+                  </wpg:grpSpPr>
+                  <pic:pic>
+                    <pic:nvPicPr>
+                      <pic:cNvPr id="0" name="30-github-return-empty-integration-public.png"/>
+                      <pic:cNvPicPr/>
+                    </pic:nvPicPr>
+                    <pic:blipFill>
+                      <a:blip r:embed="rId17"/>
+                      <a:stretch>
+                        <a:fillRect/>
+                      </a:stretch>
+                    </pic:blipFill>
+                    <pic:spPr>
+                      <a:xfrm>
+                        <a:off x="0" y="0"/>
+                        <a:ext cx="6126480" cy="3591799"/>
+                      </a:xfrm>
+                      <a:prstGeom prst="rect"/>
+                    </pic:spPr>
+                  </pic:pic>
+                  <wps:wsp>
+                    <wps:cNvSpPr/>
+                    <wps:spPr>
+                      <a:xfrm>
+                        <a:off x="1411493" y="1531620"/>
+                        <a:ext cx="3363558" cy="1339417"/>
+                      </a:xfrm>
+                      <a:prstGeom prst="rect">
+                        <a:avLst/>
+                      </a:prstGeom>
+                      <a:noFill/>
+                      <a:ln w="22860">
+                        <a:solidFill>
+                          <a:srgbClr val="D82D36"/>
+                        </a:solidFill>
+                        <a:prstDash val="solid"/>
+                      </a:ln>
+                    </wps:spPr>
+                    <wps:bodyPr/>
+                  </wps:wsp>
+                </wpg:wgp>
+              </a:graphicData>
+            </a:graphic>
+          </wp:inline>
+        </w:drawing>
+      </w:r>
+    </w:p>
+    <w:p>
+      <w:pPr>
+        <w:pStyle w:val="Caption"/>
+      </w:pPr>
+      <w:r>
+        <w:t>04:50:15 UTC · Actual sanitized screenshot. The installation form had been left open about 75 minutes. Delay is a precondition, not an established cause.</w:t>
+      </w:r>
+    </w:p>
+    <w:p>
+      <w:hyperlink r:id="rId18">
+        <w:r>
+          <w:rPr>
+            <w:color w:val="164F80"/>
+          </w:rPr>
+          <w:t>Full-size annotated screenshot and installed authorized scope evidence</w:t>
+        </w:r>
+      </w:hyperlink>
+    </w:p>
+    <w:p>
+      <w:r>
+        <w:rPr>
+          <w:b/>
+        </w:rPr>
+        <w:t xml:space="preserve">Reproduce </w:t>
+      </w:r>
+      <w:r>
+        <w:rPr>
+          <w:b w:val="0"/>
+        </w:rPr>
+        <w:t>Complete the approved install after the pause, select the intended Datadog organization, then retry Connect. Re-enter fresh through the official integration catalog and verify the intended site/org.</w:t>
+      </w:r>
+    </w:p>
+    <w:p>
+      <w:r>
+        <w:rPr>
+          <w:b/>
+        </w:rPr>
+        <w:t xml:space="preserve">Expected and actual </w:t>
+      </w:r>
+      <w:r>
+        <w:rPr>
+          <w:b w:val="0"/>
+        </w:rPr>
+        <w:t>Complete the association or explain a concrete recovery step/error. Instead, Datadog shows Get Started and the retry reaches GitHub settings with Save disabled. Fresh catalog navigation did not recover it.</w:t>
+      </w:r>
+    </w:p>
+    <w:p>
+      <w:r>
+        <w:rPr>
+          <w:b/>
+        </w:rPr>
+        <w:t xml:space="preserve">Impact and boundary </w:t>
+      </w:r>
+      <w:r>
+        <w:rPr>
+          <w:b w:val="0"/>
+        </w:rPr>
+        <w:t>Source linking is blocked in this interrupted state. Manual debugger entry remains available; no source-association workaround was verified. Fresh uninterrupted installation and backend cause are unproven.</w:t>
+      </w:r>
+    </w:p>
+    <w:p>
+      <w:r>
+        <w:rPr>
+          <w:b/>
+        </w:rPr>
+        <w:t xml:space="preserve">Recording scope </w:t>
+      </w:r>
+      <w:r>
+        <w:rPr>
+          <w:b w:val="0"/>
+        </w:rPr>
+        <w:t>Install/reauthentication before 04:49:33 is screenshot-only. Later recovery has reviewed recording 07 motion; the online finding links highlight 00:00 and 01:19.50, plus the full safe archive. No source retrieval or captured-value pass is claimed.</w:t>
+      </w:r>
+    </w:p>
+    <w:p>
+      <w:r>
+        <w:br w:type="page"/>
+      </w:r>
+    </w:p>
+    <w:p>
+      <w:r>
+        <w:rPr>
+          <w:b w:val="0"/>
+          <w:sz w:val="18"/>
+        </w:rPr>
         <w:t>TECHNICAL APPENDIX</w:t>
       </w:r>
     </w:p>
@@ -4708,7 +5008,7 @@
       </w:r>
     </w:p>
     <w:p>
-      <w:hyperlink r:id="rId17">
+      <w:hyperlink r:id="rId19">
         <w:r>
           <w:rPr>
             <w:color w:val="164F80"/>
@@ -4723,7 +5023,7 @@
           <w:b w:val="0"/>
           <w:sz w:val="18"/>
         </w:rPr>
-        <w:t>Reviewed motion: authenticated UI QA 181.30 seconds; account/setup transitions 20.25 seconds, with identity masked and OAuth omitted. UX02 appears at 00:00 and 02:42.80 in the UI excerpt. The complete privacy-safe archive is still being prepared; excerpts are not all recorded footage.</w:t>
+        <w:t>Reviewed motion: authenticated UI QA 181.30 seconds; account/setup transitions 20.25 seconds, with identity masked and OAuth omitted. UX02 appears at 00:00 and 02:42.80 in the UI excerpt. Both historical and recording 07 safe archives are available with exact omissions. Recording 08 is wholly withheld tooling preparation. Highlights overlap the archives; no successful runtime capture is shown.</w:t>
       </w:r>
     </w:p>
     <w:p>
@@ -4735,7 +5035,7 @@
       </w:r>
     </w:p>
     <w:p>
-      <w:hyperlink r:id="rId18">
+      <w:hyperlink r:id="rId20">
         <w:r>
           <w:rPr>
             <w:color w:val="164F80"/>
@@ -4745,7 +5045,7 @@
       </w:hyperlink>
     </w:p>
     <w:p>
-      <w:hyperlink r:id="rId19">
+      <w:hyperlink r:id="rId21">
         <w:r>
           <w:rPr>
             <w:color w:val="164F80"/>
@@ -4755,7 +5055,7 @@
       </w:hyperlink>
     </w:p>
     <w:p>
-      <w:hyperlink r:id="rId20">
+      <w:hyperlink r:id="rId22">
         <w:r>
           <w:rPr>
             <w:color w:val="164F80"/>
@@ -4765,7 +5065,7 @@
       </w:hyperlink>
     </w:p>
     <w:p>
-      <w:hyperlink r:id="rId21">
+      <w:hyperlink r:id="rId23">
         <w:r>
           <w:rPr>
             <w:color w:val="164F80"/>
@@ -4775,7 +5075,7 @@
       </w:hyperlink>
     </w:p>
     <w:p>
-      <w:hyperlink r:id="rId22">
+      <w:hyperlink r:id="rId24">
         <w:r>
           <w:rPr>
             <w:color w:val="164F80"/>
@@ -5506,6 +5806,172 @@
           </w:p>
         </w:tc>
       </w:tr>
+      <w:tr>
+        <w:trPr>
+          <w:cantSplit/>
+        </w:trPr>
+        <w:tc>
+          <w:tcPr>
+            <w:tcW w:type="dxa" w:w="2448"/>
+            <w:vAlign w:val="center"/>
+            <w:tcMar>
+              <w:top w:w="85" w:type="dxa"/>
+              <w:left w:w="85" w:type="dxa"/>
+              <w:bottom w:w="85" w:type="dxa"/>
+              <w:right w:w="85" w:type="dxa"/>
+            </w:tcMar>
+            <w:shd w:fill="F3F5F7"/>
+          </w:tcPr>
+          <w:p>
+            <w:pPr>
+              <w:spacing w:after="20" w:before="20" w:line="240" w:lineRule="auto"/>
+            </w:pPr>
+            <w:r>
+              <w:rPr>
+                <w:b w:val="0"/>
+                <w:color w:val="000000"/>
+                <w:sz w:val="18"/>
+              </w:rPr>
+              <w:t>U08 Empty list filter persistence</w:t>
+            </w:r>
+          </w:p>
+        </w:tc>
+        <w:tc>
+          <w:tcPr>
+            <w:tcW w:type="dxa" w:w="1440"/>
+            <w:vAlign w:val="center"/>
+            <w:tcMar>
+              <w:top w:w="85" w:type="dxa"/>
+              <w:left w:w="85" w:type="dxa"/>
+              <w:bottom w:w="85" w:type="dxa"/>
+              <w:right w:w="85" w:type="dxa"/>
+            </w:tcMar>
+            <w:shd w:fill="F3F5F7"/>
+          </w:tcPr>
+          <w:p>
+            <w:pPr>
+              <w:spacing w:after="20" w:before="20" w:line="240" w:lineRule="auto"/>
+            </w:pPr>
+            <w:r>
+              <w:rPr>
+                <w:b w:val="0"/>
+                <w:color w:val="000000"/>
+                <w:sz w:val="18"/>
+              </w:rPr>
+              <w:t>03:56–03:58</w:t>
+            </w:r>
+          </w:p>
+        </w:tc>
+        <w:tc>
+          <w:tcPr>
+            <w:tcW w:type="dxa" w:w="6336"/>
+            <w:vAlign w:val="center"/>
+            <w:tcMar>
+              <w:top w:w="85" w:type="dxa"/>
+              <w:left w:w="85" w:type="dxa"/>
+              <w:bottom w:w="85" w:type="dxa"/>
+              <w:right w:w="85" w:type="dxa"/>
+            </w:tcMar>
+            <w:shd w:fill="F3F5F7"/>
+          </w:tcPr>
+          <w:p>
+            <w:pPr>
+              <w:spacing w:after="20" w:before="20" w:line="240" w:lineRule="auto"/>
+            </w:pPr>
+            <w:r>
+              <w:rPr>
+                <w:b w:val="0"/>
+                <w:color w:val="000000"/>
+                <w:sz w:val="18"/>
+              </w:rPr>
+              <w:t>Search/status/owner controls were exercised; status/owner persist on reload. No populated-result correctness.</w:t>
+            </w:r>
+          </w:p>
+        </w:tc>
+      </w:tr>
+      <w:tr>
+        <w:trPr>
+          <w:cantSplit/>
+        </w:trPr>
+        <w:tc>
+          <w:tcPr>
+            <w:tcW w:type="dxa" w:w="2448"/>
+            <w:vAlign w:val="center"/>
+            <w:tcMar>
+              <w:top w:w="85" w:type="dxa"/>
+              <w:left w:w="85" w:type="dxa"/>
+              <w:bottom w:w="85" w:type="dxa"/>
+              <w:right w:w="85" w:type="dxa"/>
+            </w:tcMar>
+            <w:shd w:fill="FFFFFF"/>
+          </w:tcPr>
+          <w:p>
+            <w:pPr>
+              <w:spacing w:after="20" w:before="20" w:line="240" w:lineRule="auto"/>
+            </w:pPr>
+            <w:r>
+              <w:rPr>
+                <w:b w:val="0"/>
+                <w:color w:val="000000"/>
+                <w:sz w:val="18"/>
+              </w:rPr>
+              <w:t>U09 Clear Filter and custom dates</w:t>
+            </w:r>
+          </w:p>
+        </w:tc>
+        <w:tc>
+          <w:tcPr>
+            <w:tcW w:type="dxa" w:w="1440"/>
+            <w:vAlign w:val="center"/>
+            <w:tcMar>
+              <w:top w:w="85" w:type="dxa"/>
+              <w:left w:w="85" w:type="dxa"/>
+              <w:bottom w:w="85" w:type="dxa"/>
+              <w:right w:w="85" w:type="dxa"/>
+            </w:tcMar>
+            <w:shd w:fill="FFFFFF"/>
+          </w:tcPr>
+          <w:p>
+            <w:pPr>
+              <w:spacing w:after="20" w:before="20" w:line="240" w:lineRule="auto"/>
+            </w:pPr>
+            <w:r>
+              <w:rPr>
+                <w:b w:val="0"/>
+                <w:color w:val="000000"/>
+                <w:sz w:val="18"/>
+              </w:rPr>
+              <w:t>03:56–03:58</w:t>
+            </w:r>
+          </w:p>
+        </w:tc>
+        <w:tc>
+          <w:tcPr>
+            <w:tcW w:type="dxa" w:w="6336"/>
+            <w:vAlign w:val="center"/>
+            <w:tcMar>
+              <w:top w:w="85" w:type="dxa"/>
+              <w:left w:w="85" w:type="dxa"/>
+              <w:bottom w:w="85" w:type="dxa"/>
+              <w:right w:w="85" w:type="dxa"/>
+            </w:tcMar>
+            <w:shd w:fill="FFFFFF"/>
+          </w:tcPr>
+          <w:p>
+            <w:pPr>
+              <w:spacing w:after="20" w:before="20" w:line="240" w:lineRule="auto"/>
+            </w:pPr>
+            <w:r>
+              <w:rPr>
+                <w:b w:val="0"/>
+                <w:color w:val="000000"/>
+                <w:sz w:val="18"/>
+              </w:rPr>
+              <w:t>Clear Filter resets selections. October 1–7 custom range displays correctly. Zero-session list.</w:t>
+            </w:r>
+          </w:p>
+        </w:tc>
+      </w:tr>
     </w:tbl>
     <w:p>
       <w:r>
@@ -5533,7 +5999,7 @@
         <w:pStyle w:val="Heading1"/>
       </w:pPr>
       <w:r>
-        <w:t>Verified control and inventory checks</w:t>
+        <w:t>Verified setup and control checks</w:t>
       </w:r>
     </w:p>
     <w:tbl>
@@ -5665,7 +6131,7 @@
                 <w:color w:val="000000"/>
                 <w:sz w:val="18"/>
               </w:rPr>
-              <w:t>U08 Empty list filter persistence</w:t>
+              <w:t>U10 Pre-install cancellation</w:t>
             </w:r>
           </w:p>
         </w:tc>
@@ -5691,7 +6157,7 @@
                 <w:color w:val="000000"/>
                 <w:sz w:val="18"/>
               </w:rPr>
-              <w:t>03:56–03:58</w:t>
+              <w:t>03:59–04:00</w:t>
             </w:r>
           </w:p>
         </w:tc>
@@ -5717,7 +6183,7 @@
                 <w:color w:val="000000"/>
                 <w:sz w:val="18"/>
               </w:rPr>
-              <w:t>Search/status/owner controls were exercised; status/owner persist on reload. No populated-result correctness.</w:t>
+              <w:t>Official/custom setup canceled; reload remains Not Connected. No App grant.</w:t>
             </w:r>
           </w:p>
         </w:tc>
@@ -5748,7 +6214,7 @@
                 <w:color w:val="000000"/>
                 <w:sz w:val="18"/>
               </w:rPr>
-              <w:t>U09 Clear Filter and custom dates</w:t>
+              <w:t>U11 Final session inventory</w:t>
             </w:r>
           </w:p>
         </w:tc>
@@ -5774,7 +6240,7 @@
                 <w:color w:val="000000"/>
                 <w:sz w:val="18"/>
               </w:rPr>
-              <w:t>03:56–03:58</w:t>
+              <w:t>04:12</w:t>
             </w:r>
           </w:p>
         </w:tc>
@@ -5800,7 +6266,7 @@
                 <w:color w:val="000000"/>
                 <w:sz w:val="18"/>
               </w:rPr>
-              <w:t>Clear Filter resets selections. October 1–7 custom range displays correctly. Zero-session list.</w:t>
+              <w:t>All 0 / Active 0 / Inactive 0; filters cleared. Live accessibility observation after video stopped.</w:t>
             </w:r>
           </w:p>
         </w:tc>
@@ -5831,7 +6297,7 @@
                 <w:color w:val="000000"/>
                 <w:sz w:val="18"/>
               </w:rPr>
-              <w:t>U10 Pre-install cancellation</w:t>
+              <w:t>U12 Python command controls</w:t>
             </w:r>
           </w:p>
         </w:tc>
@@ -5857,7 +6323,7 @@
                 <w:color w:val="000000"/>
                 <w:sz w:val="18"/>
               </w:rPr>
-              <w:t>03:59–04:00</w:t>
+              <w:t>02:31:35; 03:19:52</w:t>
             </w:r>
           </w:p>
         </w:tc>
@@ -5883,7 +6349,7 @@
                 <w:color w:val="000000"/>
                 <w:sz w:val="18"/>
               </w:rPr>
-              <w:t>Official/custom setup canceled; reload remains Not Connected. No App grant.</w:t>
+              <w:t>Invalid module command exits 1; script and suffix-free module alternatives exit 0. Local-only, not Datadog capture.</w:t>
             </w:r>
           </w:p>
         </w:tc>
@@ -5914,7 +6380,7 @@
                 <w:color w:val="000000"/>
                 <w:sz w:val="18"/>
               </w:rPr>
-              <w:t>U11 Final session inventory</w:t>
+              <w:t>U13 Published finding images</w:t>
             </w:r>
           </w:p>
         </w:tc>
@@ -5940,7 +6406,7 @@
                 <w:color w:val="000000"/>
                 <w:sz w:val="18"/>
               </w:rPr>
-              <w:t>04:12</w:t>
+              <w:t>Verified by 03:59</w:t>
             </w:r>
           </w:p>
         </w:tc>
@@ -5966,7 +6432,7 @@
                 <w:color w:val="000000"/>
                 <w:sz w:val="18"/>
               </w:rPr>
-              <w:t>All 0 / Active 0 / Inactive 0; filters cleared. Live accessibility observation after video stopped.</w:t>
+              <w:t>All four finding pages rendered their inline annotated image; the UX02 original-image link opened. Publication QA, not Datadog behavior.</w:t>
             </w:r>
           </w:p>
         </w:tc>
@@ -5997,7 +6463,7 @@
                 <w:color w:val="000000"/>
                 <w:sz w:val="18"/>
               </w:rPr>
-              <w:t>U12 Python command controls</w:t>
+              <w:t>U14 Temporary helper shutdown</w:t>
             </w:r>
           </w:p>
         </w:tc>
@@ -6023,7 +6489,7 @@
                 <w:color w:val="000000"/>
                 <w:sz w:val="18"/>
               </w:rPr>
-              <w:t>02:31:35; 03:19:52</w:t>
+              <w:t>04:22:42</w:t>
             </w:r>
           </w:p>
         </w:tc>
@@ -6049,7 +6515,7 @@
                 <w:color w:val="000000"/>
                 <w:sz w:val="18"/>
               </w:rPr>
-              <w:t>Invalid module command exits 1; script and suffix-free module alternatives exit 0. Local-only, not Datadog capture.</w:t>
+              <w:t>Two completed local setup helpers stopped; each shows zero remaining owned processes. Private configuration retained without inspection.</w:t>
             </w:r>
           </w:p>
         </w:tc>
@@ -6080,7 +6546,7 @@
                 <w:color w:val="000000"/>
                 <w:sz w:val="18"/>
               </w:rPr>
-              <w:t>U13 Published finding images</w:t>
+              <w:t>U15 Service discovery</w:t>
             </w:r>
           </w:p>
         </w:tc>
@@ -6106,7 +6572,7 @@
                 <w:color w:val="000000"/>
                 <w:sz w:val="18"/>
               </w:rPr>
-              <w:t>Verified by 03:59</w:t>
+              <w:t>04:50:17</w:t>
             </w:r>
           </w:p>
         </w:tc>
@@ -6132,7 +6598,7 @@
                 <w:color w:val="000000"/>
                 <w:sz w:val="18"/>
               </w:rPr>
-              <w:t>All four finding pages rendered their inline annotated image; the UX02 original-image link opened. Publication QA, not Datadog behavior.</w:t>
+              <w:t>The synthetic sample became selectable; only wildcard environment was offered. No session or capture.</w:t>
             </w:r>
           </w:p>
         </w:tc>
@@ -6163,7 +6629,7 @@
                 <w:color w:val="000000"/>
                 <w:sz w:val="18"/>
               </w:rPr>
-              <w:t>U14 Temporary helper shutdown</w:t>
+              <w:t>U16 Runtime prerequisite snapshots</w:t>
             </w:r>
           </w:p>
         </w:tc>
@@ -6189,7 +6655,7 @@
                 <w:color w:val="000000"/>
                 <w:sz w:val="18"/>
               </w:rPr>
-              <w:t>04:22:42</w:t>
+              <w:t>04:47:03; 04:54:47</w:t>
             </w:r>
           </w:p>
         </w:tc>
@@ -6215,7 +6681,173 @@
                 <w:color w:val="000000"/>
                 <w:sz w:val="18"/>
               </w:rPr>
-              <w:t>Two completed local setup helpers stopped; each shows zero remaining owned processes. Private configuration retained without inspection.</w:t>
+              <w:t>Agent/trace/SDK readiness and RC enabled/key-authorized were verified at these instants; later scope stop means this is not current liveness.</w:t>
+            </w:r>
+          </w:p>
+        </w:tc>
+      </w:tr>
+      <w:tr>
+        <w:trPr>
+          <w:cantSplit/>
+        </w:trPr>
+        <w:tc>
+          <w:tcPr>
+            <w:tcW w:type="dxa" w:w="2448"/>
+            <w:vAlign w:val="center"/>
+            <w:tcMar>
+              <w:top w:w="85" w:type="dxa"/>
+              <w:left w:w="85" w:type="dxa"/>
+              <w:bottom w:w="85" w:type="dxa"/>
+              <w:right w:w="85" w:type="dxa"/>
+            </w:tcMar>
+            <w:shd w:fill="F3F5F7"/>
+          </w:tcPr>
+          <w:p>
+            <w:pPr>
+              <w:spacing w:after="20" w:before="20" w:line="240" w:lineRule="auto"/>
+            </w:pPr>
+            <w:r>
+              <w:rPr>
+                <w:b w:val="0"/>
+                <w:color w:val="000000"/>
+                <w:sz w:val="18"/>
+              </w:rPr>
+              <w:t>U17 A-only installed scope</w:t>
+            </w:r>
+          </w:p>
+        </w:tc>
+        <w:tc>
+          <w:tcPr>
+            <w:tcW w:type="dxa" w:w="1440"/>
+            <w:vAlign w:val="center"/>
+            <w:tcMar>
+              <w:top w:w="85" w:type="dxa"/>
+              <w:left w:w="85" w:type="dxa"/>
+              <w:bottom w:w="85" w:type="dxa"/>
+              <w:right w:w="85" w:type="dxa"/>
+            </w:tcMar>
+            <w:shd w:fill="F3F5F7"/>
+          </w:tcPr>
+          <w:p>
+            <w:pPr>
+              <w:spacing w:after="20" w:before="20" w:line="240" w:lineRule="auto"/>
+            </w:pPr>
+            <w:r>
+              <w:rPr>
+                <w:b w:val="0"/>
+                <w:color w:val="000000"/>
+                <w:sz w:val="18"/>
+              </w:rPr>
+              <w:t>04:51:29; 05:06:05</w:t>
+            </w:r>
+          </w:p>
+        </w:tc>
+        <w:tc>
+          <w:tcPr>
+            <w:tcW w:type="dxa" w:w="6336"/>
+            <w:vAlign w:val="center"/>
+            <w:tcMar>
+              <w:top w:w="85" w:type="dxa"/>
+              <w:left w:w="85" w:type="dxa"/>
+              <w:bottom w:w="85" w:type="dxa"/>
+              <w:right w:w="85" w:type="dxa"/>
+            </w:tcMar>
+            <w:shd w:fill="F3F5F7"/>
+          </w:tcPr>
+          <w:p>
+            <w:pPr>
+              <w:spacing w:after="20" w:before="20" w:line="240" w:lineRule="auto"/>
+            </w:pPr>
+            <w:r>
+              <w:rPr>
+                <w:b w:val="0"/>
+                <w:color w:val="000000"/>
+                <w:sz w:val="18"/>
+              </w:rPr>
+              <w:t>GitHub installation plus persisted one-repository selection verified, identified privately as A. B created afterward remains ungranted. Datadog association failed.</w:t>
+            </w:r>
+          </w:p>
+        </w:tc>
+      </w:tr>
+      <w:tr>
+        <w:trPr>
+          <w:cantSplit/>
+        </w:trPr>
+        <w:tc>
+          <w:tcPr>
+            <w:tcW w:type="dxa" w:w="2448"/>
+            <w:vAlign w:val="center"/>
+            <w:tcMar>
+              <w:top w:w="85" w:type="dxa"/>
+              <w:left w:w="85" w:type="dxa"/>
+              <w:bottom w:w="85" w:type="dxa"/>
+              <w:right w:w="85" w:type="dxa"/>
+            </w:tcMar>
+            <w:shd w:fill="FFFFFF"/>
+          </w:tcPr>
+          <w:p>
+            <w:pPr>
+              <w:spacing w:after="20" w:before="20" w:line="240" w:lineRule="auto"/>
+            </w:pPr>
+            <w:r>
+              <w:rPr>
+                <w:b w:val="0"/>
+                <w:color w:val="000000"/>
+                <w:sz w:val="18"/>
+              </w:rPr>
+              <w:t>U18 Wildcard setup warning</w:t>
+            </w:r>
+          </w:p>
+        </w:tc>
+        <w:tc>
+          <w:tcPr>
+            <w:tcW w:type="dxa" w:w="1440"/>
+            <w:vAlign w:val="center"/>
+            <w:tcMar>
+              <w:top w:w="85" w:type="dxa"/>
+              <w:left w:w="85" w:type="dxa"/>
+              <w:bottom w:w="85" w:type="dxa"/>
+              <w:right w:w="85" w:type="dxa"/>
+            </w:tcMar>
+            <w:shd w:fill="FFFFFF"/>
+          </w:tcPr>
+          <w:p>
+            <w:pPr>
+              <w:spacing w:after="20" w:before="20" w:line="240" w:lineRule="auto"/>
+            </w:pPr>
+            <w:r>
+              <w:rPr>
+                <w:b w:val="0"/>
+                <w:color w:val="000000"/>
+                <w:sz w:val="18"/>
+              </w:rPr>
+              <w:t>04:53:17</w:t>
+            </w:r>
+          </w:p>
+        </w:tc>
+        <w:tc>
+          <w:tcPr>
+            <w:tcW w:type="dxa" w:w="6336"/>
+            <w:vAlign w:val="center"/>
+            <w:tcMar>
+              <w:top w:w="85" w:type="dxa"/>
+              <w:left w:w="85" w:type="dxa"/>
+              <w:bottom w:w="85" w:type="dxa"/>
+              <w:right w:w="85" w:type="dxa"/>
+            </w:tcMar>
+            <w:shd w:fill="FFFFFF"/>
+          </w:tcPr>
+          <w:p>
+            <w:pPr>
+              <w:spacing w:after="20" w:before="20" w:line="240" w:lineRule="auto"/>
+            </w:pPr>
+            <w:r>
+              <w:rPr>
+                <w:b w:val="0"/>
+                <w:color w:val="000000"/>
+                <w:sz w:val="18"/>
+              </w:rPr>
+              <w:t>Manual draft explains all-environment creation will not auto-enable the service and offers Configuration or a specific environment.</w:t>
             </w:r>
           </w:p>
         </w:tc>
@@ -6229,7 +6861,721 @@
       </w:r>
     </w:p>
     <w:p>
-      <w:hyperlink r:id="rId23">
+      <w:r>
+        <w:br w:type="page"/>
+      </w:r>
+    </w:p>
+    <w:p>
+      <w:r>
+        <w:rPr>
+          <w:b w:val="0"/>
+          <w:sz w:val="18"/>
+        </w:rPr>
+        <w:t>SUPPLEMENTAL RESULTS</w:t>
+      </w:r>
+    </w:p>
+    <w:p>
+      <w:pPr>
+        <w:pStyle w:val="Heading1"/>
+      </w:pPr>
+      <w:r>
+        <w:t>Verified setup and control checks</w:t>
+      </w:r>
+    </w:p>
+    <w:tbl>
+      <w:tblPr>
+        <w:tblW w:type="auto" w:w="0"/>
+        <w:jc w:val="center"/>
+        <w:tblLayout w:type="fixed"/>
+        <w:tblLook w:firstColumn="1" w:firstRow="1" w:lastColumn="0" w:lastRow="0" w:noHBand="0" w:noVBand="1" w:val="04A0"/>
+        <w:tblBorders>
+          <w:top w:val="single" w:sz="4" w:color="D9D9D9"/>
+          <w:left w:val="single" w:sz="4" w:color="D9D9D9"/>
+          <w:bottom w:val="single" w:sz="4" w:color="D9D9D9"/>
+          <w:right w:val="single" w:sz="4" w:color="D9D9D9"/>
+          <w:insideH w:val="single" w:sz="4" w:color="D9D9D9"/>
+          <w:insideV w:val="single" w:sz="4" w:color="D9D9D9"/>
+        </w:tblBorders>
+      </w:tblPr>
+      <w:tblGrid>
+        <w:gridCol w:w="2448"/>
+        <w:gridCol w:w="1440"/>
+        <w:gridCol w:w="6336"/>
+      </w:tblGrid>
+      <w:tr>
+        <w:trPr>
+          <w:tblHeader/>
+        </w:trPr>
+        <w:tc>
+          <w:tcPr>
+            <w:tcW w:type="dxa" w:w="2448"/>
+            <w:vAlign w:val="center"/>
+            <w:tcMar>
+              <w:top w:w="85" w:type="dxa"/>
+              <w:left w:w="85" w:type="dxa"/>
+              <w:bottom w:w="85" w:type="dxa"/>
+              <w:right w:w="85" w:type="dxa"/>
+            </w:tcMar>
+            <w:shd w:fill="24384B"/>
+          </w:tcPr>
+          <w:p>
+            <w:pPr>
+              <w:spacing w:after="20" w:before="20" w:line="240" w:lineRule="auto"/>
+            </w:pPr>
+            <w:r>
+              <w:rPr>
+                <w:b/>
+                <w:color w:val="FFFFFF"/>
+                <w:sz w:val="18"/>
+              </w:rPr>
+              <w:t>Check</w:t>
+            </w:r>
+          </w:p>
+        </w:tc>
+        <w:tc>
+          <w:tcPr>
+            <w:tcW w:type="dxa" w:w="1440"/>
+            <w:vAlign w:val="center"/>
+            <w:tcMar>
+              <w:top w:w="85" w:type="dxa"/>
+              <w:left w:w="85" w:type="dxa"/>
+              <w:bottom w:w="85" w:type="dxa"/>
+              <w:right w:w="85" w:type="dxa"/>
+            </w:tcMar>
+            <w:shd w:fill="24384B"/>
+          </w:tcPr>
+          <w:p>
+            <w:pPr>
+              <w:spacing w:after="20" w:before="20" w:line="240" w:lineRule="auto"/>
+            </w:pPr>
+            <w:r>
+              <w:rPr>
+                <w:b/>
+                <w:color w:val="FFFFFF"/>
+                <w:sz w:val="18"/>
+              </w:rPr>
+              <w:t>UTC</w:t>
+            </w:r>
+          </w:p>
+        </w:tc>
+        <w:tc>
+          <w:tcPr>
+            <w:tcW w:type="dxa" w:w="6336"/>
+            <w:vAlign w:val="center"/>
+            <w:tcMar>
+              <w:top w:w="85" w:type="dxa"/>
+              <w:left w:w="85" w:type="dxa"/>
+              <w:bottom w:w="85" w:type="dxa"/>
+              <w:right w:w="85" w:type="dxa"/>
+            </w:tcMar>
+            <w:shd w:fill="24384B"/>
+          </w:tcPr>
+          <w:p>
+            <w:pPr>
+              <w:spacing w:after="20" w:before="20" w:line="240" w:lineRule="auto"/>
+            </w:pPr>
+            <w:r>
+              <w:rPr>
+                <w:b/>
+                <w:color w:val="FFFFFF"/>
+                <w:sz w:val="18"/>
+              </w:rPr>
+              <w:t>Verified scope</w:t>
+            </w:r>
+          </w:p>
+        </w:tc>
+      </w:tr>
+      <w:tr>
+        <w:trPr>
+          <w:cantSplit/>
+        </w:trPr>
+        <w:tc>
+          <w:tcPr>
+            <w:tcW w:type="dxa" w:w="2448"/>
+            <w:vAlign w:val="center"/>
+            <w:tcMar>
+              <w:top w:w="85" w:type="dxa"/>
+              <w:left w:w="85" w:type="dxa"/>
+              <w:bottom w:w="85" w:type="dxa"/>
+              <w:right w:w="85" w:type="dxa"/>
+            </w:tcMar>
+            <w:shd w:fill="FFFFFF"/>
+          </w:tcPr>
+          <w:p>
+            <w:pPr>
+              <w:spacing w:after="20" w:before="20" w:line="240" w:lineRule="auto"/>
+            </w:pPr>
+            <w:r>
+              <w:rPr>
+                <w:b w:val="0"/>
+                <w:color w:val="000000"/>
+                <w:sz w:val="18"/>
+              </w:rPr>
+              <w:t>U19 Invalid line draft controls</w:t>
+            </w:r>
+          </w:p>
+        </w:tc>
+        <w:tc>
+          <w:tcPr>
+            <w:tcW w:type="dxa" w:w="1440"/>
+            <w:vAlign w:val="center"/>
+            <w:tcMar>
+              <w:top w:w="85" w:type="dxa"/>
+              <w:left w:w="85" w:type="dxa"/>
+              <w:bottom w:w="85" w:type="dxa"/>
+              <w:right w:w="85" w:type="dxa"/>
+            </w:tcMar>
+            <w:shd w:fill="FFFFFF"/>
+          </w:tcPr>
+          <w:p>
+            <w:pPr>
+              <w:spacing w:after="20" w:before="20" w:line="240" w:lineRule="auto"/>
+            </w:pPr>
+            <w:r>
+              <w:rPr>
+                <w:b w:val="0"/>
+                <w:color w:val="000000"/>
+                <w:sz w:val="18"/>
+              </w:rPr>
+              <w:t>04:54–04:55</w:t>
+            </w:r>
+          </w:p>
+        </w:tc>
+        <w:tc>
+          <w:tcPr>
+            <w:tcW w:type="dxa" w:w="6336"/>
+            <w:vAlign w:val="center"/>
+            <w:tcMar>
+              <w:top w:w="85" w:type="dxa"/>
+              <w:left w:w="85" w:type="dxa"/>
+              <w:bottom w:w="85" w:type="dxa"/>
+              <w:right w:w="85" w:type="dxa"/>
+            </w:tcMar>
+            <w:shd w:fill="FFFFFF"/>
+          </w:tcPr>
+          <w:p>
+            <w:pPr>
+              <w:spacing w:after="20" w:before="20" w:line="240" w:lineRule="auto"/>
+            </w:pPr>
+            <w:r>
+              <w:rPr>
+                <w:b w:val="0"/>
+                <w:color w:val="000000"/>
+                <w:sz w:val="18"/>
+              </w:rPr>
+              <w:t>Line 0, -1 and abc kept Start disabled; 9999 enabled an unsubmitted draft and 17 restored the baseline. No runtime target validation.</w:t>
+            </w:r>
+          </w:p>
+        </w:tc>
+      </w:tr>
+      <w:tr>
+        <w:trPr>
+          <w:cantSplit/>
+        </w:trPr>
+        <w:tc>
+          <w:tcPr>
+            <w:tcW w:type="dxa" w:w="2448"/>
+            <w:vAlign w:val="center"/>
+            <w:tcMar>
+              <w:top w:w="85" w:type="dxa"/>
+              <w:left w:w="85" w:type="dxa"/>
+              <w:bottom w:w="85" w:type="dxa"/>
+              <w:right w:w="85" w:type="dxa"/>
+            </w:tcMar>
+            <w:shd w:fill="F3F5F7"/>
+          </w:tcPr>
+          <w:p>
+            <w:pPr>
+              <w:spacing w:after="20" w:before="20" w:line="240" w:lineRule="auto"/>
+            </w:pPr>
+            <w:r>
+              <w:rPr>
+                <w:b w:val="0"/>
+                <w:color w:val="000000"/>
+                <w:sz w:val="18"/>
+              </w:rPr>
+              <w:t>U20 Source guidance</w:t>
+            </w:r>
+          </w:p>
+        </w:tc>
+        <w:tc>
+          <w:tcPr>
+            <w:tcW w:type="dxa" w:w="1440"/>
+            <w:vAlign w:val="center"/>
+            <w:tcMar>
+              <w:top w:w="85" w:type="dxa"/>
+              <w:left w:w="85" w:type="dxa"/>
+              <w:bottom w:w="85" w:type="dxa"/>
+              <w:right w:w="85" w:type="dxa"/>
+            </w:tcMar>
+            <w:shd w:fill="F3F5F7"/>
+          </w:tcPr>
+          <w:p>
+            <w:pPr>
+              <w:spacing w:after="20" w:before="20" w:line="240" w:lineRule="auto"/>
+            </w:pPr>
+            <w:r>
+              <w:rPr>
+                <w:b w:val="0"/>
+                <w:color w:val="000000"/>
+                <w:sz w:val="18"/>
+              </w:rPr>
+              <w:t>04:55:34</w:t>
+            </w:r>
+          </w:p>
+        </w:tc>
+        <w:tc>
+          <w:tcPr>
+            <w:tcW w:type="dxa" w:w="6336"/>
+            <w:vAlign w:val="center"/>
+            <w:tcMar>
+              <w:top w:w="85" w:type="dxa"/>
+              <w:left w:w="85" w:type="dxa"/>
+              <w:bottom w:w="85" w:type="dxa"/>
+              <w:right w:w="85" w:type="dxa"/>
+            </w:tcMar>
+            <w:shd w:fill="F3F5F7"/>
+          </w:tcPr>
+          <w:p>
+            <w:pPr>
+              <w:spacing w:after="20" w:before="20" w:line="240" w:lineRule="auto"/>
+            </w:pPr>
+            <w:r>
+              <w:rPr>
+                <w:b w:val="0"/>
+                <w:color w:val="000000"/>
+                <w:sz w:val="18"/>
+              </w:rPr>
+              <w:t>Missing-source explanation identifies permissions or tags as possible causes and links Learn More; it does not claim fetched source.</w:t>
+            </w:r>
+          </w:p>
+        </w:tc>
+      </w:tr>
+      <w:tr>
+        <w:trPr>
+          <w:cantSplit/>
+        </w:trPr>
+        <w:tc>
+          <w:tcPr>
+            <w:tcW w:type="dxa" w:w="2448"/>
+            <w:vAlign w:val="center"/>
+            <w:tcMar>
+              <w:top w:w="85" w:type="dxa"/>
+              <w:left w:w="85" w:type="dxa"/>
+              <w:bottom w:w="85" w:type="dxa"/>
+              <w:right w:w="85" w:type="dxa"/>
+            </w:tcMar>
+            <w:shd w:fill="FFFFFF"/>
+          </w:tcPr>
+          <w:p>
+            <w:pPr>
+              <w:spacing w:after="20" w:before="20" w:line="240" w:lineRule="auto"/>
+            </w:pPr>
+            <w:r>
+              <w:rPr>
+                <w:b w:val="0"/>
+                <w:color w:val="000000"/>
+                <w:sz w:val="18"/>
+              </w:rPr>
+              <w:t>U21 Template rejection and recovery</w:t>
+            </w:r>
+          </w:p>
+        </w:tc>
+        <w:tc>
+          <w:tcPr>
+            <w:tcW w:type="dxa" w:w="1440"/>
+            <w:vAlign w:val="center"/>
+            <w:tcMar>
+              <w:top w:w="85" w:type="dxa"/>
+              <w:left w:w="85" w:type="dxa"/>
+              <w:bottom w:w="85" w:type="dxa"/>
+              <w:right w:w="85" w:type="dxa"/>
+            </w:tcMar>
+            <w:shd w:fill="FFFFFF"/>
+          </w:tcPr>
+          <w:p>
+            <w:pPr>
+              <w:spacing w:after="20" w:before="20" w:line="240" w:lineRule="auto"/>
+            </w:pPr>
+            <w:r>
+              <w:rPr>
+                <w:b w:val="0"/>
+                <w:color w:val="000000"/>
+                <w:sz w:val="18"/>
+              </w:rPr>
+              <w:t>05:06:52–05:38:08</w:t>
+            </w:r>
+          </w:p>
+        </w:tc>
+        <w:tc>
+          <w:tcPr>
+            <w:tcW w:type="dxa" w:w="6336"/>
+            <w:vAlign w:val="center"/>
+            <w:tcMar>
+              <w:top w:w="85" w:type="dxa"/>
+              <w:left w:w="85" w:type="dxa"/>
+              <w:bottom w:w="85" w:type="dxa"/>
+              <w:right w:w="85" w:type="dxa"/>
+            </w:tcMar>
+            <w:shd w:fill="FFFFFF"/>
+          </w:tcPr>
+          <w:p>
+            <w:pPr>
+              <w:spacing w:after="20" w:before="20" w:line="240" w:lineRule="auto"/>
+            </w:pPr>
+            <w:r>
+              <w:rPr>
+                <w:b w:val="0"/>
+                <w:color w:val="000000"/>
+                <w:sz w:val="18"/>
+              </w:rPr>
+              <w:t>An actual unmatched brace disabled Start; blur added a red field outline. Correcting the brace enabled Start. Initial auto-balanced attempt excluded.</w:t>
+            </w:r>
+          </w:p>
+        </w:tc>
+      </w:tr>
+      <w:tr>
+        <w:trPr>
+          <w:cantSplit/>
+        </w:trPr>
+        <w:tc>
+          <w:tcPr>
+            <w:tcW w:type="dxa" w:w="2448"/>
+            <w:vAlign w:val="center"/>
+            <w:tcMar>
+              <w:top w:w="85" w:type="dxa"/>
+              <w:left w:w="85" w:type="dxa"/>
+              <w:bottom w:w="85" w:type="dxa"/>
+              <w:right w:w="85" w:type="dxa"/>
+            </w:tcMar>
+            <w:shd w:fill="F3F5F7"/>
+          </w:tcPr>
+          <w:p>
+            <w:pPr>
+              <w:spacing w:after="20" w:before="20" w:line="240" w:lineRule="auto"/>
+            </w:pPr>
+            <w:r>
+              <w:rPr>
+                <w:b w:val="0"/>
+                <w:color w:val="000000"/>
+                <w:sz w:val="18"/>
+              </w:rPr>
+              <w:t>U22 Fixture file integrity</w:t>
+            </w:r>
+          </w:p>
+        </w:tc>
+        <w:tc>
+          <w:tcPr>
+            <w:tcW w:type="dxa" w:w="1440"/>
+            <w:vAlign w:val="center"/>
+            <w:tcMar>
+              <w:top w:w="85" w:type="dxa"/>
+              <w:left w:w="85" w:type="dxa"/>
+              <w:bottom w:w="85" w:type="dxa"/>
+              <w:right w:w="85" w:type="dxa"/>
+            </w:tcMar>
+            <w:shd w:fill="F3F5F7"/>
+          </w:tcPr>
+          <w:p>
+            <w:pPr>
+              <w:spacing w:after="20" w:before="20" w:line="240" w:lineRule="auto"/>
+            </w:pPr>
+            <w:r>
+              <w:rPr>
+                <w:b w:val="0"/>
+                <w:color w:val="000000"/>
+                <w:sz w:val="18"/>
+              </w:rPr>
+              <w:t>By 05:10</w:t>
+            </w:r>
+          </w:p>
+        </w:tc>
+        <w:tc>
+          <w:tcPr>
+            <w:tcW w:type="dxa" w:w="6336"/>
+            <w:vAlign w:val="center"/>
+            <w:tcMar>
+              <w:top w:w="85" w:type="dxa"/>
+              <w:left w:w="85" w:type="dxa"/>
+              <w:bottom w:w="85" w:type="dxa"/>
+              <w:right w:w="85" w:type="dxa"/>
+            </w:tcMar>
+            <w:shd w:fill="F3F5F7"/>
+          </w:tcPr>
+          <w:p>
+            <w:pPr>
+              <w:spacing w:after="20" w:before="20" w:line="240" w:lineRule="auto"/>
+            </w:pPr>
+            <w:r>
+              <w:rPr>
+                <w:b w:val="0"/>
+                <w:color w:val="000000"/>
+                <w:sz w:val="18"/>
+              </w:rPr>
+              <w:t>Downloaded A pricing.py and app.py match the local baseline byte-for-byte; intended return target remains line 17. This is not Datadog source mapping.</w:t>
+            </w:r>
+          </w:p>
+        </w:tc>
+      </w:tr>
+      <w:tr>
+        <w:trPr>
+          <w:cantSplit/>
+        </w:trPr>
+        <w:tc>
+          <w:tcPr>
+            <w:tcW w:type="dxa" w:w="2448"/>
+            <w:vAlign w:val="center"/>
+            <w:tcMar>
+              <w:top w:w="85" w:type="dxa"/>
+              <w:left w:w="85" w:type="dxa"/>
+              <w:bottom w:w="85" w:type="dxa"/>
+              <w:right w:w="85" w:type="dxa"/>
+            </w:tcMar>
+            <w:shd w:fill="FFFFFF"/>
+          </w:tcPr>
+          <w:p>
+            <w:pPr>
+              <w:spacing w:after="20" w:before="20" w:line="240" w:lineRule="auto"/>
+            </w:pPr>
+            <w:r>
+              <w:rPr>
+                <w:b w:val="0"/>
+                <w:color w:val="000000"/>
+                <w:sz w:val="18"/>
+              </w:rPr>
+              <w:t>U23 Python Function draft</w:t>
+            </w:r>
+          </w:p>
+        </w:tc>
+        <w:tc>
+          <w:tcPr>
+            <w:tcW w:type="dxa" w:w="1440"/>
+            <w:vAlign w:val="center"/>
+            <w:tcMar>
+              <w:top w:w="85" w:type="dxa"/>
+              <w:left w:w="85" w:type="dxa"/>
+              <w:bottom w:w="85" w:type="dxa"/>
+              <w:right w:w="85" w:type="dxa"/>
+            </w:tcMar>
+            <w:shd w:fill="FFFFFF"/>
+          </w:tcPr>
+          <w:p>
+            <w:pPr>
+              <w:spacing w:after="20" w:before="20" w:line="240" w:lineRule="auto"/>
+            </w:pPr>
+            <w:r>
+              <w:rPr>
+                <w:b w:val="0"/>
+                <w:color w:val="000000"/>
+                <w:sz w:val="18"/>
+              </w:rPr>
+              <w:t>05:39:50</w:t>
+            </w:r>
+          </w:p>
+        </w:tc>
+        <w:tc>
+          <w:tcPr>
+            <w:tcW w:type="dxa" w:w="6336"/>
+            <w:vAlign w:val="center"/>
+            <w:tcMar>
+              <w:top w:w="85" w:type="dxa"/>
+              <w:left w:w="85" w:type="dxa"/>
+              <w:bottom w:w="85" w:type="dxa"/>
+              <w:right w:w="85" w:type="dxa"/>
+            </w:tcMar>
+            <w:shd w:fill="FFFFFF"/>
+          </w:tcPr>
+          <w:p>
+            <w:pPr>
+              <w:spacing w:after="20" w:before="20" w:line="240" w:lineRule="auto"/>
+            </w:pPr>
+            <w:r>
+              <w:rPr>
+                <w:b w:val="0"/>
+                <w:color w:val="000000"/>
+                <w:sz w:val="18"/>
+              </w:rPr>
+              <w:t>Function mode accepts Module pricing and Function calculate_quote as an enabled draft. No submit or entry/exit capture.</w:t>
+            </w:r>
+          </w:p>
+        </w:tc>
+      </w:tr>
+      <w:tr>
+        <w:trPr>
+          <w:cantSplit/>
+        </w:trPr>
+        <w:tc>
+          <w:tcPr>
+            <w:tcW w:type="dxa" w:w="2448"/>
+            <w:vAlign w:val="center"/>
+            <w:tcMar>
+              <w:top w:w="85" w:type="dxa"/>
+              <w:left w:w="85" w:type="dxa"/>
+              <w:bottom w:w="85" w:type="dxa"/>
+              <w:right w:w="85" w:type="dxa"/>
+            </w:tcMar>
+            <w:shd w:fill="F3F5F7"/>
+          </w:tcPr>
+          <w:p>
+            <w:pPr>
+              <w:spacing w:after="20" w:before="20" w:line="240" w:lineRule="auto"/>
+            </w:pPr>
+            <w:r>
+              <w:rPr>
+                <w:b w:val="0"/>
+                <w:color w:val="000000"/>
+                <w:sz w:val="18"/>
+              </w:rPr>
+              <w:t>U24 Edited draft cancellation</w:t>
+            </w:r>
+          </w:p>
+        </w:tc>
+        <w:tc>
+          <w:tcPr>
+            <w:tcW w:type="dxa" w:w="1440"/>
+            <w:vAlign w:val="center"/>
+            <w:tcMar>
+              <w:top w:w="85" w:type="dxa"/>
+              <w:left w:w="85" w:type="dxa"/>
+              <w:bottom w:w="85" w:type="dxa"/>
+              <w:right w:w="85" w:type="dxa"/>
+            </w:tcMar>
+            <w:shd w:fill="F3F5F7"/>
+          </w:tcPr>
+          <w:p>
+            <w:pPr>
+              <w:spacing w:after="20" w:before="20" w:line="240" w:lineRule="auto"/>
+            </w:pPr>
+            <w:r>
+              <w:rPr>
+                <w:b w:val="0"/>
+                <w:color w:val="000000"/>
+                <w:sz w:val="18"/>
+              </w:rPr>
+              <w:t>05:43</w:t>
+            </w:r>
+          </w:p>
+        </w:tc>
+        <w:tc>
+          <w:tcPr>
+            <w:tcW w:type="dxa" w:w="6336"/>
+            <w:vAlign w:val="center"/>
+            <w:tcMar>
+              <w:top w:w="85" w:type="dxa"/>
+              <w:left w:w="85" w:type="dxa"/>
+              <w:bottom w:w="85" w:type="dxa"/>
+              <w:right w:w="85" w:type="dxa"/>
+            </w:tcMar>
+            <w:shd w:fill="F3F5F7"/>
+          </w:tcPr>
+          <w:p>
+            <w:pPr>
+              <w:spacing w:after="20" w:before="20" w:line="240" w:lineRule="auto"/>
+            </w:pPr>
+            <w:r>
+              <w:rPr>
+                <w:b w:val="0"/>
+                <w:color w:val="000000"/>
+                <w:sz w:val="18"/>
+              </w:rPr>
+              <w:t>Closing and reopening resets to Line mode and empty File/Line, retaining service/environment. No unsaved draft was published; reopened draft closed.</w:t>
+            </w:r>
+          </w:p>
+        </w:tc>
+      </w:tr>
+      <w:tr>
+        <w:trPr>
+          <w:cantSplit/>
+        </w:trPr>
+        <w:tc>
+          <w:tcPr>
+            <w:tcW w:type="dxa" w:w="2448"/>
+            <w:vAlign w:val="center"/>
+            <w:tcMar>
+              <w:top w:w="85" w:type="dxa"/>
+              <w:left w:w="85" w:type="dxa"/>
+              <w:bottom w:w="85" w:type="dxa"/>
+              <w:right w:w="85" w:type="dxa"/>
+            </w:tcMar>
+            <w:shd w:fill="FFFFFF"/>
+          </w:tcPr>
+          <w:p>
+            <w:pPr>
+              <w:spacing w:after="20" w:before="20" w:line="240" w:lineRule="auto"/>
+            </w:pPr>
+            <w:r>
+              <w:rPr>
+                <w:b w:val="0"/>
+                <w:color w:val="000000"/>
+                <w:sz w:val="18"/>
+              </w:rPr>
+              <w:t>U25 Latest zero inventory</w:t>
+            </w:r>
+          </w:p>
+        </w:tc>
+        <w:tc>
+          <w:tcPr>
+            <w:tcW w:type="dxa" w:w="1440"/>
+            <w:vAlign w:val="center"/>
+            <w:tcMar>
+              <w:top w:w="85" w:type="dxa"/>
+              <w:left w:w="85" w:type="dxa"/>
+              <w:bottom w:w="85" w:type="dxa"/>
+              <w:right w:w="85" w:type="dxa"/>
+            </w:tcMar>
+            <w:shd w:fill="FFFFFF"/>
+          </w:tcPr>
+          <w:p>
+            <w:pPr>
+              <w:spacing w:after="20" w:before="20" w:line="240" w:lineRule="auto"/>
+            </w:pPr>
+            <w:r>
+              <w:rPr>
+                <w:b w:val="0"/>
+                <w:color w:val="000000"/>
+                <w:sz w:val="18"/>
+              </w:rPr>
+              <w:t>By 05:45</w:t>
+            </w:r>
+          </w:p>
+        </w:tc>
+        <w:tc>
+          <w:tcPr>
+            <w:tcW w:type="dxa" w:w="6336"/>
+            <w:vAlign w:val="center"/>
+            <w:tcMar>
+              <w:top w:w="85" w:type="dxa"/>
+              <w:left w:w="85" w:type="dxa"/>
+              <w:bottom w:w="85" w:type="dxa"/>
+              <w:right w:w="85" w:type="dxa"/>
+            </w:tcMar>
+            <w:shd w:fill="FFFFFF"/>
+          </w:tcPr>
+          <w:p>
+            <w:pPr>
+              <w:spacing w:after="20" w:before="20" w:line="240" w:lineRule="auto"/>
+            </w:pPr>
+            <w:r>
+              <w:rPr>
+                <w:b w:val="0"/>
+                <w:color w:val="000000"/>
+                <w:sz w:val="18"/>
+              </w:rPr>
+              <w:t>After rejected creates and draft cancellation, All 0 / Active 0 / Inactive 0 remained. A-only installation unchanged; active lifecycle semantics untested.</w:t>
+            </w:r>
+          </w:p>
+        </w:tc>
+      </w:tr>
+    </w:tbl>
+    <w:p>
+      <w:r>
+        <w:rPr>
+          <w:b w:val="0"/>
+        </w:rPr>
+      </w:r>
+    </w:p>
+    <w:p>
+      <w:hyperlink r:id="rId25">
         <w:r>
           <w:rPr>
             <w:color w:val="164F80"/>
@@ -6265,7 +7611,7 @@
         <w:rPr>
           <w:b w:val="0"/>
         </w:rPr>
-        <w:t>The synthetic runtime is stopped and no successful ingestion was proved. The official GitHub App installation remains unsubmitted. Earlier connection refusals and unready Remote Configuration checks were unresolved setup signals, not product defects. Telemetry approval is the current restart gate. Locator and recording failures belong to audit tooling.</w:t>
+        <w:t>Runtime readiness and Remote Configuration were verified briefly after approval. Runtime then stopped at an additional telemetry-destination boundary. GitHub installation and authorization are verified; Datadog association remains unconnected. No debugger capture was proved. Earlier RC eligibility was unknown, not verified misconfiguration.</w:t>
       </w:r>
     </w:p>
     <w:tbl>
@@ -6396,7 +7742,7 @@
                 <w:color w:val="000000"/>
                 <w:sz w:val="18"/>
               </w:rPr>
-              <w:t>Approval for the specific synthetic telemetry payload to Datadog US1; then healthy Agent/SDK, Remote Configuration, forwarding and a real first captured event.</w:t>
+              <w:t>Initial payload approved. Additional intake-destination boundary must be resolved, then continuous healthy runtime and a real captured event verified.</w:t>
             </w:r>
           </w:p>
         </w:tc>
@@ -6453,7 +7799,7 @@
                 <w:color w:val="000000"/>
                 <w:sz w:val="18"/>
               </w:rPr>
-              <w:t>Approval for the official GitHub App limited to A; exact deployed commit mapping. Private B is not created or granted.</w:t>
+              <w:t>A-only installation and user authorization verified; Datadog association must recover. B exists and remains ungranted. Exact source mapping unverified.</w:t>
             </w:r>
           </w:p>
         </w:tc>
@@ -6650,7 +7996,7 @@
         <w:rPr>
           <w:b w:val="0"/>
         </w:rPr>
-        <w:t>After the specific approvals, establish F01 with actual quantity 3 locals and verified service/environment/version. Start F11 using the shortest available expiry and observe its terminal state. Validate S02 exact deployed SHA and S03 A allowed with B never granted. Run the other prerequisite-matched cases, then reconcile created entities and retained settings with C01–C03.</w:t>
+        <w:t>After the current runtime boundary is resolved, establish F01 with actual quantity 3 locals and verified service/environment/version. Start F11 using the shortest available expiry and observe its terminal state. Validate S02 exact deployed SHA and S03 A allowed with B never granted. Run the other prerequisite-matched cases, then reconcile created entities and retained settings with C01–C03.</w:t>
       </w:r>
     </w:p>
     <w:p>
@@ -6666,7 +8012,7 @@
         <w:rPr>
           <w:b w:val="0"/>
         </w:rPr>
-        <w:t>Final product inventory at 04:12 UTC was All 0 / Active 0 / Inactive 0, with filters cleared. Agent/sample processes stopped by 03:39. Two temporary setup helpers stopped at 04:22:42, with zero remaining owned processes. Accounts, public audit repository and private A are intentionally retained. Private configuration was not inspected; C02 is not a full cleanup certification.</w:t>
+        <w:t>Two baseline attempts were rejected with visible error toasts with console HTTP 400; the fresh unfiltered list remained All 0 / Active 0 / Inactive 0. Edited and reopened drafts were closed by 05:45; no entities were created. Runtime is stopped after an additional-destination boundary. The approved A-only App installation, A/B repositories and accounts are retained. The old no-App-grant inventory is historical. Current full inventory/cleanup remains incomplete under C02.</w:t>
       </w:r>
     </w:p>
     <w:p>
@@ -6680,7 +8026,7 @@
           <w:b w:val="0"/>
           <w:sz w:val="18"/>
         </w:rPr>
-        <w:t>63 CASE CHECKPOINT  |  2 SCOPED PASS  |  2 FINDING  |  59 BLOCKED</w:t>
+        <w:t>63 CASE CHECKPOINT  |  2 SCOPED PASS  |  3 FINDING  |  58 BLOCKED</w:t>
       </w:r>
     </w:p>
     <w:p>
@@ -7213,7 +8559,7 @@
                 <w:color w:val="000000"/>
                 <w:sz w:val="18"/>
               </w:rPr>
-              <w:t>No two-target service/env/version values. Empty-list controls passed separately.</w:t>
+              <w:t>One service discovered, only wildcard environment available. Two-target dependencies and populated-result correctness untested.</w:t>
             </w:r>
           </w:p>
         </w:tc>
@@ -7545,7 +8891,7 @@
                 <w:color w:val="000000"/>
                 <w:sz w:val="18"/>
               </w:rPr>
-              <w:t>125% modal focus/Escape smoke passed; editor, long paths and validation unavailable.</w:t>
+              <w:t>125% modal focus/Escape passed. Later draft validation is separate; code-gutter, long-path and validation-accessibility coverage remains incomplete.</w:t>
             </w:r>
           </w:p>
         </w:tc>
@@ -7559,7 +8905,7 @@
       </w:r>
     </w:p>
     <w:p>
-      <w:hyperlink r:id="rId24">
+      <w:hyperlink r:id="rId26">
         <w:r>
           <w:rPr>
             <w:color w:val="164F80"/>
@@ -7579,7 +8925,7 @@
           <w:b w:val="0"/>
           <w:sz w:val="18"/>
         </w:rPr>
-        <w:t>63 CASE CHECKPOINT  |  2 SCOPED PASS  |  2 FINDING  |  59 BLOCKED</w:t>
+        <w:t>63 CASE CHECKPOINT  |  2 SCOPED PASS  |  3 FINDING  |  58 BLOCKED</w:t>
       </w:r>
     </w:p>
     <w:p>
@@ -7863,7 +9209,7 @@
                 <w:color w:val="000000"/>
                 <w:sz w:val="18"/>
               </w:rPr>
-              <w:t>G1 unavailable. Baseline capture at pricing.py line 17 with numeric locals and bounded quantity 2/3/4 traffic not run.</w:t>
+              <w:t>Numeric-template and plain-message submissions returned visible instrumentation-invalid errors and HTTP 400. All 0; enabled-target/runtime prerequisites unresolved.</w:t>
             </w:r>
           </w:p>
         </w:tc>
@@ -8112,7 +9458,7 @@
                 <w:color w:val="000000"/>
                 <w:sz w:val="18"/>
               </w:rPr>
-              <w:t>No selectable service, so expression/target fields were not reached. Locator failure occurred before input. Runtime portion also needs G1.</w:t>
+              <w:t>Unmatched template brace disables Start; correction enables it. Conditional-expression and runtime variants still need an enabled target/G1.</w:t>
             </w:r>
           </w:p>
         </w:tc>
@@ -8278,7 +9624,7 @@
                 <w:color w:val="000000"/>
                 <w:sz w:val="18"/>
               </w:rPr>
-              <w:t>No selectable service, so expression/target fields were not reached. Locator failure occurred before input. Runtime portion also needs G1.</w:t>
+              <w:t>0, -1 and abc disable Start; 9999 enables an unsubmitted draft. Runtime out-of-range, blank/comment and relocation tests need G1.</w:t>
             </w:r>
           </w:p>
         </w:tc>
@@ -8361,7 +9707,7 @@
                 <w:color w:val="000000"/>
                 <w:sz w:val="18"/>
               </w:rPr>
-              <w:t>G1 unavailable. Compare pricing.calculate_quote method entry/exit and line 17 context; no installed capture to inspect.</w:t>
+              <w:t>Python Module pricing / Function calculate_quote enables a draft. No submission; entry/exit, method context and line comparison remain untested.</w:t>
             </w:r>
           </w:p>
         </w:tc>
@@ -8458,7 +9804,7 @@
       </w:r>
     </w:p>
     <w:p>
-      <w:hyperlink r:id="rId24">
+      <w:hyperlink r:id="rId26">
         <w:r>
           <w:rPr>
             <w:color w:val="164F80"/>
@@ -8478,7 +9824,7 @@
           <w:b w:val="0"/>
           <w:sz w:val="18"/>
         </w:rPr>
-        <w:t>63 CASE CHECKPOINT  |  2 SCOPED PASS  |  2 FINDING  |  59 BLOCKED</w:t>
+        <w:t>63 CASE CHECKPOINT  |  2 SCOPED PASS  |  3 FINDING  |  58 BLOCKED</w:t>
       </w:r>
     </w:p>
     <w:p>
@@ -9094,7 +10440,7 @@
                 <w:color w:val="000000"/>
                 <w:sz w:val="18"/>
               </w:rPr>
-              <w:t>Empty-modal navigation/cancel/refresh passed; saved-state/editor variants need G1.</w:t>
+              <w:t>Empty-modal navigation and edited Function-draft cancellation/reopen reset verified. Saved-entity and runtime persistence remain untested.</w:t>
             </w:r>
           </w:p>
         </w:tc>
@@ -9357,7 +10703,7 @@
       </w:r>
     </w:p>
     <w:p>
-      <w:hyperlink r:id="rId24">
+      <w:hyperlink r:id="rId26">
         <w:r>
           <w:rPr>
             <w:color w:val="164F80"/>
@@ -9377,7 +10723,7 @@
           <w:b w:val="0"/>
           <w:sz w:val="18"/>
         </w:rPr>
-        <w:t>63 CASE CHECKPOINT  |  2 SCOPED PASS  |  2 FINDING  |  59 BLOCKED</w:t>
+        <w:t>63 CASE CHECKPOINT  |  2 SCOPED PASS  |  3 FINDING  |  58 BLOCKED</w:t>
       </w:r>
     </w:p>
     <w:p>
@@ -10076,7 +11422,7 @@
                 <w:color w:val="000000"/>
                 <w:sz w:val="18"/>
               </w:rPr>
-              <w:t>Pre-install permissions and cancel/reload only. Integration remains unconnected.</w:t>
+              <w:t>Original pre-install/cancel scope passes. Later GitHub grant is verified; Datadog association fails under S11.</w:t>
             </w:r>
           </w:p>
         </w:tc>
@@ -10242,7 +11588,7 @@
                 <w:color w:val="000000"/>
                 <w:sz w:val="18"/>
               </w:rPr>
-              <w:t>G2 unavailable. Record effective A-only grant.</w:t>
+              <w:t>A-only grant and ungranted private B are verified. A source retrieval and B-denied retrieval remain blocked until Datadog association/G2 works.</w:t>
             </w:r>
           </w:p>
         </w:tc>
@@ -10256,7 +11602,7 @@
       </w:r>
     </w:p>
     <w:p>
-      <w:hyperlink r:id="rId24">
+      <w:hyperlink r:id="rId26">
         <w:r>
           <w:rPr>
             <w:color w:val="164F80"/>
@@ -10276,7 +11622,7 @@
           <w:b w:val="0"/>
           <w:sz w:val="18"/>
         </w:rPr>
-        <w:t>63 CASE CHECKPOINT  |  2 SCOPED PASS  |  2 FINDING  |  59 BLOCKED</w:t>
+        <w:t>63 CASE CHECKPOINT  |  2 SCOPED PASS  |  3 FINDING  |  58 BLOCKED</w:t>
       </w:r>
     </w:p>
     <w:p>
@@ -11032,7 +12378,7 @@
                 <w:color w:val="000000"/>
                 <w:sz w:val="18"/>
               </w:rPr>
-              <w:t>BLOCKED</w:t>
+              <w:t>FINDING</w:t>
             </w:r>
           </w:p>
         </w:tc>
@@ -11058,7 +12404,7 @@
                 <w:color w:val="000000"/>
                 <w:sz w:val="18"/>
               </w:rPr>
-              <w:t>G3 unavailable. After S10 or a canceled/expired setup, reconnect using approved A-only scope, return to debugger, load fresh source.</w:t>
+              <w:t>MEDIUM SCI01: installed/authorized A-only link cannot recover through Connect after an interrupted flow; fresh-install cause unproven.</w:t>
             </w:r>
           </w:p>
         </w:tc>
@@ -11155,7 +12501,7 @@
       </w:r>
     </w:p>
     <w:p>
-      <w:hyperlink r:id="rId24">
+      <w:hyperlink r:id="rId26">
         <w:r>
           <w:rPr>
             <w:color w:val="164F80"/>
@@ -11175,7 +12521,7 @@
           <w:b w:val="0"/>
           <w:sz w:val="18"/>
         </w:rPr>
-        <w:t>63 CASE CHECKPOINT  |  2 SCOPED PASS  |  2 FINDING  |  59 BLOCKED</w:t>
+        <w:t>63 CASE CHECKPOINT  |  2 SCOPED PASS  |  3 FINDING  |  58 BLOCKED</w:t>
       </w:r>
     </w:p>
     <w:p>
@@ -11874,7 +13220,7 @@
                 <w:color w:val="000000"/>
                 <w:sz w:val="18"/>
               </w:rPr>
-              <w:t>Zero-session inventory verified; created-entity disable and post-stop traffic need G1.</w:t>
+              <w:t>Rejected submissions left All 0 / Active 0 / Inactive 0 after filter reset. Drafts closed by 05:45; no created-entity lifecycle cleanup.</w:t>
             </w:r>
           </w:p>
         </w:tc>
@@ -11957,7 +13303,7 @@
                 <w:color w:val="000000"/>
                 <w:sz w:val="18"/>
               </w:rPr>
-              <w:t>Named processes/helpers stopped and assets retained; full settings inventory incomplete.</w:t>
+              <w:t>Runtime stopped, A-only installation and A/B assets retained. Full latest settings/resource reconciliation incomplete.</w:t>
             </w:r>
           </w:p>
         </w:tc>
@@ -12054,7 +13400,7 @@
       </w:r>
     </w:p>
     <w:p>
-      <w:hyperlink r:id="rId24">
+      <w:hyperlink r:id="rId26">
         <w:r>
           <w:rPr>
             <w:color w:val="164F80"/>
@@ -12074,7 +13420,7 @@
           <w:b w:val="0"/>
           <w:sz w:val="18"/>
         </w:rPr>
-        <w:t>63 CASE CHECKPOINT  |  2 SCOPED PASS  |  2 FINDING  |  59 BLOCKED</w:t>
+        <w:t>63 CASE CHECKPOINT  |  2 SCOPED PASS  |  3 FINDING  |  58 BLOCKED</w:t>
       </w:r>
     </w:p>
     <w:p>
@@ -12953,7 +14299,7 @@
       </w:r>
     </w:p>
     <w:p>
-      <w:hyperlink r:id="rId24">
+      <w:hyperlink r:id="rId26">
         <w:r>
           <w:rPr>
             <w:color w:val="164F80"/>

</xml_diff>

<commit_message>
Publish 06:28 evidence-reviewed QA checkpoint
</commit_message>
<xml_diff>
--- a/report.docx
+++ b/report.docx
@@ -26,7 +26,7 @@
           <w:b w:val="0"/>
           <w:sz w:val="18"/>
         </w:rPr>
-        <w:t>Continuation checkpoint  |  8 October 2026 at 05:45 UTC  |  01:45 New York</w:t>
+        <w:t>Continuation checkpoint  |  8 October 2026 at 06:28 UTC  |  02:28 New York</w:t>
       </w:r>
     </w:p>
     <w:p>
@@ -42,7 +42,7 @@
         <w:rPr>
           <w:b w:val="0"/>
         </w:rPr>
-        <w:t>The audit has two Medium findings: an invalid Python quickstart command and an interrupted GitHub connection that cannot recover through Connect. Service discovery and runtime readiness were observed, but no live debugger capture or source association is verified. Every original case has a scoped result or concrete blocker.</w:t>
+        <w:t>The audit has two Medium findings: an invalid Python quickstart command and an interrupted GitHub connection that cannot recover through Connect. Historical APM ingestion and Agent-side authorization were observed. Debugger SDK registration, live capture and source association remain unverified. Every original case has a scoped result or concrete blocker.</w:t>
       </w:r>
     </w:p>
     <w:p>
@@ -64,7 +64,7 @@
         <w:rPr>
           <w:b w:val="0"/>
         </w:rPr>
-        <w:t xml:space="preserve"> GitHub shows the approved A-only App installation and user authorization, while Datadog remains unconnected and its Connect retry makes no progress. The form had been paused about 75 minutes; fresh-install behavior is unproven.</w:t>
+        <w:t xml:space="preserve"> The A-only App is installed/authorized, but Datadog remains unconnected after a paused flow. Fresh-install behavior is unproven.</w:t>
       </w:r>
     </w:p>
     <w:p>
@@ -80,13 +80,35 @@
         <w:rPr>
           <w:b/>
         </w:rPr>
-        <w:t>Fix the Python quickstart first.</w:t>
+        <w:t>Fix the Python quickstart.</w:t>
       </w:r>
       <w:r>
         <w:rPr>
           <w:b w:val="0"/>
         </w:rPr>
-        <w:t xml:space="preserve"> The documented module command includes a .py suffix and fails for an ordinary Python script. Both corrected forms pass the isolated local check.</w:t>
+        <w:t xml:space="preserve"> Its .py-suffixed module command fails for an ordinary script; corrected script/module forms pass local controls.</w:t>
+      </w:r>
+    </w:p>
+    <w:p>
+      <w:pPr>
+        <w:pStyle w:val="ListBullet"/>
+      </w:pPr>
+      <w:r>
+        <w:rPr>
+          <w:b w:val="0"/>
+        </w:rPr>
+      </w:r>
+      <w:r>
+        <w:rPr>
+          <w:b/>
+        </w:rPr>
+        <w:t>Explain invalid templates.</w:t>
+      </w:r>
+      <w:r>
+        <w:rPr>
+          <w:b w:val="0"/>
+        </w:rPr>
+        <w:t xml:space="preserve"> The red border and disabled Start work, but the observed invalid state lacks a syntax-error explanation. The valid correction recovers.</w:t>
       </w:r>
     </w:p>
     <w:p>
@@ -161,7 +183,7 @@
           <w:b w:val="0"/>
           <w:sz w:val="18"/>
         </w:rPr>
-        <w:t>Severity index below: HIGH 0 · MEDIUM 2 · LOW 3. Click a finding ID to jump to its detail page.</w:t>
+        <w:t>Severity index below: HIGH 0 · MEDIUM 2 · LOW 4. Click a finding ID to jump to its detail page.</w:t>
       </w:r>
     </w:p>
     <w:p>
@@ -180,7 +202,7 @@
           <w:b w:val="0"/>
           <w:sz w:val="18"/>
         </w:rPr>
-        <w:t>63 original cases: 2 scoped PASS, 3 FINDING, 58 BLOCKED. Separate executed subchecks preserve genuine UI observations without implying full runtime coverage.</w:t>
+        <w:t>63 original cases: 2 scoped PASS, 4 FINDING, 57 BLOCKED. Separate executed subchecks preserve genuine UI observations without implying full runtime coverage.</w:t>
       </w:r>
     </w:p>
     <w:p>
@@ -196,7 +218,7 @@
         <w:rPr>
           <w:b w:val="0"/>
         </w:rPr>
-        <w:t>A documented prerequisite is not proof that it worked. This report distinguishes directly observed behavior, local reproduction, UX recommendations, and tests not run. Real capture, exact source revision, authorization boundaries, expiry, and cleanup require separate evidence.</w:t>
+        <w:t>A scoped result is not a completed end-to-end test. Live capture, source retrieval, authorization boundaries and lifecycle remain unverified.</w:t>
       </w:r>
     </w:p>
     <w:p>
@@ -866,6 +888,115 @@
               <w:right w:w="85" w:type="dxa"/>
             </w:tcMar>
             <w:shd w:fill="FFFFFF"/>
+          </w:tcPr>
+          <w:p>
+            <w:pPr>
+              <w:spacing w:after="20" w:before="20" w:line="240" w:lineRule="auto"/>
+            </w:pPr>
+            <w:r>
+              <w:rPr>
+                <w:b w:val="0"/>
+                <w:color w:val="000000"/>
+                <w:sz w:val="18"/>
+              </w:rPr>
+              <w:t>1</w:t>
+            </w:r>
+          </w:p>
+        </w:tc>
+      </w:tr>
+      <w:tr>
+        <w:trPr>
+          <w:cantSplit/>
+        </w:trPr>
+        <w:tc>
+          <w:tcPr>
+            <w:tcW w:type="dxa" w:w="1008"/>
+            <w:vAlign w:val="center"/>
+            <w:tcMar>
+              <w:top w:w="85" w:type="dxa"/>
+              <w:left w:w="85" w:type="dxa"/>
+              <w:bottom w:w="85" w:type="dxa"/>
+              <w:right w:w="85" w:type="dxa"/>
+            </w:tcMar>
+            <w:shd w:fill="F3F5F7"/>
+          </w:tcPr>
+          <w:p>
+            <w:pPr>
+              <w:spacing w:after="20" w:before="20" w:line="240" w:lineRule="auto"/>
+            </w:pPr>
+            <w:hyperlink w:anchor="UX03">
+              <w:r>
+                <w:rPr>
+                  <w:color w:val="164F80"/>
+                </w:rPr>
+                <w:t>UX03</w:t>
+              </w:r>
+            </w:hyperlink>
+          </w:p>
+        </w:tc>
+        <w:tc>
+          <w:tcPr>
+            <w:tcW w:type="dxa" w:w="1944"/>
+            <w:vAlign w:val="center"/>
+            <w:tcMar>
+              <w:top w:w="85" w:type="dxa"/>
+              <w:left w:w="85" w:type="dxa"/>
+              <w:bottom w:w="85" w:type="dxa"/>
+              <w:right w:w="85" w:type="dxa"/>
+            </w:tcMar>
+            <w:shd w:fill="F3F5F7"/>
+          </w:tcPr>
+          <w:p>
+            <w:pPr>
+              <w:spacing w:after="20" w:before="20" w:line="240" w:lineRule="auto"/>
+            </w:pPr>
+            <w:r>
+              <w:rPr>
+                <w:b w:val="0"/>
+                <w:color w:val="000000"/>
+                <w:sz w:val="18"/>
+              </w:rPr>
+              <w:t>LOW · feedback</w:t>
+            </w:r>
+          </w:p>
+        </w:tc>
+        <w:tc>
+          <w:tcPr>
+            <w:tcW w:type="dxa" w:w="6480"/>
+            <w:vAlign w:val="center"/>
+            <w:tcMar>
+              <w:top w:w="85" w:type="dxa"/>
+              <w:left w:w="85" w:type="dxa"/>
+              <w:bottom w:w="85" w:type="dxa"/>
+              <w:right w:w="85" w:type="dxa"/>
+            </w:tcMar>
+            <w:shd w:fill="F3F5F7"/>
+          </w:tcPr>
+          <w:p>
+            <w:pPr>
+              <w:spacing w:after="20" w:before="20" w:line="240" w:lineRule="auto"/>
+            </w:pPr>
+            <w:r>
+              <w:rPr>
+                <w:b w:val="0"/>
+                <w:color w:val="000000"/>
+                <w:sz w:val="18"/>
+              </w:rPr>
+              <w:t>Invalid template leaves the correction implicit in the observed state</w:t>
+            </w:r>
+          </w:p>
+        </w:tc>
+        <w:tc>
+          <w:tcPr>
+            <w:tcW w:type="dxa" w:w="792"/>
+            <w:vAlign w:val="center"/>
+            <w:tcMar>
+              <w:top w:w="85" w:type="dxa"/>
+              <w:left w:w="85" w:type="dxa"/>
+              <w:bottom w:w="85" w:type="dxa"/>
+              <w:right w:w="85" w:type="dxa"/>
+            </w:tcMar>
+            <w:shd w:fill="F3F5F7"/>
           </w:tcPr>
           <w:p>
             <w:pPr>
@@ -1015,7 +1146,7 @@
         <w:rPr>
           <w:b w:val="0"/>
         </w:rPr>
-        <w:t>Dates and times are UTC. Screenshot-file timestamps and recording offsets are identified separately; approximate offsets are not capture clocks.</w:t>
+        <w:t>Report clocks are UTC; some UI controls display UTC-07:00. Screenshot-file timestamps and recording offsets are identified separately and are not interchangeable.</w:t>
       </w:r>
     </w:p>
     <w:p>
@@ -1294,7 +1425,7 @@
         <w:rPr>
           <w:b w:val="0"/>
         </w:rPr>
-        <w:t>Cloud desktop browser; approximately 1180 × 757 page viewport at default zoom. Documentation evidence images are 1165 × 747 pixels. Local reproduction uses Python 3.12.14. A dedicated synthetic sample contains no real customer data. Runtime snapshots used Agent/trace-agent 7.84.2, ddtrace 4.11.0 and Python 3.13.5. Datadog UI build 35.143254999. Runtime later stopped at an additional-destination boundary; source association remains unconnected despite verified GitHub installation and authorization. No captured event.</w:t>
+        <w:t>Cloud desktop browser; approximately 1180 × 757 page viewport at default zoom. Documentation evidence images are 1165 × 747 pixels. Local reproduction uses Python 3.12.14. A dedicated synthetic sample contains no real customer data. Local process/intake snapshots used Agent/trace-agent 7.84.2, ddtrace 4.11.0 and Python 3.13.5. They do not establish debugger SDK client registration. Datadog UI build 35.143254999. Runtime later stopped at an additional-destination boundary; source association remains unconnected despite verified GitHub installation and authorization. Historical APM spans were later verified; no captured debugger event.</w:t>
       </w:r>
     </w:p>
     <w:p>
@@ -1993,14 +2124,14 @@
       </w:r>
     </w:p>
     <w:p>
-      <w:bookmarkStart w:id="1045" w:name="UX01"/>
+      <w:bookmarkStart w:id="1046" w:name="UX01"/>
       <w:pPr>
         <w:pStyle w:val="Heading1"/>
       </w:pPr>
       <w:r>
         <w:t>A permanent region choice needs decision support</w:t>
       </w:r>
-      <w:bookmarkEnd w:id="1045"/>
+      <w:bookmarkEnd w:id="1046"/>
     </w:p>
     <w:p>
       <w:r>
@@ -2169,14 +2300,14 @@
       </w:r>
     </w:p>
     <w:p>
-      <w:bookmarkStart w:id="1056" w:name="DOC02"/>
+      <w:bookmarkStart w:id="1057" w:name="DOC02"/>
       <w:pPr>
         <w:pStyle w:val="Heading1"/>
       </w:pPr>
       <w:r>
         <w:t>Documentation navigation breaks words at desktop width</w:t>
       </w:r>
-      <w:bookmarkEnd w:id="1056"/>
+      <w:bookmarkEnd w:id="1057"/>
     </w:p>
     <w:p>
       <w:r>
@@ -2345,14 +2476,14 @@
       </w:r>
     </w:p>
     <w:p>
-      <w:bookmarkStart w:id="1067" w:name="UX02"/>
+      <w:bookmarkStart w:id="1068" w:name="UX02"/>
       <w:pPr>
         <w:pStyle w:val="Heading1"/>
       </w:pPr>
       <w:r>
         <w:t>Empty service states do not explain setup recovery</w:t>
       </w:r>
-      <w:bookmarkEnd w:id="1067"/>
+      <w:bookmarkEnd w:id="1068"/>
     </w:p>
     <w:p>
       <w:r>
@@ -2517,6 +2648,182 @@
           <w:b w:val="0"/>
           <w:sz w:val="18"/>
         </w:rPr>
+        <w:t>PART 1  |  UX03  |  LOW  |  SCOPED FEEDBACK ISSUE</w:t>
+      </w:r>
+    </w:p>
+    <w:p>
+      <w:bookmarkStart w:id="1079" w:name="UX03"/>
+      <w:pPr>
+        <w:pStyle w:val="Heading1"/>
+      </w:pPr>
+      <w:r>
+        <w:t>Invalid log template lacks an explanatory error message</w:t>
+      </w:r>
+      <w:bookmarkEnd w:id="1079"/>
+    </w:p>
+    <w:p>
+      <w:r>
+        <w:rPr>
+          <w:b w:val="0"/>
+        </w:rPr>
+        <w:t>An unmatched log template prevents submission and gets a red border after blur. In the tested view and recorded accessibility snapshot, no text explains the syntax error or the required correction.</w:t>
+      </w:r>
+    </w:p>
+    <w:p>
+      <w:pPr>
+        <w:spacing w:after="100"/>
+      </w:pPr>
+      <w:r>
+        <w:drawing>
+          <wp:inline xmlns:a="http://schemas.openxmlformats.org/drawingml/2006/main" xmlns:pic="http://schemas.openxmlformats.org/drawingml/2006/picture">
+            <wp:extent cx="6217920" cy="3852019"/>
+            <wp:docPr id="4" name="Picture 4" descr="Actual unmatched log-template draft with genuine red validation border, disabled Start and a separate report outline"/>
+            <wp:cNvGraphicFramePr>
+              <a:graphicFrameLocks noChangeAspect="1"/>
+            </wp:cNvGraphicFramePr>
+            <a:graphic>
+              <a:graphicData uri="http://schemas.microsoft.com/office/word/2010/wordprocessingGroup">
+                <wpg:wgp>
+                  <wpg:cNvGrpSpPr/>
+                  <wpg:grpSpPr>
+                    <a:xfrm>
+                      <a:off x="0" y="0"/>
+                      <a:ext cx="6217920" cy="3852019"/>
+                      <a:chOff x="0" y="0"/>
+                      <a:chExt cx="6217920" cy="3852019"/>
+                    </a:xfrm>
+                  </wpg:grpSpPr>
+                  <pic:pic>
+                    <pic:nvPicPr>
+                      <pic:cNvPr id="0" name="58-invalid-template-draft.png"/>
+                      <pic:cNvPicPr/>
+                    </pic:nvPicPr>
+                    <pic:blipFill>
+                      <a:blip r:embed="rId16"/>
+                      <a:stretch>
+                        <a:fillRect/>
+                      </a:stretch>
+                    </pic:blipFill>
+                    <pic:spPr>
+                      <a:xfrm>
+                        <a:off x="0" y="0"/>
+                        <a:ext cx="6217920" cy="3852019"/>
+                      </a:xfrm>
+                      <a:prstGeom prst="rect"/>
+                    </pic:spPr>
+                  </pic:pic>
+                  <wps:wsp>
+                    <wps:cNvSpPr/>
+                    <wps:spPr>
+                      <a:xfrm>
+                        <a:off x="291279" y="2401567"/>
+                        <a:ext cx="5789918" cy="214001"/>
+                      </a:xfrm>
+                      <a:prstGeom prst="rect">
+                        <a:avLst/>
+                      </a:prstGeom>
+                      <a:noFill/>
+                      <a:ln w="22860">
+                        <a:solidFill>
+                          <a:srgbClr val="D82D36"/>
+                        </a:solidFill>
+                        <a:prstDash val="solid"/>
+                      </a:ln>
+                    </wps:spPr>
+                    <wps:bodyPr/>
+                  </wps:wsp>
+                </wpg:wgp>
+              </a:graphicData>
+            </a:graphic>
+          </wp:inline>
+        </w:drawing>
+      </w:r>
+    </w:p>
+    <w:p>
+      <w:pPr>
+        <w:pStyle w:val="Caption"/>
+      </w:pPr>
+      <w:r>
+        <w:t>Source 58 file timestamp 06:26:32 UTC; interaction 06:25–06:28. Actual crop; no generated UI. The separate outline preserves the genuine application border.</w:t>
+      </w:r>
+    </w:p>
+    <w:p>
+      <w:hyperlink r:id="rId17">
+        <w:r>
+          <w:rPr>
+            <w:color w:val="164F80"/>
+          </w:rPr>
+          <w:t>Full-size original annotation and correction control</w:t>
+        </w:r>
+      </w:hyperlink>
+    </w:p>
+    <w:p>
+      <w:r>
+        <w:rPr>
+          <w:b/>
+        </w:rPr>
+        <w:t xml:space="preserve">Reproduce and control </w:t>
+      </w:r>
+      <w:r>
+        <w:rPr>
+          <w:b w:val="0"/>
+        </w:rPr>
+        <w:t>Enter QA {quantity in the manual Line draft, then blur. Start is disabled and the border turns red. Add the closing brace: the border clears and Start enables. No submit.</w:t>
+      </w:r>
+    </w:p>
+    <w:p>
+      <w:r>
+        <w:rPr>
+          <w:b/>
+        </w:rPr>
+        <w:t xml:space="preserve">Expected and actual </w:t>
+      </w:r>
+      <w:r>
+        <w:rPr>
+          <w:b w:val="0"/>
+        </w:rPr>
+        <w:t>Give a specific text explanation, associated with the field. The inspected textarea has a generic editor name and lacks the recorded error-related ARIA attributes; the captured alert addresses service setup instead.</w:t>
+      </w:r>
+    </w:p>
+    <w:p>
+      <w:r>
+        <w:rPr>
+          <w:b/>
+        </w:rPr>
+        <w:t xml:space="preserve">Boundary </w:t>
+      </w:r>
+      <w:r>
+        <w:rPr>
+          <w:b w:val="0"/>
+        </w:rPr>
+        <w:t>W3C SC 3.3.1 motivates an explanatory text error. Missing aria-invalid alone is not proof of failure. This is not a screen-reader run or global WCAG verdict; a transient announcement and computed Line naming require retest.</w:t>
+      </w:r>
+    </w:p>
+    <w:p>
+      <w:r>
+        <w:rPr>
+          <w:b/>
+        </w:rPr>
+        <w:t xml:space="preserve">Motion evidence </w:t>
+      </w:r>
+      <w:r>
+        <w:rPr>
+          <w:b w:val="0"/>
+        </w:rPr>
+        <w:t>Reviewed source 10 highlights show unmatched input at 00:29.30, blur feedback at 00:41.30 and correction at 00:53.30. The online finding links exact source clocks and the full retained recording.</w:t>
+      </w:r>
+    </w:p>
+    <w:p>
+      <w:r>
+        <w:br w:type="page"/>
+      </w:r>
+    </w:p>
+    <w:p>
+      <w:r>
+        <w:rPr>
+          <w:b w:val="0"/>
+          <w:sz w:val="18"/>
+        </w:rPr>
         <w:t>LIVE DEBUGGER AND SOURCE CODE INTEGRATION</w:t>
       </w:r>
     </w:p>
@@ -2541,7 +2848,7 @@
         <w:rPr>
           <w:b w:val="0"/>
         </w:rPr>
-        <w:t>All 63 original cases are accounted for: 2 scoped PASS, 3 FINDING and 58 BLOCKED. B04 and S01 pass only the route and pre-install scopes stated below. The appendix lists every case; the online matrix preserves full preconditions, steps, expected results and cleanup. No runtime capture or source-mapping pass is claimed.</w:t>
+        <w:t>All 63 original cases are accounted for: 2 scoped PASS, 4 FINDING and 57 BLOCKED. B04 and S01 pass only the route and pre-install scopes stated below. The appendix lists every case; the online matrix preserves full preconditions, steps, expected results and cleanup. No runtime capture or source-mapping pass is claimed.</w:t>
       </w:r>
     </w:p>
     <w:tbl>
@@ -2673,7 +2980,7 @@
                 <w:color w:val="000000"/>
                 <w:sz w:val="18"/>
               </w:rPr>
-              <w:t>B02/B03/S11</w:t>
+              <w:t>B02/B03/B09/S11</w:t>
             </w:r>
           </w:p>
         </w:tc>
@@ -2725,7 +3032,7 @@
                 <w:color w:val="000000"/>
                 <w:sz w:val="18"/>
               </w:rPr>
-              <w:t>UX02 guidance, DOC01 command and SCI01 interrupted source-connection recovery</w:t>
+              <w:t>UX02 guidance, DOC01 command, UX03 error explanation and SCI01 source recovery</w:t>
             </w:r>
           </w:p>
         </w:tc>
@@ -2922,7 +3229,7 @@
                 <w:color w:val="000000"/>
                 <w:sz w:val="18"/>
               </w:rPr>
-              <w:t>B09/F14</w:t>
+              <w:t>F14</w:t>
             </w:r>
           </w:p>
         </w:tc>
@@ -2974,7 +3281,7 @@
                 <w:color w:val="000000"/>
                 <w:sz w:val="18"/>
               </w:rPr>
-              <w:t>Modal and draft navigation checks passed; remaining accessibility and saved-entity variants untested</w:t>
+              <w:t>Modal and draft navigation checks passed; saved-entity/runtime variants remain untested</w:t>
             </w:r>
           </w:p>
         </w:tc>
@@ -3255,14 +3562,14 @@
       </w:r>
     </w:p>
     <w:p>
-      <w:bookmarkStart w:id="1093" w:name="DOC01"/>
+      <w:bookmarkStart w:id="1105" w:name="DOC01"/>
       <w:pPr>
         <w:pStyle w:val="Heading1"/>
       </w:pPr>
       <w:r>
         <w:t>Python quickstart contains an invalid module command</w:t>
       </w:r>
-      <w:bookmarkEnd w:id="1093"/>
+      <w:bookmarkEnd w:id="1105"/>
     </w:p>
     <w:p>
       <w:r>
@@ -3280,7 +3587,7 @@
         <w:drawing>
           <wp:inline xmlns:a="http://schemas.openxmlformats.org/drawingml/2006/main" xmlns:pic="http://schemas.openxmlformats.org/drawingml/2006/picture">
             <wp:extent cx="6492240" cy="4162835"/>
-            <wp:docPr id="4" name="Picture 4" descr="Datadog Python setup example with a red border around the invalid launch command"/>
+            <wp:docPr id="5" name="Picture 5" descr="Datadog Python setup example with a red border around the invalid launch command"/>
             <wp:cNvGraphicFramePr>
               <a:graphicFrameLocks noChangeAspect="1"/>
             </wp:cNvGraphicFramePr>
@@ -3302,7 +3609,7 @@
                       <pic:cNvPicPr/>
                     </pic:nvPicPr>
                     <pic:blipFill>
-                      <a:blip r:embed="rId16"/>
+                      <a:blip r:embed="rId18"/>
                       <a:stretch>
                         <a:fillRect/>
                       </a:stretch>
@@ -3431,14 +3738,14 @@
       </w:r>
     </w:p>
     <w:p>
-      <w:bookmarkStart w:id="1104" w:name="SCI01"/>
+      <w:bookmarkStart w:id="1116" w:name="SCI01"/>
       <w:pPr>
         <w:pStyle w:val="Heading1"/>
       </w:pPr>
       <w:r>
         <w:t>Interrupted GitHub setup does not recover through Connect</w:t>
       </w:r>
-      <w:bookmarkEnd w:id="1104"/>
+      <w:bookmarkEnd w:id="1116"/>
     </w:p>
     <w:p>
       <w:r>
@@ -3456,7 +3763,7 @@
         <w:drawing>
           <wp:inline xmlns:a="http://schemas.openxmlformats.org/drawingml/2006/main" xmlns:pic="http://schemas.openxmlformats.org/drawingml/2006/picture">
             <wp:extent cx="6126480" cy="3591799"/>
-            <wp:docPr id="5" name="Picture 5" descr="Actual Datadog unconnected GitHub setup after callback, with account areas excluded"/>
+            <wp:docPr id="6" name="Picture 6" descr="Actual Datadog unconnected GitHub setup after callback, with account areas excluded"/>
             <wp:cNvGraphicFramePr>
               <a:graphicFrameLocks noChangeAspect="1"/>
             </wp:cNvGraphicFramePr>
@@ -3478,7 +3785,7 @@
                       <pic:cNvPicPr/>
                     </pic:nvPicPr>
                     <pic:blipFill>
-                      <a:blip r:embed="rId17"/>
+                      <a:blip r:embed="rId19"/>
                       <a:stretch>
                         <a:fillRect/>
                       </a:stretch>
@@ -3527,7 +3834,7 @@
       </w:r>
     </w:p>
     <w:p>
-      <w:hyperlink r:id="rId18">
+      <w:hyperlink r:id="rId20">
         <w:r>
           <w:rPr>
             <w:color w:val="164F80"/>
@@ -5008,7 +5315,7 @@
       </w:r>
     </w:p>
     <w:p>
-      <w:hyperlink r:id="rId19">
+      <w:hyperlink r:id="rId21">
         <w:r>
           <w:rPr>
             <w:color w:val="164F80"/>
@@ -5023,7 +5330,7 @@
           <w:b w:val="0"/>
           <w:sz w:val="18"/>
         </w:rPr>
-        <w:t>Reviewed motion: authenticated UI QA 181.30 seconds; account/setup transitions 20.25 seconds, with identity masked and OAuth omitted. UX02 appears at 00:00 and 02:42.80 in the UI excerpt. Both historical and recording 07 safe archives are available with exact omissions. Recording 08 is wholly withheld tooling preparation. Highlights overlap the archives; no successful runtime capture is shown.</w:t>
+        <w:t>Reviewed motion: authenticated UI QA 181.30 seconds; account/setup transitions 20.25 seconds, with identity masked and OAuth omitted. UX02 appears at 00:00 and 02:42.80 in the UI excerpt. Reviewed archives now account for sources 01–10, with exact omissions. Sources 06 and 08 are wholly withheld tooling preparation. Highlights overlap archive footage; no successful debugger capture is shown.</w:t>
       </w:r>
     </w:p>
     <w:p>
@@ -5035,7 +5342,7 @@
       </w:r>
     </w:p>
     <w:p>
-      <w:hyperlink r:id="rId20">
+      <w:hyperlink r:id="rId22">
         <w:r>
           <w:rPr>
             <w:color w:val="164F80"/>
@@ -5045,7 +5352,7 @@
       </w:hyperlink>
     </w:p>
     <w:p>
-      <w:hyperlink r:id="rId21">
+      <w:hyperlink r:id="rId23">
         <w:r>
           <w:rPr>
             <w:color w:val="164F80"/>
@@ -5055,7 +5362,7 @@
       </w:hyperlink>
     </w:p>
     <w:p>
-      <w:hyperlink r:id="rId22">
+      <w:hyperlink r:id="rId24">
         <w:r>
           <w:rPr>
             <w:color w:val="164F80"/>
@@ -5065,7 +5372,7 @@
       </w:hyperlink>
     </w:p>
     <w:p>
-      <w:hyperlink r:id="rId23">
+      <w:hyperlink r:id="rId25">
         <w:r>
           <w:rPr>
             <w:color w:val="164F80"/>
@@ -5075,7 +5382,7 @@
       </w:hyperlink>
     </w:p>
     <w:p>
-      <w:hyperlink r:id="rId24">
+      <w:hyperlink r:id="rId26">
         <w:r>
           <w:rPr>
             <w:color w:val="164F80"/>
@@ -5972,139 +6279,6 @@
           </w:p>
         </w:tc>
       </w:tr>
-    </w:tbl>
-    <w:p>
-      <w:r>
-        <w:rPr>
-          <w:b w:val="0"/>
-        </w:rPr>
-      </w:r>
-    </w:p>
-    <w:p>
-      <w:r>
-        <w:br w:type="page"/>
-      </w:r>
-    </w:p>
-    <w:p>
-      <w:r>
-        <w:rPr>
-          <w:b w:val="0"/>
-          <w:sz w:val="18"/>
-        </w:rPr>
-        <w:t>SUPPLEMENTAL RESULTS</w:t>
-      </w:r>
-    </w:p>
-    <w:p>
-      <w:pPr>
-        <w:pStyle w:val="Heading1"/>
-      </w:pPr>
-      <w:r>
-        <w:t>Verified setup and control checks</w:t>
-      </w:r>
-    </w:p>
-    <w:tbl>
-      <w:tblPr>
-        <w:tblW w:type="auto" w:w="0"/>
-        <w:jc w:val="center"/>
-        <w:tblLayout w:type="fixed"/>
-        <w:tblLook w:firstColumn="1" w:firstRow="1" w:lastColumn="0" w:lastRow="0" w:noHBand="0" w:noVBand="1" w:val="04A0"/>
-        <w:tblBorders>
-          <w:top w:val="single" w:sz="4" w:color="D9D9D9"/>
-          <w:left w:val="single" w:sz="4" w:color="D9D9D9"/>
-          <w:bottom w:val="single" w:sz="4" w:color="D9D9D9"/>
-          <w:right w:val="single" w:sz="4" w:color="D9D9D9"/>
-          <w:insideH w:val="single" w:sz="4" w:color="D9D9D9"/>
-          <w:insideV w:val="single" w:sz="4" w:color="D9D9D9"/>
-        </w:tblBorders>
-      </w:tblPr>
-      <w:tblGrid>
-        <w:gridCol w:w="2448"/>
-        <w:gridCol w:w="1440"/>
-        <w:gridCol w:w="6336"/>
-      </w:tblGrid>
-      <w:tr>
-        <w:trPr>
-          <w:tblHeader/>
-        </w:trPr>
-        <w:tc>
-          <w:tcPr>
-            <w:tcW w:type="dxa" w:w="2448"/>
-            <w:vAlign w:val="center"/>
-            <w:tcMar>
-              <w:top w:w="85" w:type="dxa"/>
-              <w:left w:w="85" w:type="dxa"/>
-              <w:bottom w:w="85" w:type="dxa"/>
-              <w:right w:w="85" w:type="dxa"/>
-            </w:tcMar>
-            <w:shd w:fill="24384B"/>
-          </w:tcPr>
-          <w:p>
-            <w:pPr>
-              <w:spacing w:after="20" w:before="20" w:line="240" w:lineRule="auto"/>
-            </w:pPr>
-            <w:r>
-              <w:rPr>
-                <w:b/>
-                <w:color w:val="FFFFFF"/>
-                <w:sz w:val="18"/>
-              </w:rPr>
-              <w:t>Check</w:t>
-            </w:r>
-          </w:p>
-        </w:tc>
-        <w:tc>
-          <w:tcPr>
-            <w:tcW w:type="dxa" w:w="1440"/>
-            <w:vAlign w:val="center"/>
-            <w:tcMar>
-              <w:top w:w="85" w:type="dxa"/>
-              <w:left w:w="85" w:type="dxa"/>
-              <w:bottom w:w="85" w:type="dxa"/>
-              <w:right w:w="85" w:type="dxa"/>
-            </w:tcMar>
-            <w:shd w:fill="24384B"/>
-          </w:tcPr>
-          <w:p>
-            <w:pPr>
-              <w:spacing w:after="20" w:before="20" w:line="240" w:lineRule="auto"/>
-            </w:pPr>
-            <w:r>
-              <w:rPr>
-                <w:b/>
-                <w:color w:val="FFFFFF"/>
-                <w:sz w:val="18"/>
-              </w:rPr>
-              <w:t>UTC</w:t>
-            </w:r>
-          </w:p>
-        </w:tc>
-        <w:tc>
-          <w:tcPr>
-            <w:tcW w:type="dxa" w:w="6336"/>
-            <w:vAlign w:val="center"/>
-            <w:tcMar>
-              <w:top w:w="85" w:type="dxa"/>
-              <w:left w:w="85" w:type="dxa"/>
-              <w:bottom w:w="85" w:type="dxa"/>
-              <w:right w:w="85" w:type="dxa"/>
-            </w:tcMar>
-            <w:shd w:fill="24384B"/>
-          </w:tcPr>
-          <w:p>
-            <w:pPr>
-              <w:spacing w:after="20" w:before="20" w:line="240" w:lineRule="auto"/>
-            </w:pPr>
-            <w:r>
-              <w:rPr>
-                <w:b/>
-                <w:color w:val="FFFFFF"/>
-                <w:sz w:val="18"/>
-              </w:rPr>
-              <w:t>Verified scope</w:t>
-            </w:r>
-          </w:p>
-        </w:tc>
-      </w:tr>
       <w:tr>
         <w:trPr>
           <w:cantSplit/>
@@ -6119,7 +6293,7 @@
               <w:bottom w:w="85" w:type="dxa"/>
               <w:right w:w="85" w:type="dxa"/>
             </w:tcMar>
-            <w:shd w:fill="FFFFFF"/>
+            <w:shd w:fill="F3F5F7"/>
           </w:tcPr>
           <w:p>
             <w:pPr>
@@ -6145,7 +6319,7 @@
               <w:bottom w:w="85" w:type="dxa"/>
               <w:right w:w="85" w:type="dxa"/>
             </w:tcMar>
-            <w:shd w:fill="FFFFFF"/>
+            <w:shd w:fill="F3F5F7"/>
           </w:tcPr>
           <w:p>
             <w:pPr>
@@ -6171,7 +6345,7 @@
               <w:bottom w:w="85" w:type="dxa"/>
               <w:right w:w="85" w:type="dxa"/>
             </w:tcMar>
-            <w:shd w:fill="FFFFFF"/>
+            <w:shd w:fill="F3F5F7"/>
           </w:tcPr>
           <w:p>
             <w:pPr>
@@ -6184,670 +6358,6 @@
                 <w:sz w:val="18"/>
               </w:rPr>
               <w:t>Official/custom setup canceled; reload remains Not Connected. No App grant.</w:t>
-            </w:r>
-          </w:p>
-        </w:tc>
-      </w:tr>
-      <w:tr>
-        <w:trPr>
-          <w:cantSplit/>
-        </w:trPr>
-        <w:tc>
-          <w:tcPr>
-            <w:tcW w:type="dxa" w:w="2448"/>
-            <w:vAlign w:val="center"/>
-            <w:tcMar>
-              <w:top w:w="85" w:type="dxa"/>
-              <w:left w:w="85" w:type="dxa"/>
-              <w:bottom w:w="85" w:type="dxa"/>
-              <w:right w:w="85" w:type="dxa"/>
-            </w:tcMar>
-            <w:shd w:fill="F3F5F7"/>
-          </w:tcPr>
-          <w:p>
-            <w:pPr>
-              <w:spacing w:after="20" w:before="20" w:line="240" w:lineRule="auto"/>
-            </w:pPr>
-            <w:r>
-              <w:rPr>
-                <w:b w:val="0"/>
-                <w:color w:val="000000"/>
-                <w:sz w:val="18"/>
-              </w:rPr>
-              <w:t>U11 Final session inventory</w:t>
-            </w:r>
-          </w:p>
-        </w:tc>
-        <w:tc>
-          <w:tcPr>
-            <w:tcW w:type="dxa" w:w="1440"/>
-            <w:vAlign w:val="center"/>
-            <w:tcMar>
-              <w:top w:w="85" w:type="dxa"/>
-              <w:left w:w="85" w:type="dxa"/>
-              <w:bottom w:w="85" w:type="dxa"/>
-              <w:right w:w="85" w:type="dxa"/>
-            </w:tcMar>
-            <w:shd w:fill="F3F5F7"/>
-          </w:tcPr>
-          <w:p>
-            <w:pPr>
-              <w:spacing w:after="20" w:before="20" w:line="240" w:lineRule="auto"/>
-            </w:pPr>
-            <w:r>
-              <w:rPr>
-                <w:b w:val="0"/>
-                <w:color w:val="000000"/>
-                <w:sz w:val="18"/>
-              </w:rPr>
-              <w:t>04:12</w:t>
-            </w:r>
-          </w:p>
-        </w:tc>
-        <w:tc>
-          <w:tcPr>
-            <w:tcW w:type="dxa" w:w="6336"/>
-            <w:vAlign w:val="center"/>
-            <w:tcMar>
-              <w:top w:w="85" w:type="dxa"/>
-              <w:left w:w="85" w:type="dxa"/>
-              <w:bottom w:w="85" w:type="dxa"/>
-              <w:right w:w="85" w:type="dxa"/>
-            </w:tcMar>
-            <w:shd w:fill="F3F5F7"/>
-          </w:tcPr>
-          <w:p>
-            <w:pPr>
-              <w:spacing w:after="20" w:before="20" w:line="240" w:lineRule="auto"/>
-            </w:pPr>
-            <w:r>
-              <w:rPr>
-                <w:b w:val="0"/>
-                <w:color w:val="000000"/>
-                <w:sz w:val="18"/>
-              </w:rPr>
-              <w:t>All 0 / Active 0 / Inactive 0; filters cleared. Live accessibility observation after video stopped.</w:t>
-            </w:r>
-          </w:p>
-        </w:tc>
-      </w:tr>
-      <w:tr>
-        <w:trPr>
-          <w:cantSplit/>
-        </w:trPr>
-        <w:tc>
-          <w:tcPr>
-            <w:tcW w:type="dxa" w:w="2448"/>
-            <w:vAlign w:val="center"/>
-            <w:tcMar>
-              <w:top w:w="85" w:type="dxa"/>
-              <w:left w:w="85" w:type="dxa"/>
-              <w:bottom w:w="85" w:type="dxa"/>
-              <w:right w:w="85" w:type="dxa"/>
-            </w:tcMar>
-            <w:shd w:fill="FFFFFF"/>
-          </w:tcPr>
-          <w:p>
-            <w:pPr>
-              <w:spacing w:after="20" w:before="20" w:line="240" w:lineRule="auto"/>
-            </w:pPr>
-            <w:r>
-              <w:rPr>
-                <w:b w:val="0"/>
-                <w:color w:val="000000"/>
-                <w:sz w:val="18"/>
-              </w:rPr>
-              <w:t>U12 Python command controls</w:t>
-            </w:r>
-          </w:p>
-        </w:tc>
-        <w:tc>
-          <w:tcPr>
-            <w:tcW w:type="dxa" w:w="1440"/>
-            <w:vAlign w:val="center"/>
-            <w:tcMar>
-              <w:top w:w="85" w:type="dxa"/>
-              <w:left w:w="85" w:type="dxa"/>
-              <w:bottom w:w="85" w:type="dxa"/>
-              <w:right w:w="85" w:type="dxa"/>
-            </w:tcMar>
-            <w:shd w:fill="FFFFFF"/>
-          </w:tcPr>
-          <w:p>
-            <w:pPr>
-              <w:spacing w:after="20" w:before="20" w:line="240" w:lineRule="auto"/>
-            </w:pPr>
-            <w:r>
-              <w:rPr>
-                <w:b w:val="0"/>
-                <w:color w:val="000000"/>
-                <w:sz w:val="18"/>
-              </w:rPr>
-              <w:t>02:31:35; 03:19:52</w:t>
-            </w:r>
-          </w:p>
-        </w:tc>
-        <w:tc>
-          <w:tcPr>
-            <w:tcW w:type="dxa" w:w="6336"/>
-            <w:vAlign w:val="center"/>
-            <w:tcMar>
-              <w:top w:w="85" w:type="dxa"/>
-              <w:left w:w="85" w:type="dxa"/>
-              <w:bottom w:w="85" w:type="dxa"/>
-              <w:right w:w="85" w:type="dxa"/>
-            </w:tcMar>
-            <w:shd w:fill="FFFFFF"/>
-          </w:tcPr>
-          <w:p>
-            <w:pPr>
-              <w:spacing w:after="20" w:before="20" w:line="240" w:lineRule="auto"/>
-            </w:pPr>
-            <w:r>
-              <w:rPr>
-                <w:b w:val="0"/>
-                <w:color w:val="000000"/>
-                <w:sz w:val="18"/>
-              </w:rPr>
-              <w:t>Invalid module command exits 1; script and suffix-free module alternatives exit 0. Local-only, not Datadog capture.</w:t>
-            </w:r>
-          </w:p>
-        </w:tc>
-      </w:tr>
-      <w:tr>
-        <w:trPr>
-          <w:cantSplit/>
-        </w:trPr>
-        <w:tc>
-          <w:tcPr>
-            <w:tcW w:type="dxa" w:w="2448"/>
-            <w:vAlign w:val="center"/>
-            <w:tcMar>
-              <w:top w:w="85" w:type="dxa"/>
-              <w:left w:w="85" w:type="dxa"/>
-              <w:bottom w:w="85" w:type="dxa"/>
-              <w:right w:w="85" w:type="dxa"/>
-            </w:tcMar>
-            <w:shd w:fill="F3F5F7"/>
-          </w:tcPr>
-          <w:p>
-            <w:pPr>
-              <w:spacing w:after="20" w:before="20" w:line="240" w:lineRule="auto"/>
-            </w:pPr>
-            <w:r>
-              <w:rPr>
-                <w:b w:val="0"/>
-                <w:color w:val="000000"/>
-                <w:sz w:val="18"/>
-              </w:rPr>
-              <w:t>U13 Published finding images</w:t>
-            </w:r>
-          </w:p>
-        </w:tc>
-        <w:tc>
-          <w:tcPr>
-            <w:tcW w:type="dxa" w:w="1440"/>
-            <w:vAlign w:val="center"/>
-            <w:tcMar>
-              <w:top w:w="85" w:type="dxa"/>
-              <w:left w:w="85" w:type="dxa"/>
-              <w:bottom w:w="85" w:type="dxa"/>
-              <w:right w:w="85" w:type="dxa"/>
-            </w:tcMar>
-            <w:shd w:fill="F3F5F7"/>
-          </w:tcPr>
-          <w:p>
-            <w:pPr>
-              <w:spacing w:after="20" w:before="20" w:line="240" w:lineRule="auto"/>
-            </w:pPr>
-            <w:r>
-              <w:rPr>
-                <w:b w:val="0"/>
-                <w:color w:val="000000"/>
-                <w:sz w:val="18"/>
-              </w:rPr>
-              <w:t>Verified by 03:59</w:t>
-            </w:r>
-          </w:p>
-        </w:tc>
-        <w:tc>
-          <w:tcPr>
-            <w:tcW w:type="dxa" w:w="6336"/>
-            <w:vAlign w:val="center"/>
-            <w:tcMar>
-              <w:top w:w="85" w:type="dxa"/>
-              <w:left w:w="85" w:type="dxa"/>
-              <w:bottom w:w="85" w:type="dxa"/>
-              <w:right w:w="85" w:type="dxa"/>
-            </w:tcMar>
-            <w:shd w:fill="F3F5F7"/>
-          </w:tcPr>
-          <w:p>
-            <w:pPr>
-              <w:spacing w:after="20" w:before="20" w:line="240" w:lineRule="auto"/>
-            </w:pPr>
-            <w:r>
-              <w:rPr>
-                <w:b w:val="0"/>
-                <w:color w:val="000000"/>
-                <w:sz w:val="18"/>
-              </w:rPr>
-              <w:t>All four finding pages rendered their inline annotated image; the UX02 original-image link opened. Publication QA, not Datadog behavior.</w:t>
-            </w:r>
-          </w:p>
-        </w:tc>
-      </w:tr>
-      <w:tr>
-        <w:trPr>
-          <w:cantSplit/>
-        </w:trPr>
-        <w:tc>
-          <w:tcPr>
-            <w:tcW w:type="dxa" w:w="2448"/>
-            <w:vAlign w:val="center"/>
-            <w:tcMar>
-              <w:top w:w="85" w:type="dxa"/>
-              <w:left w:w="85" w:type="dxa"/>
-              <w:bottom w:w="85" w:type="dxa"/>
-              <w:right w:w="85" w:type="dxa"/>
-            </w:tcMar>
-            <w:shd w:fill="FFFFFF"/>
-          </w:tcPr>
-          <w:p>
-            <w:pPr>
-              <w:spacing w:after="20" w:before="20" w:line="240" w:lineRule="auto"/>
-            </w:pPr>
-            <w:r>
-              <w:rPr>
-                <w:b w:val="0"/>
-                <w:color w:val="000000"/>
-                <w:sz w:val="18"/>
-              </w:rPr>
-              <w:t>U14 Temporary helper shutdown</w:t>
-            </w:r>
-          </w:p>
-        </w:tc>
-        <w:tc>
-          <w:tcPr>
-            <w:tcW w:type="dxa" w:w="1440"/>
-            <w:vAlign w:val="center"/>
-            <w:tcMar>
-              <w:top w:w="85" w:type="dxa"/>
-              <w:left w:w="85" w:type="dxa"/>
-              <w:bottom w:w="85" w:type="dxa"/>
-              <w:right w:w="85" w:type="dxa"/>
-            </w:tcMar>
-            <w:shd w:fill="FFFFFF"/>
-          </w:tcPr>
-          <w:p>
-            <w:pPr>
-              <w:spacing w:after="20" w:before="20" w:line="240" w:lineRule="auto"/>
-            </w:pPr>
-            <w:r>
-              <w:rPr>
-                <w:b w:val="0"/>
-                <w:color w:val="000000"/>
-                <w:sz w:val="18"/>
-              </w:rPr>
-              <w:t>04:22:42</w:t>
-            </w:r>
-          </w:p>
-        </w:tc>
-        <w:tc>
-          <w:tcPr>
-            <w:tcW w:type="dxa" w:w="6336"/>
-            <w:vAlign w:val="center"/>
-            <w:tcMar>
-              <w:top w:w="85" w:type="dxa"/>
-              <w:left w:w="85" w:type="dxa"/>
-              <w:bottom w:w="85" w:type="dxa"/>
-              <w:right w:w="85" w:type="dxa"/>
-            </w:tcMar>
-            <w:shd w:fill="FFFFFF"/>
-          </w:tcPr>
-          <w:p>
-            <w:pPr>
-              <w:spacing w:after="20" w:before="20" w:line="240" w:lineRule="auto"/>
-            </w:pPr>
-            <w:r>
-              <w:rPr>
-                <w:b w:val="0"/>
-                <w:color w:val="000000"/>
-                <w:sz w:val="18"/>
-              </w:rPr>
-              <w:t>Two completed local setup helpers stopped; each shows zero remaining owned processes. Private configuration retained without inspection.</w:t>
-            </w:r>
-          </w:p>
-        </w:tc>
-      </w:tr>
-      <w:tr>
-        <w:trPr>
-          <w:cantSplit/>
-        </w:trPr>
-        <w:tc>
-          <w:tcPr>
-            <w:tcW w:type="dxa" w:w="2448"/>
-            <w:vAlign w:val="center"/>
-            <w:tcMar>
-              <w:top w:w="85" w:type="dxa"/>
-              <w:left w:w="85" w:type="dxa"/>
-              <w:bottom w:w="85" w:type="dxa"/>
-              <w:right w:w="85" w:type="dxa"/>
-            </w:tcMar>
-            <w:shd w:fill="F3F5F7"/>
-          </w:tcPr>
-          <w:p>
-            <w:pPr>
-              <w:spacing w:after="20" w:before="20" w:line="240" w:lineRule="auto"/>
-            </w:pPr>
-            <w:r>
-              <w:rPr>
-                <w:b w:val="0"/>
-                <w:color w:val="000000"/>
-                <w:sz w:val="18"/>
-              </w:rPr>
-              <w:t>U15 Service discovery</w:t>
-            </w:r>
-          </w:p>
-        </w:tc>
-        <w:tc>
-          <w:tcPr>
-            <w:tcW w:type="dxa" w:w="1440"/>
-            <w:vAlign w:val="center"/>
-            <w:tcMar>
-              <w:top w:w="85" w:type="dxa"/>
-              <w:left w:w="85" w:type="dxa"/>
-              <w:bottom w:w="85" w:type="dxa"/>
-              <w:right w:w="85" w:type="dxa"/>
-            </w:tcMar>
-            <w:shd w:fill="F3F5F7"/>
-          </w:tcPr>
-          <w:p>
-            <w:pPr>
-              <w:spacing w:after="20" w:before="20" w:line="240" w:lineRule="auto"/>
-            </w:pPr>
-            <w:r>
-              <w:rPr>
-                <w:b w:val="0"/>
-                <w:color w:val="000000"/>
-                <w:sz w:val="18"/>
-              </w:rPr>
-              <w:t>04:50:17</w:t>
-            </w:r>
-          </w:p>
-        </w:tc>
-        <w:tc>
-          <w:tcPr>
-            <w:tcW w:type="dxa" w:w="6336"/>
-            <w:vAlign w:val="center"/>
-            <w:tcMar>
-              <w:top w:w="85" w:type="dxa"/>
-              <w:left w:w="85" w:type="dxa"/>
-              <w:bottom w:w="85" w:type="dxa"/>
-              <w:right w:w="85" w:type="dxa"/>
-            </w:tcMar>
-            <w:shd w:fill="F3F5F7"/>
-          </w:tcPr>
-          <w:p>
-            <w:pPr>
-              <w:spacing w:after="20" w:before="20" w:line="240" w:lineRule="auto"/>
-            </w:pPr>
-            <w:r>
-              <w:rPr>
-                <w:b w:val="0"/>
-                <w:color w:val="000000"/>
-                <w:sz w:val="18"/>
-              </w:rPr>
-              <w:t>The synthetic sample became selectable; only wildcard environment was offered. No session or capture.</w:t>
-            </w:r>
-          </w:p>
-        </w:tc>
-      </w:tr>
-      <w:tr>
-        <w:trPr>
-          <w:cantSplit/>
-        </w:trPr>
-        <w:tc>
-          <w:tcPr>
-            <w:tcW w:type="dxa" w:w="2448"/>
-            <w:vAlign w:val="center"/>
-            <w:tcMar>
-              <w:top w:w="85" w:type="dxa"/>
-              <w:left w:w="85" w:type="dxa"/>
-              <w:bottom w:w="85" w:type="dxa"/>
-              <w:right w:w="85" w:type="dxa"/>
-            </w:tcMar>
-            <w:shd w:fill="FFFFFF"/>
-          </w:tcPr>
-          <w:p>
-            <w:pPr>
-              <w:spacing w:after="20" w:before="20" w:line="240" w:lineRule="auto"/>
-            </w:pPr>
-            <w:r>
-              <w:rPr>
-                <w:b w:val="0"/>
-                <w:color w:val="000000"/>
-                <w:sz w:val="18"/>
-              </w:rPr>
-              <w:t>U16 Runtime prerequisite snapshots</w:t>
-            </w:r>
-          </w:p>
-        </w:tc>
-        <w:tc>
-          <w:tcPr>
-            <w:tcW w:type="dxa" w:w="1440"/>
-            <w:vAlign w:val="center"/>
-            <w:tcMar>
-              <w:top w:w="85" w:type="dxa"/>
-              <w:left w:w="85" w:type="dxa"/>
-              <w:bottom w:w="85" w:type="dxa"/>
-              <w:right w:w="85" w:type="dxa"/>
-            </w:tcMar>
-            <w:shd w:fill="FFFFFF"/>
-          </w:tcPr>
-          <w:p>
-            <w:pPr>
-              <w:spacing w:after="20" w:before="20" w:line="240" w:lineRule="auto"/>
-            </w:pPr>
-            <w:r>
-              <w:rPr>
-                <w:b w:val="0"/>
-                <w:color w:val="000000"/>
-                <w:sz w:val="18"/>
-              </w:rPr>
-              <w:t>04:47:03; 04:54:47</w:t>
-            </w:r>
-          </w:p>
-        </w:tc>
-        <w:tc>
-          <w:tcPr>
-            <w:tcW w:type="dxa" w:w="6336"/>
-            <w:vAlign w:val="center"/>
-            <w:tcMar>
-              <w:top w:w="85" w:type="dxa"/>
-              <w:left w:w="85" w:type="dxa"/>
-              <w:bottom w:w="85" w:type="dxa"/>
-              <w:right w:w="85" w:type="dxa"/>
-            </w:tcMar>
-            <w:shd w:fill="FFFFFF"/>
-          </w:tcPr>
-          <w:p>
-            <w:pPr>
-              <w:spacing w:after="20" w:before="20" w:line="240" w:lineRule="auto"/>
-            </w:pPr>
-            <w:r>
-              <w:rPr>
-                <w:b w:val="0"/>
-                <w:color w:val="000000"/>
-                <w:sz w:val="18"/>
-              </w:rPr>
-              <w:t>Agent/trace/SDK readiness and RC enabled/key-authorized were verified at these instants; later scope stop means this is not current liveness.</w:t>
-            </w:r>
-          </w:p>
-        </w:tc>
-      </w:tr>
-      <w:tr>
-        <w:trPr>
-          <w:cantSplit/>
-        </w:trPr>
-        <w:tc>
-          <w:tcPr>
-            <w:tcW w:type="dxa" w:w="2448"/>
-            <w:vAlign w:val="center"/>
-            <w:tcMar>
-              <w:top w:w="85" w:type="dxa"/>
-              <w:left w:w="85" w:type="dxa"/>
-              <w:bottom w:w="85" w:type="dxa"/>
-              <w:right w:w="85" w:type="dxa"/>
-            </w:tcMar>
-            <w:shd w:fill="F3F5F7"/>
-          </w:tcPr>
-          <w:p>
-            <w:pPr>
-              <w:spacing w:after="20" w:before="20" w:line="240" w:lineRule="auto"/>
-            </w:pPr>
-            <w:r>
-              <w:rPr>
-                <w:b w:val="0"/>
-                <w:color w:val="000000"/>
-                <w:sz w:val="18"/>
-              </w:rPr>
-              <w:t>U17 A-only installed scope</w:t>
-            </w:r>
-          </w:p>
-        </w:tc>
-        <w:tc>
-          <w:tcPr>
-            <w:tcW w:type="dxa" w:w="1440"/>
-            <w:vAlign w:val="center"/>
-            <w:tcMar>
-              <w:top w:w="85" w:type="dxa"/>
-              <w:left w:w="85" w:type="dxa"/>
-              <w:bottom w:w="85" w:type="dxa"/>
-              <w:right w:w="85" w:type="dxa"/>
-            </w:tcMar>
-            <w:shd w:fill="F3F5F7"/>
-          </w:tcPr>
-          <w:p>
-            <w:pPr>
-              <w:spacing w:after="20" w:before="20" w:line="240" w:lineRule="auto"/>
-            </w:pPr>
-            <w:r>
-              <w:rPr>
-                <w:b w:val="0"/>
-                <w:color w:val="000000"/>
-                <w:sz w:val="18"/>
-              </w:rPr>
-              <w:t>04:51:29; 05:06:05</w:t>
-            </w:r>
-          </w:p>
-        </w:tc>
-        <w:tc>
-          <w:tcPr>
-            <w:tcW w:type="dxa" w:w="6336"/>
-            <w:vAlign w:val="center"/>
-            <w:tcMar>
-              <w:top w:w="85" w:type="dxa"/>
-              <w:left w:w="85" w:type="dxa"/>
-              <w:bottom w:w="85" w:type="dxa"/>
-              <w:right w:w="85" w:type="dxa"/>
-            </w:tcMar>
-            <w:shd w:fill="F3F5F7"/>
-          </w:tcPr>
-          <w:p>
-            <w:pPr>
-              <w:spacing w:after="20" w:before="20" w:line="240" w:lineRule="auto"/>
-            </w:pPr>
-            <w:r>
-              <w:rPr>
-                <w:b w:val="0"/>
-                <w:color w:val="000000"/>
-                <w:sz w:val="18"/>
-              </w:rPr>
-              <w:t>GitHub installation plus persisted one-repository selection verified, identified privately as A. B created afterward remains ungranted. Datadog association failed.</w:t>
-            </w:r>
-          </w:p>
-        </w:tc>
-      </w:tr>
-      <w:tr>
-        <w:trPr>
-          <w:cantSplit/>
-        </w:trPr>
-        <w:tc>
-          <w:tcPr>
-            <w:tcW w:type="dxa" w:w="2448"/>
-            <w:vAlign w:val="center"/>
-            <w:tcMar>
-              <w:top w:w="85" w:type="dxa"/>
-              <w:left w:w="85" w:type="dxa"/>
-              <w:bottom w:w="85" w:type="dxa"/>
-              <w:right w:w="85" w:type="dxa"/>
-            </w:tcMar>
-            <w:shd w:fill="FFFFFF"/>
-          </w:tcPr>
-          <w:p>
-            <w:pPr>
-              <w:spacing w:after="20" w:before="20" w:line="240" w:lineRule="auto"/>
-            </w:pPr>
-            <w:r>
-              <w:rPr>
-                <w:b w:val="0"/>
-                <w:color w:val="000000"/>
-                <w:sz w:val="18"/>
-              </w:rPr>
-              <w:t>U18 Wildcard setup warning</w:t>
-            </w:r>
-          </w:p>
-        </w:tc>
-        <w:tc>
-          <w:tcPr>
-            <w:tcW w:type="dxa" w:w="1440"/>
-            <w:vAlign w:val="center"/>
-            <w:tcMar>
-              <w:top w:w="85" w:type="dxa"/>
-              <w:left w:w="85" w:type="dxa"/>
-              <w:bottom w:w="85" w:type="dxa"/>
-              <w:right w:w="85" w:type="dxa"/>
-            </w:tcMar>
-            <w:shd w:fill="FFFFFF"/>
-          </w:tcPr>
-          <w:p>
-            <w:pPr>
-              <w:spacing w:after="20" w:before="20" w:line="240" w:lineRule="auto"/>
-            </w:pPr>
-            <w:r>
-              <w:rPr>
-                <w:b w:val="0"/>
-                <w:color w:val="000000"/>
-                <w:sz w:val="18"/>
-              </w:rPr>
-              <w:t>04:53:17</w:t>
-            </w:r>
-          </w:p>
-        </w:tc>
-        <w:tc>
-          <w:tcPr>
-            <w:tcW w:type="dxa" w:w="6336"/>
-            <w:vAlign w:val="center"/>
-            <w:tcMar>
-              <w:top w:w="85" w:type="dxa"/>
-              <w:left w:w="85" w:type="dxa"/>
-              <w:bottom w:w="85" w:type="dxa"/>
-              <w:right w:w="85" w:type="dxa"/>
-            </w:tcMar>
-            <w:shd w:fill="FFFFFF"/>
-          </w:tcPr>
-          <w:p>
-            <w:pPr>
-              <w:spacing w:after="20" w:before="20" w:line="240" w:lineRule="auto"/>
-            </w:pPr>
-            <w:r>
-              <w:rPr>
-                <w:b w:val="0"/>
-                <w:color w:val="000000"/>
-                <w:sz w:val="18"/>
-              </w:rPr>
-              <w:t>Manual draft explains all-environment creation will not auto-enable the service and offers Configuration or a specific environment.</w:t>
             </w:r>
           </w:p>
         </w:tc>
@@ -7011,7 +6521,7 @@
                 <w:color w:val="000000"/>
                 <w:sz w:val="18"/>
               </w:rPr>
-              <w:t>U19 Invalid line draft controls</w:t>
+              <w:t>U11 Final session inventory</w:t>
             </w:r>
           </w:p>
         </w:tc>
@@ -7037,7 +6547,7 @@
                 <w:color w:val="000000"/>
                 <w:sz w:val="18"/>
               </w:rPr>
-              <w:t>04:54–04:55</w:t>
+              <w:t>04:12</w:t>
             </w:r>
           </w:p>
         </w:tc>
@@ -7063,7 +6573,7 @@
                 <w:color w:val="000000"/>
                 <w:sz w:val="18"/>
               </w:rPr>
-              <w:t>Line 0, -1 and abc kept Start disabled; 9999 enabled an unsubmitted draft and 17 restored the baseline. No runtime target validation.</w:t>
+              <w:t>All 0 / Active 0 / Inactive 0; filters cleared. Live accessibility observation after video stopped.</w:t>
             </w:r>
           </w:p>
         </w:tc>
@@ -7094,7 +6604,7 @@
                 <w:color w:val="000000"/>
                 <w:sz w:val="18"/>
               </w:rPr>
-              <w:t>U20 Source guidance</w:t>
+              <w:t>U12 Python command controls</w:t>
             </w:r>
           </w:p>
         </w:tc>
@@ -7120,7 +6630,7 @@
                 <w:color w:val="000000"/>
                 <w:sz w:val="18"/>
               </w:rPr>
-              <w:t>04:55:34</w:t>
+              <w:t>02:31:35; 03:19:52</w:t>
             </w:r>
           </w:p>
         </w:tc>
@@ -7146,7 +6656,7 @@
                 <w:color w:val="000000"/>
                 <w:sz w:val="18"/>
               </w:rPr>
-              <w:t>Missing-source explanation identifies permissions or tags as possible causes and links Learn More; it does not claim fetched source.</w:t>
+              <w:t>Invalid module command exits 1; script and suffix-free module alternatives exit 0. Local-only, not Datadog capture.</w:t>
             </w:r>
           </w:p>
         </w:tc>
@@ -7177,7 +6687,7 @@
                 <w:color w:val="000000"/>
                 <w:sz w:val="18"/>
               </w:rPr>
-              <w:t>U21 Template rejection and recovery</w:t>
+              <w:t>U13 Published finding images</w:t>
             </w:r>
           </w:p>
         </w:tc>
@@ -7203,7 +6713,7 @@
                 <w:color w:val="000000"/>
                 <w:sz w:val="18"/>
               </w:rPr>
-              <w:t>05:06:52–05:38:08</w:t>
+              <w:t>Verified by 03:59</w:t>
             </w:r>
           </w:p>
         </w:tc>
@@ -7229,7 +6739,7 @@
                 <w:color w:val="000000"/>
                 <w:sz w:val="18"/>
               </w:rPr>
-              <w:t>An actual unmatched brace disabled Start; blur added a red field outline. Correcting the brace enabled Start. Initial auto-balanced attempt excluded.</w:t>
+              <w:t>All four finding pages rendered their inline annotated image; the UX02 original-image link opened. Publication QA, not Datadog behavior.</w:t>
             </w:r>
           </w:p>
         </w:tc>
@@ -7260,7 +6770,7 @@
                 <w:color w:val="000000"/>
                 <w:sz w:val="18"/>
               </w:rPr>
-              <w:t>U22 Fixture file integrity</w:t>
+              <w:t>U14 Temporary helper shutdown</w:t>
             </w:r>
           </w:p>
         </w:tc>
@@ -7286,7 +6796,7 @@
                 <w:color w:val="000000"/>
                 <w:sz w:val="18"/>
               </w:rPr>
-              <w:t>By 05:10</w:t>
+              <w:t>04:22:42</w:t>
             </w:r>
           </w:p>
         </w:tc>
@@ -7312,7 +6822,7 @@
                 <w:color w:val="000000"/>
                 <w:sz w:val="18"/>
               </w:rPr>
-              <w:t>Downloaded A pricing.py and app.py match the local baseline byte-for-byte; intended return target remains line 17. This is not Datadog source mapping.</w:t>
+              <w:t>Two completed local setup helpers stopped; each shows zero remaining owned processes. Private configuration retained without inspection.</w:t>
             </w:r>
           </w:p>
         </w:tc>
@@ -7343,7 +6853,7 @@
                 <w:color w:val="000000"/>
                 <w:sz w:val="18"/>
               </w:rPr>
-              <w:t>U23 Python Function draft</w:t>
+              <w:t>U15 Service discovery</w:t>
             </w:r>
           </w:p>
         </w:tc>
@@ -7369,7 +6879,7 @@
                 <w:color w:val="000000"/>
                 <w:sz w:val="18"/>
               </w:rPr>
-              <w:t>05:39:50</w:t>
+              <w:t>04:50:17</w:t>
             </w:r>
           </w:p>
         </w:tc>
@@ -7395,7 +6905,7 @@
                 <w:color w:val="000000"/>
                 <w:sz w:val="18"/>
               </w:rPr>
-              <w:t>Function mode accepts Module pricing and Function calculate_quote as an enabled draft. No submit or entry/exit capture.</w:t>
+              <w:t>The synthetic sample became selectable; only wildcard environment was offered. No session or capture.</w:t>
             </w:r>
           </w:p>
         </w:tc>
@@ -7426,7 +6936,7 @@
                 <w:color w:val="000000"/>
                 <w:sz w:val="18"/>
               </w:rPr>
-              <w:t>U24 Edited draft cancellation</w:t>
+              <w:t>U16 Agent and sample snapshots</w:t>
             </w:r>
           </w:p>
         </w:tc>
@@ -7452,7 +6962,7 @@
                 <w:color w:val="000000"/>
                 <w:sz w:val="18"/>
               </w:rPr>
-              <w:t>05:43</w:t>
+              <w:t>04:47:03; 04:54:47</w:t>
             </w:r>
           </w:p>
         </w:tc>
@@ -7478,7 +6988,7 @@
                 <w:color w:val="000000"/>
                 <w:sz w:val="18"/>
               </w:rPr>
-              <w:t>Closing and reopening resets to Line mode and empty File/Line, retaining service/environment. No unsaved draft was published; reopened draft closed.</w:t>
+              <w:t>Local Agent intake/sample startup and Agent RC org/key authorization verified at these instants. Debugger SDK client registration and current liveness remain unverified.</w:t>
             </w:r>
           </w:p>
         </w:tc>
@@ -7509,7 +7019,7 @@
                 <w:color w:val="000000"/>
                 <w:sz w:val="18"/>
               </w:rPr>
-              <w:t>U25 Latest zero inventory</w:t>
+              <w:t>U17 A-only installed scope</w:t>
             </w:r>
           </w:p>
         </w:tc>
@@ -7535,7 +7045,7 @@
                 <w:color w:val="000000"/>
                 <w:sz w:val="18"/>
               </w:rPr>
-              <w:t>By 05:45</w:t>
+              <w:t>04:51:29; 05:06:05</w:t>
             </w:r>
           </w:p>
         </w:tc>
@@ -7561,7 +7071,256 @@
                 <w:color w:val="000000"/>
                 <w:sz w:val="18"/>
               </w:rPr>
-              <w:t>After rejected creates and draft cancellation, All 0 / Active 0 / Inactive 0 remained. A-only installation unchanged; active lifecycle semantics untested.</w:t>
+              <w:t>GitHub installation plus persisted one-repository selection verified, identified privately as A. B created afterward remains ungranted. Datadog association failed.</w:t>
+            </w:r>
+          </w:p>
+        </w:tc>
+      </w:tr>
+      <w:tr>
+        <w:trPr>
+          <w:cantSplit/>
+        </w:trPr>
+        <w:tc>
+          <w:tcPr>
+            <w:tcW w:type="dxa" w:w="2448"/>
+            <w:vAlign w:val="center"/>
+            <w:tcMar>
+              <w:top w:w="85" w:type="dxa"/>
+              <w:left w:w="85" w:type="dxa"/>
+              <w:bottom w:w="85" w:type="dxa"/>
+              <w:right w:w="85" w:type="dxa"/>
+            </w:tcMar>
+            <w:shd w:fill="F3F5F7"/>
+          </w:tcPr>
+          <w:p>
+            <w:pPr>
+              <w:spacing w:after="20" w:before="20" w:line="240" w:lineRule="auto"/>
+            </w:pPr>
+            <w:r>
+              <w:rPr>
+                <w:b w:val="0"/>
+                <w:color w:val="000000"/>
+                <w:sz w:val="18"/>
+              </w:rPr>
+              <w:t>U18 Wildcard setup warning</w:t>
+            </w:r>
+          </w:p>
+        </w:tc>
+        <w:tc>
+          <w:tcPr>
+            <w:tcW w:type="dxa" w:w="1440"/>
+            <w:vAlign w:val="center"/>
+            <w:tcMar>
+              <w:top w:w="85" w:type="dxa"/>
+              <w:left w:w="85" w:type="dxa"/>
+              <w:bottom w:w="85" w:type="dxa"/>
+              <w:right w:w="85" w:type="dxa"/>
+            </w:tcMar>
+            <w:shd w:fill="F3F5F7"/>
+          </w:tcPr>
+          <w:p>
+            <w:pPr>
+              <w:spacing w:after="20" w:before="20" w:line="240" w:lineRule="auto"/>
+            </w:pPr>
+            <w:r>
+              <w:rPr>
+                <w:b w:val="0"/>
+                <w:color w:val="000000"/>
+                <w:sz w:val="18"/>
+              </w:rPr>
+              <w:t>04:53:17</w:t>
+            </w:r>
+          </w:p>
+        </w:tc>
+        <w:tc>
+          <w:tcPr>
+            <w:tcW w:type="dxa" w:w="6336"/>
+            <w:vAlign w:val="center"/>
+            <w:tcMar>
+              <w:top w:w="85" w:type="dxa"/>
+              <w:left w:w="85" w:type="dxa"/>
+              <w:bottom w:w="85" w:type="dxa"/>
+              <w:right w:w="85" w:type="dxa"/>
+            </w:tcMar>
+            <w:shd w:fill="F3F5F7"/>
+          </w:tcPr>
+          <w:p>
+            <w:pPr>
+              <w:spacing w:after="20" w:before="20" w:line="240" w:lineRule="auto"/>
+            </w:pPr>
+            <w:r>
+              <w:rPr>
+                <w:b w:val="0"/>
+                <w:color w:val="000000"/>
+                <w:sz w:val="18"/>
+              </w:rPr>
+              <w:t>Manual draft explains all-environment creation will not auto-enable the service and offers Configuration or a specific environment.</w:t>
+            </w:r>
+          </w:p>
+        </w:tc>
+      </w:tr>
+      <w:tr>
+        <w:trPr>
+          <w:cantSplit/>
+        </w:trPr>
+        <w:tc>
+          <w:tcPr>
+            <w:tcW w:type="dxa" w:w="2448"/>
+            <w:vAlign w:val="center"/>
+            <w:tcMar>
+              <w:top w:w="85" w:type="dxa"/>
+              <w:left w:w="85" w:type="dxa"/>
+              <w:bottom w:w="85" w:type="dxa"/>
+              <w:right w:w="85" w:type="dxa"/>
+            </w:tcMar>
+            <w:shd w:fill="FFFFFF"/>
+          </w:tcPr>
+          <w:p>
+            <w:pPr>
+              <w:spacing w:after="20" w:before="20" w:line="240" w:lineRule="auto"/>
+            </w:pPr>
+            <w:r>
+              <w:rPr>
+                <w:b w:val="0"/>
+                <w:color w:val="000000"/>
+                <w:sz w:val="18"/>
+              </w:rPr>
+              <w:t>U19 Invalid line draft controls</w:t>
+            </w:r>
+          </w:p>
+        </w:tc>
+        <w:tc>
+          <w:tcPr>
+            <w:tcW w:type="dxa" w:w="1440"/>
+            <w:vAlign w:val="center"/>
+            <w:tcMar>
+              <w:top w:w="85" w:type="dxa"/>
+              <w:left w:w="85" w:type="dxa"/>
+              <w:bottom w:w="85" w:type="dxa"/>
+              <w:right w:w="85" w:type="dxa"/>
+            </w:tcMar>
+            <w:shd w:fill="FFFFFF"/>
+          </w:tcPr>
+          <w:p>
+            <w:pPr>
+              <w:spacing w:after="20" w:before="20" w:line="240" w:lineRule="auto"/>
+            </w:pPr>
+            <w:r>
+              <w:rPr>
+                <w:b w:val="0"/>
+                <w:color w:val="000000"/>
+                <w:sz w:val="18"/>
+              </w:rPr>
+              <w:t>04:54–04:55</w:t>
+            </w:r>
+          </w:p>
+        </w:tc>
+        <w:tc>
+          <w:tcPr>
+            <w:tcW w:type="dxa" w:w="6336"/>
+            <w:vAlign w:val="center"/>
+            <w:tcMar>
+              <w:top w:w="85" w:type="dxa"/>
+              <w:left w:w="85" w:type="dxa"/>
+              <w:bottom w:w="85" w:type="dxa"/>
+              <w:right w:w="85" w:type="dxa"/>
+            </w:tcMar>
+            <w:shd w:fill="FFFFFF"/>
+          </w:tcPr>
+          <w:p>
+            <w:pPr>
+              <w:spacing w:after="20" w:before="20" w:line="240" w:lineRule="auto"/>
+            </w:pPr>
+            <w:r>
+              <w:rPr>
+                <w:b w:val="0"/>
+                <w:color w:val="000000"/>
+                <w:sz w:val="18"/>
+              </w:rPr>
+              <w:t>Line 0, -1 and abc kept Start disabled; 9999 enabled an unsubmitted draft and 17 restored the baseline. No runtime target validation.</w:t>
+            </w:r>
+          </w:p>
+        </w:tc>
+      </w:tr>
+      <w:tr>
+        <w:trPr>
+          <w:cantSplit/>
+        </w:trPr>
+        <w:tc>
+          <w:tcPr>
+            <w:tcW w:type="dxa" w:w="2448"/>
+            <w:vAlign w:val="center"/>
+            <w:tcMar>
+              <w:top w:w="85" w:type="dxa"/>
+              <w:left w:w="85" w:type="dxa"/>
+              <w:bottom w:w="85" w:type="dxa"/>
+              <w:right w:w="85" w:type="dxa"/>
+            </w:tcMar>
+            <w:shd w:fill="F3F5F7"/>
+          </w:tcPr>
+          <w:p>
+            <w:pPr>
+              <w:spacing w:after="20" w:before="20" w:line="240" w:lineRule="auto"/>
+            </w:pPr>
+            <w:r>
+              <w:rPr>
+                <w:b w:val="0"/>
+                <w:color w:val="000000"/>
+                <w:sz w:val="18"/>
+              </w:rPr>
+              <w:t>U20 Source guidance</w:t>
+            </w:r>
+          </w:p>
+        </w:tc>
+        <w:tc>
+          <w:tcPr>
+            <w:tcW w:type="dxa" w:w="1440"/>
+            <w:vAlign w:val="center"/>
+            <w:tcMar>
+              <w:top w:w="85" w:type="dxa"/>
+              <w:left w:w="85" w:type="dxa"/>
+              <w:bottom w:w="85" w:type="dxa"/>
+              <w:right w:w="85" w:type="dxa"/>
+            </w:tcMar>
+            <w:shd w:fill="F3F5F7"/>
+          </w:tcPr>
+          <w:p>
+            <w:pPr>
+              <w:spacing w:after="20" w:before="20" w:line="240" w:lineRule="auto"/>
+            </w:pPr>
+            <w:r>
+              <w:rPr>
+                <w:b w:val="0"/>
+                <w:color w:val="000000"/>
+                <w:sz w:val="18"/>
+              </w:rPr>
+              <w:t>04:55:34</w:t>
+            </w:r>
+          </w:p>
+        </w:tc>
+        <w:tc>
+          <w:tcPr>
+            <w:tcW w:type="dxa" w:w="6336"/>
+            <w:vAlign w:val="center"/>
+            <w:tcMar>
+              <w:top w:w="85" w:type="dxa"/>
+              <w:left w:w="85" w:type="dxa"/>
+              <w:bottom w:w="85" w:type="dxa"/>
+              <w:right w:w="85" w:type="dxa"/>
+            </w:tcMar>
+            <w:shd w:fill="F3F5F7"/>
+          </w:tcPr>
+          <w:p>
+            <w:pPr>
+              <w:spacing w:after="20" w:before="20" w:line="240" w:lineRule="auto"/>
+            </w:pPr>
+            <w:r>
+              <w:rPr>
+                <w:b w:val="0"/>
+                <w:color w:val="000000"/>
+                <w:sz w:val="18"/>
+              </w:rPr>
+              <w:t>Missing-source explanation identifies permissions or tags as possible causes and links Learn More; it does not claim fetched source.</w:t>
             </w:r>
           </w:p>
         </w:tc>
@@ -7575,7 +7334,804 @@
       </w:r>
     </w:p>
     <w:p>
-      <w:hyperlink r:id="rId25">
+      <w:r>
+        <w:br w:type="page"/>
+      </w:r>
+    </w:p>
+    <w:p>
+      <w:r>
+        <w:rPr>
+          <w:b w:val="0"/>
+          <w:sz w:val="18"/>
+        </w:rPr>
+        <w:t>SUPPLEMENTAL RESULTS</w:t>
+      </w:r>
+    </w:p>
+    <w:p>
+      <w:pPr>
+        <w:pStyle w:val="Heading1"/>
+      </w:pPr>
+      <w:r>
+        <w:t>Verified setup and control checks</w:t>
+      </w:r>
+    </w:p>
+    <w:tbl>
+      <w:tblPr>
+        <w:tblW w:type="auto" w:w="0"/>
+        <w:jc w:val="center"/>
+        <w:tblLayout w:type="fixed"/>
+        <w:tblLook w:firstColumn="1" w:firstRow="1" w:lastColumn="0" w:lastRow="0" w:noHBand="0" w:noVBand="1" w:val="04A0"/>
+        <w:tblBorders>
+          <w:top w:val="single" w:sz="4" w:color="D9D9D9"/>
+          <w:left w:val="single" w:sz="4" w:color="D9D9D9"/>
+          <w:bottom w:val="single" w:sz="4" w:color="D9D9D9"/>
+          <w:right w:val="single" w:sz="4" w:color="D9D9D9"/>
+          <w:insideH w:val="single" w:sz="4" w:color="D9D9D9"/>
+          <w:insideV w:val="single" w:sz="4" w:color="D9D9D9"/>
+        </w:tblBorders>
+      </w:tblPr>
+      <w:tblGrid>
+        <w:gridCol w:w="2448"/>
+        <w:gridCol w:w="1440"/>
+        <w:gridCol w:w="6336"/>
+      </w:tblGrid>
+      <w:tr>
+        <w:trPr>
+          <w:tblHeader/>
+        </w:trPr>
+        <w:tc>
+          <w:tcPr>
+            <w:tcW w:type="dxa" w:w="2448"/>
+            <w:vAlign w:val="center"/>
+            <w:tcMar>
+              <w:top w:w="85" w:type="dxa"/>
+              <w:left w:w="85" w:type="dxa"/>
+              <w:bottom w:w="85" w:type="dxa"/>
+              <w:right w:w="85" w:type="dxa"/>
+            </w:tcMar>
+            <w:shd w:fill="24384B"/>
+          </w:tcPr>
+          <w:p>
+            <w:pPr>
+              <w:spacing w:after="20" w:before="20" w:line="240" w:lineRule="auto"/>
+            </w:pPr>
+            <w:r>
+              <w:rPr>
+                <w:b/>
+                <w:color w:val="FFFFFF"/>
+                <w:sz w:val="18"/>
+              </w:rPr>
+              <w:t>Check</w:t>
+            </w:r>
+          </w:p>
+        </w:tc>
+        <w:tc>
+          <w:tcPr>
+            <w:tcW w:type="dxa" w:w="1440"/>
+            <w:vAlign w:val="center"/>
+            <w:tcMar>
+              <w:top w:w="85" w:type="dxa"/>
+              <w:left w:w="85" w:type="dxa"/>
+              <w:bottom w:w="85" w:type="dxa"/>
+              <w:right w:w="85" w:type="dxa"/>
+            </w:tcMar>
+            <w:shd w:fill="24384B"/>
+          </w:tcPr>
+          <w:p>
+            <w:pPr>
+              <w:spacing w:after="20" w:before="20" w:line="240" w:lineRule="auto"/>
+            </w:pPr>
+            <w:r>
+              <w:rPr>
+                <w:b/>
+                <w:color w:val="FFFFFF"/>
+                <w:sz w:val="18"/>
+              </w:rPr>
+              <w:t>UTC</w:t>
+            </w:r>
+          </w:p>
+        </w:tc>
+        <w:tc>
+          <w:tcPr>
+            <w:tcW w:type="dxa" w:w="6336"/>
+            <w:vAlign w:val="center"/>
+            <w:tcMar>
+              <w:top w:w="85" w:type="dxa"/>
+              <w:left w:w="85" w:type="dxa"/>
+              <w:bottom w:w="85" w:type="dxa"/>
+              <w:right w:w="85" w:type="dxa"/>
+            </w:tcMar>
+            <w:shd w:fill="24384B"/>
+          </w:tcPr>
+          <w:p>
+            <w:pPr>
+              <w:spacing w:after="20" w:before="20" w:line="240" w:lineRule="auto"/>
+            </w:pPr>
+            <w:r>
+              <w:rPr>
+                <w:b/>
+                <w:color w:val="FFFFFF"/>
+                <w:sz w:val="18"/>
+              </w:rPr>
+              <w:t>Verified scope</w:t>
+            </w:r>
+          </w:p>
+        </w:tc>
+      </w:tr>
+      <w:tr>
+        <w:trPr>
+          <w:cantSplit/>
+        </w:trPr>
+        <w:tc>
+          <w:tcPr>
+            <w:tcW w:type="dxa" w:w="2448"/>
+            <w:vAlign w:val="center"/>
+            <w:tcMar>
+              <w:top w:w="85" w:type="dxa"/>
+              <w:left w:w="85" w:type="dxa"/>
+              <w:bottom w:w="85" w:type="dxa"/>
+              <w:right w:w="85" w:type="dxa"/>
+            </w:tcMar>
+            <w:shd w:fill="FFFFFF"/>
+          </w:tcPr>
+          <w:p>
+            <w:pPr>
+              <w:spacing w:after="20" w:before="20" w:line="240" w:lineRule="auto"/>
+            </w:pPr>
+            <w:r>
+              <w:rPr>
+                <w:b w:val="0"/>
+                <w:color w:val="000000"/>
+                <w:sz w:val="18"/>
+              </w:rPr>
+              <w:t>U21 Template rejection and recovery</w:t>
+            </w:r>
+          </w:p>
+        </w:tc>
+        <w:tc>
+          <w:tcPr>
+            <w:tcW w:type="dxa" w:w="1440"/>
+            <w:vAlign w:val="center"/>
+            <w:tcMar>
+              <w:top w:w="85" w:type="dxa"/>
+              <w:left w:w="85" w:type="dxa"/>
+              <w:bottom w:w="85" w:type="dxa"/>
+              <w:right w:w="85" w:type="dxa"/>
+            </w:tcMar>
+            <w:shd w:fill="FFFFFF"/>
+          </w:tcPr>
+          <w:p>
+            <w:pPr>
+              <w:spacing w:after="20" w:before="20" w:line="240" w:lineRule="auto"/>
+            </w:pPr>
+            <w:r>
+              <w:rPr>
+                <w:b w:val="0"/>
+                <w:color w:val="000000"/>
+                <w:sz w:val="18"/>
+              </w:rPr>
+              <w:t>05:06:52–05:38:08</w:t>
+            </w:r>
+          </w:p>
+        </w:tc>
+        <w:tc>
+          <w:tcPr>
+            <w:tcW w:type="dxa" w:w="6336"/>
+            <w:vAlign w:val="center"/>
+            <w:tcMar>
+              <w:top w:w="85" w:type="dxa"/>
+              <w:left w:w="85" w:type="dxa"/>
+              <w:bottom w:w="85" w:type="dxa"/>
+              <w:right w:w="85" w:type="dxa"/>
+            </w:tcMar>
+            <w:shd w:fill="FFFFFF"/>
+          </w:tcPr>
+          <w:p>
+            <w:pPr>
+              <w:spacing w:after="20" w:before="20" w:line="240" w:lineRule="auto"/>
+            </w:pPr>
+            <w:r>
+              <w:rPr>
+                <w:b w:val="0"/>
+                <w:color w:val="000000"/>
+                <w:sz w:val="18"/>
+              </w:rPr>
+              <w:t>An actual unmatched brace disabled Start; blur added a red field outline. Correcting the brace enabled Start. Initial auto-balanced attempt excluded.</w:t>
+            </w:r>
+          </w:p>
+        </w:tc>
+      </w:tr>
+      <w:tr>
+        <w:trPr>
+          <w:cantSplit/>
+        </w:trPr>
+        <w:tc>
+          <w:tcPr>
+            <w:tcW w:type="dxa" w:w="2448"/>
+            <w:vAlign w:val="center"/>
+            <w:tcMar>
+              <w:top w:w="85" w:type="dxa"/>
+              <w:left w:w="85" w:type="dxa"/>
+              <w:bottom w:w="85" w:type="dxa"/>
+              <w:right w:w="85" w:type="dxa"/>
+            </w:tcMar>
+            <w:shd w:fill="F3F5F7"/>
+          </w:tcPr>
+          <w:p>
+            <w:pPr>
+              <w:spacing w:after="20" w:before="20" w:line="240" w:lineRule="auto"/>
+            </w:pPr>
+            <w:r>
+              <w:rPr>
+                <w:b w:val="0"/>
+                <w:color w:val="000000"/>
+                <w:sz w:val="18"/>
+              </w:rPr>
+              <w:t>U22 Fixture file integrity</w:t>
+            </w:r>
+          </w:p>
+        </w:tc>
+        <w:tc>
+          <w:tcPr>
+            <w:tcW w:type="dxa" w:w="1440"/>
+            <w:vAlign w:val="center"/>
+            <w:tcMar>
+              <w:top w:w="85" w:type="dxa"/>
+              <w:left w:w="85" w:type="dxa"/>
+              <w:bottom w:w="85" w:type="dxa"/>
+              <w:right w:w="85" w:type="dxa"/>
+            </w:tcMar>
+            <w:shd w:fill="F3F5F7"/>
+          </w:tcPr>
+          <w:p>
+            <w:pPr>
+              <w:spacing w:after="20" w:before="20" w:line="240" w:lineRule="auto"/>
+            </w:pPr>
+            <w:r>
+              <w:rPr>
+                <w:b w:val="0"/>
+                <w:color w:val="000000"/>
+                <w:sz w:val="18"/>
+              </w:rPr>
+              <w:t>By 05:10</w:t>
+            </w:r>
+          </w:p>
+        </w:tc>
+        <w:tc>
+          <w:tcPr>
+            <w:tcW w:type="dxa" w:w="6336"/>
+            <w:vAlign w:val="center"/>
+            <w:tcMar>
+              <w:top w:w="85" w:type="dxa"/>
+              <w:left w:w="85" w:type="dxa"/>
+              <w:bottom w:w="85" w:type="dxa"/>
+              <w:right w:w="85" w:type="dxa"/>
+            </w:tcMar>
+            <w:shd w:fill="F3F5F7"/>
+          </w:tcPr>
+          <w:p>
+            <w:pPr>
+              <w:spacing w:after="20" w:before="20" w:line="240" w:lineRule="auto"/>
+            </w:pPr>
+            <w:r>
+              <w:rPr>
+                <w:b w:val="0"/>
+                <w:color w:val="000000"/>
+                <w:sz w:val="18"/>
+              </w:rPr>
+              <w:t>Downloaded A pricing.py and app.py match the local baseline byte-for-byte; intended return target remains line 17. This is not Datadog source mapping.</w:t>
+            </w:r>
+          </w:p>
+        </w:tc>
+      </w:tr>
+      <w:tr>
+        <w:trPr>
+          <w:cantSplit/>
+        </w:trPr>
+        <w:tc>
+          <w:tcPr>
+            <w:tcW w:type="dxa" w:w="2448"/>
+            <w:vAlign w:val="center"/>
+            <w:tcMar>
+              <w:top w:w="85" w:type="dxa"/>
+              <w:left w:w="85" w:type="dxa"/>
+              <w:bottom w:w="85" w:type="dxa"/>
+              <w:right w:w="85" w:type="dxa"/>
+            </w:tcMar>
+            <w:shd w:fill="FFFFFF"/>
+          </w:tcPr>
+          <w:p>
+            <w:pPr>
+              <w:spacing w:after="20" w:before="20" w:line="240" w:lineRule="auto"/>
+            </w:pPr>
+            <w:r>
+              <w:rPr>
+                <w:b w:val="0"/>
+                <w:color w:val="000000"/>
+                <w:sz w:val="18"/>
+              </w:rPr>
+              <w:t>U23 Python Function draft</w:t>
+            </w:r>
+          </w:p>
+        </w:tc>
+        <w:tc>
+          <w:tcPr>
+            <w:tcW w:type="dxa" w:w="1440"/>
+            <w:vAlign w:val="center"/>
+            <w:tcMar>
+              <w:top w:w="85" w:type="dxa"/>
+              <w:left w:w="85" w:type="dxa"/>
+              <w:bottom w:w="85" w:type="dxa"/>
+              <w:right w:w="85" w:type="dxa"/>
+            </w:tcMar>
+            <w:shd w:fill="FFFFFF"/>
+          </w:tcPr>
+          <w:p>
+            <w:pPr>
+              <w:spacing w:after="20" w:before="20" w:line="240" w:lineRule="auto"/>
+            </w:pPr>
+            <w:r>
+              <w:rPr>
+                <w:b w:val="0"/>
+                <w:color w:val="000000"/>
+                <w:sz w:val="18"/>
+              </w:rPr>
+              <w:t>05:39:50</w:t>
+            </w:r>
+          </w:p>
+        </w:tc>
+        <w:tc>
+          <w:tcPr>
+            <w:tcW w:type="dxa" w:w="6336"/>
+            <w:vAlign w:val="center"/>
+            <w:tcMar>
+              <w:top w:w="85" w:type="dxa"/>
+              <w:left w:w="85" w:type="dxa"/>
+              <w:bottom w:w="85" w:type="dxa"/>
+              <w:right w:w="85" w:type="dxa"/>
+            </w:tcMar>
+            <w:shd w:fill="FFFFFF"/>
+          </w:tcPr>
+          <w:p>
+            <w:pPr>
+              <w:spacing w:after="20" w:before="20" w:line="240" w:lineRule="auto"/>
+            </w:pPr>
+            <w:r>
+              <w:rPr>
+                <w:b w:val="0"/>
+                <w:color w:val="000000"/>
+                <w:sz w:val="18"/>
+              </w:rPr>
+              <w:t>Function mode accepts Module pricing and Function calculate_quote as an enabled draft. No submit or entry/exit capture.</w:t>
+            </w:r>
+          </w:p>
+        </w:tc>
+      </w:tr>
+      <w:tr>
+        <w:trPr>
+          <w:cantSplit/>
+        </w:trPr>
+        <w:tc>
+          <w:tcPr>
+            <w:tcW w:type="dxa" w:w="2448"/>
+            <w:vAlign w:val="center"/>
+            <w:tcMar>
+              <w:top w:w="85" w:type="dxa"/>
+              <w:left w:w="85" w:type="dxa"/>
+              <w:bottom w:w="85" w:type="dxa"/>
+              <w:right w:w="85" w:type="dxa"/>
+            </w:tcMar>
+            <w:shd w:fill="F3F5F7"/>
+          </w:tcPr>
+          <w:p>
+            <w:pPr>
+              <w:spacing w:after="20" w:before="20" w:line="240" w:lineRule="auto"/>
+            </w:pPr>
+            <w:r>
+              <w:rPr>
+                <w:b w:val="0"/>
+                <w:color w:val="000000"/>
+                <w:sz w:val="18"/>
+              </w:rPr>
+              <w:t>U24 Edited draft cancellation</w:t>
+            </w:r>
+          </w:p>
+        </w:tc>
+        <w:tc>
+          <w:tcPr>
+            <w:tcW w:type="dxa" w:w="1440"/>
+            <w:vAlign w:val="center"/>
+            <w:tcMar>
+              <w:top w:w="85" w:type="dxa"/>
+              <w:left w:w="85" w:type="dxa"/>
+              <w:bottom w:w="85" w:type="dxa"/>
+              <w:right w:w="85" w:type="dxa"/>
+            </w:tcMar>
+            <w:shd w:fill="F3F5F7"/>
+          </w:tcPr>
+          <w:p>
+            <w:pPr>
+              <w:spacing w:after="20" w:before="20" w:line="240" w:lineRule="auto"/>
+            </w:pPr>
+            <w:r>
+              <w:rPr>
+                <w:b w:val="0"/>
+                <w:color w:val="000000"/>
+                <w:sz w:val="18"/>
+              </w:rPr>
+              <w:t>05:43</w:t>
+            </w:r>
+          </w:p>
+        </w:tc>
+        <w:tc>
+          <w:tcPr>
+            <w:tcW w:type="dxa" w:w="6336"/>
+            <w:vAlign w:val="center"/>
+            <w:tcMar>
+              <w:top w:w="85" w:type="dxa"/>
+              <w:left w:w="85" w:type="dxa"/>
+              <w:bottom w:w="85" w:type="dxa"/>
+              <w:right w:w="85" w:type="dxa"/>
+            </w:tcMar>
+            <w:shd w:fill="F3F5F7"/>
+          </w:tcPr>
+          <w:p>
+            <w:pPr>
+              <w:spacing w:after="20" w:before="20" w:line="240" w:lineRule="auto"/>
+            </w:pPr>
+            <w:r>
+              <w:rPr>
+                <w:b w:val="0"/>
+                <w:color w:val="000000"/>
+                <w:sz w:val="18"/>
+              </w:rPr>
+              <w:t>Closing and reopening resets to Line mode and empty File/Line, retaining service/environment. No unsaved draft was published; reopened draft closed.</w:t>
+            </w:r>
+          </w:p>
+        </w:tc>
+      </w:tr>
+      <w:tr>
+        <w:trPr>
+          <w:cantSplit/>
+        </w:trPr>
+        <w:tc>
+          <w:tcPr>
+            <w:tcW w:type="dxa" w:w="2448"/>
+            <w:vAlign w:val="center"/>
+            <w:tcMar>
+              <w:top w:w="85" w:type="dxa"/>
+              <w:left w:w="85" w:type="dxa"/>
+              <w:bottom w:w="85" w:type="dxa"/>
+              <w:right w:w="85" w:type="dxa"/>
+            </w:tcMar>
+            <w:shd w:fill="FFFFFF"/>
+          </w:tcPr>
+          <w:p>
+            <w:pPr>
+              <w:spacing w:after="20" w:before="20" w:line="240" w:lineRule="auto"/>
+            </w:pPr>
+            <w:r>
+              <w:rPr>
+                <w:b w:val="0"/>
+                <w:color w:val="000000"/>
+                <w:sz w:val="18"/>
+              </w:rPr>
+              <w:t>U25 Latest zero inventory</w:t>
+            </w:r>
+          </w:p>
+        </w:tc>
+        <w:tc>
+          <w:tcPr>
+            <w:tcW w:type="dxa" w:w="1440"/>
+            <w:vAlign w:val="center"/>
+            <w:tcMar>
+              <w:top w:w="85" w:type="dxa"/>
+              <w:left w:w="85" w:type="dxa"/>
+              <w:bottom w:w="85" w:type="dxa"/>
+              <w:right w:w="85" w:type="dxa"/>
+            </w:tcMar>
+            <w:shd w:fill="FFFFFF"/>
+          </w:tcPr>
+          <w:p>
+            <w:pPr>
+              <w:spacing w:after="20" w:before="20" w:line="240" w:lineRule="auto"/>
+            </w:pPr>
+            <w:r>
+              <w:rPr>
+                <w:b w:val="0"/>
+                <w:color w:val="000000"/>
+                <w:sz w:val="18"/>
+              </w:rPr>
+              <w:t>By 05:45</w:t>
+            </w:r>
+          </w:p>
+        </w:tc>
+        <w:tc>
+          <w:tcPr>
+            <w:tcW w:type="dxa" w:w="6336"/>
+            <w:vAlign w:val="center"/>
+            <w:tcMar>
+              <w:top w:w="85" w:type="dxa"/>
+              <w:left w:w="85" w:type="dxa"/>
+              <w:bottom w:w="85" w:type="dxa"/>
+              <w:right w:w="85" w:type="dxa"/>
+            </w:tcMar>
+            <w:shd w:fill="FFFFFF"/>
+          </w:tcPr>
+          <w:p>
+            <w:pPr>
+              <w:spacing w:after="20" w:before="20" w:line="240" w:lineRule="auto"/>
+            </w:pPr>
+            <w:r>
+              <w:rPr>
+                <w:b w:val="0"/>
+                <w:color w:val="000000"/>
+                <w:sz w:val="18"/>
+              </w:rPr>
+              <w:t>After rejected creates and draft cancellation, All 0 / Active 0 / Inactive 0 remained. A-only installation unchanged; active lifecycle semantics untested.</w:t>
+            </w:r>
+          </w:p>
+        </w:tc>
+      </w:tr>
+      <w:tr>
+        <w:trPr>
+          <w:cantSplit/>
+        </w:trPr>
+        <w:tc>
+          <w:tcPr>
+            <w:tcW w:type="dxa" w:w="2448"/>
+            <w:vAlign w:val="center"/>
+            <w:tcMar>
+              <w:top w:w="85" w:type="dxa"/>
+              <w:left w:w="85" w:type="dxa"/>
+              <w:bottom w:w="85" w:type="dxa"/>
+              <w:right w:w="85" w:type="dxa"/>
+            </w:tcMar>
+            <w:shd w:fill="F3F5F7"/>
+          </w:tcPr>
+          <w:p>
+            <w:pPr>
+              <w:spacing w:after="20" w:before="20" w:line="240" w:lineRule="auto"/>
+            </w:pPr>
+            <w:r>
+              <w:rPr>
+                <w:b w:val="0"/>
+                <w:color w:val="000000"/>
+                <w:sz w:val="18"/>
+              </w:rPr>
+              <w:t>U26 Historical APM ingestion</w:t>
+            </w:r>
+          </w:p>
+        </w:tc>
+        <w:tc>
+          <w:tcPr>
+            <w:tcW w:type="dxa" w:w="1440"/>
+            <w:vAlign w:val="center"/>
+            <w:tcMar>
+              <w:top w:w="85" w:type="dxa"/>
+              <w:left w:w="85" w:type="dxa"/>
+              <w:bottom w:w="85" w:type="dxa"/>
+              <w:right w:w="85" w:type="dxa"/>
+            </w:tcMar>
+            <w:shd w:fill="F3F5F7"/>
+          </w:tcPr>
+          <w:p>
+            <w:pPr>
+              <w:spacing w:after="20" w:before="20" w:line="240" w:lineRule="auto"/>
+            </w:pPr>
+            <w:r>
+              <w:rPr>
+                <w:b w:val="0"/>
+                <w:color w:val="000000"/>
+                <w:sz w:val="18"/>
+              </w:rPr>
+              <w:t>05:49–06:21</w:t>
+            </w:r>
+          </w:p>
+        </w:tc>
+        <w:tc>
+          <w:tcPr>
+            <w:tcW w:type="dxa" w:w="6336"/>
+            <w:vAlign w:val="center"/>
+            <w:tcMar>
+              <w:top w:w="85" w:type="dxa"/>
+              <w:left w:w="85" w:type="dxa"/>
+              <w:bottom w:w="85" w:type="dxa"/>
+              <w:right w:w="85" w:type="dxa"/>
+            </w:tcMar>
+            <w:shd w:fill="F3F5F7"/>
+          </w:tcPr>
+          <w:p>
+            <w:pPr>
+              <w:spacing w:after="20" w:before="20" w:line="240" w:lineRule="auto"/>
+            </w:pPr>
+            <w:r>
+              <w:rPr>
+                <w:b w:val="0"/>
+                <w:color w:val="000000"/>
+                <w:sz w:val="18"/>
+              </w:rPr>
+              <w:t>47 indexed spans recovered; an actual old span carries HTTP 200, Python, staging, version 0.1.0 and the baseline commit. No debugger capture or source retrieval.</w:t>
+            </w:r>
+          </w:p>
+        </w:tc>
+      </w:tr>
+      <w:tr>
+        <w:trPr>
+          <w:cantSplit/>
+        </w:trPr>
+        <w:tc>
+          <w:tcPr>
+            <w:tcW w:type="dxa" w:w="2448"/>
+            <w:vAlign w:val="center"/>
+            <w:tcMar>
+              <w:top w:w="85" w:type="dxa"/>
+              <w:left w:w="85" w:type="dxa"/>
+              <w:bottom w:w="85" w:type="dxa"/>
+              <w:right w:w="85" w:type="dxa"/>
+            </w:tcMar>
+            <w:shd w:fill="FFFFFF"/>
+          </w:tcPr>
+          <w:p>
+            <w:pPr>
+              <w:spacing w:after="20" w:before="20" w:line="240" w:lineRule="auto"/>
+            </w:pPr>
+            <w:r>
+              <w:rPr>
+                <w:b w:val="0"/>
+                <w:color w:val="000000"/>
+                <w:sz w:val="18"/>
+              </w:rPr>
+              <w:t>U27 APM time-window recovery</w:t>
+            </w:r>
+          </w:p>
+        </w:tc>
+        <w:tc>
+          <w:tcPr>
+            <w:tcW w:type="dxa" w:w="1440"/>
+            <w:vAlign w:val="center"/>
+            <w:tcMar>
+              <w:top w:w="85" w:type="dxa"/>
+              <w:left w:w="85" w:type="dxa"/>
+              <w:bottom w:w="85" w:type="dxa"/>
+              <w:right w:w="85" w:type="dxa"/>
+            </w:tcMar>
+            <w:shd w:fill="FFFFFF"/>
+          </w:tcPr>
+          <w:p>
+            <w:pPr>
+              <w:spacing w:after="20" w:before="20" w:line="240" w:lineRule="auto"/>
+            </w:pPr>
+            <w:r>
+              <w:rPr>
+                <w:b w:val="0"/>
+                <w:color w:val="000000"/>
+                <w:sz w:val="18"/>
+              </w:rPr>
+              <w:t>05:55–06:21</w:t>
+            </w:r>
+          </w:p>
+        </w:tc>
+        <w:tc>
+          <w:tcPr>
+            <w:tcW w:type="dxa" w:w="6336"/>
+            <w:vAlign w:val="center"/>
+            <w:tcMar>
+              <w:top w:w="85" w:type="dxa"/>
+              <w:left w:w="85" w:type="dxa"/>
+              <w:bottom w:w="85" w:type="dxa"/>
+              <w:right w:w="85" w:type="dxa"/>
+            </w:tcMar>
+            <w:shd w:fill="FFFFFF"/>
+          </w:tcPr>
+          <w:p>
+            <w:pPr>
+              <w:spacing w:after="20" w:before="20" w:line="240" w:lineRule="auto"/>
+            </w:pPr>
+            <w:r>
+              <w:rPr>
+                <w:b w:val="0"/>
+                <w:color w:val="000000"/>
+                <w:sz w:val="18"/>
+              </w:rPr>
+              <w:t>Empty recent search offered a wider timeframe; one-hour history recovered spans. This is APM search behavior, not debugger result filtering.</w:t>
+            </w:r>
+          </w:p>
+        </w:tc>
+      </w:tr>
+      <w:tr>
+        <w:trPr>
+          <w:cantSplit/>
+        </w:trPr>
+        <w:tc>
+          <w:tcPr>
+            <w:tcW w:type="dxa" w:w="2448"/>
+            <w:vAlign w:val="center"/>
+            <w:tcMar>
+              <w:top w:w="85" w:type="dxa"/>
+              <w:left w:w="85" w:type="dxa"/>
+              <w:bottom w:w="85" w:type="dxa"/>
+              <w:right w:w="85" w:type="dxa"/>
+            </w:tcMar>
+            <w:shd w:fill="F3F5F7"/>
+          </w:tcPr>
+          <w:p>
+            <w:pPr>
+              <w:spacing w:after="20" w:before="20" w:line="240" w:lineRule="auto"/>
+            </w:pPr>
+            <w:r>
+              <w:rPr>
+                <w:b w:val="0"/>
+                <w:color w:val="000000"/>
+                <w:sz w:val="18"/>
+              </w:rPr>
+              <w:t>U28 SDK freshness guidance</w:t>
+            </w:r>
+          </w:p>
+        </w:tc>
+        <w:tc>
+          <w:tcPr>
+            <w:tcW w:type="dxa" w:w="1440"/>
+            <w:vAlign w:val="center"/>
+            <w:tcMar>
+              <w:top w:w="85" w:type="dxa"/>
+              <w:left w:w="85" w:type="dxa"/>
+              <w:bottom w:w="85" w:type="dxa"/>
+              <w:right w:w="85" w:type="dxa"/>
+            </w:tcMar>
+            <w:shd w:fill="F3F5F7"/>
+          </w:tcPr>
+          <w:p>
+            <w:pPr>
+              <w:spacing w:after="20" w:before="20" w:line="240" w:lineRule="auto"/>
+            </w:pPr>
+            <w:r>
+              <w:rPr>
+                <w:b w:val="0"/>
+                <w:color w:val="000000"/>
+                <w:sz w:val="18"/>
+              </w:rPr>
+              <w:t>By 06:15</w:t>
+            </w:r>
+          </w:p>
+        </w:tc>
+        <w:tc>
+          <w:tcPr>
+            <w:tcW w:type="dxa" w:w="6336"/>
+            <w:vAlign w:val="center"/>
+            <w:tcMar>
+              <w:top w:w="85" w:type="dxa"/>
+              <w:left w:w="85" w:type="dxa"/>
+              <w:bottom w:w="85" w:type="dxa"/>
+              <w:right w:w="85" w:type="dxa"/>
+            </w:tcMar>
+            <w:shd w:fill="F3F5F7"/>
+          </w:tcPr>
+          <w:p>
+            <w:pPr>
+              <w:spacing w:after="20" w:before="20" w:line="240" w:lineRule="auto"/>
+            </w:pPr>
+            <w:r>
+              <w:rPr>
+                <w:b w:val="0"/>
+                <w:color w:val="000000"/>
+                <w:sz w:val="18"/>
+              </w:rPr>
+              <w:t>SDK Configurations states no data detected in the last 15 minutes and suggests runtime, telemetry and intake checks. Stopped runtime is compatible; no registration-failure conclusion.</w:t>
+            </w:r>
+          </w:p>
+        </w:tc>
+      </w:tr>
+    </w:tbl>
+    <w:p>
+      <w:r>
+        <w:rPr>
+          <w:b w:val="0"/>
+        </w:rPr>
+      </w:r>
+    </w:p>
+    <w:p>
+      <w:hyperlink r:id="rId27">
         <w:r>
           <w:rPr>
             <w:color w:val="164F80"/>
@@ -7611,7 +8167,7 @@
         <w:rPr>
           <w:b w:val="0"/>
         </w:rPr>
-        <w:t>Runtime readiness and Remote Configuration were verified briefly after approval. Runtime then stopped at an additional telemetry-destination boundary. GitHub installation and authorization are verified; Datadog association remains unconnected. No debugger capture was proved. Earlier RC eligibility was unknown, not verified misconfiguration.</w:t>
+        <w:t>Local Agent intake/sample startup and Agent RC authorization were verified briefly. Historical APM ingestion was later verified; debugger SDK client registration remains unverified. Runtime remains stopped at an additional telemetry-destination boundary. GitHub installation and authorization are verified; Datadog association remains unconnected. No debugger capture was proved. Earlier RC eligibility was unknown, not verified misconfiguration.</w:t>
       </w:r>
     </w:p>
     <w:tbl>
@@ -8012,7 +8568,7 @@
         <w:rPr>
           <w:b w:val="0"/>
         </w:rPr>
-        <w:t>Two baseline attempts were rejected with visible error toasts with console HTTP 400; the fresh unfiltered list remained All 0 / Active 0 / Inactive 0. Edited and reopened drafts were closed by 05:45; no entities were created. Runtime is stopped after an additional-destination boundary. The approved A-only App installation, A/B repositories and accounts are retained. The old no-App-grant inventory is historical. Current full inventory/cleanup remains incomplete under C02.</w:t>
+        <w:t>Two baseline attempts were rejected with visible error toasts with console HTTP 400; the fresh unfiltered list remained All 0 / Active 0 / Inactive 0. Edited/reopened drafts and the later accessibility draft were closed; no entities were created. Runtime is stopped after an additional-destination boundary. The approved A-only App installation, A/B repositories and accounts are retained. The old no-App-grant inventory is historical. Current full inventory/cleanup remains incomplete under C02.</w:t>
       </w:r>
     </w:p>
     <w:p>
@@ -8026,7 +8582,7 @@
           <w:b w:val="0"/>
           <w:sz w:val="18"/>
         </w:rPr>
-        <w:t>63 CASE CHECKPOINT  |  2 SCOPED PASS  |  3 FINDING  |  58 BLOCKED</w:t>
+        <w:t>63 CASE CHECKPOINT  |  2 SCOPED PASS  |  4 FINDING  |  57 BLOCKED</w:t>
       </w:r>
     </w:p>
     <w:p>
@@ -8865,7 +9421,7 @@
                 <w:color w:val="000000"/>
                 <w:sz w:val="18"/>
               </w:rPr>
-              <w:t>BLOCKED</w:t>
+              <w:t>FINDING</w:t>
             </w:r>
           </w:p>
         </w:tc>
@@ -8891,7 +9447,7 @@
                 <w:color w:val="000000"/>
                 <w:sz w:val="18"/>
               </w:rPr>
-              <w:t>125% modal focus/Escape passed. Later draft validation is separate; code-gutter, long-path and validation-accessibility coverage remains incomplete.</w:t>
+              <w:t>LOW UX03: invalid template has visible validation but no explanatory text in the observed state. Full screen-reader/Line naming coverage untested.</w:t>
             </w:r>
           </w:p>
         </w:tc>
@@ -8905,7 +9461,7 @@
       </w:r>
     </w:p>
     <w:p>
-      <w:hyperlink r:id="rId26">
+      <w:hyperlink r:id="rId28">
         <w:r>
           <w:rPr>
             <w:color w:val="164F80"/>
@@ -8925,7 +9481,7 @@
           <w:b w:val="0"/>
           <w:sz w:val="18"/>
         </w:rPr>
-        <w:t>63 CASE CHECKPOINT  |  2 SCOPED PASS  |  3 FINDING  |  58 BLOCKED</w:t>
+        <w:t>63 CASE CHECKPOINT  |  2 SCOPED PASS  |  4 FINDING  |  57 BLOCKED</w:t>
       </w:r>
     </w:p>
     <w:p>
@@ -9804,7 +10360,7 @@
       </w:r>
     </w:p>
     <w:p>
-      <w:hyperlink r:id="rId26">
+      <w:hyperlink r:id="rId28">
         <w:r>
           <w:rPr>
             <w:color w:val="164F80"/>
@@ -9824,7 +10380,7 @@
           <w:b w:val="0"/>
           <w:sz w:val="18"/>
         </w:rPr>
-        <w:t>63 CASE CHECKPOINT  |  2 SCOPED PASS  |  3 FINDING  |  58 BLOCKED</w:t>
+        <w:t>63 CASE CHECKPOINT  |  2 SCOPED PASS  |  4 FINDING  |  57 BLOCKED</w:t>
       </w:r>
     </w:p>
     <w:p>
@@ -10703,7 +11259,7 @@
       </w:r>
     </w:p>
     <w:p>
-      <w:hyperlink r:id="rId26">
+      <w:hyperlink r:id="rId28">
         <w:r>
           <w:rPr>
             <w:color w:val="164F80"/>
@@ -10723,7 +11279,7 @@
           <w:b w:val="0"/>
           <w:sz w:val="18"/>
         </w:rPr>
-        <w:t>63 CASE CHECKPOINT  |  2 SCOPED PASS  |  3 FINDING  |  58 BLOCKED</w:t>
+        <w:t>63 CASE CHECKPOINT  |  2 SCOPED PASS  |  4 FINDING  |  57 BLOCKED</w:t>
       </w:r>
     </w:p>
     <w:p>
@@ -11602,7 +12158,7 @@
       </w:r>
     </w:p>
     <w:p>
-      <w:hyperlink r:id="rId26">
+      <w:hyperlink r:id="rId28">
         <w:r>
           <w:rPr>
             <w:color w:val="164F80"/>
@@ -11622,7 +12178,7 @@
           <w:b w:val="0"/>
           <w:sz w:val="18"/>
         </w:rPr>
-        <w:t>63 CASE CHECKPOINT  |  2 SCOPED PASS  |  3 FINDING  |  58 BLOCKED</w:t>
+        <w:t>63 CASE CHECKPOINT  |  2 SCOPED PASS  |  4 FINDING  |  57 BLOCKED</w:t>
       </w:r>
     </w:p>
     <w:p>
@@ -12501,7 +13057,7 @@
       </w:r>
     </w:p>
     <w:p>
-      <w:hyperlink r:id="rId26">
+      <w:hyperlink r:id="rId28">
         <w:r>
           <w:rPr>
             <w:color w:val="164F80"/>
@@ -12521,7 +13077,7 @@
           <w:b w:val="0"/>
           <w:sz w:val="18"/>
         </w:rPr>
-        <w:t>63 CASE CHECKPOINT  |  2 SCOPED PASS  |  3 FINDING  |  58 BLOCKED</w:t>
+        <w:t>63 CASE CHECKPOINT  |  2 SCOPED PASS  |  4 FINDING  |  57 BLOCKED</w:t>
       </w:r>
     </w:p>
     <w:p>
@@ -13400,7 +13956,7 @@
       </w:r>
     </w:p>
     <w:p>
-      <w:hyperlink r:id="rId26">
+      <w:hyperlink r:id="rId28">
         <w:r>
           <w:rPr>
             <w:color w:val="164F80"/>
@@ -13420,7 +13976,7 @@
           <w:b w:val="0"/>
           <w:sz w:val="18"/>
         </w:rPr>
-        <w:t>63 CASE CHECKPOINT  |  2 SCOPED PASS  |  3 FINDING  |  58 BLOCKED</w:t>
+        <w:t>63 CASE CHECKPOINT  |  2 SCOPED PASS  |  4 FINDING  |  57 BLOCKED</w:t>
       </w:r>
     </w:p>
     <w:p>
@@ -14299,7 +14855,7 @@
       </w:r>
     </w:p>
     <w:p>
-      <w:hyperlink r:id="rId26">
+      <w:hyperlink r:id="rId28">
         <w:r>
           <w:rPr>
             <w:color w:val="164F80"/>
@@ -15151,6 +15707,120 @@
                 <w:sz w:val="18"/>
               </w:rPr>
               <w:t>Protection that removes or masks selected data. Missing, unavailable, and redacted values mean different things.</w:t>
+            </w:r>
+          </w:p>
+        </w:tc>
+      </w:tr>
+      <w:tr>
+        <w:trPr>
+          <w:cantSplit/>
+        </w:trPr>
+        <w:tc>
+          <w:tcPr>
+            <w:tcW w:type="dxa" w:w="2088"/>
+            <w:vAlign w:val="center"/>
+            <w:tcMar>
+              <w:top w:w="85" w:type="dxa"/>
+              <w:left w:w="85" w:type="dxa"/>
+              <w:bottom w:w="85" w:type="dxa"/>
+              <w:right w:w="85" w:type="dxa"/>
+            </w:tcMar>
+            <w:shd w:fill="F3F5F7"/>
+          </w:tcPr>
+          <w:p>
+            <w:pPr>
+              <w:spacing w:after="20" w:before="20" w:line="240" w:lineRule="auto"/>
+            </w:pPr>
+            <w:r>
+              <w:rPr>
+                <w:b w:val="0"/>
+                <w:color w:val="000000"/>
+                <w:sz w:val="18"/>
+              </w:rPr>
+              <w:t>ARIA</w:t>
+            </w:r>
+          </w:p>
+        </w:tc>
+        <w:tc>
+          <w:tcPr>
+            <w:tcW w:type="dxa" w:w="8136"/>
+            <w:vAlign w:val="center"/>
+            <w:tcMar>
+              <w:top w:w="85" w:type="dxa"/>
+              <w:left w:w="85" w:type="dxa"/>
+              <w:bottom w:w="85" w:type="dxa"/>
+              <w:right w:w="85" w:type="dxa"/>
+            </w:tcMar>
+            <w:shd w:fill="F3F5F7"/>
+          </w:tcPr>
+          <w:p>
+            <w:pPr>
+              <w:spacing w:after="20" w:before="20" w:line="240" w:lineRule="auto"/>
+            </w:pPr>
+            <w:r>
+              <w:rPr>
+                <w:b w:val="0"/>
+                <w:color w:val="000000"/>
+                <w:sz w:val="18"/>
+              </w:rPr>
+              <w:t>Labels, states and relationships that can help assistive technology interpret an interface. Missing one attribute alone does not prove an accessibility failure.</w:t>
+            </w:r>
+          </w:p>
+        </w:tc>
+      </w:tr>
+      <w:tr>
+        <w:trPr>
+          <w:cantSplit/>
+        </w:trPr>
+        <w:tc>
+          <w:tcPr>
+            <w:tcW w:type="dxa" w:w="2088"/>
+            <w:vAlign w:val="center"/>
+            <w:tcMar>
+              <w:top w:w="85" w:type="dxa"/>
+              <w:left w:w="85" w:type="dxa"/>
+              <w:bottom w:w="85" w:type="dxa"/>
+              <w:right w:w="85" w:type="dxa"/>
+            </w:tcMar>
+            <w:shd w:fill="FFFFFF"/>
+          </w:tcPr>
+          <w:p>
+            <w:pPr>
+              <w:spacing w:after="20" w:before="20" w:line="240" w:lineRule="auto"/>
+            </w:pPr>
+            <w:r>
+              <w:rPr>
+                <w:b w:val="0"/>
+                <w:color w:val="000000"/>
+                <w:sz w:val="18"/>
+              </w:rPr>
+              <w:t>WCAG</w:t>
+            </w:r>
+          </w:p>
+        </w:tc>
+        <w:tc>
+          <w:tcPr>
+            <w:tcW w:type="dxa" w:w="8136"/>
+            <w:vAlign w:val="center"/>
+            <w:tcMar>
+              <w:top w:w="85" w:type="dxa"/>
+              <w:left w:w="85" w:type="dxa"/>
+              <w:bottom w:w="85" w:type="dxa"/>
+              <w:right w:w="85" w:type="dxa"/>
+            </w:tcMar>
+            <w:shd w:fill="FFFFFF"/>
+          </w:tcPr>
+          <w:p>
+            <w:pPr>
+              <w:spacing w:after="20" w:before="20" w:line="240" w:lineRule="auto"/>
+            </w:pPr>
+            <w:r>
+              <w:rPr>
+                <w:b w:val="0"/>
+                <w:color w:val="000000"/>
+                <w:sz w:val="18"/>
+              </w:rPr>
+              <w:t>Web Content Accessibility Guidelines. The focused checks in this report are not a complete conformance audit.</w:t>
             </w:r>
           </w:p>
         </w:tc>

</xml_diff>

<commit_message>
Publish nine-finding live QA checkpoint with historical report boundary
</commit_message>
<xml_diff>
--- a/report.docx
+++ b/report.docx
@@ -26,7 +26,7 @@
           <w:b w:val="0"/>
           <w:sz w:val="18"/>
         </w:rPr>
-        <w:t>Continuation checkpoint  |  8 October 2026 at 06:28 UTC  |  02:28 New York</w:t>
+        <w:t>Live capture checkpoint  |  8 October 2026 at 10:50 UTC  |  06:50 New York</w:t>
       </w:r>
     </w:p>
     <w:p>
@@ -42,7 +42,7 @@
         <w:rPr>
           <w:b w:val="0"/>
         </w:rPr>
-        <w:t>The audit has two Medium findings: an invalid Python quickstart command and an interrupted GitHub connection that cannot recover through Connect. Historical APM ingestion and Agent-side authorization were observed. Debugger SDK registration, live capture and source association remain unverified. Every original case has a scoped result or concrete blocker.</w:t>
+        <w:t>Live numeric capture now passes all three fixture controls, and source retrieval matches the deployed revision. A controlled A-only reinstall repaired the interrupted source association. Two Medium findings remain: the Python quickstart command and the interrupted-connection recovery path. A bounded expiry test also passed. Further access-boundary and functional cases remain open.</w:t>
       </w:r>
     </w:p>
     <w:p>
@@ -64,7 +64,7 @@
         <w:rPr>
           <w:b w:val="0"/>
         </w:rPr>
-        <w:t xml:space="preserve"> The A-only App is installed/authorized, but Datadog remains unconnected after a paused flow. Fresh-install behavior is unproven.</w:t>
+        <w:t xml:space="preserve"> Connect did not recover the paused flow; a controlled same-scope reinstall restored association and source retrieval.</w:t>
       </w:r>
     </w:p>
     <w:p>
@@ -86,7 +86,29 @@
         <w:rPr>
           <w:b w:val="0"/>
         </w:rPr>
-        <w:t xml:space="preserve"> Its .py-suffixed module command fails for an ordinary script; corrected script/module forms pass local controls.</w:t>
+        <w:t xml:space="preserve"> The documented .py-suffixed module form fails; script/module alternatives work.</w:t>
+      </w:r>
+    </w:p>
+    <w:p>
+      <w:pPr>
+        <w:pStyle w:val="ListBullet"/>
+      </w:pPr>
+      <w:r>
+        <w:rPr>
+          <w:b w:val="0"/>
+        </w:rPr>
+      </w:r>
+      <w:r>
+        <w:rPr>
+          <w:b/>
+        </w:rPr>
+        <w:t>Preserve event navigation.</w:t>
+      </w:r>
+      <w:r>
+        <w:rPr>
+          <w:b w:val="0"/>
+        </w:rPr>
+        <w:t xml:space="preserve"> View in Logs should open the matching indexed snapshot directly.</w:t>
       </w:r>
     </w:p>
     <w:p>
@@ -108,7 +130,7 @@
         <w:rPr>
           <w:b w:val="0"/>
         </w:rPr>
-        <w:t xml:space="preserve"> The red border and disabled Start work, but the observed invalid state lacks a syntax-error explanation. The valid correction recovers.</w:t>
+        <w:t xml:space="preserve"> Keep the working validation border and add a specific correction message.</w:t>
       </w:r>
     </w:p>
     <w:p>
@@ -124,13 +146,13 @@
         <w:rPr>
           <w:b/>
         </w:rPr>
-        <w:t>Make navigation labels readable.</w:t>
+        <w:t>Improve empty-state guidance.</w:t>
       </w:r>
       <w:r>
         <w:rPr>
           <w:b w:val="0"/>
         </w:rPr>
-        <w:t xml:space="preserve"> At the observed desktop viewport, the documentation contents rail breaks several section names mid-word.</w:t>
+        <w:t xml:space="preserve"> Put a concrete setup recovery step beside empty service and environment lists.</w:t>
       </w:r>
     </w:p>
     <w:p>
@@ -146,35 +168,13 @@
         <w:rPr>
           <w:b/>
         </w:rPr>
-        <w:t>Give empty states a next step.</w:t>
+        <w:t>Improve labels and first choices.</w:t>
       </w:r>
       <w:r>
         <w:rPr>
           <w:b w:val="0"/>
         </w:rPr>
-        <w:t xml:space="preserve"> The authenticated manual route is visible and prevents starting without a service, but the empty service/environment sections do not explain setup recovery.</w:t>
-      </w:r>
-    </w:p>
-    <w:p>
-      <w:pPr>
-        <w:pStyle w:val="ListBullet"/>
-      </w:pPr>
-      <w:r>
-        <w:rPr>
-          <w:b w:val="0"/>
-        </w:rPr>
-      </w:r>
-      <w:r>
-        <w:rPr>
-          <w:b/>
-        </w:rPr>
-        <w:t>Explain the first irreversible decision.</w:t>
-      </w:r>
-      <w:r>
-        <w:rPr>
-          <w:b w:val="0"/>
-        </w:rPr>
-        <w:t xml:space="preserve"> Region selection is clearly marked permanent, but a complete beginner receives little in-place help choosing one.</w:t>
+        <w:t xml:space="preserve"> Keep navigation words readable and explain permanent region selection.</w:t>
       </w:r>
     </w:p>
     <w:p>
@@ -183,7 +183,7 @@
           <w:b w:val="0"/>
           <w:sz w:val="18"/>
         </w:rPr>
-        <w:t>Severity index below: HIGH 0 · MEDIUM 2 · LOW 4. Click a finding ID to jump to its detail page.</w:t>
+        <w:t>Severity index below: HIGH 0 · MEDIUM 2 · LOW 5. Click a finding ID to jump to its detail page.</w:t>
       </w:r>
     </w:p>
     <w:p>
@@ -202,7 +202,7 @@
           <w:b w:val="0"/>
           <w:sz w:val="18"/>
         </w:rPr>
-        <w:t>63 original cases: 2 scoped PASS, 4 FINDING, 57 BLOCKED. Separate executed subchecks preserve genuine UI observations without implying full runtime coverage.</w:t>
+        <w:t>63 cases: 10 PASS, 5 FINDING, 19 OPEN and 29 BLOCKED. OPEN comprises 3 in progress and 16 pending. Two of the PASS results are the earlier scoped route/setup checks.</w:t>
       </w:r>
     </w:p>
     <w:p>
@@ -218,7 +218,7 @@
         <w:rPr>
           <w:b w:val="0"/>
         </w:rPr>
-        <w:t>A scoped result is not a completed end-to-end test. Live capture, source retrieval, authorization boundaries and lifecycle remain unverified.</w:t>
+        <w:t>The baseline works; this is an ongoing audit, not end-to-end signoff. Repository B access, manual stop/re-enable, role isolation and the remaining original cases still need their own evidence.</w:t>
       </w:r>
     </w:p>
     <w:p>
@@ -546,7 +546,7 @@
                 <w:color w:val="000000"/>
                 <w:sz w:val="18"/>
               </w:rPr>
-              <w:t>Interrupted GitHub connection cannot recover through the offered route</w:t>
+              <w:t>Connect retry failed; same-scope reinstall restored association</w:t>
             </w:r>
           </w:p>
         </w:tc>
@@ -1013,14 +1013,116 @@
           </w:p>
         </w:tc>
       </w:tr>
+      <w:tr>
+        <w:trPr>
+          <w:cantSplit/>
+        </w:trPr>
+        <w:tc>
+          <w:tcPr>
+            <w:tcW w:type="dxa" w:w="1008"/>
+            <w:vAlign w:val="center"/>
+            <w:tcMar>
+              <w:top w:w="85" w:type="dxa"/>
+              <w:left w:w="85" w:type="dxa"/>
+              <w:bottom w:w="85" w:type="dxa"/>
+              <w:right w:w="85" w:type="dxa"/>
+            </w:tcMar>
+            <w:shd w:fill="FFFFFF"/>
+          </w:tcPr>
+          <w:p>
+            <w:pPr>
+              <w:spacing w:after="20" w:before="20" w:line="240" w:lineRule="auto"/>
+            </w:pPr>
+            <w:hyperlink w:anchor="UX04">
+              <w:r>
+                <w:rPr>
+                  <w:color w:val="164F80"/>
+                </w:rPr>
+                <w:t>UX04</w:t>
+              </w:r>
+            </w:hyperlink>
+          </w:p>
+        </w:tc>
+        <w:tc>
+          <w:tcPr>
+            <w:tcW w:type="dxa" w:w="1944"/>
+            <w:vAlign w:val="center"/>
+            <w:tcMar>
+              <w:top w:w="85" w:type="dxa"/>
+              <w:left w:w="85" w:type="dxa"/>
+              <w:bottom w:w="85" w:type="dxa"/>
+              <w:right w:w="85" w:type="dxa"/>
+            </w:tcMar>
+            <w:shd w:fill="FFFFFF"/>
+          </w:tcPr>
+          <w:p>
+            <w:pPr>
+              <w:spacing w:after="20" w:before="20" w:line="240" w:lineRule="auto"/>
+            </w:pPr>
+            <w:r>
+              <w:rPr>
+                <w:b w:val="0"/>
+                <w:color w:val="000000"/>
+                <w:sz w:val="18"/>
+              </w:rPr>
+              <w:t>LOW · navigation</w:t>
+            </w:r>
+          </w:p>
+        </w:tc>
+        <w:tc>
+          <w:tcPr>
+            <w:tcW w:type="dxa" w:w="6480"/>
+            <w:vAlign w:val="center"/>
+            <w:tcMar>
+              <w:top w:w="85" w:type="dxa"/>
+              <w:left w:w="85" w:type="dxa"/>
+              <w:bottom w:w="85" w:type="dxa"/>
+              <w:right w:w="85" w:type="dxa"/>
+            </w:tcMar>
+            <w:shd w:fill="FFFFFF"/>
+          </w:tcPr>
+          <w:p>
+            <w:pPr>
+              <w:spacing w:after="20" w:before="20" w:line="240" w:lineRule="auto"/>
+            </w:pPr>
+            <w:r>
+              <w:rPr>
+                <w:b w:val="0"/>
+                <w:color w:val="000000"/>
+                <w:sz w:val="18"/>
+              </w:rPr>
+              <w:t>Direct event link needs an extra click to open its indexed snapshot</w:t>
+            </w:r>
+          </w:p>
+        </w:tc>
+        <w:tc>
+          <w:tcPr>
+            <w:tcW w:type="dxa" w:w="792"/>
+            <w:vAlign w:val="center"/>
+            <w:tcMar>
+              <w:top w:w="85" w:type="dxa"/>
+              <w:left w:w="85" w:type="dxa"/>
+              <w:bottom w:w="85" w:type="dxa"/>
+              <w:right w:w="85" w:type="dxa"/>
+            </w:tcMar>
+            <w:shd w:fill="FFFFFF"/>
+          </w:tcPr>
+          <w:p>
+            <w:pPr>
+              <w:spacing w:after="20" w:before="20" w:line="240" w:lineRule="auto"/>
+            </w:pPr>
+            <w:r>
+              <w:rPr>
+                <w:b w:val="0"/>
+                <w:color w:val="000000"/>
+                <w:sz w:val="18"/>
+              </w:rPr>
+              <w:t>1</w:t>
+            </w:r>
+          </w:p>
+        </w:tc>
+      </w:tr>
     </w:tbl>
-    <w:p>
-      <w:r>
-        <w:rPr>
-          <w:b w:val="0"/>
-        </w:rPr>
-      </w:r>
-    </w:p>
     <w:p>
       <w:r>
         <w:br w:type="page"/>
@@ -1425,7 +1527,7 @@
         <w:rPr>
           <w:b w:val="0"/>
         </w:rPr>
-        <w:t>Cloud desktop browser; approximately 1180 × 757 page viewport at default zoom. Documentation evidence images are 1165 × 747 pixels. Local reproduction uses Python 3.12.14. A dedicated synthetic sample contains no real customer data. Local process/intake snapshots used Agent/trace-agent 7.84.2, ddtrace 4.11.0 and Python 3.13.5. They do not establish debugger SDK client registration. Datadog UI build 35.143254999. Runtime later stopped at an additional-destination boundary; source association remains unconnected despite verified GitHub installation and authorization. Historical APM spans were later verified; no captured debugger event.</w:t>
+        <w:t>The browser viewport is approximately 1180 × 757 pixels. Early local command reproduction used Python 3.12.14; earlier process snapshots used Python 3.13.5. The hosted baseline uses Agent 7.84.2 and ddtrace 4.11.0, with Python series 3.13 requested; its exact patch has not been retrieved. Agent authorization, debugger SDK registration, actual numeric capture and baseline source retrieval are now verified. The earlier recorded Datadog UI build was 35.143254999.</w:t>
       </w:r>
     </w:p>
     <w:p>
@@ -1888,7 +1990,7 @@
                 <w:color w:val="000000"/>
                 <w:sz w:val="18"/>
               </w:rPr>
-              <w:t>Service discovered after approval; wildcard setup guidance and draft validation checked; actual capture unverified</w:t>
+              <w:t>Manual capture now matches the numeric oracle. Initial progress and Logs navigation observations remain scoped.</w:t>
             </w:r>
           </w:p>
         </w:tc>
@@ -1971,7 +2073,7 @@
                 <w:color w:val="000000"/>
                 <w:sz w:val="18"/>
               </w:rPr>
-              <w:t>Manual entry available; installed/authorized GitHub link cannot recover in the interrupted state</w:t>
+              <w:t>Same-scope reinstall repaired the association; actual source matches the deployed revision.</w:t>
             </w:r>
           </w:p>
         </w:tc>
@@ -2054,7 +2156,7 @@
                 <w:color w:val="000000"/>
                 <w:sz w:val="18"/>
               </w:rPr>
-              <w:t>No active session; stop and expiry semantics blocked pending a real capture</w:t>
+              <w:t>Target expiry and retained history are verified; manual stop/re-enable and full cleanup remain open at this checkpoint.</w:t>
             </w:r>
           </w:p>
         </w:tc>
@@ -2814,6 +2916,126 @@
       </w:r>
     </w:p>
     <w:p>
+      <w:pPr>
+        <w:pStyle w:val="Heading1"/>
+        <w:pageBreakBefore/>
+      </w:pPr>
+      <w:bookmarkStart w:id="1117" w:name="UX04"/>
+      <w:r>
+        <w:t>View in Logs needs an extra indexed row click</w:t>
+      </w:r>
+      <w:bookmarkEnd w:id="1117"/>
+    </w:p>
+    <w:p>
+      <w:pPr>
+        <w:pStyle w:val="Caption"/>
+      </w:pPr>
+      <w:r>
+        <w:t>LOW · UX04 · Navigation recovery friction · Part 1 beginner usability · B08</w:t>
+      </w:r>
+    </w:p>
+    <w:p>
+      <w:pPr>
+        <w:pStyle w:val="Normal"/>
+      </w:pPr>
+      <w:r>
+        <w:t>Across two tested snapshots, View in Logs opened “The requested event is not indexed” while the snapshot-targeted view contained the matching indexed log. Clicking that row recovered the same snapshot’s values, source and JSON.</w:t>
+      </w:r>
+    </w:p>
+    <w:p>
+      <w:pPr>
+        <w:keepNext/>
+        <w:spacing w:after="100"/>
+      </w:pPr>
+      <w:r>
+        <w:drawing>
+          <wp:inline xmlns:a="http://schemas.openxmlformats.org/drawingml/2006/main" xmlns:pic="http://schemas.openxmlformats.org/drawingml/2006/picture">
+            <wp:extent cx="5669280" cy="4069080"/>
+            <wp:docPr id="11" name="Evidence image 11" descr="View in Logs error panel and snapshot-targeted query"/>
+            <wp:cNvGraphicFramePr>
+              <a:graphicFrameLocks noChangeAspect="1"/>
+            </wp:cNvGraphicFramePr>
+            <a:graphic>
+              <a:graphicData uri="http://schemas.openxmlformats.org/drawingml/2006/picture">
+                <pic:pic>
+                  <pic:nvPicPr>
+                    <pic:cNvPr id="12" name="Evidence image 12.png" descr="View in Logs error panel and snapshot-targeted query"/>
+                    <pic:cNvPicPr/>
+                  </pic:nvPicPr>
+                  <pic:blipFill>
+                    <a:blip r:embed="rId34"/>
+                    <a:stretch>
+                      <a:fillRect/>
+                    </a:stretch>
+                  </pic:blipFill>
+                  <pic:spPr>
+                    <a:xfrm>
+                      <a:off x="0" y="0"/>
+                      <a:ext cx="5669280" cy="4069080"/>
+                    </a:xfrm>
+                    <a:prstGeom prst="rect"/>
+                  </pic:spPr>
+                </pic:pic>
+              </a:graphicData>
+            </a:graphic>
+          </wp:inline>
+        </w:drawing>
+      </w:r>
+    </w:p>
+    <w:p>
+      <w:pPr>
+        <w:pStyle w:val="Caption"/>
+      </w:pPr>
+      <w:r>
+        <w:t>10:41 UTC observed state. Outlines mark the actual error and snapshot query. The results row/count is obscured; exact matching identity and repeatability are established separately.</w:t>
+      </w:r>
+    </w:p>
+    <w:p>
+      <w:pPr>
+        <w:pStyle w:val="Normal"/>
+      </w:pPr>
+      <w:hyperlink r:id="rId35">
+        <w:r>
+          <w:rPr>
+            <w:color w:val="164F80"/>
+          </w:rPr>
+          <w:t>Full-size annotated screenshot and exact evidence boundaries</w:t>
+        </w:r>
+      </w:hyperlink>
+    </w:p>
+    <w:p>
+      <w:pPr>
+        <w:pStyle w:val="Normal"/>
+      </w:pPr>
+      <w:r>
+        <w:t>Reproduce: select a captured debugger snapshot, use View in Logs, observe the error panel, then select the matching indexed row. Verify debugger.snapshot.id, probe and timestamp against the original capture.</w:t>
+      </w:r>
+    </w:p>
+    <w:p>
+      <w:pPr>
+        <w:pStyle w:val="Normal"/>
+      </w:pPr>
+      <w:r>
+        <w:t>Verification: independent reproductions used the control snapshot at 10:24 and the target snapshot at 10:41. The recovered JSON matched each originating snapshot identity exactly, not merely a similar message or time.</w:t>
+      </w:r>
+    </w:p>
+    <w:p>
+      <w:pPr>
+        <w:pStyle w:val="Normal"/>
+      </w:pPr>
+      <w:r>
+        <w:t>Expected and impact: a direct event link should open its available indexed target, or offer clear recovery. The extra row click is a verified workaround. Severity is Low because recovery succeeds; no data loss or broad indexing failure is established.</w:t>
+      </w:r>
+    </w:p>
+    <w:p>
+      <w:pPr>
+        <w:pStyle w:val="Normal"/>
+      </w:pPr>
+      <w:r>
+        <w:t>Limits: differing live/indexed UI event IDs are observations, not a proven cause. This still does not display the one matching row/count. Screenshots and separate UI/payload checks verify the case; only genuinely visible foreground steps are claimed by the reviewed video.</w:t>
+      </w:r>
+    </w:p>
+    <w:p>
       <w:r>
         <w:br w:type="page"/>
       </w:r>
@@ -2848,7 +3070,7 @@
         <w:rPr>
           <w:b w:val="0"/>
         </w:rPr>
-        <w:t>All 63 original cases are accounted for: 2 scoped PASS, 4 FINDING and 57 BLOCKED. B04 and S01 pass only the route and pre-install scopes stated below. The appendix lists every case; the online matrix preserves full preconditions, steps, expected results and cleanup. No runtime capture or source-mapping pass is claimed.</w:t>
+        <w:t>63 cases: 10 PASS, 5 FINDING, 19 OPEN and 29 BLOCKED. OPEN comprises 3 in progress and 16 pending. The appendix preserves every original case. The online matrix retains full steps and cleanup. A PASS describes the tested scope, not every variant of the feature.</w:t>
       </w:r>
     </w:p>
     <w:tbl>
@@ -2980,7 +3202,7 @@
                 <w:color w:val="000000"/>
                 <w:sz w:val="18"/>
               </w:rPr>
-              <w:t>B02/B03/B09/S11</w:t>
+              <w:t>B02/B03/B08/B09/S11</w:t>
             </w:r>
           </w:p>
         </w:tc>
@@ -3032,7 +3254,7 @@
                 <w:color w:val="000000"/>
                 <w:sz w:val="18"/>
               </w:rPr>
-              <w:t>UX02 guidance, DOC01 command, UX03 error explanation and SCI01 source recovery</w:t>
+              <w:t>UX02, DOC01, UX03, SCI01 and the Low UX04 direct-event navigation issue</w:t>
             </w:r>
           </w:p>
         </w:tc>
@@ -3063,7 +3285,7 @@
                 <w:color w:val="000000"/>
                 <w:sz w:val="18"/>
               </w:rPr>
-              <w:t>B04</w:t>
+              <w:t>B04/S01</w:t>
             </w:r>
           </w:p>
         </w:tc>
@@ -3115,7 +3337,7 @@
                 <w:color w:val="000000"/>
                 <w:sz w:val="18"/>
               </w:rPr>
-              <w:t>Manual entry without SCI and visible Bits prerequisite; no successful session</w:t>
+              <w:t>Manual entry without SCI; actual manual capture subsequently succeeded before source association repair.</w:t>
             </w:r>
           </w:p>
         </w:tc>
@@ -3146,7 +3368,7 @@
                 <w:color w:val="000000"/>
                 <w:sz w:val="18"/>
               </w:rPr>
-              <w:t>S01</w:t>
+              <w:t>B07/C03</w:t>
             </w:r>
           </w:p>
         </w:tc>
@@ -3198,7 +3420,7 @@
                 <w:color w:val="000000"/>
                 <w:sz w:val="18"/>
               </w:rPr>
-              <w:t>Pre-install permission/cancel checks; later App grant verified separately, source association failed</w:t>
+              <w:t>Recorded first-success sequence and verified invocation/source-repair controls; no blind-user or causal claim.</w:t>
             </w:r>
           </w:p>
         </w:tc>
@@ -3255,7 +3477,7 @@
                 <w:color w:val="000000"/>
                 <w:sz w:val="18"/>
               </w:rPr>
-              <w:t>BLOCKED</w:t>
+              <w:t>PENDING</w:t>
             </w:r>
           </w:p>
         </w:tc>
@@ -3281,7 +3503,7 @@
                 <w:color w:val="000000"/>
                 <w:sz w:val="18"/>
               </w:rPr>
-              <w:t>Modal and draft navigation checks passed; saved-entity/runtime variants remain untested</w:t>
+              <w:t>Earlier modal/draft navigation passed; remaining saved-entity variants need direct tests.</w:t>
             </w:r>
           </w:p>
         </w:tc>
@@ -3312,7 +3534,7 @@
                 <w:color w:val="000000"/>
                 <w:sz w:val="18"/>
               </w:rPr>
-              <w:t>C01/C03</w:t>
+              <w:t>C01/C02</w:t>
             </w:r>
           </w:p>
         </w:tc>
@@ -3338,7 +3560,7 @@
                 <w:color w:val="000000"/>
                 <w:sz w:val="18"/>
               </w:rPr>
-              <w:t>BLOCKED</w:t>
+              <w:t>IN PROGRESS</w:t>
             </w:r>
           </w:p>
         </w:tc>
@@ -3364,7 +3586,7 @@
                 <w:color w:val="000000"/>
                 <w:sz w:val="18"/>
               </w:rPr>
-              <w:t>Zero-session inventory and local syntax controls passed; active cleanup and live correction retest unavailable</w:t>
+              <w:t>Control/experimental cleanup and full retained-resource/settings inventory remain open.</w:t>
             </w:r>
           </w:p>
         </w:tc>
@@ -3395,7 +3617,7 @@
                 <w:color w:val="000000"/>
                 <w:sz w:val="18"/>
               </w:rPr>
-              <w:t>Runtime/source</w:t>
+              <w:t>F01–03/F11/S02/X04</w:t>
             </w:r>
           </w:p>
         </w:tc>
@@ -3421,7 +3643,7 @@
                 <w:color w:val="000000"/>
                 <w:sz w:val="18"/>
               </w:rPr>
-              <w:t>BLOCKED</w:t>
+              <w:t>PASS</w:t>
             </w:r>
           </w:p>
         </w:tc>
@@ -3447,7 +3669,7 @@
                 <w:color w:val="000000"/>
                 <w:sz w:val="18"/>
               </w:rPr>
-              <w:t>Initial approvals received; additional-destination boundary stopped runtime. Source association failure recorded in SCI01</w:t>
+              <w:t>Numeric/conditional/no-match controls, exact deployed source and bounded expiry/history checks passed.</w:t>
             </w:r>
           </w:p>
         </w:tc>
@@ -3466,7 +3688,7 @@
           <w:b w:val="0"/>
           <w:sz w:val="18"/>
         </w:rPr>
-        <w:t>Two baseline submissions, including a plain-message control, returned a visible instrumentation-invalid toast and HTTP 400. The fresh unfiltered list remained All 0 / Active 0 / Inactive 0. Wildcard-environment/runtime prerequisites remain unresolved; no cause or runtime defect is inferred.</w:t>
+        <w:t>Historical attempts at 05:15 and 05:19 returned a visible instrumentation-invalid error and HTTP 400. Later, a healthy SDK runtime with a specific staging environment created sessions and captured correct values. The earlier failure did not recur in that changed context; a sole cause was not isolated.</w:t>
       </w:r>
     </w:p>
     <w:p>
@@ -3490,7 +3712,7 @@
         <w:pStyle w:val="Heading2"/>
       </w:pPr>
       <w:r>
-        <w:t>High risk tests before confidence in release readiness</w:t>
+        <w:t>Release confidence checklist</w:t>
       </w:r>
     </w:p>
     <w:p>
@@ -3501,7 +3723,7 @@
         <w:rPr>
           <w:b w:val="0"/>
         </w:rPr>
-        <w:t>Capture actual quantity 3 locals at pricing.py line 17 and match the correct service, environment, and deployed revision.</w:t>
+        <w:t>Verified baseline: actual quantity 3 locals, selected service/environment and deployed source match the fixture.</w:t>
       </w:r>
     </w:p>
     <w:p>
@@ -3512,7 +3734,7 @@
         <w:rPr>
           <w:b w:val="0"/>
         </w:rPr>
-        <w:t>Confirm repo A works while never-granted private repo B cannot return source through the tested integration.</w:t>
+        <w:t>Still required: confirm never-granted private repository B cannot return source through the tested integration.</w:t>
       </w:r>
     </w:p>
     <w:p>
@@ -3523,7 +3745,7 @@
         <w:rPr>
           <w:b w:val="0"/>
         </w:rPr>
-        <w:t>Observe capture before and after real expiration, distinguishing late ingestion from late execution.</w:t>
+        <w:t>Verified bounded expiry: distinguish SDK snapshot execution, UI row time and retained history; no instantaneous stop claim.</w:t>
       </w:r>
     </w:p>
     <w:p>
@@ -3534,7 +3756,7 @@
         <w:rPr>
           <w:b w:val="0"/>
         </w:rPr>
-        <w:t>Reload after stopping and verify every created test session/logpoint is inactive.</w:t>
+        <w:t>Still required: disable and recheck every remaining test session/logpoint, with continuing traffic where available.</w:t>
       </w:r>
     </w:p>
     <w:p>
@@ -3743,7 +3965,7 @@
         <w:pStyle w:val="Heading1"/>
       </w:pPr>
       <w:r>
-        <w:t>Interrupted GitHub setup does not recover through Connect</w:t>
+        <w:t>Interrupted GitHub setup recovered after a controlled reinstall</w:t>
       </w:r>
       <w:bookmarkEnd w:id="1116"/>
     </w:p>
@@ -3752,7 +3974,7 @@
         <w:rPr>
           <w:b w:val="0"/>
         </w:rPr>
-        <w:t>GitHub verifies the approved A-only App installation and user authorization. Datadog remains unconnected, and its offered Connect action returns to unchanged installation settings without a usable completion route.</w:t>
+        <w:t>The original interrupted flow left Datadog unconnected while GitHub showed the approved A-only installation. Connect retried into unchanged settings. A controlled same-scope uninstall/reinstall later reached connected configuration and verified source retrieval.</w:t>
       </w:r>
     </w:p>
     <w:p>
@@ -3868,7 +4090,7 @@
         <w:rPr>
           <w:b w:val="0"/>
         </w:rPr>
-        <w:t>Complete the association or explain a concrete recovery step/error. Instead, Datadog shows Get Started and the retry reaches GitHub settings with Save disabled. Fresh catalog navigation did not recover it.</w:t>
+        <w:t>Complete the association or explain a concrete recovery step. The interrupted flow showed Get Started and returned to GitHub settings with Save disabled. Fresh catalog navigation did not repair that state. A full approved reinstall subsequently did.</w:t>
       </w:r>
     </w:p>
     <w:p>
@@ -3882,7 +4104,7 @@
         <w:rPr>
           <w:b w:val="0"/>
         </w:rPr>
-        <w:t>Source linking is blocked in this interrupted state. Manual debugger entry remains available; no source-association workaround was verified. Fresh uninterrupted installation and backend cause are unproven.</w:t>
+        <w:t>The interrupted state blocked source linking. Connect/catalog retries failed; a privileged same-scope reinstall recovered it. The fresh A-only callback and deployed-source comparison now pass; B remains ungranted. The approximately 75-minute pause is a precondition, not an established cause. Fresh installation failure is not generalized from the original result.</w:t>
       </w:r>
     </w:p>
     <w:p>
@@ -3896,7 +4118,7 @@
         <w:rPr>
           <w:b w:val="0"/>
         </w:rPr>
-        <w:t>Install/reauthentication before 04:49:33 is screenshot-only. Later recovery has reviewed recording 07 motion; the online finding links highlight 00:00 and 01:19.50, plus the full safe archive. No source retrieval or captured-value pass is claimed.</w:t>
+        <w:t>Original install/reauthentication before 04:49:33 is screenshot-only; later failed recovery has reviewed source 07 motion. Source 11 records the removal and fresh draft, then stops at 09:53:41.25 before the successful callback. The 09:55 connected configuration is screenshot-only; source 12 records later capture/source checks.</w:t>
       </w:r>
     </w:p>
     <w:p>
@@ -5330,7 +5552,7 @@
           <w:b w:val="0"/>
           <w:sz w:val="18"/>
         </w:rPr>
-        <w:t>Reviewed motion: authenticated UI QA 181.30 seconds; account/setup transitions 20.25 seconds, with identity masked and OAuth omitted. UX02 appears at 00:00 and 02:42.80 in the UI excerpt. Reviewed archives now account for sources 01–10, with exact omissions. Sources 06 and 08 are wholly withheld tooling preparation. Highlights overlap archive footage; no successful debugger capture is shown.</w:t>
+        <w:t>The early clips cover signup and first-run UI only. Source 11 now adds real session creation, captured values and repair preparation; its highlight is 3:32.80. The successful GitHub callback is screenshot-only. Source 12 adds numeric/source/predicate and expiry evidence, with recorded foreground limits. The video catalog gives exact intervals, omissions and availability; highlights overlap their archives.</w:t>
       </w:r>
     </w:p>
     <w:p>
@@ -5396,7 +5618,7 @@
         <w:rPr>
           <w:b w:val="0"/>
         </w:rPr>
-        <w:t>References inform expected behavior and test design. They are not substitutes for observed product results. All current findings are limited to the captured site, viewport, and isolated runtime check.</w:t>
+        <w:t>References describe expected behavior, not execution. Results are limited to the tested account, site, versions and controlled synthetic fixtures.</w:t>
       </w:r>
     </w:p>
     <w:p>
@@ -8167,7 +8389,7 @@
         <w:rPr>
           <w:b w:val="0"/>
         </w:rPr>
-        <w:t>Local Agent intake/sample startup and Agent RC authorization were verified briefly. Historical APM ingestion was later verified; debugger SDK client registration remains unverified. Runtime remains stopped at an additional telemetry-destination boundary. GitHub installation and authorization are verified; Datadog association remains unconnected. No debugger capture was proved. Earlier RC eligibility was unknown, not verified misconfiguration.</w:t>
+        <w:t>The additional runtime approval has been received. Hosted Agent authorization and debugger SDK registration are verified, and F01 captures the numeric oracle. After a controlled A-only reinstall, S02 retrieves and follows the exact deployed source. The original session expired with preserved history and a continuing later control; timing is bounded rather than instantaneous. Remaining access identities and fixture variants are separate prerequisites.</w:t>
       </w:r>
     </w:p>
     <w:tbl>
@@ -8241,7 +8463,7 @@
                 <w:color w:val="FFFFFF"/>
                 <w:sz w:val="18"/>
               </w:rPr>
-              <w:t>Concrete missing prerequisite</w:t>
+              <w:t>Current readiness or missing prerequisite</w:t>
             </w:r>
           </w:p>
         </w:tc>
@@ -8298,7 +8520,7 @@
                 <w:color w:val="000000"/>
                 <w:sz w:val="18"/>
               </w:rPr>
-              <w:t>Initial payload approved. Additional intake-destination boundary must be resolved, then continuous healthy runtime and a real captured event verified.</w:t>
+              <w:t>G1 met for baseline: Agent and SDK registration plus actual numeric captures. Maintain healthy runtime/control traffic for lifecycle tests.</w:t>
             </w:r>
           </w:p>
         </w:tc>
@@ -8355,7 +8577,7 @@
                 <w:color w:val="000000"/>
                 <w:sz w:val="18"/>
               </w:rPr>
-              <w:t>A-only installation and user authorization verified; Datadog association must recover. B exists and remains ungranted. Exact source mapping unverified.</w:t>
+              <w:t>G2 baseline met: A-only association, source text and followed deployed-SHA/file/line comparison. B remains ungranted; its boundary test is separate.</w:t>
             </w:r>
           </w:p>
         </w:tc>
@@ -8412,7 +8634,7 @@
                 <w:color w:val="000000"/>
                 <w:sz w:val="18"/>
               </w:rPr>
-              <w:t>Independent restricted test identities and approval for the exact test-only role/revocation changes.</w:t>
+              <w:t>Independent restricted identities and case-specific role/revocation setup are still needed. The approved A-only repair does not execute these other tests.</w:t>
             </w:r>
           </w:p>
         </w:tc>
@@ -8469,7 +8691,7 @@
                 <w:color w:val="000000"/>
                 <w:sz w:val="18"/>
               </w:rPr>
-              <w:t>Case-specific controlled deployment/restart/failure tests after a working baseline. Local prepared fixtures are not executed tests.</w:t>
+              <w:t>Additional controlled fixture/deployment/restart/failure variants must be deployed and actually exercised. Offline preparation is not a product test.</w:t>
             </w:r>
           </w:p>
         </w:tc>
@@ -8552,7 +8774,7 @@
         <w:rPr>
           <w:b w:val="0"/>
         </w:rPr>
-        <w:t>After the current runtime boundary is resolved, establish F01 with actual quantity 3 locals and verified service/environment/version. Start F11 using the shortest available expiry and observe its terminal state. Validate S02 exact deployed SHA and S03 A allowed with B never granted. Run the other prerequisite-matched cases, then reconcile created entities and retained settings with C01–C03.</w:t>
+        <w:t>Complete manual stop/re-enable and other lifecycle variants after the verified expiry. Complete the never-granted B boundary and other prerequisite-matched cases. Reconcile active sessions, bounded runtime jobs, retained grants and settings under C01–C02. New optional variants remain separate from the original 63 cases.</w:t>
       </w:r>
     </w:p>
     <w:p>
@@ -8568,7 +8790,7 @@
         <w:rPr>
           <w:b w:val="0"/>
         </w:rPr>
-        <w:t>Two baseline attempts were rejected with visible error toasts with console HTTP 400; the fresh unfiltered list remained All 0 / Active 0 / Inactive 0. Edited/reopened drafts and the later accessibility draft were closed; no entities were created. Runtime is stopped after an additional-destination boundary. The approved A-only App installation, A/B repositories and accounts are retained. The old no-App-grant inventory is historical. Current full inventory/cleanup remains incomplete under C02.</w:t>
+        <w:t>The original no-session/no-App-grant inventory is historical. The original baseline session is expired; control and experimental sessions remain intentional QA assets. The runtime continuation is healthy after handover. The integration remains A-only and B is ungranted. Accounts, synthetic repositories and durable recovery assets remain test assets. Final disable and resource/settings reconciliation remain open.</w:t>
       </w:r>
     </w:p>
     <w:p>
@@ -8582,7 +8804,7 @@
           <w:b w:val="0"/>
           <w:sz w:val="18"/>
         </w:rPr>
-        <w:t>63 CASE CHECKPOINT  |  2 SCOPED PASS  |  4 FINDING  |  57 BLOCKED</w:t>
+        <w:t>63 CASES  |  10 PASS  |  5 FINDING  |  19 OPEN  |  29 BLOCKED</w:t>
       </w:r>
     </w:p>
     <w:p>
@@ -8783,7 +9005,7 @@
                 <w:color w:val="000000"/>
                 <w:sz w:val="18"/>
               </w:rPr>
-              <w:t>Blind timing needs a fresh tester. Informed navigation passed separately.</w:t>
+              <w:t>Blind navigation timing needs a fresh uninformed tester; informed navigation is documented separately.</w:t>
             </w:r>
           </w:p>
         </w:tc>
@@ -9032,7 +9254,7 @@
                 <w:color w:val="000000"/>
                 <w:sz w:val="18"/>
               </w:rPr>
-              <w:t>Manual entry without SCI and visible Bits prerequisite only. No successful session.</w:t>
+              <w:t>Manual route/prerequisite clarity verified; later actual manual capture worked before source-association repair.</w:t>
             </w:r>
           </w:p>
         </w:tc>
@@ -9115,7 +9337,7 @@
                 <w:color w:val="000000"/>
                 <w:sz w:val="18"/>
               </w:rPr>
-              <w:t>One service discovered, only wildcard environment available. Two-target dependencies and populated-result correctness untested.</w:t>
+              <w:t>Needs additional populated service/environment/version combinations for the multi-value dependency checks.</w:t>
             </w:r>
           </w:p>
         </w:tc>
@@ -9198,7 +9420,7 @@
                 <w:color w:val="000000"/>
                 <w:sz w:val="18"/>
               </w:rPr>
-              <w:t>No restricted test identity or natural permission failure. Preflight explanation inspected.</w:t>
+              <w:t>No independent restricted identity or naturally occurring permission-error state is established.</w:t>
             </w:r>
           </w:p>
         </w:tc>
@@ -9255,7 +9477,7 @@
                 <w:color w:val="000000"/>
                 <w:sz w:val="18"/>
               </w:rPr>
-              <w:t>BLOCKED</w:t>
+              <w:t>PASS</w:t>
             </w:r>
           </w:p>
         </w:tc>
@@ -9281,7 +9503,7 @@
                 <w:color w:val="000000"/>
                 <w:sz w:val="18"/>
               </w:rPr>
-              <w:t>G1 unavailable. Record time from creation to accepted/configured/installed/first event.</w:t>
+              <w:t>Recorded creation/progress/first-value sequence; operator navigation is included, not a performance benchmark.</w:t>
             </w:r>
           </w:p>
         </w:tc>
@@ -9338,7 +9560,7 @@
                 <w:color w:val="000000"/>
                 <w:sz w:val="18"/>
               </w:rPr>
-              <w:t>BLOCKED</w:t>
+              <w:t>FINDING</w:t>
             </w:r>
           </w:p>
         </w:tc>
@@ -9364,7 +9586,7 @@
                 <w:color w:val="000000"/>
                 <w:sz w:val="18"/>
               </w:rPr>
-              <w:t>G1 unavailable. Find quantity 3 and inspect locals.</w:t>
+              <w:t>Source/values and return context work; UX04 is repeated direct-event link friction with a one-click recovery.</w:t>
             </w:r>
           </w:p>
         </w:tc>
@@ -9481,7 +9703,7 @@
           <w:b w:val="0"/>
           <w:sz w:val="18"/>
         </w:rPr>
-        <w:t>63 CASE CHECKPOINT  |  2 SCOPED PASS  |  4 FINDING  |  57 BLOCKED</w:t>
+        <w:t>63 CASES  |  10 PASS  |  5 FINDING  |  19 OPEN  |  29 BLOCKED</w:t>
       </w:r>
     </w:p>
     <w:p>
@@ -9656,7 +9878,7 @@
                 <w:color w:val="000000"/>
                 <w:sz w:val="18"/>
               </w:rPr>
-              <w:t>BLOCKED</w:t>
+              <w:t>IN PROGRESS</w:t>
             </w:r>
           </w:p>
         </w:tc>
@@ -9682,7 +9904,7 @@
                 <w:color w:val="000000"/>
                 <w:sz w:val="18"/>
               </w:rPr>
-              <w:t>G1 unavailable. From session and list views, find expiry, manual stop, what remains visible afterward, and route back tomorrow.</w:t>
+              <w:t>Expiry/history were observed; manual stop and full session/list guidance still need completion.</w:t>
             </w:r>
           </w:p>
         </w:tc>
@@ -9739,7 +9961,7 @@
                 <w:color w:val="000000"/>
                 <w:sz w:val="18"/>
               </w:rPr>
-              <w:t>BLOCKED</w:t>
+              <w:t>PASS</w:t>
             </w:r>
           </w:p>
         </w:tc>
@@ -9765,7 +9987,7 @@
                 <w:color w:val="000000"/>
                 <w:sz w:val="18"/>
               </w:rPr>
-              <w:t>Numeric-template and plain-message submissions returned visible instrumentation-invalid errors and HTTP 400. All 0; enabled-target/runtime prerequisites unresolved.</w:t>
+              <w:t>Numeric message and actual locals match all three controls: 2→2400; 3→3600/false; 4→4320/true.</w:t>
             </w:r>
           </w:p>
         </w:tc>
@@ -9822,7 +10044,7 @@
                 <w:color w:val="000000"/>
                 <w:sz w:val="18"/>
               </w:rPr>
-              <w:t>BLOCKED</w:t>
+              <w:t>PASS</w:t>
             </w:r>
           </w:p>
         </w:tc>
@@ -9848,7 +10070,7 @@
                 <w:color w:val="000000"/>
                 <w:sz w:val="18"/>
               </w:rPr>
-              <w:t>G1 unavailable. Create condition quantity == 3; cycle 2/3/4; then change to quantity == 4, apply, wait for activation and repeat.</w:t>
+              <w:t>3→4 predicate transition matched actual locals; retained old COND3 capture gained OUTDATED feedback.</w:t>
             </w:r>
           </w:p>
         </w:tc>
@@ -9905,7 +10127,7 @@
                 <w:color w:val="000000"/>
                 <w:sz w:val="18"/>
               </w:rPr>
-              <w:t>BLOCKED</w:t>
+              <w:t>PASS</w:t>
             </w:r>
           </w:p>
         </w:tc>
@@ -9931,7 +10153,7 @@
                 <w:color w:val="000000"/>
                 <w:sz w:val="18"/>
               </w:rPr>
-              <w:t>G1 unavailable. Set quantity == 101 with valid 2/3/4 traffic; then remove condition and reapply.</w:t>
+              <w:t>Never-match interval had no new matching rows while control traffic continued; removal restored 2/3/4 rows.</w:t>
             </w:r>
           </w:p>
         </w:tc>
@@ -9988,7 +10210,7 @@
                 <w:color w:val="000000"/>
                 <w:sz w:val="18"/>
               </w:rPr>
-              <w:t>BLOCKED</w:t>
+              <w:t>PENDING</w:t>
             </w:r>
           </w:p>
         </w:tc>
@@ -10014,7 +10236,7 @@
                 <w:color w:val="000000"/>
                 <w:sz w:val="18"/>
               </w:rPr>
-              <w:t>Unmatched template brace disables Start; correction enables it. Conditional-expression and runtime variants still need an enabled target/G1.</w:t>
+              <w:t>Earlier draft subchecks are preserved; the remaining runtime or saved-entity requirements are pending.</w:t>
             </w:r>
           </w:p>
         </w:tc>
@@ -10071,7 +10293,7 @@
                 <w:color w:val="000000"/>
                 <w:sz w:val="18"/>
               </w:rPr>
-              <w:t>BLOCKED</w:t>
+              <w:t>PENDING</w:t>
             </w:r>
           </w:p>
         </w:tc>
@@ -10097,7 +10319,7 @@
                 <w:color w:val="000000"/>
                 <w:sz w:val="18"/>
               </w:rPr>
-              <w:t>G1 unavailable. Reference nonexistent missing_qa_value; separately test isDefined(missing_qa_value); compare with an available local.</w:t>
+              <w:t>Working baseline is available; remaining original steps are not yet executed.</w:t>
             </w:r>
           </w:p>
         </w:tc>
@@ -10154,7 +10376,7 @@
                 <w:color w:val="000000"/>
                 <w:sz w:val="18"/>
               </w:rPr>
-              <w:t>BLOCKED</w:t>
+              <w:t>PENDING</w:t>
             </w:r>
           </w:p>
         </w:tc>
@@ -10180,7 +10402,7 @@
                 <w:color w:val="000000"/>
                 <w:sz w:val="18"/>
               </w:rPr>
-              <w:t>0, -1 and abc disable Start; 9999 enables an unsubmitted draft. Runtime out-of-range, blank/comment and relocation tests need G1.</w:t>
+              <w:t>Line 9999 produced NoFunctionsAtLine; a separate valid line 17 probe captured. Blank/comment-line variants remain pending.</w:t>
             </w:r>
           </w:p>
         </w:tc>
@@ -10237,7 +10459,7 @@
                 <w:color w:val="000000"/>
                 <w:sz w:val="18"/>
               </w:rPr>
-              <w:t>BLOCKED</w:t>
+              <w:t>PENDING</w:t>
             </w:r>
           </w:p>
         </w:tc>
@@ -10263,7 +10485,7 @@
                 <w:color w:val="000000"/>
                 <w:sz w:val="18"/>
               </w:rPr>
-              <w:t>Python Module pricing / Function calculate_quote enables a draft. No submission; entry/exit, method context and line comparison remain untested.</w:t>
+              <w:t>Earlier draft subchecks are preserved; the remaining runtime or saved-entity requirements are pending.</w:t>
             </w:r>
           </w:p>
         </w:tc>
@@ -10320,7 +10542,7 @@
                 <w:color w:val="000000"/>
                 <w:sz w:val="18"/>
               </w:rPr>
-              <w:t>BLOCKED</w:t>
+              <w:t>PENDING</w:t>
             </w:r>
           </w:p>
         </w:tc>
@@ -10346,7 +10568,7 @@
                 <w:color w:val="000000"/>
                 <w:sz w:val="18"/>
               </w:rPr>
-              <w:t>G1 unavailable. Rapidly double-click Create/Apply once; repeat Enter once during pending state; reload and inspect list.</w:t>
+              <w:t>Working baseline is available; remaining original steps are not yet executed.</w:t>
             </w:r>
           </w:p>
         </w:tc>
@@ -10380,7 +10602,7 @@
           <w:b w:val="0"/>
           <w:sz w:val="18"/>
         </w:rPr>
-        <w:t>63 CASE CHECKPOINT  |  2 SCOPED PASS  |  4 FINDING  |  57 BLOCKED</w:t>
+        <w:t>63 CASES  |  10 PASS  |  5 FINDING  |  19 OPEN  |  29 BLOCKED</w:t>
       </w:r>
     </w:p>
     <w:p>
@@ -10555,7 +10777,7 @@
                 <w:color w:val="000000"/>
                 <w:sz w:val="18"/>
               </w:rPr>
-              <w:t>BLOCKED</w:t>
+              <w:t>PENDING</w:t>
             </w:r>
           </w:p>
         </w:tc>
@@ -10581,7 +10803,7 @@
                 <w:color w:val="000000"/>
                 <w:sz w:val="18"/>
               </w:rPr>
-              <w:t>G1 unavailable. Two-tab stale edit and lost-update behavior require an existing logpoint and actual active-definition checks.</w:t>
+              <w:t>Working baseline is available; remaining original steps are not yet executed.</w:t>
             </w:r>
           </w:p>
         </w:tc>
@@ -10638,7 +10860,7 @@
                 <w:color w:val="000000"/>
                 <w:sz w:val="18"/>
               </w:rPr>
-              <w:t>BLOCKED</w:t>
+              <w:t>PENDING</w:t>
             </w:r>
           </w:p>
         </w:tc>
@@ -10664,7 +10886,7 @@
                 <w:color w:val="000000"/>
                 <w:sz w:val="18"/>
               </w:rPr>
-              <w:t>G1 unavailable. Disable logpoint in A; use stale edit/re-enable UI in B; reload.</w:t>
+              <w:t>Working baseline is available; remaining original steps are not yet executed.</w:t>
             </w:r>
           </w:p>
         </w:tc>
@@ -10721,7 +10943,7 @@
                 <w:color w:val="000000"/>
                 <w:sz w:val="18"/>
               </w:rPr>
-              <w:t>BLOCKED</w:t>
+              <w:t>PASS</w:t>
             </w:r>
           </w:p>
         </w:tc>
@@ -10747,7 +10969,7 @@
                 <w:color w:val="000000"/>
                 <w:sz w:val="18"/>
               </w:rPr>
-              <w:t>G1 unavailable. Record expiry time; keep traffic before and after it; leave page open, then reload and reopen direct session link.</w:t>
+              <w:t>Expired state/history survived reload/direct link. Last target execution and continuing control bound the stop; not instantaneous.</w:t>
             </w:r>
           </w:p>
         </w:tc>
@@ -10804,7 +11026,7 @@
                 <w:color w:val="000000"/>
                 <w:sz w:val="18"/>
               </w:rPr>
-              <w:t>BLOCKED</w:t>
+              <w:t>PENDING</w:t>
             </w:r>
           </w:p>
         </w:tc>
@@ -10830,7 +11052,7 @@
                 <w:color w:val="000000"/>
                 <w:sz w:val="18"/>
               </w:rPr>
-              <w:t>G1 unavailable. Use available re-enable/extend flow; inspect new deadline and resulting IDs; generate fresh traffic.</w:t>
+              <w:t>Working baseline is available; remaining original steps are not yet executed.</w:t>
             </w:r>
           </w:p>
         </w:tc>
@@ -10887,7 +11109,7 @@
                 <w:color w:val="000000"/>
                 <w:sz w:val="18"/>
               </w:rPr>
-              <w:t>BLOCKED</w:t>
+              <w:t>PENDING</w:t>
             </w:r>
           </w:p>
         </w:tc>
@@ -10913,7 +11135,7 @@
                 <w:color w:val="000000"/>
                 <w:sz w:val="18"/>
               </w:rPr>
-              <w:t>G1 unavailable. Disable one logpoint, then whole session; attempt documented re-enable paths; inspect sibling state each time.</w:t>
+              <w:t>Working baseline is available; remaining original steps are not yet executed.</w:t>
             </w:r>
           </w:p>
         </w:tc>
@@ -10970,7 +11192,7 @@
                 <w:color w:val="000000"/>
                 <w:sz w:val="18"/>
               </w:rPr>
-              <w:t>BLOCKED</w:t>
+              <w:t>PENDING</w:t>
             </w:r>
           </w:p>
         </w:tc>
@@ -10996,7 +11218,7 @@
                 <w:color w:val="000000"/>
                 <w:sz w:val="18"/>
               </w:rPr>
-              <w:t>Empty-modal navigation and edited Function-draft cancellation/reopen reset verified. Saved-entity and runtime persistence remain untested.</w:t>
+              <w:t>Earlier draft subchecks are preserved; the remaining runtime or saved-entity requirements are pending.</w:t>
             </w:r>
           </w:p>
         </w:tc>
@@ -11053,7 +11275,7 @@
                 <w:color w:val="000000"/>
                 <w:sz w:val="18"/>
               </w:rPr>
-              <w:t>BLOCKED</w:t>
+              <w:t>PENDING</w:t>
             </w:r>
           </w:p>
         </w:tc>
@@ -11079,7 +11301,7 @@
                 <w:color w:val="000000"/>
                 <w:sz w:val="18"/>
               </w:rPr>
-              <w:t>G1 unavailable. Attempt to edit original target service/environment/location on an existing logpoint; use the UI's supported alternate flow if blocked.</w:t>
+              <w:t>Working baseline is available; remaining original steps are not yet executed.</w:t>
             </w:r>
           </w:p>
         </w:tc>
@@ -11136,7 +11358,7 @@
                 <w:color w:val="000000"/>
                 <w:sz w:val="18"/>
               </w:rPr>
-              <w:t>BLOCKED</w:t>
+              <w:t>PENDING</w:t>
             </w:r>
           </w:p>
         </w:tc>
@@ -11162,7 +11384,7 @@
                 <w:color w:val="000000"/>
                 <w:sz w:val="18"/>
               </w:rPr>
-              <w:t>G1 unavailable. Turn variable capture off, apply, produce traffic, then turn back on and capture again.</w:t>
+              <w:t>Working baseline is available; remaining original steps are not yet executed.</w:t>
             </w:r>
           </w:p>
         </w:tc>
@@ -11219,7 +11441,7 @@
                 <w:color w:val="000000"/>
                 <w:sz w:val="18"/>
               </w:rPr>
-              <w:t>BLOCKED</w:t>
+              <w:t>PENDING</w:t>
             </w:r>
           </w:p>
         </w:tc>
@@ -11245,7 +11467,7 @@
                 <w:color w:val="000000"/>
                 <w:sz w:val="18"/>
               </w:rPr>
-              <w:t>G1 unavailable. Narrow time range to exclude newest events, pause/resume stream, change sorting, clear filters, reopen event.</w:t>
+              <w:t>Working baseline is available; remaining original steps are not yet executed.</w:t>
             </w:r>
           </w:p>
         </w:tc>
@@ -11279,7 +11501,7 @@
           <w:b w:val="0"/>
           <w:sz w:val="18"/>
         </w:rPr>
-        <w:t>63 CASE CHECKPOINT  |  2 SCOPED PASS  |  4 FINDING  |  57 BLOCKED</w:t>
+        <w:t>63 CASES  |  10 PASS  |  5 FINDING  |  19 OPEN  |  29 BLOCKED</w:t>
       </w:r>
     </w:p>
     <w:p>
@@ -11480,7 +11702,7 @@
                 <w:color w:val="000000"/>
                 <w:sz w:val="18"/>
               </w:rPr>
-              <w:t>G1, G4 unavailable. While session is active, stop/restart only test process, then send traffic.</w:t>
+              <w:t>Additional controlled fixture/deployment variant is not yet exercised: isolated runtime restart permitted.</w:t>
             </w:r>
           </w:p>
         </w:tc>
@@ -11563,7 +11785,7 @@
                 <w:color w:val="000000"/>
                 <w:sz w:val="18"/>
               </w:rPr>
-              <w:t>G1, G4 unavailable. Preserve config; deliberately stop only test Agent or use approved test-only disconnected state.</w:t>
+              <w:t>Additional controlled fixture/deployment variant is not yet exercised: isolated forwarding failure permitted.</w:t>
             </w:r>
           </w:p>
         </w:tc>
@@ -11646,7 +11868,7 @@
                 <w:color w:val="000000"/>
                 <w:sz w:val="18"/>
               </w:rPr>
-              <w:t>G1, G4 unavailable. Target one version/environment, produce traffic in both, inspect event tags and source view; then deliberately choose the other.</w:t>
+              <w:t>Additional controlled fixture/deployment variant is not yet exercised: two fixture versions/envs with distinct numeric outputs.</w:t>
             </w:r>
           </w:p>
         </w:tc>
@@ -11729,7 +11951,7 @@
                 <w:color w:val="000000"/>
                 <w:sz w:val="18"/>
               </w:rPr>
-              <w:t>G1, G4 unavailable. Capture dummy numeric locals plus obvious dummy password/accessToken values and harmless string.</w:t>
+              <w:t>Additional controlled fixture/deployment variant is not yet exercised: approved synthetic redaction fixture.</w:t>
             </w:r>
           </w:p>
         </w:tc>
@@ -11812,7 +12034,7 @@
                 <w:color w:val="000000"/>
                 <w:sz w:val="18"/>
               </w:rPr>
-              <w:t>G1, G4 unavailable. Capture empty list/map, nested object, duplicate leaf names, long synthetic string, and bounded cyclic structure.</w:t>
+              <w:t>Additional controlled fixture/deployment variant is not yet exercised: small extra fixture permitted.</w:t>
             </w:r>
           </w:p>
         </w:tc>
@@ -11895,7 +12117,7 @@
                 <w:color w:val="000000"/>
                 <w:sz w:val="18"/>
               </w:rPr>
-              <w:t>G1/G4 unavailable. Normal 1.1-second traffic versus a bounded burst; sampling and application health not tested.</w:t>
+              <w:t>Additional controlled fixture/deployment variant is not yet exercised: tiny burst test approved.</w:t>
             </w:r>
           </w:p>
         </w:tc>
@@ -11978,7 +12200,7 @@
                 <w:color w:val="000000"/>
                 <w:sz w:val="18"/>
               </w:rPr>
-              <w:t>Original pre-install/cancel scope passes. Later GitHub grant is verified; Datadog association fails under S11.</w:t>
+              <w:t>Pre-install permission/cancel scope verified; approved A-only repair and exact source retrieval are documented separately.</w:t>
             </w:r>
           </w:p>
         </w:tc>
@@ -12035,7 +12257,7 @@
                 <w:color w:val="000000"/>
                 <w:sz w:val="18"/>
               </w:rPr>
-              <w:t>BLOCKED</w:t>
+              <w:t>PASS</w:t>
             </w:r>
           </w:p>
         </w:tc>
@@ -12061,7 +12283,7 @@
                 <w:color w:val="000000"/>
                 <w:sz w:val="18"/>
               </w:rPr>
-              <w:t>G2 unavailable. Open source from actual capture; compare repository owner/name, full SHA, file, line, and nearby text with deployed C1.</w:t>
+              <w:t>Captured event, in-product source and followed provider link match the deployed SHA, pricing.py:17 and nearby code.</w:t>
             </w:r>
           </w:p>
         </w:tc>
@@ -12118,7 +12340,7 @@
                 <w:color w:val="000000"/>
                 <w:sz w:val="18"/>
               </w:rPr>
-              <w:t>BLOCKED</w:t>
+              <w:t>PENDING</w:t>
             </w:r>
           </w:p>
         </w:tc>
@@ -12144,7 +12366,7 @@
                 <w:color w:val="000000"/>
                 <w:sz w:val="18"/>
               </w:rPr>
-              <w:t>A-only grant and ungranted private B are verified. A source retrieval and B-denied retrieval remain blocked until Datadog association/G2 works.</w:t>
+              <w:t>Working baseline is available; remaining original steps are not yet executed.</w:t>
             </w:r>
           </w:p>
         </w:tc>
@@ -12178,7 +12400,7 @@
           <w:b w:val="0"/>
           <w:sz w:val="18"/>
         </w:rPr>
-        <w:t>63 CASE CHECKPOINT  |  2 SCOPED PASS  |  4 FINDING  |  57 BLOCKED</w:t>
+        <w:t>63 CASES  |  10 PASS  |  5 FINDING  |  19 OPEN  |  29 BLOCKED</w:t>
       </w:r>
     </w:p>
     <w:p>
@@ -12379,7 +12601,7 @@
                 <w:color w:val="000000"/>
                 <w:sz w:val="18"/>
               </w:rPr>
-              <w:t>G2, G4 unavailable. Map only a dedicated test instance to known B URL/SHA without granting B.</w:t>
+              <w:t>Additional controlled fixture/deployment variant is not yet exercised: approved test service tagged to B.</w:t>
             </w:r>
           </w:p>
         </w:tc>
@@ -12462,7 +12684,7 @@
                 <w:color w:val="000000"/>
                 <w:sz w:val="18"/>
               </w:rPr>
-              <w:t>G2, G4 unavailable. In C2 shift the pricing lines and change a numeric marker; do not deploy C2.</w:t>
+              <w:t>Additional controlled fixture/deployment variant is not yet exercised: A has C1 and newer C2; C1 remains deployed.</w:t>
             </w:r>
           </w:p>
         </w:tc>
@@ -12545,7 +12767,7 @@
                 <w:color w:val="000000"/>
                 <w:sz w:val="18"/>
               </w:rPr>
-              <w:t>G2, G4 unavailable. Independently test absent SHA, syntactically invalid SHA, valid-length nonexistent SHA, then real SHA with wrong repository.</w:t>
+              <w:t>Additional controlled fixture/deployment variant is not yet exercised: authorized fixture metadata variant.</w:t>
             </w:r>
           </w:p>
         </w:tc>
@@ -12628,7 +12850,7 @@
                 <w:color w:val="000000"/>
                 <w:sz w:val="18"/>
               </w:rPr>
-              <w:t>G2, G4 unavailable. Show both versions under same service/environment.</w:t>
+              <w:t>Additional controlled fixture/deployment variant is not yet exercised: approved A/C1 and A/C2 deployments.</w:t>
             </w:r>
           </w:p>
         </w:tc>
@@ -12711,7 +12933,7 @@
                 <w:color w:val="000000"/>
                 <w:sz w:val="18"/>
               </w:rPr>
-              <w:t>G2, G4 unavailable. Test same basename in two directories, moved/renamed file across commits, and path with spaces or non-ASCII.</w:t>
+              <w:t>Additional controlled fixture/deployment variant is not yet exercised: available filename/path variants; G4 to create.</w:t>
             </w:r>
           </w:p>
         </w:tc>
@@ -12794,7 +13016,7 @@
                 <w:color w:val="000000"/>
                 <w:sz w:val="18"/>
               </w:rPr>
-              <w:t>G1/G2/G4 unavailable. Compare HTTPS, trailing .git and supported SSH metadata forms with actual source mapping.</w:t>
+              <w:t>Additional controlled fixture/deployment variant is not yet exercised: mapping variants allowed.</w:t>
             </w:r>
           </w:p>
         </w:tc>
@@ -12877,7 +13099,7 @@
                 <w:color w:val="000000"/>
                 <w:sz w:val="18"/>
               </w:rPr>
-              <w:t>G2, G3 unavailable. Record before-state and known fetched files.</w:t>
+              <w:t>Case-specific restricted identity/permission-revocation setup is not established.</w:t>
             </w:r>
           </w:p>
         </w:tc>
@@ -12960,7 +13182,7 @@
                 <w:color w:val="000000"/>
                 <w:sz w:val="18"/>
               </w:rPr>
-              <w:t>MEDIUM SCI01: installed/authorized A-only link cannot recover through Connect after an interrupted flow; fresh-install cause unproven.</w:t>
+              <w:t>Interrupted Connect retry failed; controlled A-only reinstall repaired association and baseline source retrieval.</w:t>
             </w:r>
           </w:p>
         </w:tc>
@@ -13043,7 +13265,7 @@
                 <w:color w:val="000000"/>
                 <w:sz w:val="18"/>
               </w:rPr>
-              <w:t>G1, G3 unavailable. As read-only user, inspect session and attempt create/edit/disable through UI and copied direct page link.</w:t>
+              <w:t>Case-specific restricted identity/permission-revocation setup is not established.</w:t>
             </w:r>
           </w:p>
         </w:tc>
@@ -13077,7 +13299,7 @@
           <w:b w:val="0"/>
           <w:sz w:val="18"/>
         </w:rPr>
-        <w:t>63 CASE CHECKPOINT  |  2 SCOPED PASS  |  4 FINDING  |  57 BLOCKED</w:t>
+        <w:t>63 CASES  |  10 PASS  |  5 FINDING  |  19 OPEN  |  29 BLOCKED</w:t>
       </w:r>
     </w:p>
     <w:p>
@@ -13278,7 +13500,7 @@
                 <w:color w:val="000000"/>
                 <w:sz w:val="18"/>
               </w:rPr>
-              <w:t>G1, G3 unavailable. Open an editable session, revoke only that user's write capability via approved admin, then apply from stale tab and reload.</w:t>
+              <w:t>Case-specific restricted identity/permission-revocation setup is not established.</w:t>
             </w:r>
           </w:p>
         </w:tc>
@@ -13361,7 +13583,7 @@
                 <w:color w:val="000000"/>
                 <w:sz w:val="18"/>
               </w:rPr>
-              <w:t>G1, G3 unavailable. Open same session under both identities; test event/snapshot direct links and expand captured values.</w:t>
+              <w:t>Case-specific restricted identity/permission-revocation setup is not established.</w:t>
             </w:r>
           </w:p>
         </w:tc>
@@ -13444,7 +13666,7 @@
                 <w:color w:val="000000"/>
                 <w:sz w:val="18"/>
               </w:rPr>
-              <w:t>G2, G3 unavailable. Compare source retrieval under user with GitHub access and user without it, using the same authorized Datadog org integration.</w:t>
+              <w:t>Case-specific restricted identity/permission-revocation setup is not established.</w:t>
             </w:r>
           </w:p>
         </w:tc>
@@ -13501,7 +13723,7 @@
                 <w:color w:val="000000"/>
                 <w:sz w:val="18"/>
               </w:rPr>
-              <w:t>BLOCKED</w:t>
+              <w:t>PENDING</w:t>
             </w:r>
           </w:p>
         </w:tc>
@@ -13527,7 +13749,7 @@
                 <w:color w:val="000000"/>
                 <w:sz w:val="18"/>
               </w:rPr>
-              <w:t>No second org/account and no genuine session/source direct-link target.</w:t>
+              <w:t>Signed-out deep-link branch awaits execution; wrong-org branch needs a second authorized context.</w:t>
             </w:r>
           </w:p>
         </w:tc>
@@ -13610,7 +13832,7 @@
                 <w:color w:val="000000"/>
                 <w:sz w:val="18"/>
               </w:rPr>
-              <w:t>Bits gate visible; Strict-mode and full source/preview combinations not established.</w:t>
+              <w:t>Targeted redaction is visible; Strict-mode and full source/preview gate combinations remain unverified.</w:t>
             </w:r>
           </w:p>
         </w:tc>
@@ -13693,7 +13915,7 @@
                 <w:color w:val="000000"/>
                 <w:sz w:val="18"/>
               </w:rPr>
-              <w:t>G1, G2 unavailable. Ask why exactly three units cost 3600 instead of 3240.</w:t>
+              <w:t>Source baseline works; Bits preview availability and the approved assisted path remain unverified.</w:t>
             </w:r>
           </w:p>
         </w:tc>
@@ -13750,7 +13972,7 @@
                 <w:color w:val="000000"/>
                 <w:sz w:val="18"/>
               </w:rPr>
-              <w:t>BLOCKED</w:t>
+              <w:t>IN PROGRESS</w:t>
             </w:r>
           </w:p>
         </w:tc>
@@ -13776,7 +13998,7 @@
                 <w:color w:val="000000"/>
                 <w:sz w:val="18"/>
               </w:rPr>
-              <w:t>Rejected submissions left All 0 / Active 0 / Inactive 0 after filter reset. Drafts closed by 05:45; no created-entity lifecycle cleanup.</w:t>
+              <w:t>Intentional test sessions are active. Final disable, direct-link and continued-traffic checks remain open.</w:t>
             </w:r>
           </w:p>
         </w:tc>
@@ -13833,7 +14055,7 @@
                 <w:color w:val="000000"/>
                 <w:sz w:val="18"/>
               </w:rPr>
-              <w:t>BLOCKED</w:t>
+              <w:t>IN PROGRESS</w:t>
             </w:r>
           </w:p>
         </w:tc>
@@ -13859,7 +14081,7 @@
                 <w:color w:val="000000"/>
                 <w:sz w:val="18"/>
               </w:rPr>
-              <w:t>Runtime stopped, A-only installation and A/B assets retained. Full latest settings/resource reconciliation incomplete.</w:t>
+              <w:t>Hosted runtime, A-only grant and retained fixtures are tracked; final resources/settings reconciliation remains open.</w:t>
             </w:r>
           </w:p>
         </w:tc>
@@ -13916,7 +14138,7 @@
                 <w:color w:val="000000"/>
                 <w:sz w:val="18"/>
               </w:rPr>
-              <w:t>BLOCKED</w:t>
+              <w:t>PASS</w:t>
             </w:r>
           </w:p>
         </w:tc>
@@ -13942,7 +14164,7 @@
                 <w:color w:val="000000"/>
                 <w:sz w:val="18"/>
               </w:rPr>
-              <w:t>Local invalid/valid command controls verified; live correction retest needs G1/G2.</w:t>
+              <w:t>Command workaround and controlled A-only repair are verified with actual capture/source; original causes/fixes are not overclaimed.</w:t>
             </w:r>
           </w:p>
         </w:tc>
@@ -13976,7 +14198,7 @@
           <w:b w:val="0"/>
           <w:sz w:val="18"/>
         </w:rPr>
-        <w:t>63 CASE CHECKPOINT  |  2 SCOPED PASS  |  4 FINDING  |  57 BLOCKED</w:t>
+        <w:t>63 CASES  |  10 PASS  |  5 FINDING  |  19 OPEN  |  29 BLOCKED</w:t>
       </w:r>
     </w:p>
     <w:p>
@@ -14177,7 +14399,7 @@
                 <w:color w:val="000000"/>
                 <w:sz w:val="18"/>
               </w:rPr>
-              <w:t>G1, G2, G4 unavailable. Keep both commits active under one service/environment; give each replica a unique numeric marker; capture bounded traffic and open each event source.</w:t>
+              <w:t>Additional controlled fixture/deployment variant is not yet exercised: two approved test replicas at C1/C2 during a rolling deployment.</w:t>
             </w:r>
           </w:p>
         </w:tc>
@@ -14260,7 +14482,7 @@
                 <w:color w:val="000000"/>
                 <w:sz w:val="18"/>
               </w:rPr>
-              <w:t>G1, G2, G4 unavailable. Use different numeric markers; switch environment/version/repository filters quickly and open each event directly.</w:t>
+              <w:t>Additional controlled fixture/deployment variant is not yet exercised: same service name across two test environments and two repository forks.</w:t>
             </w:r>
           </w:p>
         </w:tc>
@@ -14343,7 +14565,7 @@
                 <w:color w:val="000000"/>
                 <w:sz w:val="18"/>
               </w:rPr>
-              <w:t>G1, G4 unavailable. Install at the never-executed function; separately create a target known to fail installation; compare status; finally execute the healthy function once.</w:t>
+              <w:t>Additional controlled fixture/deployment variant is not yet exercised: one healthy function that is never called and one controlled failed installation.</w:t>
             </w:r>
           </w:p>
         </w:tc>
@@ -14400,7 +14622,7 @@
                 <w:color w:val="000000"/>
                 <w:sz w:val="18"/>
               </w:rPr>
-              <w:t>BLOCKED</w:t>
+              <w:t>PASS</w:t>
             </w:r>
           </w:p>
         </w:tc>
@@ -14426,7 +14648,7 @@
                 <w:color w:val="000000"/>
                 <w:sz w:val="18"/>
               </w:rPr>
-              <w:t>G1 unavailable. Record executions immediately before and after effective stop; inspect late arrivals and refresh/direct links.</w:t>
+              <w:t>SDK snapshot time is separated from UI row time and retained history; later control executed after the target stopped.</w:t>
             </w:r>
           </w:p>
         </w:tc>
@@ -14509,7 +14731,7 @@
                 <w:color w:val="000000"/>
                 <w:sz w:val="18"/>
               </w:rPr>
-              <w:t>G1, G2, G4 unavailable. Capture baseline at C1; deploy C2; inspect installed target, displayed source, and new captures.</w:t>
+              <w:t>Additional controlled fixture/deployment variant is not yet exercised: C2 shifts the original selected statement to a new line.</w:t>
             </w:r>
           </w:p>
         </w:tc>
@@ -14592,7 +14814,7 @@
                 <w:color w:val="000000"/>
                 <w:sz w:val="18"/>
               </w:rPr>
-              <w:t>G1, G4 unavailable. Send bounded overlapping requests carrying unique numeric correlation IDs; inspect local variables, trace/request context, and source per event.</w:t>
+              <w:t>Additional controlled fixture/deployment variant is not yet exercised: approved tiny async fixture variant.</w:t>
             </w:r>
           </w:p>
         </w:tc>
@@ -14675,7 +14897,7 @@
                 <w:color w:val="000000"/>
                 <w:sz w:val="18"/>
               </w:rPr>
-              <w:t>G1, G4 unavailable. Exercise cyclic objects, Unicode keys/values, duplicate nested keys, and nested dummy password/accessToken identifiers without weakening redaction.</w:t>
+              <w:t>Additional controlled fixture/deployment variant is not yet exercised: approved small synthetic data fixture.</w:t>
             </w:r>
           </w:p>
         </w:tc>
@@ -14758,7 +14980,7 @@
                 <w:color w:val="000000"/>
                 <w:sz w:val="18"/>
               </w:rPr>
-              <w:t>G2, G3 unavailable. Establish source baseline; remove one permitted prerequisite or revoke A; restore only its prior authorized scope; refresh and request fresh source.</w:t>
+              <w:t>Case-specific restricted identity/permission-revocation setup is not established.</w:t>
             </w:r>
           </w:p>
         </w:tc>
@@ -14815,7 +15037,7 @@
                 <w:color w:val="000000"/>
                 <w:sz w:val="18"/>
               </w:rPr>
-              <w:t>BLOCKED</w:t>
+              <w:t>PENDING</w:t>
             </w:r>
           </w:p>
         </w:tc>
@@ -14841,7 +15063,7 @@
                 <w:color w:val="000000"/>
                 <w:sz w:val="18"/>
               </w:rPr>
-              <w:t>G1 unavailable. Give session one condition quantity == 3 and session two quantity == 4; generate 2/3/4 traffic; edit one, then stop/expire one while the other remains active.</w:t>
+              <w:t>Working baseline is available; remaining original steps are not yet executed.</w:t>
             </w:r>
           </w:p>
         </w:tc>
@@ -15832,6 +16054,2320 @@
           <w:b w:val="0"/>
         </w:rPr>
       </w:r>
+    </w:p>
+    <w:p>
+      <w:pPr>
+        <w:pStyle w:val="Heading1"/>
+        <w:pageBreakBefore/>
+      </w:pPr>
+      <w:r>
+        <w:t>Verified live capture</w:t>
+      </w:r>
+    </w:p>
+    <w:p>
+      <w:pPr>
+        <w:pStyle w:val="Normal"/>
+      </w:pPr>
+      <w:r>
+        <w:t>F01 now passes the planned baseline. The live message template and captured locals agree for quantities 2, 3 and 4. Quantity 3 exposes the deliberately planted application boundary bug; it is not a Datadog defect.</w:t>
+      </w:r>
+    </w:p>
+    <w:tbl>
+      <w:tblPr>
+        <w:tblW w:type="auto" w:w="0"/>
+        <w:jc w:val="center"/>
+        <w:tblLayout w:type="fixed"/>
+        <w:tblLook w:firstColumn="1" w:firstRow="1" w:lastColumn="0" w:lastRow="0" w:noHBand="0" w:noVBand="1" w:val="04A0"/>
+        <w:tblBorders>
+          <w:top w:val="single" w:sz="4" w:color="D9D9D9"/>
+          <w:left w:val="single" w:sz="4" w:color="D9D9D9"/>
+          <w:bottom w:val="single" w:sz="4" w:color="D9D9D9"/>
+          <w:right w:val="single" w:sz="4" w:color="D9D9D9"/>
+          <w:insideH w:val="single" w:sz="4" w:color="D9D9D9"/>
+          <w:insideV w:val="single" w:sz="4" w:color="D9D9D9"/>
+        </w:tblBorders>
+      </w:tblPr>
+      <w:tblGrid>
+        <w:gridCol w:w="936"/>
+        <w:gridCol w:w="1800"/>
+        <w:gridCol w:w="2808"/>
+        <w:gridCol w:w="1728"/>
+        <w:gridCol w:w="2952"/>
+      </w:tblGrid>
+      <w:tr>
+        <w:trPr>
+          <w:tblHeader/>
+          <w:cantSplit/>
+        </w:trPr>
+        <w:tc>
+          <w:tcPr>
+            <w:tcW w:type="dxa" w:w="936"/>
+            <w:vAlign w:val="center"/>
+            <w:tcMar>
+              <w:top w:w="85" w:type="dxa"/>
+              <w:left w:w="85" w:type="dxa"/>
+              <w:bottom w:w="85" w:type="dxa"/>
+              <w:right w:w="85" w:type="dxa"/>
+            </w:tcMar>
+            <w:shd w:fill="24384B"/>
+          </w:tcPr>
+          <w:p>
+            <w:pPr>
+              <w:spacing w:after="20" w:before="20" w:line="240" w:lineRule="auto"/>
+            </w:pPr>
+            <w:r>
+              <w:rPr>
+                <w:b/>
+                <w:color w:val="FFFFFF"/>
+                <w:sz w:val="18"/>
+              </w:rPr>
+              <w:t>Quantity</w:t>
+            </w:r>
+          </w:p>
+        </w:tc>
+        <w:tc>
+          <w:tcPr>
+            <w:tcW w:type="dxa" w:w="1800"/>
+            <w:vAlign w:val="center"/>
+            <w:tcMar>
+              <w:top w:w="85" w:type="dxa"/>
+              <w:left w:w="85" w:type="dxa"/>
+              <w:bottom w:w="85" w:type="dxa"/>
+              <w:right w:w="85" w:type="dxa"/>
+            </w:tcMar>
+            <w:shd w:fill="24384B"/>
+          </w:tcPr>
+          <w:p>
+            <w:pPr>
+              <w:spacing w:after="20" w:before="20" w:line="240" w:lineRule="auto"/>
+            </w:pPr>
+            <w:r>
+              <w:rPr>
+                <w:b/>
+                <w:color w:val="FFFFFF"/>
+                <w:sz w:val="18"/>
+              </w:rPr>
+              <w:t>Subtotal</w:t>
+            </w:r>
+          </w:p>
+        </w:tc>
+        <w:tc>
+          <w:tcPr>
+            <w:tcW w:type="dxa" w:w="2808"/>
+            <w:vAlign w:val="center"/>
+            <w:tcMar>
+              <w:top w:w="85" w:type="dxa"/>
+              <w:left w:w="85" w:type="dxa"/>
+              <w:bottom w:w="85" w:type="dxa"/>
+              <w:right w:w="85" w:type="dxa"/>
+            </w:tcMar>
+            <w:shd w:fill="24384B"/>
+          </w:tcPr>
+          <w:p>
+            <w:pPr>
+              <w:spacing w:after="20" w:before="20" w:line="240" w:lineRule="auto"/>
+            </w:pPr>
+            <w:r>
+              <w:rPr>
+                <w:b/>
+                <w:color w:val="FFFFFF"/>
+                <w:sz w:val="18"/>
+              </w:rPr>
+              <w:t>Discount eligible</w:t>
+            </w:r>
+          </w:p>
+        </w:tc>
+        <w:tc>
+          <w:tcPr>
+            <w:tcW w:type="dxa" w:w="1728"/>
+            <w:vAlign w:val="center"/>
+            <w:tcMar>
+              <w:top w:w="85" w:type="dxa"/>
+              <w:left w:w="85" w:type="dxa"/>
+              <w:bottom w:w="85" w:type="dxa"/>
+              <w:right w:w="85" w:type="dxa"/>
+            </w:tcMar>
+            <w:shd w:fill="24384B"/>
+          </w:tcPr>
+          <w:p>
+            <w:pPr>
+              <w:spacing w:after="20" w:before="20" w:line="240" w:lineRule="auto"/>
+            </w:pPr>
+            <w:r>
+              <w:rPr>
+                <w:b/>
+                <w:color w:val="FFFFFF"/>
+                <w:sz w:val="18"/>
+              </w:rPr>
+              <w:t>Discount</w:t>
+            </w:r>
+          </w:p>
+        </w:tc>
+        <w:tc>
+          <w:tcPr>
+            <w:tcW w:type="dxa" w:w="2952"/>
+            <w:vAlign w:val="center"/>
+            <w:tcMar>
+              <w:top w:w="85" w:type="dxa"/>
+              <w:left w:w="85" w:type="dxa"/>
+              <w:bottom w:w="85" w:type="dxa"/>
+              <w:right w:w="85" w:type="dxa"/>
+            </w:tcMar>
+            <w:shd w:fill="24384B"/>
+          </w:tcPr>
+          <w:p>
+            <w:pPr>
+              <w:spacing w:after="20" w:before="20" w:line="240" w:lineRule="auto"/>
+            </w:pPr>
+            <w:r>
+              <w:rPr>
+                <w:b/>
+                <w:color w:val="FFFFFF"/>
+                <w:sz w:val="18"/>
+              </w:rPr>
+              <w:t>Actual total</w:t>
+            </w:r>
+          </w:p>
+        </w:tc>
+      </w:tr>
+      <w:tr>
+        <w:trPr>
+          <w:cantSplit/>
+        </w:trPr>
+        <w:tc>
+          <w:tcPr>
+            <w:tcW w:type="dxa" w:w="936"/>
+            <w:vAlign w:val="center"/>
+            <w:tcMar>
+              <w:top w:w="85" w:type="dxa"/>
+              <w:left w:w="85" w:type="dxa"/>
+              <w:bottom w:w="85" w:type="dxa"/>
+              <w:right w:w="85" w:type="dxa"/>
+            </w:tcMar>
+            <w:shd w:fill="FFFFFF"/>
+          </w:tcPr>
+          <w:p>
+            <w:pPr>
+              <w:spacing w:after="20" w:before="20" w:line="240" w:lineRule="auto"/>
+            </w:pPr>
+            <w:r>
+              <w:rPr>
+                <w:b w:val="0"/>
+                <w:color w:val="000000"/>
+                <w:sz w:val="18"/>
+              </w:rPr>
+              <w:t>2</w:t>
+            </w:r>
+          </w:p>
+        </w:tc>
+        <w:tc>
+          <w:tcPr>
+            <w:tcW w:type="dxa" w:w="1800"/>
+            <w:vAlign w:val="center"/>
+            <w:tcMar>
+              <w:top w:w="85" w:type="dxa"/>
+              <w:left w:w="85" w:type="dxa"/>
+              <w:bottom w:w="85" w:type="dxa"/>
+              <w:right w:w="85" w:type="dxa"/>
+            </w:tcMar>
+            <w:shd w:fill="FFFFFF"/>
+          </w:tcPr>
+          <w:p>
+            <w:pPr>
+              <w:spacing w:after="20" w:before="20" w:line="240" w:lineRule="auto"/>
+            </w:pPr>
+            <w:r>
+              <w:rPr>
+                <w:b w:val="0"/>
+                <w:color w:val="000000"/>
+                <w:sz w:val="18"/>
+              </w:rPr>
+              <w:t>2400</w:t>
+            </w:r>
+          </w:p>
+        </w:tc>
+        <w:tc>
+          <w:tcPr>
+            <w:tcW w:type="dxa" w:w="2808"/>
+            <w:vAlign w:val="center"/>
+            <w:tcMar>
+              <w:top w:w="85" w:type="dxa"/>
+              <w:left w:w="85" w:type="dxa"/>
+              <w:bottom w:w="85" w:type="dxa"/>
+              <w:right w:w="85" w:type="dxa"/>
+            </w:tcMar>
+            <w:shd w:fill="FFFFFF"/>
+          </w:tcPr>
+          <w:p>
+            <w:pPr>
+              <w:spacing w:after="20" w:before="20" w:line="240" w:lineRule="auto"/>
+            </w:pPr>
+            <w:r>
+              <w:rPr>
+                <w:b w:val="0"/>
+                <w:color w:val="000000"/>
+                <w:sz w:val="18"/>
+              </w:rPr>
+              <w:t>false</w:t>
+            </w:r>
+          </w:p>
+        </w:tc>
+        <w:tc>
+          <w:tcPr>
+            <w:tcW w:type="dxa" w:w="1728"/>
+            <w:vAlign w:val="center"/>
+            <w:tcMar>
+              <w:top w:w="85" w:type="dxa"/>
+              <w:left w:w="85" w:type="dxa"/>
+              <w:bottom w:w="85" w:type="dxa"/>
+              <w:right w:w="85" w:type="dxa"/>
+            </w:tcMar>
+            <w:shd w:fill="FFFFFF"/>
+          </w:tcPr>
+          <w:p>
+            <w:pPr>
+              <w:spacing w:after="20" w:before="20" w:line="240" w:lineRule="auto"/>
+            </w:pPr>
+            <w:r>
+              <w:rPr>
+                <w:b w:val="0"/>
+                <w:color w:val="000000"/>
+                <w:sz w:val="18"/>
+              </w:rPr>
+              <w:t>0</w:t>
+            </w:r>
+          </w:p>
+        </w:tc>
+        <w:tc>
+          <w:tcPr>
+            <w:tcW w:type="dxa" w:w="2952"/>
+            <w:vAlign w:val="center"/>
+            <w:tcMar>
+              <w:top w:w="85" w:type="dxa"/>
+              <w:left w:w="85" w:type="dxa"/>
+              <w:bottom w:w="85" w:type="dxa"/>
+              <w:right w:w="85" w:type="dxa"/>
+            </w:tcMar>
+            <w:shd w:fill="FFFFFF"/>
+          </w:tcPr>
+          <w:p>
+            <w:pPr>
+              <w:spacing w:after="20" w:before="20" w:line="240" w:lineRule="auto"/>
+            </w:pPr>
+            <w:r>
+              <w:rPr>
+                <w:b w:val="0"/>
+                <w:color w:val="000000"/>
+                <w:sz w:val="18"/>
+              </w:rPr>
+              <w:t>2400</w:t>
+            </w:r>
+          </w:p>
+        </w:tc>
+      </w:tr>
+      <w:tr>
+        <w:trPr>
+          <w:cantSplit/>
+        </w:trPr>
+        <w:tc>
+          <w:tcPr>
+            <w:tcW w:type="dxa" w:w="936"/>
+            <w:vAlign w:val="center"/>
+            <w:tcMar>
+              <w:top w:w="85" w:type="dxa"/>
+              <w:left w:w="85" w:type="dxa"/>
+              <w:bottom w:w="85" w:type="dxa"/>
+              <w:right w:w="85" w:type="dxa"/>
+            </w:tcMar>
+            <w:shd w:fill="F3F5F7"/>
+          </w:tcPr>
+          <w:p>
+            <w:pPr>
+              <w:spacing w:after="20" w:before="20" w:line="240" w:lineRule="auto"/>
+            </w:pPr>
+            <w:r>
+              <w:rPr>
+                <w:b w:val="0"/>
+                <w:color w:val="000000"/>
+                <w:sz w:val="18"/>
+              </w:rPr>
+              <w:t>3</w:t>
+            </w:r>
+          </w:p>
+        </w:tc>
+        <w:tc>
+          <w:tcPr>
+            <w:tcW w:type="dxa" w:w="1800"/>
+            <w:vAlign w:val="center"/>
+            <w:tcMar>
+              <w:top w:w="85" w:type="dxa"/>
+              <w:left w:w="85" w:type="dxa"/>
+              <w:bottom w:w="85" w:type="dxa"/>
+              <w:right w:w="85" w:type="dxa"/>
+            </w:tcMar>
+            <w:shd w:fill="F3F5F7"/>
+          </w:tcPr>
+          <w:p>
+            <w:pPr>
+              <w:spacing w:after="20" w:before="20" w:line="240" w:lineRule="auto"/>
+            </w:pPr>
+            <w:r>
+              <w:rPr>
+                <w:b w:val="0"/>
+                <w:color w:val="000000"/>
+                <w:sz w:val="18"/>
+              </w:rPr>
+              <w:t>3600</w:t>
+            </w:r>
+          </w:p>
+        </w:tc>
+        <w:tc>
+          <w:tcPr>
+            <w:tcW w:type="dxa" w:w="2808"/>
+            <w:vAlign w:val="center"/>
+            <w:tcMar>
+              <w:top w:w="85" w:type="dxa"/>
+              <w:left w:w="85" w:type="dxa"/>
+              <w:bottom w:w="85" w:type="dxa"/>
+              <w:right w:w="85" w:type="dxa"/>
+            </w:tcMar>
+            <w:shd w:fill="F3F5F7"/>
+          </w:tcPr>
+          <w:p>
+            <w:pPr>
+              <w:spacing w:after="20" w:before="20" w:line="240" w:lineRule="auto"/>
+            </w:pPr>
+            <w:r>
+              <w:rPr>
+                <w:b w:val="0"/>
+                <w:color w:val="000000"/>
+                <w:sz w:val="18"/>
+              </w:rPr>
+              <w:t>false</w:t>
+            </w:r>
+          </w:p>
+        </w:tc>
+        <w:tc>
+          <w:tcPr>
+            <w:tcW w:type="dxa" w:w="1728"/>
+            <w:vAlign w:val="center"/>
+            <w:tcMar>
+              <w:top w:w="85" w:type="dxa"/>
+              <w:left w:w="85" w:type="dxa"/>
+              <w:bottom w:w="85" w:type="dxa"/>
+              <w:right w:w="85" w:type="dxa"/>
+            </w:tcMar>
+            <w:shd w:fill="F3F5F7"/>
+          </w:tcPr>
+          <w:p>
+            <w:pPr>
+              <w:spacing w:after="20" w:before="20" w:line="240" w:lineRule="auto"/>
+            </w:pPr>
+            <w:r>
+              <w:rPr>
+                <w:b w:val="0"/>
+                <w:color w:val="000000"/>
+                <w:sz w:val="18"/>
+              </w:rPr>
+              <w:t>0</w:t>
+            </w:r>
+          </w:p>
+        </w:tc>
+        <w:tc>
+          <w:tcPr>
+            <w:tcW w:type="dxa" w:w="2952"/>
+            <w:vAlign w:val="center"/>
+            <w:tcMar>
+              <w:top w:w="85" w:type="dxa"/>
+              <w:left w:w="85" w:type="dxa"/>
+              <w:bottom w:w="85" w:type="dxa"/>
+              <w:right w:w="85" w:type="dxa"/>
+            </w:tcMar>
+            <w:shd w:fill="F3F5F7"/>
+          </w:tcPr>
+          <w:p>
+            <w:pPr>
+              <w:spacing w:after="20" w:before="20" w:line="240" w:lineRule="auto"/>
+            </w:pPr>
+            <w:r>
+              <w:rPr>
+                <w:b w:val="0"/>
+                <w:color w:val="000000"/>
+                <w:sz w:val="18"/>
+              </w:rPr>
+              <w:t>3600</w:t>
+            </w:r>
+          </w:p>
+        </w:tc>
+      </w:tr>
+      <w:tr>
+        <w:trPr>
+          <w:cantSplit/>
+        </w:trPr>
+        <w:tc>
+          <w:tcPr>
+            <w:tcW w:type="dxa" w:w="936"/>
+            <w:vAlign w:val="center"/>
+            <w:tcMar>
+              <w:top w:w="85" w:type="dxa"/>
+              <w:left w:w="85" w:type="dxa"/>
+              <w:bottom w:w="85" w:type="dxa"/>
+              <w:right w:w="85" w:type="dxa"/>
+            </w:tcMar>
+            <w:shd w:fill="FFFFFF"/>
+          </w:tcPr>
+          <w:p>
+            <w:pPr>
+              <w:spacing w:after="20" w:before="20" w:line="240" w:lineRule="auto"/>
+            </w:pPr>
+            <w:r>
+              <w:rPr>
+                <w:b w:val="0"/>
+                <w:color w:val="000000"/>
+                <w:sz w:val="18"/>
+              </w:rPr>
+              <w:t>4</w:t>
+            </w:r>
+          </w:p>
+        </w:tc>
+        <w:tc>
+          <w:tcPr>
+            <w:tcW w:type="dxa" w:w="1800"/>
+            <w:vAlign w:val="center"/>
+            <w:tcMar>
+              <w:top w:w="85" w:type="dxa"/>
+              <w:left w:w="85" w:type="dxa"/>
+              <w:bottom w:w="85" w:type="dxa"/>
+              <w:right w:w="85" w:type="dxa"/>
+            </w:tcMar>
+            <w:shd w:fill="FFFFFF"/>
+          </w:tcPr>
+          <w:p>
+            <w:pPr>
+              <w:spacing w:after="20" w:before="20" w:line="240" w:lineRule="auto"/>
+            </w:pPr>
+            <w:r>
+              <w:rPr>
+                <w:b w:val="0"/>
+                <w:color w:val="000000"/>
+                <w:sz w:val="18"/>
+              </w:rPr>
+              <w:t>4800</w:t>
+            </w:r>
+          </w:p>
+        </w:tc>
+        <w:tc>
+          <w:tcPr>
+            <w:tcW w:type="dxa" w:w="2808"/>
+            <w:vAlign w:val="center"/>
+            <w:tcMar>
+              <w:top w:w="85" w:type="dxa"/>
+              <w:left w:w="85" w:type="dxa"/>
+              <w:bottom w:w="85" w:type="dxa"/>
+              <w:right w:w="85" w:type="dxa"/>
+            </w:tcMar>
+            <w:shd w:fill="FFFFFF"/>
+          </w:tcPr>
+          <w:p>
+            <w:pPr>
+              <w:spacing w:after="20" w:before="20" w:line="240" w:lineRule="auto"/>
+            </w:pPr>
+            <w:r>
+              <w:rPr>
+                <w:b w:val="0"/>
+                <w:color w:val="000000"/>
+                <w:sz w:val="18"/>
+              </w:rPr>
+              <w:t>true</w:t>
+            </w:r>
+          </w:p>
+        </w:tc>
+        <w:tc>
+          <w:tcPr>
+            <w:tcW w:type="dxa" w:w="1728"/>
+            <w:vAlign w:val="center"/>
+            <w:tcMar>
+              <w:top w:w="85" w:type="dxa"/>
+              <w:left w:w="85" w:type="dxa"/>
+              <w:bottom w:w="85" w:type="dxa"/>
+              <w:right w:w="85" w:type="dxa"/>
+            </w:tcMar>
+            <w:shd w:fill="FFFFFF"/>
+          </w:tcPr>
+          <w:p>
+            <w:pPr>
+              <w:spacing w:after="20" w:before="20" w:line="240" w:lineRule="auto"/>
+            </w:pPr>
+            <w:r>
+              <w:rPr>
+                <w:b w:val="0"/>
+                <w:color w:val="000000"/>
+                <w:sz w:val="18"/>
+              </w:rPr>
+              <w:t>480</w:t>
+            </w:r>
+          </w:p>
+        </w:tc>
+        <w:tc>
+          <w:tcPr>
+            <w:tcW w:type="dxa" w:w="2952"/>
+            <w:vAlign w:val="center"/>
+            <w:tcMar>
+              <w:top w:w="85" w:type="dxa"/>
+              <w:left w:w="85" w:type="dxa"/>
+              <w:bottom w:w="85" w:type="dxa"/>
+              <w:right w:w="85" w:type="dxa"/>
+            </w:tcMar>
+            <w:shd w:fill="FFFFFF"/>
+          </w:tcPr>
+          <w:p>
+            <w:pPr>
+              <w:spacing w:after="20" w:before="20" w:line="240" w:lineRule="auto"/>
+            </w:pPr>
+            <w:r>
+              <w:rPr>
+                <w:b w:val="0"/>
+                <w:color w:val="000000"/>
+                <w:sz w:val="18"/>
+              </w:rPr>
+              <w:t>4320</w:t>
+            </w:r>
+          </w:p>
+        </w:tc>
+      </w:tr>
+    </w:tbl>
+    <w:p>
+      <w:pPr>
+        <w:keepNext/>
+        <w:spacing w:after="100"/>
+      </w:pPr>
+      <w:r>
+        <w:drawing>
+          <wp:inline xmlns:a="http://schemas.openxmlformats.org/drawingml/2006/main" xmlns:pic="http://schemas.openxmlformats.org/drawingml/2006/picture">
+            <wp:extent cx="6217920" cy="3279648"/>
+            <wp:docPr id="7" name="Evidence image 7" descr="Numeric log message and captured quantity-three pricing locals"/>
+            <wp:cNvGraphicFramePr>
+              <a:graphicFrameLocks noChangeAspect="1"/>
+            </wp:cNvGraphicFramePr>
+            <a:graphic>
+              <a:graphicData uri="http://schemas.openxmlformats.org/drawingml/2006/picture">
+                <pic:pic>
+                  <pic:nvPicPr>
+                    <pic:cNvPr id="8" name="Evidence image 8.png" descr="Numeric log message and captured quantity-three pricing locals"/>
+                    <pic:cNvPicPr/>
+                  </pic:nvPicPr>
+                  <pic:blipFill>
+                    <a:blip r:embed="rId29"/>
+                    <a:stretch>
+                      <a:fillRect/>
+                    </a:stretch>
+                  </pic:blipFill>
+                  <pic:spPr>
+                    <a:xfrm>
+                      <a:off x="0" y="0"/>
+                      <a:ext cx="6217920" cy="3279648"/>
+                    </a:xfrm>
+                    <a:prstGeom prst="rect"/>
+                  </pic:spPr>
+                </pic:pic>
+              </a:graphicData>
+            </a:graphic>
+          </wp:inline>
+        </w:drawing>
+      </w:r>
+    </w:p>
+    <w:p>
+      <w:pPr>
+        <w:pStyle w:val="Caption"/>
+      </w:pPr>
+      <w:r>
+        <w:t>Source 12 · Numeric quantity-3 control observed 10:03:50.811 UTC. Exact event execution time is not inferred from the visible list or UI timestamp parameter. Source identity is masked; all shown values are genuine.</w:t>
+      </w:r>
+    </w:p>
+    <w:p>
+      <w:pPr>
+        <w:pStyle w:val="Normal"/>
+      </w:pPr>
+      <w:hyperlink r:id="rId30">
+        <w:r>
+          <w:rPr>
+            <w:color w:val="164F80"/>
+          </w:rPr>
+          <w:t>Full-size numeric capture and provenance</w:t>
+        </w:r>
+      </w:hyperlink>
+    </w:p>
+    <w:tbl>
+      <w:tblPr>
+        <w:tblW w:type="auto" w:w="0"/>
+        <w:jc w:val="center"/>
+        <w:tblLayout w:type="fixed"/>
+        <w:tblLook w:firstColumn="1" w:firstRow="1" w:lastColumn="0" w:lastRow="0" w:noHBand="0" w:noVBand="1" w:val="04A0"/>
+        <w:tblBorders>
+          <w:top w:val="single" w:sz="4" w:color="D9D9D9"/>
+          <w:left w:val="single" w:sz="4" w:color="D9D9D9"/>
+          <w:bottom w:val="single" w:sz="4" w:color="D9D9D9"/>
+          <w:right w:val="single" w:sz="4" w:color="D9D9D9"/>
+          <w:insideH w:val="single" w:sz="4" w:color="D9D9D9"/>
+          <w:insideV w:val="single" w:sz="4" w:color="D9D9D9"/>
+        </w:tblBorders>
+      </w:tblPr>
+      <w:tblGrid>
+        <w:gridCol w:w="2448"/>
+        <w:gridCol w:w="1440"/>
+        <w:gridCol w:w="6336"/>
+      </w:tblGrid>
+      <w:tr>
+        <w:trPr>
+          <w:tblHeader/>
+          <w:cantSplit/>
+        </w:trPr>
+        <w:tc>
+          <w:tcPr>
+            <w:tcW w:type="dxa" w:w="2448"/>
+            <w:vAlign w:val="center"/>
+            <w:tcMar>
+              <w:top w:w="85" w:type="dxa"/>
+              <w:left w:w="85" w:type="dxa"/>
+              <w:bottom w:w="85" w:type="dxa"/>
+              <w:right w:w="85" w:type="dxa"/>
+            </w:tcMar>
+            <w:shd w:fill="24384B"/>
+          </w:tcPr>
+          <w:p>
+            <w:pPr>
+              <w:spacing w:after="20" w:before="20" w:line="240" w:lineRule="auto"/>
+            </w:pPr>
+            <w:r>
+              <w:rPr>
+                <w:b/>
+                <w:color w:val="FFFFFF"/>
+                <w:sz w:val="18"/>
+              </w:rPr>
+              <w:t>Check</w:t>
+            </w:r>
+          </w:p>
+        </w:tc>
+        <w:tc>
+          <w:tcPr>
+            <w:tcW w:type="dxa" w:w="1440"/>
+            <w:vAlign w:val="center"/>
+            <w:tcMar>
+              <w:top w:w="85" w:type="dxa"/>
+              <w:left w:w="85" w:type="dxa"/>
+              <w:bottom w:w="85" w:type="dxa"/>
+              <w:right w:w="85" w:type="dxa"/>
+            </w:tcMar>
+            <w:shd w:fill="24384B"/>
+          </w:tcPr>
+          <w:p>
+            <w:pPr>
+              <w:spacing w:after="20" w:before="20" w:line="240" w:lineRule="auto"/>
+            </w:pPr>
+            <w:r>
+              <w:rPr>
+                <w:b/>
+                <w:color w:val="FFFFFF"/>
+                <w:sz w:val="18"/>
+              </w:rPr>
+              <w:t>UTC</w:t>
+            </w:r>
+          </w:p>
+        </w:tc>
+        <w:tc>
+          <w:tcPr>
+            <w:tcW w:type="dxa" w:w="6336"/>
+            <w:vAlign w:val="center"/>
+            <w:tcMar>
+              <w:top w:w="85" w:type="dxa"/>
+              <w:left w:w="85" w:type="dxa"/>
+              <w:bottom w:w="85" w:type="dxa"/>
+              <w:right w:w="85" w:type="dxa"/>
+            </w:tcMar>
+            <w:shd w:fill="24384B"/>
+          </w:tcPr>
+          <w:p>
+            <w:pPr>
+              <w:spacing w:after="20" w:before="20" w:line="240" w:lineRule="auto"/>
+            </w:pPr>
+            <w:r>
+              <w:rPr>
+                <w:b/>
+                <w:color w:val="FFFFFF"/>
+                <w:sz w:val="18"/>
+              </w:rPr>
+              <w:t>Verified scope</w:t>
+            </w:r>
+          </w:p>
+        </w:tc>
+      </w:tr>
+      <w:tr>
+        <w:trPr>
+          <w:cantSplit/>
+        </w:trPr>
+        <w:tc>
+          <w:tcPr>
+            <w:tcW w:type="dxa" w:w="2448"/>
+            <w:vAlign w:val="center"/>
+            <w:tcMar>
+              <w:top w:w="85" w:type="dxa"/>
+              <w:left w:w="85" w:type="dxa"/>
+              <w:bottom w:w="85" w:type="dxa"/>
+              <w:right w:w="85" w:type="dxa"/>
+            </w:tcMar>
+            <w:shd w:fill="FFFFFF"/>
+          </w:tcPr>
+          <w:p>
+            <w:pPr>
+              <w:spacing w:after="20" w:before="20" w:line="240" w:lineRule="auto"/>
+            </w:pPr>
+            <w:r>
+              <w:rPr>
+                <w:b w:val="0"/>
+                <w:color w:val="000000"/>
+                <w:sz w:val="18"/>
+              </w:rPr>
+              <w:t>U29 SDK registration</w:t>
+            </w:r>
+          </w:p>
+        </w:tc>
+        <w:tc>
+          <w:tcPr>
+            <w:tcW w:type="dxa" w:w="1440"/>
+            <w:vAlign w:val="center"/>
+            <w:tcMar>
+              <w:top w:w="85" w:type="dxa"/>
+              <w:left w:w="85" w:type="dxa"/>
+              <w:bottom w:w="85" w:type="dxa"/>
+              <w:right w:w="85" w:type="dxa"/>
+            </w:tcMar>
+            <w:shd w:fill="FFFFFF"/>
+          </w:tcPr>
+          <w:p>
+            <w:pPr>
+              <w:spacing w:after="20" w:before="20" w:line="240" w:lineRule="auto"/>
+            </w:pPr>
+            <w:r>
+              <w:rPr>
+                <w:b w:val="0"/>
+                <w:color w:val="000000"/>
+                <w:sz w:val="18"/>
+              </w:rPr>
+              <w:t>09:20:37</w:t>
+            </w:r>
+          </w:p>
+        </w:tc>
+        <w:tc>
+          <w:tcPr>
+            <w:tcW w:type="dxa" w:w="6336"/>
+            <w:vAlign w:val="center"/>
+            <w:tcMar>
+              <w:top w:w="85" w:type="dxa"/>
+              <w:left w:w="85" w:type="dxa"/>
+              <w:bottom w:w="85" w:type="dxa"/>
+              <w:right w:w="85" w:type="dxa"/>
+            </w:tcMar>
+            <w:shd w:fill="FFFFFF"/>
+          </w:tcPr>
+          <w:p>
+            <w:pPr>
+              <w:spacing w:after="20" w:before="20" w:line="240" w:lineRule="auto"/>
+            </w:pPr>
+            <w:r>
+              <w:rPr>
+                <w:b w:val="0"/>
+                <w:color w:val="000000"/>
+                <w:sz w:val="18"/>
+              </w:rPr>
+              <w:t>Agent authorization and matching SDK products registered; subsequent capture provides the functional proof.</w:t>
+            </w:r>
+          </w:p>
+        </w:tc>
+      </w:tr>
+      <w:tr>
+        <w:trPr>
+          <w:cantSplit/>
+        </w:trPr>
+        <w:tc>
+          <w:tcPr>
+            <w:tcW w:type="dxa" w:w="2448"/>
+            <w:vAlign w:val="center"/>
+            <w:tcMar>
+              <w:top w:w="85" w:type="dxa"/>
+              <w:left w:w="85" w:type="dxa"/>
+              <w:bottom w:w="85" w:type="dxa"/>
+              <w:right w:w="85" w:type="dxa"/>
+            </w:tcMar>
+            <w:shd w:fill="F3F5F7"/>
+          </w:tcPr>
+          <w:p>
+            <w:pPr>
+              <w:spacing w:after="20" w:before="20" w:line="240" w:lineRule="auto"/>
+            </w:pPr>
+            <w:r>
+              <w:rPr>
+                <w:b w:val="0"/>
+                <w:color w:val="000000"/>
+                <w:sz w:val="18"/>
+              </w:rPr>
+              <w:t>U30 First capture</w:t>
+            </w:r>
+          </w:p>
+        </w:tc>
+        <w:tc>
+          <w:tcPr>
+            <w:tcW w:type="dxa" w:w="1440"/>
+            <w:vAlign w:val="center"/>
+            <w:tcMar>
+              <w:top w:w="85" w:type="dxa"/>
+              <w:left w:w="85" w:type="dxa"/>
+              <w:bottom w:w="85" w:type="dxa"/>
+              <w:right w:w="85" w:type="dxa"/>
+            </w:tcMar>
+            <w:shd w:fill="F3F5F7"/>
+          </w:tcPr>
+          <w:p>
+            <w:pPr>
+              <w:spacing w:after="20" w:before="20" w:line="240" w:lineRule="auto"/>
+            </w:pPr>
+            <w:r>
+              <w:rPr>
+                <w:b w:val="0"/>
+                <w:color w:val="000000"/>
+                <w:sz w:val="18"/>
+              </w:rPr>
+              <w:t>09:28–09:31</w:t>
+            </w:r>
+          </w:p>
+        </w:tc>
+        <w:tc>
+          <w:tcPr>
+            <w:tcW w:type="dxa" w:w="6336"/>
+            <w:vAlign w:val="center"/>
+            <w:tcMar>
+              <w:top w:w="85" w:type="dxa"/>
+              <w:left w:w="85" w:type="dxa"/>
+              <w:bottom w:w="85" w:type="dxa"/>
+              <w:right w:w="85" w:type="dxa"/>
+            </w:tcMar>
+            <w:shd w:fill="F3F5F7"/>
+          </w:tcPr>
+          <w:p>
+            <w:pPr>
+              <w:spacing w:after="20" w:before="20" w:line="240" w:lineRule="auto"/>
+            </w:pPr>
+            <w:r>
+              <w:rPr>
+                <w:b w:val="0"/>
+                <w:color w:val="000000"/>
+                <w:sz w:val="18"/>
+              </w:rPr>
+              <w:t>Manual creation, instrumenting, events and actual locals observed. Operator navigation is included; this is not measured ingestion latency.</w:t>
+            </w:r>
+          </w:p>
+        </w:tc>
+      </w:tr>
+      <w:tr>
+        <w:trPr>
+          <w:cantSplit/>
+        </w:trPr>
+        <w:tc>
+          <w:tcPr>
+            <w:tcW w:type="dxa" w:w="2448"/>
+            <w:vAlign w:val="center"/>
+            <w:tcMar>
+              <w:top w:w="85" w:type="dxa"/>
+              <w:left w:w="85" w:type="dxa"/>
+              <w:bottom w:w="85" w:type="dxa"/>
+              <w:right w:w="85" w:type="dxa"/>
+            </w:tcMar>
+            <w:shd w:fill="FFFFFF"/>
+          </w:tcPr>
+          <w:p>
+            <w:pPr>
+              <w:spacing w:after="20" w:before="20" w:line="240" w:lineRule="auto"/>
+            </w:pPr>
+            <w:r>
+              <w:rPr>
+                <w:b w:val="0"/>
+                <w:color w:val="000000"/>
+                <w:sz w:val="18"/>
+              </w:rPr>
+              <w:t>U31 Numeric controls</w:t>
+            </w:r>
+          </w:p>
+        </w:tc>
+        <w:tc>
+          <w:tcPr>
+            <w:tcW w:type="dxa" w:w="1440"/>
+            <w:vAlign w:val="center"/>
+            <w:tcMar>
+              <w:top w:w="85" w:type="dxa"/>
+              <w:left w:w="85" w:type="dxa"/>
+              <w:bottom w:w="85" w:type="dxa"/>
+              <w:right w:w="85" w:type="dxa"/>
+            </w:tcMar>
+            <w:shd w:fill="FFFFFF"/>
+          </w:tcPr>
+          <w:p>
+            <w:pPr>
+              <w:spacing w:after="20" w:before="20" w:line="240" w:lineRule="auto"/>
+            </w:pPr>
+            <w:r>
+              <w:rPr>
+                <w:b w:val="0"/>
+                <w:color w:val="000000"/>
+                <w:sz w:val="18"/>
+              </w:rPr>
+              <w:t>10:03–10:04</w:t>
+            </w:r>
+          </w:p>
+        </w:tc>
+        <w:tc>
+          <w:tcPr>
+            <w:tcW w:type="dxa" w:w="6336"/>
+            <w:vAlign w:val="center"/>
+            <w:tcMar>
+              <w:top w:w="85" w:type="dxa"/>
+              <w:left w:w="85" w:type="dxa"/>
+              <w:bottom w:w="85" w:type="dxa"/>
+              <w:right w:w="85" w:type="dxa"/>
+            </w:tcMar>
+            <w:shd w:fill="FFFFFF"/>
+          </w:tcPr>
+          <w:p>
+            <w:pPr>
+              <w:spacing w:after="20" w:before="20" w:line="240" w:lineRule="auto"/>
+            </w:pPr>
+            <w:r>
+              <w:rPr>
+                <w:b w:val="0"/>
+                <w:color w:val="000000"/>
+                <w:sz w:val="18"/>
+              </w:rPr>
+              <w:t>Rendered template and six locals matched all 2/3/4 oracle cases. Exact observations are in the evidence ledger.</w:t>
+            </w:r>
+          </w:p>
+        </w:tc>
+      </w:tr>
+    </w:tbl>
+    <w:p>
+      <w:pPr>
+        <w:pStyle w:val="Normal"/>
+      </w:pPr>
+      <w:r>
+        <w:t/>
+      </w:r>
+    </w:p>
+    <w:p>
+      <w:pPr>
+        <w:pStyle w:val="Heading1"/>
+        <w:pageBreakBefore/>
+      </w:pPr>
+      <w:r>
+        <w:t>Verified source and ongoing lifecycle checks</w:t>
+      </w:r>
+    </w:p>
+    <w:p>
+      <w:pPr>
+        <w:pStyle w:val="Normal"/>
+      </w:pPr>
+      <w:r>
+        <w:t>S02 passes the baseline source comparison. A real post-handover snapshot has debugger.snapshot.timestamp 1791455041812, or 10:24:01.812 UTC. Datadog displays pricing.py source and captured values. Its provider link was followed and matched repository A, deployed revision f5061500e8bf30880aebcf7966ba64df44d2ccde, line 17 and the full nearby code.</w:t>
+      </w:r>
+    </w:p>
+    <w:p>
+      <w:pPr>
+        <w:keepNext/>
+        <w:spacing w:after="100"/>
+      </w:pPr>
+      <w:r>
+        <w:drawing>
+          <wp:inline xmlns:a="http://schemas.openxmlformats.org/drawingml/2006/main" xmlns:pic="http://schemas.openxmlformats.org/drawingml/2006/picture">
+            <wp:extent cx="6217920" cy="3279648"/>
+            <wp:docPr id="9" name="Evidence image 9" descr="Retrieved pricing source at line seventeen beside actual captured values"/>
+            <wp:cNvGraphicFramePr>
+              <a:graphicFrameLocks noChangeAspect="1"/>
+            </wp:cNvGraphicFramePr>
+            <a:graphic>
+              <a:graphicData uri="http://schemas.openxmlformats.org/drawingml/2006/picture">
+                <pic:pic>
+                  <pic:nvPicPr>
+                    <pic:cNvPr id="10" name="Evidence image 10.png" descr="Retrieved pricing source at line seventeen beside actual captured values"/>
+                    <pic:cNvPicPr/>
+                  </pic:nvPicPr>
+                  <pic:blipFill>
+                    <a:blip r:embed="rId31"/>
+                    <a:stretch>
+                      <a:fillRect/>
+                    </a:stretch>
+                  </pic:blipFill>
+                  <pic:spPr>
+                    <a:xfrm>
+                      <a:off x="0" y="0"/>
+                      <a:ext cx="6217920" cy="3279648"/>
+                    </a:xfrm>
+                    <a:prstGeom prst="rect"/>
+                  </pic:spPr>
+                </pic:pic>
+              </a:graphicData>
+            </a:graphic>
+          </wp:inline>
+        </w:drawing>
+      </w:r>
+    </w:p>
+    <w:p>
+      <w:pPr>
+        <w:pStyle w:val="Caption"/>
+      </w:pPr>
+      <w:r>
+        <w:t>Source 12 · Datadog source and post-handover control capture. The exact SDK snapshot timestamp is verified separately in Logs JSON and screenshot 82; it is not printed in this still.</w:t>
+      </w:r>
+    </w:p>
+    <w:p>
+      <w:pPr>
+        <w:pStyle w:val="Normal"/>
+      </w:pPr>
+      <w:hyperlink r:id="rId32">
+        <w:r>
+          <w:rPr>
+            <w:color w:val="164F80"/>
+          </w:rPr>
+          <w:t>Full-size source and capture evidence</w:t>
+        </w:r>
+      </w:hyperlink>
+    </w:p>
+    <w:tbl>
+      <w:tblPr>
+        <w:tblW w:type="auto" w:w="0"/>
+        <w:jc w:val="center"/>
+        <w:tblLayout w:type="fixed"/>
+        <w:tblLook w:firstColumn="1" w:firstRow="1" w:lastColumn="0" w:lastRow="0" w:noHBand="0" w:noVBand="1" w:val="04A0"/>
+        <w:tblBorders>
+          <w:top w:val="single" w:sz="4" w:color="D9D9D9"/>
+          <w:left w:val="single" w:sz="4" w:color="D9D9D9"/>
+          <w:bottom w:val="single" w:sz="4" w:color="D9D9D9"/>
+          <w:right w:val="single" w:sz="4" w:color="D9D9D9"/>
+          <w:insideH w:val="single" w:sz="4" w:color="D9D9D9"/>
+          <w:insideV w:val="single" w:sz="4" w:color="D9D9D9"/>
+        </w:tblBorders>
+      </w:tblPr>
+      <w:tblGrid>
+        <w:gridCol w:w="2448"/>
+        <w:gridCol w:w="1440"/>
+        <w:gridCol w:w="6336"/>
+      </w:tblGrid>
+      <w:tr>
+        <w:trPr>
+          <w:tblHeader/>
+          <w:cantSplit/>
+        </w:trPr>
+        <w:tc>
+          <w:tcPr>
+            <w:tcW w:type="dxa" w:w="2448"/>
+            <w:vAlign w:val="center"/>
+            <w:tcMar>
+              <w:top w:w="85" w:type="dxa"/>
+              <w:left w:w="85" w:type="dxa"/>
+              <w:bottom w:w="85" w:type="dxa"/>
+              <w:right w:w="85" w:type="dxa"/>
+            </w:tcMar>
+            <w:shd w:fill="24384B"/>
+          </w:tcPr>
+          <w:p>
+            <w:pPr>
+              <w:spacing w:after="20" w:before="20" w:line="240" w:lineRule="auto"/>
+            </w:pPr>
+            <w:r>
+              <w:rPr>
+                <w:b/>
+                <w:color w:val="FFFFFF"/>
+                <w:sz w:val="18"/>
+              </w:rPr>
+              <w:t>Check</w:t>
+            </w:r>
+          </w:p>
+        </w:tc>
+        <w:tc>
+          <w:tcPr>
+            <w:tcW w:type="dxa" w:w="1440"/>
+            <w:vAlign w:val="center"/>
+            <w:tcMar>
+              <w:top w:w="85" w:type="dxa"/>
+              <w:left w:w="85" w:type="dxa"/>
+              <w:bottom w:w="85" w:type="dxa"/>
+              <w:right w:w="85" w:type="dxa"/>
+            </w:tcMar>
+            <w:shd w:fill="24384B"/>
+          </w:tcPr>
+          <w:p>
+            <w:pPr>
+              <w:spacing w:after="20" w:before="20" w:line="240" w:lineRule="auto"/>
+            </w:pPr>
+            <w:r>
+              <w:rPr>
+                <w:b/>
+                <w:color w:val="FFFFFF"/>
+                <w:sz w:val="18"/>
+              </w:rPr>
+              <w:t>UTC</w:t>
+            </w:r>
+          </w:p>
+        </w:tc>
+        <w:tc>
+          <w:tcPr>
+            <w:tcW w:type="dxa" w:w="6336"/>
+            <w:vAlign w:val="center"/>
+            <w:tcMar>
+              <w:top w:w="85" w:type="dxa"/>
+              <w:left w:w="85" w:type="dxa"/>
+              <w:bottom w:w="85" w:type="dxa"/>
+              <w:right w:w="85" w:type="dxa"/>
+            </w:tcMar>
+            <w:shd w:fill="24384B"/>
+          </w:tcPr>
+          <w:p>
+            <w:pPr>
+              <w:spacing w:after="20" w:before="20" w:line="240" w:lineRule="auto"/>
+            </w:pPr>
+            <w:r>
+              <w:rPr>
+                <w:b/>
+                <w:color w:val="FFFFFF"/>
+                <w:sz w:val="18"/>
+              </w:rPr>
+              <w:t>Verified scope</w:t>
+            </w:r>
+          </w:p>
+        </w:tc>
+      </w:tr>
+      <w:tr>
+        <w:trPr>
+          <w:cantSplit/>
+        </w:trPr>
+        <w:tc>
+          <w:tcPr>
+            <w:tcW w:type="dxa" w:w="2448"/>
+            <w:vAlign w:val="center"/>
+            <w:tcMar>
+              <w:top w:w="85" w:type="dxa"/>
+              <w:left w:w="85" w:type="dxa"/>
+              <w:bottom w:w="85" w:type="dxa"/>
+              <w:right w:w="85" w:type="dxa"/>
+            </w:tcMar>
+            <w:shd w:fill="FFFFFF"/>
+          </w:tcPr>
+          <w:p>
+            <w:pPr>
+              <w:spacing w:after="20" w:before="20" w:line="240" w:lineRule="auto"/>
+            </w:pPr>
+            <w:r>
+              <w:rPr>
+                <w:b w:val="0"/>
+                <w:color w:val="000000"/>
+                <w:sz w:val="18"/>
+              </w:rPr>
+              <w:t>U32 Source repair</w:t>
+            </w:r>
+          </w:p>
+        </w:tc>
+        <w:tc>
+          <w:tcPr>
+            <w:tcW w:type="dxa" w:w="1440"/>
+            <w:vAlign w:val="center"/>
+            <w:tcMar>
+              <w:top w:w="85" w:type="dxa"/>
+              <w:left w:w="85" w:type="dxa"/>
+              <w:bottom w:w="85" w:type="dxa"/>
+              <w:right w:w="85" w:type="dxa"/>
+            </w:tcMar>
+            <w:shd w:fill="FFFFFF"/>
+          </w:tcPr>
+          <w:p>
+            <w:pPr>
+              <w:spacing w:after="20" w:before="20" w:line="240" w:lineRule="auto"/>
+            </w:pPr>
+            <w:r>
+              <w:rPr>
+                <w:b w:val="0"/>
+                <w:color w:val="000000"/>
+                <w:sz w:val="18"/>
+              </w:rPr>
+              <w:t>09:49–09:55</w:t>
+            </w:r>
+          </w:p>
+        </w:tc>
+        <w:tc>
+          <w:tcPr>
+            <w:tcW w:type="dxa" w:w="6336"/>
+            <w:vAlign w:val="center"/>
+            <w:tcMar>
+              <w:top w:w="85" w:type="dxa"/>
+              <w:left w:w="85" w:type="dxa"/>
+              <w:bottom w:w="85" w:type="dxa"/>
+              <w:right w:w="85" w:type="dxa"/>
+            </w:tcMar>
+            <w:shd w:fill="FFFFFF"/>
+          </w:tcPr>
+          <w:p>
+            <w:pPr>
+              <w:spacing w:after="20" w:before="20" w:line="240" w:lineRule="auto"/>
+            </w:pPr>
+            <w:r>
+              <w:rPr>
+                <w:b w:val="0"/>
+                <w:color w:val="000000"/>
+                <w:sz w:val="18"/>
+              </w:rPr>
+              <w:t>Controlled same-A-only removal/reinstall reached connected configuration. B remained ungranted; the successful callback is screenshot-only after source 11 stopped.</w:t>
+            </w:r>
+          </w:p>
+        </w:tc>
+      </w:tr>
+      <w:tr>
+        <w:trPr>
+          <w:cantSplit/>
+        </w:trPr>
+        <w:tc>
+          <w:tcPr>
+            <w:tcW w:type="dxa" w:w="2448"/>
+            <w:vAlign w:val="center"/>
+            <w:tcMar>
+              <w:top w:w="85" w:type="dxa"/>
+              <w:left w:w="85" w:type="dxa"/>
+              <w:bottom w:w="85" w:type="dxa"/>
+              <w:right w:w="85" w:type="dxa"/>
+            </w:tcMar>
+            <w:shd w:fill="F3F5F7"/>
+          </w:tcPr>
+          <w:p>
+            <w:pPr>
+              <w:spacing w:after="20" w:before="20" w:line="240" w:lineRule="auto"/>
+            </w:pPr>
+            <w:r>
+              <w:rPr>
+                <w:b w:val="0"/>
+                <w:color w:val="000000"/>
+                <w:sz w:val="18"/>
+              </w:rPr>
+              <w:t>U33 Exact source</w:t>
+            </w:r>
+          </w:p>
+        </w:tc>
+        <w:tc>
+          <w:tcPr>
+            <w:tcW w:type="dxa" w:w="1440"/>
+            <w:vAlign w:val="center"/>
+            <w:tcMar>
+              <w:top w:w="85" w:type="dxa"/>
+              <w:left w:w="85" w:type="dxa"/>
+              <w:bottom w:w="85" w:type="dxa"/>
+              <w:right w:w="85" w:type="dxa"/>
+            </w:tcMar>
+            <w:shd w:fill="F3F5F7"/>
+          </w:tcPr>
+          <w:p>
+            <w:pPr>
+              <w:spacing w:after="20" w:before="20" w:line="240" w:lineRule="auto"/>
+            </w:pPr>
+            <w:r>
+              <w:rPr>
+                <w:b w:val="0"/>
+                <w:color w:val="000000"/>
+                <w:sz w:val="18"/>
+              </w:rPr>
+              <w:t>10:25:48</w:t>
+            </w:r>
+          </w:p>
+        </w:tc>
+        <w:tc>
+          <w:tcPr>
+            <w:tcW w:type="dxa" w:w="6336"/>
+            <w:vAlign w:val="center"/>
+            <w:tcMar>
+              <w:top w:w="85" w:type="dxa"/>
+              <w:left w:w="85" w:type="dxa"/>
+              <w:bottom w:w="85" w:type="dxa"/>
+              <w:right w:w="85" w:type="dxa"/>
+            </w:tcMar>
+            <w:shd w:fill="F3F5F7"/>
+          </w:tcPr>
+          <w:p>
+            <w:pPr>
+              <w:spacing w:after="20" w:before="20" w:line="240" w:lineRule="auto"/>
+            </w:pPr>
+            <w:r>
+              <w:rPr>
+                <w:b w:val="0"/>
+                <w:color w:val="000000"/>
+                <w:sz w:val="18"/>
+              </w:rPr>
+              <w:t>Provider link was followed to the deployed revision/file/line. The older file last-change commit is correctly distinct from the selected revision.</w:t>
+            </w:r>
+          </w:p>
+        </w:tc>
+      </w:tr>
+      <w:tr>
+        <w:trPr>
+          <w:cantSplit/>
+        </w:trPr>
+        <w:tc>
+          <w:tcPr>
+            <w:tcW w:type="dxa" w:w="2448"/>
+            <w:vAlign w:val="center"/>
+            <w:tcMar>
+              <w:top w:w="85" w:type="dxa"/>
+              <w:left w:w="85" w:type="dxa"/>
+              <w:bottom w:w="85" w:type="dxa"/>
+              <w:right w:w="85" w:type="dxa"/>
+            </w:tcMar>
+            <w:shd w:fill="FFFFFF"/>
+          </w:tcPr>
+          <w:p>
+            <w:pPr>
+              <w:spacing w:after="20" w:before="20" w:line="240" w:lineRule="auto"/>
+            </w:pPr>
+            <w:r>
+              <w:rPr>
+                <w:b w:val="0"/>
+                <w:color w:val="000000"/>
+                <w:sz w:val="18"/>
+              </w:rPr>
+              <w:t>U34 Handover control</w:t>
+            </w:r>
+          </w:p>
+        </w:tc>
+        <w:tc>
+          <w:tcPr>
+            <w:tcW w:type="dxa" w:w="1440"/>
+            <w:vAlign w:val="center"/>
+            <w:tcMar>
+              <w:top w:w="85" w:type="dxa"/>
+              <w:left w:w="85" w:type="dxa"/>
+              <w:bottom w:w="85" w:type="dxa"/>
+              <w:right w:w="85" w:type="dxa"/>
+            </w:tcMar>
+            <w:shd w:fill="FFFFFF"/>
+          </w:tcPr>
+          <w:p>
+            <w:pPr>
+              <w:spacing w:after="20" w:before="20" w:line="240" w:lineRule="auto"/>
+            </w:pPr>
+            <w:r>
+              <w:rPr>
+                <w:b w:val="0"/>
+                <w:color w:val="000000"/>
+                <w:sz w:val="18"/>
+              </w:rPr>
+              <w:t>10:21–10:24</w:t>
+            </w:r>
+          </w:p>
+        </w:tc>
+        <w:tc>
+          <w:tcPr>
+            <w:tcW w:type="dxa" w:w="6336"/>
+            <w:vAlign w:val="center"/>
+            <w:tcMar>
+              <w:top w:w="85" w:type="dxa"/>
+              <w:left w:w="85" w:type="dxa"/>
+              <w:bottom w:w="85" w:type="dxa"/>
+              <w:right w:w="85" w:type="dxa"/>
+            </w:tcMar>
+            <w:shd w:fill="FFFFFF"/>
+          </w:tcPr>
+          <w:p>
+            <w:pPr>
+              <w:spacing w:after="20" w:before="20" w:line="240" w:lineRule="auto"/>
+            </w:pPr>
+            <w:r>
+              <w:rPr>
+                <w:b w:val="0"/>
+                <w:color w:val="000000"/>
+                <w:sz w:val="18"/>
+              </w:rPr>
+              <w:t>Run 2 registered and the later control produced a real snapshot after handover. Creation/status alone is not counted as capture.</w:t>
+            </w:r>
+          </w:p>
+        </w:tc>
+      </w:tr>
+      <w:tr>
+        <w:trPr>
+          <w:cantSplit/>
+        </w:trPr>
+        <w:tc>
+          <w:tcPr>
+            <w:tcW w:type="dxa" w:w="2448"/>
+            <w:vAlign w:val="center"/>
+            <w:tcMar>
+              <w:top w:w="85" w:type="dxa"/>
+              <w:left w:w="85" w:type="dxa"/>
+              <w:bottom w:w="85" w:type="dxa"/>
+              <w:right w:w="85" w:type="dxa"/>
+            </w:tcMar>
+            <w:shd w:fill="F3F5F7"/>
+          </w:tcPr>
+          <w:p>
+            <w:pPr>
+              <w:spacing w:after="20" w:before="20" w:line="240" w:lineRule="auto"/>
+            </w:pPr>
+            <w:r>
+              <w:rPr>
+                <w:b w:val="0"/>
+                <w:color w:val="000000"/>
+                <w:sz w:val="18"/>
+              </w:rPr>
+              <w:t>U35 Verified expiry</w:t>
+            </w:r>
+          </w:p>
+        </w:tc>
+        <w:tc>
+          <w:tcPr>
+            <w:tcW w:type="dxa" w:w="1440"/>
+            <w:vAlign w:val="center"/>
+            <w:tcMar>
+              <w:top w:w="85" w:type="dxa"/>
+              <w:left w:w="85" w:type="dxa"/>
+              <w:bottom w:w="85" w:type="dxa"/>
+              <w:right w:w="85" w:type="dxa"/>
+            </w:tcMar>
+            <w:shd w:fill="F3F5F7"/>
+          </w:tcPr>
+          <w:p>
+            <w:pPr>
+              <w:spacing w:after="20" w:before="20" w:line="240" w:lineRule="auto"/>
+            </w:pPr>
+            <w:r>
+              <w:rPr>
+                <w:b w:val="0"/>
+                <w:color w:val="000000"/>
+                <w:sz w:val="18"/>
+              </w:rPr>
+              <w:t>10:45–10:50</w:t>
+            </w:r>
+          </w:p>
+        </w:tc>
+        <w:tc>
+          <w:tcPr>
+            <w:tcW w:type="dxa" w:w="6336"/>
+            <w:vAlign w:val="center"/>
+            <w:tcMar>
+              <w:top w:w="85" w:type="dxa"/>
+              <w:left w:w="85" w:type="dxa"/>
+              <w:bottom w:w="85" w:type="dxa"/>
+              <w:right w:w="85" w:type="dxa"/>
+            </w:tcMar>
+            <w:shd w:fill="F3F5F7"/>
+          </w:tcPr>
+          <w:p>
+            <w:pPr>
+              <w:spacing w:after="20" w:before="20" w:line="240" w:lineRule="auto"/>
+            </w:pPr>
+            <w:r>
+              <w:rPr>
+                <w:b w:val="0"/>
+                <w:color w:val="000000"/>
+                <w:sz w:val="18"/>
+              </w:rPr>
+              <w:t>Observed active→expired window 10:45:35.975–10:45:50.640. Last target execution 10:45:41.045; later control 10:47:30.402. Reload/direct link retained expiry.</w:t>
+            </w:r>
+          </w:p>
+        </w:tc>
+      </w:tr>
+    </w:tbl>
+    <w:p>
+      <w:pPr>
+        <w:pStyle w:val="Normal"/>
+      </w:pPr>
+      <w:r>
+        <w:t>SCI01 now has a verified recovery path; its original interrupted-state failure remains scoped. The possible relationship between a template Apply and the revised countdown remains untested. Expiry is verified by screenshots/rendered UI and payload times; the desktop video does not show the active-to-expired transition; it retains an already-expired after-state. B boundaries and remaining lifecycle/functional cases continue.</w:t>
+      </w:r>
+    </w:p>
+    <w:p>
+      <w:pPr>
+        <w:pStyle w:val="Normal"/>
+      </w:pPr>
+      <w:hyperlink r:id="rId33">
+        <w:r>
+          <w:rPr>
+            <w:color w:val="164F80"/>
+          </w:rPr>
+          <w:t>Connected configuration and recovery provenance</w:t>
+        </w:r>
+      </w:hyperlink>
+    </w:p>
+    <w:p>
+      <w:pPr>
+        <w:pStyle w:val="Heading1"/>
+        <w:pageBreakBefore/>
+      </w:pPr>
+      <w:bookmarkStart w:id="1118" w:name="OBSERVATIONS"/>
+      <w:r>
+        <w:t>Additional checks and open observations</w:t>
+      </w:r>
+      <w:bookmarkEnd w:id="1118"/>
+    </w:p>
+    <w:p>
+      <w:pPr>
+        <w:pStyle w:val="Normal"/>
+      </w:pPr>
+      <w:r>
+        <w:t>U36–U42 complete the 42-check supplemental inventory. They do not add original cases or imply that every parent-case requirement passed.</w:t>
+      </w:r>
+    </w:p>
+    <w:tbl>
+      <w:tblPr>
+        <w:tblW w:type="auto" w:w="0"/>
+        <w:jc w:val="center"/>
+        <w:tblLayout w:type="fixed"/>
+        <w:tblLook w:firstColumn="1" w:firstRow="1" w:lastColumn="0" w:lastRow="0" w:noHBand="0" w:noVBand="1" w:val="04A0"/>
+        <w:tblBorders>
+          <w:top w:val="single" w:sz="4" w:color="D9D9D9"/>
+          <w:left w:val="single" w:sz="4" w:color="D9D9D9"/>
+          <w:bottom w:val="single" w:sz="4" w:color="D9D9D9"/>
+          <w:right w:val="single" w:sz="4" w:color="D9D9D9"/>
+          <w:insideH w:val="single" w:sz="4" w:color="D9D9D9"/>
+          <w:insideV w:val="single" w:sz="4" w:color="D9D9D9"/>
+        </w:tblBorders>
+      </w:tblPr>
+      <w:tblGrid>
+        <w:gridCol w:w="2448"/>
+        <w:gridCol w:w="1440"/>
+        <w:gridCol w:w="6336"/>
+      </w:tblGrid>
+      <w:tr>
+        <w:trPr>
+          <w:tblHeader/>
+          <w:cantSplit/>
+        </w:trPr>
+        <w:tc>
+          <w:tcPr>
+            <w:tcW w:type="dxa" w:w="2448"/>
+            <w:vAlign w:val="center"/>
+            <w:tcMar>
+              <w:top w:w="85" w:type="dxa"/>
+              <w:left w:w="85" w:type="dxa"/>
+              <w:bottom w:w="85" w:type="dxa"/>
+              <w:right w:w="85" w:type="dxa"/>
+            </w:tcMar>
+            <w:shd w:fill="24384B"/>
+          </w:tcPr>
+          <w:p>
+            <w:pPr>
+              <w:spacing w:after="20" w:before="20" w:line="240" w:lineRule="auto"/>
+            </w:pPr>
+            <w:r>
+              <w:rPr>
+                <w:b/>
+                <w:color w:val="FFFFFF"/>
+                <w:sz w:val="18"/>
+              </w:rPr>
+              <w:t>Check</w:t>
+            </w:r>
+          </w:p>
+        </w:tc>
+        <w:tc>
+          <w:tcPr>
+            <w:tcW w:type="dxa" w:w="1440"/>
+            <w:vAlign w:val="center"/>
+            <w:tcMar>
+              <w:top w:w="85" w:type="dxa"/>
+              <w:left w:w="85" w:type="dxa"/>
+              <w:bottom w:w="85" w:type="dxa"/>
+              <w:right w:w="85" w:type="dxa"/>
+            </w:tcMar>
+            <w:shd w:fill="24384B"/>
+          </w:tcPr>
+          <w:p>
+            <w:pPr>
+              <w:spacing w:after="20" w:before="20" w:line="240" w:lineRule="auto"/>
+            </w:pPr>
+            <w:r>
+              <w:rPr>
+                <w:b/>
+                <w:color w:val="FFFFFF"/>
+                <w:sz w:val="18"/>
+              </w:rPr>
+              <w:t>UTC / source</w:t>
+            </w:r>
+          </w:p>
+        </w:tc>
+        <w:tc>
+          <w:tcPr>
+            <w:tcW w:type="dxa" w:w="6336"/>
+            <w:vAlign w:val="center"/>
+            <w:tcMar>
+              <w:top w:w="85" w:type="dxa"/>
+              <w:left w:w="85" w:type="dxa"/>
+              <w:bottom w:w="85" w:type="dxa"/>
+              <w:right w:w="85" w:type="dxa"/>
+            </w:tcMar>
+            <w:shd w:fill="24384B"/>
+          </w:tcPr>
+          <w:p>
+            <w:pPr>
+              <w:spacing w:after="20" w:before="20" w:line="240" w:lineRule="auto"/>
+            </w:pPr>
+            <w:r>
+              <w:rPr>
+                <w:b/>
+                <w:color w:val="FFFFFF"/>
+                <w:sz w:val="18"/>
+              </w:rPr>
+              <w:t>Verified scope</w:t>
+            </w:r>
+          </w:p>
+        </w:tc>
+      </w:tr>
+      <w:tr>
+        <w:trPr>
+          <w:cantSplit/>
+        </w:trPr>
+        <w:tc>
+          <w:tcPr>
+            <w:tcW w:type="dxa" w:w="2448"/>
+            <w:vAlign w:val="center"/>
+            <w:tcMar>
+              <w:top w:w="85" w:type="dxa"/>
+              <w:left w:w="85" w:type="dxa"/>
+              <w:bottom w:w="85" w:type="dxa"/>
+              <w:right w:w="85" w:type="dxa"/>
+            </w:tcMar>
+            <w:shd w:fill="FFFFFF"/>
+          </w:tcPr>
+          <w:p>
+            <w:pPr>
+              <w:spacing w:after="20" w:before="20" w:line="240" w:lineRule="auto"/>
+            </w:pPr>
+            <w:r>
+              <w:rPr>
+                <w:b w:val="0"/>
+                <w:color w:val="000000"/>
+                <w:sz w:val="18"/>
+              </w:rPr>
+              <w:t>U36 When editor operability</w:t>
+            </w:r>
+          </w:p>
+        </w:tc>
+        <w:tc>
+          <w:tcPr>
+            <w:tcW w:type="dxa" w:w="1440"/>
+            <w:vAlign w:val="center"/>
+            <w:tcMar>
+              <w:top w:w="85" w:type="dxa"/>
+              <w:left w:w="85" w:type="dxa"/>
+              <w:bottom w:w="85" w:type="dxa"/>
+              <w:right w:w="85" w:type="dxa"/>
+            </w:tcMar>
+            <w:shd w:fill="FFFFFF"/>
+          </w:tcPr>
+          <w:p>
+            <w:pPr>
+              <w:spacing w:after="20" w:before="20" w:line="240" w:lineRule="auto"/>
+            </w:pPr>
+            <w:r>
+              <w:rPr>
+                <w:b w:val="0"/>
+                <w:color w:val="000000"/>
+                <w:sz w:val="18"/>
+              </w:rPr>
+              <w:t>10:30:40</w:t>
+            </w:r>
+          </w:p>
+        </w:tc>
+        <w:tc>
+          <w:tcPr>
+            <w:tcW w:type="dxa" w:w="6336"/>
+            <w:vAlign w:val="center"/>
+            <w:tcMar>
+              <w:top w:w="85" w:type="dxa"/>
+              <w:left w:w="85" w:type="dxa"/>
+              <w:bottom w:w="85" w:type="dxa"/>
+              <w:right w:w="85" w:type="dxa"/>
+            </w:tcMar>
+            <w:shd w:fill="FFFFFF"/>
+          </w:tcPr>
+          <w:p>
+            <w:pPr>
+              <w:spacing w:after="20" w:before="20" w:line="240" w:lineRule="auto"/>
+            </w:pPr>
+            <w:r>
+              <w:rPr>
+                <w:b w:val="0"/>
+                <w:color w:val="000000"/>
+                <w:sz w:val="18"/>
+              </w:rPr>
+              <w:t>A normal supported click opened When; native disabled was false and no aria-disabled existed. Prior availability assessment was corrected.</w:t>
+            </w:r>
+          </w:p>
+        </w:tc>
+      </w:tr>
+      <w:tr>
+        <w:trPr>
+          <w:cantSplit/>
+        </w:trPr>
+        <w:tc>
+          <w:tcPr>
+            <w:tcW w:type="dxa" w:w="2448"/>
+            <w:vAlign w:val="center"/>
+            <w:tcMar>
+              <w:top w:w="85" w:type="dxa"/>
+              <w:left w:w="85" w:type="dxa"/>
+              <w:bottom w:w="85" w:type="dxa"/>
+              <w:right w:w="85" w:type="dxa"/>
+            </w:tcMar>
+            <w:shd w:fill="F3F5F7"/>
+          </w:tcPr>
+          <w:p>
+            <w:pPr>
+              <w:spacing w:after="20" w:before="20" w:line="240" w:lineRule="auto"/>
+            </w:pPr>
+            <w:r>
+              <w:rPr>
+                <w:b w:val="0"/>
+                <w:color w:val="000000"/>
+                <w:sz w:val="18"/>
+              </w:rPr>
+              <w:t>U37 Invalid-line rejection and recovery</w:t>
+            </w:r>
+          </w:p>
+        </w:tc>
+        <w:tc>
+          <w:tcPr>
+            <w:tcW w:type="dxa" w:w="1440"/>
+            <w:vAlign w:val="center"/>
+            <w:tcMar>
+              <w:top w:w="85" w:type="dxa"/>
+              <w:left w:w="85" w:type="dxa"/>
+              <w:bottom w:w="85" w:type="dxa"/>
+              <w:right w:w="85" w:type="dxa"/>
+            </w:tcMar>
+            <w:shd w:fill="F3F5F7"/>
+          </w:tcPr>
+          <w:p>
+            <w:pPr>
+              <w:spacing w:after="20" w:before="20" w:line="240" w:lineRule="auto"/>
+            </w:pPr>
+            <w:r>
+              <w:rPr>
+                <w:b w:val="0"/>
+                <w:color w:val="000000"/>
+                <w:sz w:val="18"/>
+              </w:rPr>
+              <w:t>10:29–10:33</w:t>
+            </w:r>
+          </w:p>
+        </w:tc>
+        <w:tc>
+          <w:tcPr>
+            <w:tcW w:type="dxa" w:w="6336"/>
+            <w:vAlign w:val="center"/>
+            <w:tcMar>
+              <w:top w:w="85" w:type="dxa"/>
+              <w:left w:w="85" w:type="dxa"/>
+              <w:bottom w:w="85" w:type="dxa"/>
+              <w:right w:w="85" w:type="dxa"/>
+            </w:tcMar>
+            <w:shd w:fill="F3F5F7"/>
+          </w:tcPr>
+          <w:p>
+            <w:pPr>
+              <w:spacing w:after="20" w:before="20" w:line="240" w:lineRule="auto"/>
+            </w:pPr>
+            <w:r>
+              <w:rPr>
+                <w:b w:val="0"/>
+                <w:color w:val="000000"/>
+                <w:sz w:val="18"/>
+              </w:rPr>
+              <w:t>Line 9999 produced explicit NoFunctionsAtLine; a separate valid line 17 gutter probe captured. Blank/comment-line variants remain untested.</w:t>
+            </w:r>
+          </w:p>
+        </w:tc>
+      </w:tr>
+      <w:tr>
+        <w:trPr>
+          <w:cantSplit/>
+        </w:trPr>
+        <w:tc>
+          <w:tcPr>
+            <w:tcW w:type="dxa" w:w="2448"/>
+            <w:vAlign w:val="center"/>
+            <w:tcMar>
+              <w:top w:w="85" w:type="dxa"/>
+              <w:left w:w="85" w:type="dxa"/>
+              <w:bottom w:w="85" w:type="dxa"/>
+              <w:right w:w="85" w:type="dxa"/>
+            </w:tcMar>
+            <w:shd w:fill="FFFFFF"/>
+          </w:tcPr>
+          <w:p>
+            <w:pPr>
+              <w:spacing w:after="20" w:before="20" w:line="240" w:lineRule="auto"/>
+            </w:pPr>
+            <w:r>
+              <w:rPr>
+                <w:b w:val="0"/>
+                <w:color w:val="000000"/>
+                <w:sz w:val="18"/>
+              </w:rPr>
+              <w:t>U38 Predicate revision control</w:t>
+            </w:r>
+          </w:p>
+        </w:tc>
+        <w:tc>
+          <w:tcPr>
+            <w:tcW w:type="dxa" w:w="1440"/>
+            <w:vAlign w:val="center"/>
+            <w:tcMar>
+              <w:top w:w="85" w:type="dxa"/>
+              <w:left w:w="85" w:type="dxa"/>
+              <w:bottom w:w="85" w:type="dxa"/>
+              <w:right w:w="85" w:type="dxa"/>
+            </w:tcMar>
+            <w:shd w:fill="FFFFFF"/>
+          </w:tcPr>
+          <w:p>
+            <w:pPr>
+              <w:spacing w:after="20" w:before="20" w:line="240" w:lineRule="auto"/>
+            </w:pPr>
+            <w:r>
+              <w:rPr>
+                <w:b w:val="0"/>
+                <w:color w:val="000000"/>
+                <w:sz w:val="18"/>
+              </w:rPr>
+              <w:t>10:33–10:35</w:t>
+            </w:r>
+          </w:p>
+        </w:tc>
+        <w:tc>
+          <w:tcPr>
+            <w:tcW w:type="dxa" w:w="6336"/>
+            <w:vAlign w:val="center"/>
+            <w:tcMar>
+              <w:top w:w="85" w:type="dxa"/>
+              <w:left w:w="85" w:type="dxa"/>
+              <w:bottom w:w="85" w:type="dxa"/>
+              <w:right w:w="85" w:type="dxa"/>
+            </w:tcMar>
+            <w:shd w:fill="FFFFFF"/>
+          </w:tcPr>
+          <w:p>
+            <w:pPr>
+              <w:spacing w:after="20" w:before="20" w:line="240" w:lineRule="auto"/>
+            </w:pPr>
+            <w:r>
+              <w:rPr>
+                <w:b w:val="0"/>
+                <w:color w:val="000000"/>
+                <w:sz w:val="18"/>
+              </w:rPr>
+              <w:t>COND3 and COND4 post-activation rows/locals matched predicates; old selected COND3 snapshot was labeled OUTDATED.</w:t>
+            </w:r>
+          </w:p>
+        </w:tc>
+      </w:tr>
+      <w:tr>
+        <w:trPr>
+          <w:cantSplit/>
+        </w:trPr>
+        <w:tc>
+          <w:tcPr>
+            <w:tcW w:type="dxa" w:w="2448"/>
+            <w:vAlign w:val="center"/>
+            <w:tcMar>
+              <w:top w:w="85" w:type="dxa"/>
+              <w:left w:w="85" w:type="dxa"/>
+              <w:bottom w:w="85" w:type="dxa"/>
+              <w:right w:w="85" w:type="dxa"/>
+            </w:tcMar>
+            <w:shd w:fill="F3F5F7"/>
+          </w:tcPr>
+          <w:p>
+            <w:pPr>
+              <w:spacing w:after="20" w:before="20" w:line="240" w:lineRule="auto"/>
+            </w:pPr>
+            <w:r>
+              <w:rPr>
+                <w:b w:val="0"/>
+                <w:color w:val="000000"/>
+                <w:sz w:val="18"/>
+              </w:rPr>
+              <w:t>U39 No-match and restoration</w:t>
+            </w:r>
+          </w:p>
+        </w:tc>
+        <w:tc>
+          <w:tcPr>
+            <w:tcW w:type="dxa" w:w="1440"/>
+            <w:vAlign w:val="center"/>
+            <w:tcMar>
+              <w:top w:w="85" w:type="dxa"/>
+              <w:left w:w="85" w:type="dxa"/>
+              <w:bottom w:w="85" w:type="dxa"/>
+              <w:right w:w="85" w:type="dxa"/>
+            </w:tcMar>
+            <w:shd w:fill="F3F5F7"/>
+          </w:tcPr>
+          <w:p>
+            <w:pPr>
+              <w:spacing w:after="20" w:before="20" w:line="240" w:lineRule="auto"/>
+            </w:pPr>
+            <w:r>
+              <w:rPr>
+                <w:b w:val="0"/>
+                <w:color w:val="000000"/>
+                <w:sz w:val="18"/>
+              </w:rPr>
+              <w:t>10:36–10:39</w:t>
+            </w:r>
+          </w:p>
+        </w:tc>
+        <w:tc>
+          <w:tcPr>
+            <w:tcW w:type="dxa" w:w="6336"/>
+            <w:vAlign w:val="center"/>
+            <w:tcMar>
+              <w:top w:w="85" w:type="dxa"/>
+              <w:left w:w="85" w:type="dxa"/>
+              <w:bottom w:w="85" w:type="dxa"/>
+              <w:right w:w="85" w:type="dxa"/>
+            </w:tcMar>
+            <w:shd w:fill="F3F5F7"/>
+          </w:tcPr>
+          <w:p>
+            <w:pPr>
+              <w:spacing w:after="20" w:before="20" w:line="240" w:lineRule="auto"/>
+            </w:pPr>
+            <w:r>
+              <w:rPr>
+                <w:b w:val="0"/>
+                <w:color w:val="000000"/>
+                <w:sz w:val="18"/>
+              </w:rPr>
+              <w:t>Bounded NOMATCH interval had no new matching rows while baseline traffic continued; removing the predicate restored expected 2/3/4 rows.</w:t>
+            </w:r>
+          </w:p>
+        </w:tc>
+      </w:tr>
+      <w:tr>
+        <w:trPr>
+          <w:cantSplit/>
+        </w:trPr>
+        <w:tc>
+          <w:tcPr>
+            <w:tcW w:type="dxa" w:w="2448"/>
+            <w:vAlign w:val="center"/>
+            <w:tcMar>
+              <w:top w:w="85" w:type="dxa"/>
+              <w:left w:w="85" w:type="dxa"/>
+              <w:bottom w:w="85" w:type="dxa"/>
+              <w:right w:w="85" w:type="dxa"/>
+            </w:tcMar>
+            <w:shd w:fill="FFFFFF"/>
+          </w:tcPr>
+          <w:p>
+            <w:pPr>
+              <w:spacing w:after="20" w:before="20" w:line="240" w:lineRule="auto"/>
+            </w:pPr>
+            <w:r>
+              <w:rPr>
+                <w:b w:val="0"/>
+                <w:color w:val="000000"/>
+                <w:sz w:val="18"/>
+              </w:rPr>
+              <w:t>U40 B discovery check</w:t>
+            </w:r>
+          </w:p>
+        </w:tc>
+        <w:tc>
+          <w:tcPr>
+            <w:tcW w:type="dxa" w:w="1440"/>
+            <w:vAlign w:val="center"/>
+            <w:tcMar>
+              <w:top w:w="85" w:type="dxa"/>
+              <w:left w:w="85" w:type="dxa"/>
+              <w:bottom w:w="85" w:type="dxa"/>
+              <w:right w:w="85" w:type="dxa"/>
+            </w:tcMar>
+            <w:shd w:fill="FFFFFF"/>
+          </w:tcPr>
+          <w:p>
+            <w:pPr>
+              <w:spacing w:after="20" w:before="20" w:line="240" w:lineRule="auto"/>
+            </w:pPr>
+            <w:r>
+              <w:rPr>
+                <w:b w:val="0"/>
+                <w:color w:val="000000"/>
+                <w:sz w:val="18"/>
+              </w:rPr>
+              <w:t>source 12</w:t>
+            </w:r>
+          </w:p>
+        </w:tc>
+        <w:tc>
+          <w:tcPr>
+            <w:tcW w:type="dxa" w:w="6336"/>
+            <w:vAlign w:val="center"/>
+            <w:tcMar>
+              <w:top w:w="85" w:type="dxa"/>
+              <w:left w:w="85" w:type="dxa"/>
+              <w:bottom w:w="85" w:type="dxa"/>
+              <w:right w:w="85" w:type="dxa"/>
+            </w:tcMar>
+            <w:shd w:fill="FFFFFF"/>
+          </w:tcPr>
+          <w:p>
+            <w:pPr>
+              <w:spacing w:after="20" w:before="20" w:line="240" w:lineRule="auto"/>
+            </w:pPr>
+            <w:r>
+              <w:rPr>
+                <w:b w:val="0"/>
+                <w:color w:val="000000"/>
+                <w:sz w:val="18"/>
+              </w:rPr>
+              <w:t>Ungranted B was not found in the source picker. This is discovery evidence, not proof of denied private-content retrieval.</w:t>
+            </w:r>
+          </w:p>
+        </w:tc>
+      </w:tr>
+      <w:tr>
+        <w:trPr>
+          <w:cantSplit/>
+        </w:trPr>
+        <w:tc>
+          <w:tcPr>
+            <w:tcW w:type="dxa" w:w="2448"/>
+            <w:vAlign w:val="center"/>
+            <w:tcMar>
+              <w:top w:w="85" w:type="dxa"/>
+              <w:left w:w="85" w:type="dxa"/>
+              <w:bottom w:w="85" w:type="dxa"/>
+              <w:right w:w="85" w:type="dxa"/>
+            </w:tcMar>
+            <w:shd w:fill="F3F5F7"/>
+          </w:tcPr>
+          <w:p>
+            <w:pPr>
+              <w:spacing w:after="20" w:before="20" w:line="240" w:lineRule="auto"/>
+            </w:pPr>
+            <w:r>
+              <w:rPr>
+                <w:b w:val="0"/>
+                <w:color w:val="000000"/>
+                <w:sz w:val="18"/>
+              </w:rPr>
+              <w:t>U41 Direct event-link recovery</w:t>
+            </w:r>
+          </w:p>
+        </w:tc>
+        <w:tc>
+          <w:tcPr>
+            <w:tcW w:type="dxa" w:w="1440"/>
+            <w:vAlign w:val="center"/>
+            <w:tcMar>
+              <w:top w:w="85" w:type="dxa"/>
+              <w:left w:w="85" w:type="dxa"/>
+              <w:bottom w:w="85" w:type="dxa"/>
+              <w:right w:w="85" w:type="dxa"/>
+            </w:tcMar>
+            <w:shd w:fill="F3F5F7"/>
+          </w:tcPr>
+          <w:p>
+            <w:pPr>
+              <w:spacing w:after="20" w:before="20" w:line="240" w:lineRule="auto"/>
+            </w:pPr>
+            <w:r>
+              <w:rPr>
+                <w:b w:val="0"/>
+                <w:color w:val="000000"/>
+                <w:sz w:val="18"/>
+              </w:rPr>
+              <w:t>10:24; 10:41</w:t>
+            </w:r>
+          </w:p>
+        </w:tc>
+        <w:tc>
+          <w:tcPr>
+            <w:tcW w:type="dxa" w:w="6336"/>
+            <w:vAlign w:val="center"/>
+            <w:tcMar>
+              <w:top w:w="85" w:type="dxa"/>
+              <w:left w:w="85" w:type="dxa"/>
+              <w:bottom w:w="85" w:type="dxa"/>
+              <w:right w:w="85" w:type="dxa"/>
+            </w:tcMar>
+            <w:shd w:fill="F3F5F7"/>
+          </w:tcPr>
+          <w:p>
+            <w:pPr>
+              <w:spacing w:after="20" w:before="20" w:line="240" w:lineRule="auto"/>
+            </w:pPr>
+            <w:r>
+              <w:rPr>
+                <w:b w:val="0"/>
+                <w:color w:val="000000"/>
+                <w:sz w:val="18"/>
+              </w:rPr>
+              <w:t>Two View in Logs errors recovered through exact-identity indexed rows. UX04 is Low; no data loss or cause claimed.</w:t>
+            </w:r>
+          </w:p>
+        </w:tc>
+      </w:tr>
+      <w:tr>
+        <w:trPr>
+          <w:cantSplit/>
+        </w:trPr>
+        <w:tc>
+          <w:tcPr>
+            <w:tcW w:type="dxa" w:w="2448"/>
+            <w:vAlign w:val="center"/>
+            <w:tcMar>
+              <w:top w:w="85" w:type="dxa"/>
+              <w:left w:w="85" w:type="dxa"/>
+              <w:bottom w:w="85" w:type="dxa"/>
+              <w:right w:w="85" w:type="dxa"/>
+            </w:tcMar>
+            <w:shd w:fill="FFFFFF"/>
+          </w:tcPr>
+          <w:p>
+            <w:pPr>
+              <w:spacing w:after="20" w:before="20" w:line="240" w:lineRule="auto"/>
+            </w:pPr>
+            <w:r>
+              <w:rPr>
+                <w:b w:val="0"/>
+                <w:color w:val="000000"/>
+                <w:sz w:val="18"/>
+              </w:rPr>
+              <w:t>U42 Source/value explanation and return</w:t>
+            </w:r>
+          </w:p>
+        </w:tc>
+        <w:tc>
+          <w:tcPr>
+            <w:tcW w:type="dxa" w:w="1440"/>
+            <w:vAlign w:val="center"/>
+            <w:tcMar>
+              <w:top w:w="85" w:type="dxa"/>
+              <w:left w:w="85" w:type="dxa"/>
+              <w:bottom w:w="85" w:type="dxa"/>
+              <w:right w:w="85" w:type="dxa"/>
+            </w:tcMar>
+            <w:shd w:fill="FFFFFF"/>
+          </w:tcPr>
+          <w:p>
+            <w:pPr>
+              <w:spacing w:after="20" w:before="20" w:line="240" w:lineRule="auto"/>
+            </w:pPr>
+            <w:r>
+              <w:rPr>
+                <w:b w:val="0"/>
+                <w:color w:val="000000"/>
+                <w:sz w:val="18"/>
+              </w:rPr>
+              <w:t>10:42:45</w:t>
+            </w:r>
+          </w:p>
+        </w:tc>
+        <w:tc>
+          <w:tcPr>
+            <w:tcW w:type="dxa" w:w="6336"/>
+            <w:vAlign w:val="center"/>
+            <w:tcMar>
+              <w:top w:w="85" w:type="dxa"/>
+              <w:left w:w="85" w:type="dxa"/>
+              <w:bottom w:w="85" w:type="dxa"/>
+              <w:right w:w="85" w:type="dxa"/>
+            </w:tcMar>
+            <w:shd w:fill="FFFFFF"/>
+          </w:tcPr>
+          <w:p>
+            <w:pPr>
+              <w:spacing w:after="20" w:before="20" w:line="240" w:lineRule="auto"/>
+            </w:pPr>
+            <w:r>
+              <w:rPr>
+                <w:b w:val="0"/>
+                <w:color w:val="000000"/>
+                <w:sz w:val="18"/>
+              </w:rPr>
+              <w:t>The same control snapshot/context survived return; Datadog source quantity &gt; 3 and captured quantity 3/false/zero discount explained the planted application bug.</w:t>
+            </w:r>
+          </w:p>
+        </w:tc>
+      </w:tr>
+    </w:tbl>
+    <w:p>
+      <w:pPr>
+        <w:pStyle w:val="Heading2"/>
+      </w:pPr>
+      <w:r>
+        <w:t>Unconfirmed observations</w:t>
+      </w:r>
+    </w:p>
+    <w:p>
+      <w:pPr>
+        <w:pStyle w:val="Normal"/>
+      </w:pPr>
+      <w:r>
+        <w:t>These four topics have no assigned severity and are excluded from the seven finding pages. They are retained for targeted retest, not promoted to confirmed bugs.</w:t>
+      </w:r>
+    </w:p>
+    <w:p>
+      <w:pPr>
+        <w:pStyle w:val="Normal"/>
+      </w:pPr>
+      <w:r>
+        <w:t>Initial Enable logs state: the first session offered this prompt before Logs was visited and the session refreshed. Capture then worked without an explicit Logs settings change. Initial activation, timing and staleness have not been separated.</w:t>
+      </w:r>
+    </w:p>
+    <w:p>
+      <w:pPr>
+        <w:pStyle w:val="Normal"/>
+      </w:pPr>
+      <w:r>
+        <w:t>Earlier HTTP 400 guidance: wildcard-environment attempts returned a visible instrumentation-invalid error while Configuration had no environment. A later healthy SDK/specific-staging baseline worked. The cause was not isolated; recovery-message clarity remains a retest question.</w:t>
+      </w:r>
+    </w:p>
+    <w:p>
+      <w:pPr>
+        <w:pStyle w:val="Normal"/>
+      </w:pPr>
+      <w:r>
+        <w:t>Countdown and child lifetimes: the original session expired around 10:45 after a 09:45 Apply. A later 11:33 follow-up found the older failed 9999 probe expired while edited line 17 still captured and the header showed 6 minutes. Edits did not renew every sibling; the countdown appears tied to active child lifetimes. This later unscored observation narrows the question; it does not prove a session-wide TTL defect.</w:t>
+      </w:r>
+    </w:p>
+    <w:p>
+      <w:pPr>
+        <w:pStyle w:val="Normal"/>
+      </w:pPr>
+      <w:r>
+        <w:t>Invalid-line marker position: the 9999 marker appeared near the file end while the runtime explicitly rejected line 9999. No relocation or capture at a different line was proved. Check visual placement separately from installation.</w:t>
+      </w:r>
+    </w:p>
+    <w:p>
+      <w:pPr>
+        <w:pStyle w:val="Normal"/>
+      </w:pPr>
+      <w:r>
+        <w:t>The Line input naming assessment remains incomplete. The earlier condition-unavailability interpretation was corrected by an ordinary click and successful predicate captures; it is not a product finding.</w:t>
+      </w:r>
+    </w:p>
+    <w:p>
+      <w:pPr>
+        <w:pStyle w:val="Normal"/>
+      </w:pPr>
+      <w:hyperlink r:id="rId36">
+        <w:r>
+          <w:rPr>
+            <w:color w:val="164F80"/>
+          </w:rPr>
+          <w:t>Full unconfirmed-observation inventory and retest boundaries</w:t>
+        </w:r>
+      </w:hyperlink>
     </w:p>
     <w:sectPr>
       <w:footerReference w:type="default" r:id="rId9"/>

</xml_diff>

<commit_message>
Publish the checked V9 PDF and editable report
</commit_message>
<xml_diff>
--- a/report.docx
+++ b/report.docx
@@ -26,7 +26,7 @@
           <w:b w:val="0"/>
           <w:sz w:val="18"/>
         </w:rPr>
-        <w:t>Live capture checkpoint  |  8 October 2026 at 10:50 UTC  |  06:50 New York</w:t>
+        <w:t>Live QA checkpoint  |  8 October 2026 at 13:15 UTC  |  09:15 New York</w:t>
       </w:r>
     </w:p>
     <w:p>
@@ -42,7 +42,7 @@
         <w:rPr>
           <w:b w:val="0"/>
         </w:rPr>
-        <w:t>Live numeric capture now passes all three fixture controls, and source retrieval matches the deployed revision. A controlled A-only reinstall repaired the interrupted source association. Two Medium findings remain: the Python quickstart command and the interrupted-connection recovery path. A bounded expiry test also passed. Further access-boundary and functional cases remain open.</w:t>
+        <w:t>Live capture, source, lifecycle, redaction and correlation controls work in the tested setup. Four Medium findings concern the quickstart, interrupted source linking, lost drafts and SDK missing-versus-null serialization. SDK verification is separately dated after the live-QA cutoff. Permission and deployment variants remain open.</w:t>
       </w:r>
     </w:p>
     <w:p>
@@ -58,13 +58,13 @@
         <w:rPr>
           <w:b/>
         </w:rPr>
-        <w:t>Recover interrupted source connections.</w:t>
+        <w:t>Preserve dirty drafts.</w:t>
       </w:r>
       <w:r>
         <w:rPr>
           <w:b w:val="0"/>
         </w:rPr>
-        <w:t xml:space="preserve"> Connect did not recover the paused flow; a controlled same-scope reinstall restored association and source retrieval.</w:t>
+        <w:t xml:space="preserve"> A save in another tab erased an unsaved condition.</w:t>
       </w:r>
     </w:p>
     <w:p>
@@ -80,13 +80,13 @@
         <w:rPr>
           <w:b/>
         </w:rPr>
-        <w:t>Fix the Python quickstart.</w:t>
+        <w:t>Distinguish missing locals.</w:t>
       </w:r>
       <w:r>
         <w:rPr>
           <w:b w:val="0"/>
         </w:rPr>
-        <w:t xml:space="preserve"> The documented .py-suffixed module form fails; script/module alternatives work.</w:t>
+        <w:t xml:space="preserve"> ddtrace 4.11.0 conflates absence with None.</w:t>
       </w:r>
     </w:p>
     <w:p>
@@ -102,13 +102,13 @@
         <w:rPr>
           <w:b/>
         </w:rPr>
-        <w:t>Preserve event navigation.</w:t>
+        <w:t>Repair source linking.</w:t>
       </w:r>
       <w:r>
         <w:rPr>
           <w:b w:val="0"/>
         </w:rPr>
-        <w:t xml:space="preserve"> View in Logs should open the matching indexed snapshot directly.</w:t>
+        <w:t xml:space="preserve"> Same-scope reinstall repaired the interrupted association.</w:t>
       </w:r>
     </w:p>
     <w:p>
@@ -124,13 +124,13 @@
         <w:rPr>
           <w:b/>
         </w:rPr>
-        <w:t>Explain invalid templates.</w:t>
+        <w:t>Fix the quickstart.</w:t>
       </w:r>
       <w:r>
         <w:rPr>
           <w:b w:val="0"/>
         </w:rPr>
-        <w:t xml:space="preserve"> Keep the working validation border and add a specific correction message.</w:t>
+        <w:t xml:space="preserve"> Its .py-suffixed module command fails.</w:t>
       </w:r>
     </w:p>
     <w:p>
@@ -146,13 +146,13 @@
         <w:rPr>
           <w:b/>
         </w:rPr>
-        <w:t>Improve empty-state guidance.</w:t>
+        <w:t>Explain errors and recovery.</w:t>
       </w:r>
       <w:r>
         <w:rPr>
           <w:b w:val="0"/>
         </w:rPr>
-        <w:t xml:space="preserve"> Put a concrete setup recovery step beside empty service and environment lists.</w:t>
+        <w:t xml:space="preserve"> Template and direct-event feedback remain weak.</w:t>
       </w:r>
     </w:p>
     <w:p>
@@ -168,13 +168,13 @@
         <w:rPr>
           <w:b/>
         </w:rPr>
-        <w:t>Improve labels and first choices.</w:t>
+        <w:t>Clarify first choices.</w:t>
       </w:r>
       <w:r>
         <w:rPr>
           <w:b w:val="0"/>
         </w:rPr>
-        <w:t xml:space="preserve"> Keep navigation words readable and explain permanent region selection.</w:t>
+        <w:t xml:space="preserve"> Improve region, empty-state and navigation guidance.</w:t>
       </w:r>
     </w:p>
     <w:p>
@@ -183,7 +183,7 @@
           <w:b w:val="0"/>
           <w:sz w:val="18"/>
         </w:rPr>
-        <w:t>Severity index below: HIGH 0 · MEDIUM 2 · LOW 5. Click a finding ID to jump to its detail page.</w:t>
+        <w:t>Severity index below: HIGH 0 · MEDIUM 4 · LOW 5. Click a finding ID to jump to its detail page.</w:t>
       </w:r>
     </w:p>
     <w:p>
@@ -202,7 +202,7 @@
           <w:b w:val="0"/>
           <w:sz w:val="18"/>
         </w:rPr>
-        <w:t>63 cases: 10 PASS, 5 FINDING, 19 OPEN and 29 BLOCKED. OPEN comprises 3 in progress and 16 pending. Two of the PASS results are the earlier scoped route/setup checks.</w:t>
+        <w:t>63 cases: 16 PASS, 7 FINDING, 16 OPEN and 24 BLOCKED. OPEN comprises 8 in progress and 8 pending.</w:t>
       </w:r>
     </w:p>
     <w:p>
@@ -218,7 +218,7 @@
         <w:rPr>
           <w:b w:val="0"/>
         </w:rPr>
-        <w:t>The baseline works; this is an ongoing audit, not end-to-end signoff. Repository B access, manual stop/re-enable, role isolation and the remaining original cases still need their own evidence.</w:t>
+        <w:t>This is an ongoing audit, not release signoff. The live-case ledger stops at 13:15:00 UTC; SDK verification was confirmed separately at 13:16:33. Repository B boundaries, restricted identities and other controlled variants remain incomplete. Later My sessions inventory does not prove account-wide or runtime cleanup.</w:t>
       </w:r>
     </w:p>
     <w:p>
@@ -561,6 +561,224 @@
               <w:right w:w="85" w:type="dxa"/>
             </w:tcMar>
             <w:shd w:fill="F3F5F7"/>
+          </w:tcPr>
+          <w:p>
+            <w:pPr>
+              <w:spacing w:after="20" w:before="20" w:line="240" w:lineRule="auto"/>
+            </w:pPr>
+            <w:r>
+              <w:rPr>
+                <w:b w:val="0"/>
+                <w:color w:val="000000"/>
+                <w:sz w:val="18"/>
+              </w:rPr>
+              <w:t>2</w:t>
+            </w:r>
+          </w:p>
+        </w:tc>
+      </w:tr>
+      <w:tr>
+        <w:trPr>
+          <w:cantSplit/>
+        </w:trPr>
+        <w:tc>
+          <w:tcPr>
+            <w:tcW w:type="dxa" w:w="1008"/>
+            <w:vAlign w:val="center"/>
+            <w:tcMar>
+              <w:top w:w="85" w:type="dxa"/>
+              <w:left w:w="85" w:type="dxa"/>
+              <w:bottom w:w="85" w:type="dxa"/>
+              <w:right w:w="85" w:type="dxa"/>
+            </w:tcMar>
+            <w:shd w:fill="FFFFFF"/>
+          </w:tcPr>
+          <w:p>
+            <w:pPr>
+              <w:spacing w:after="20" w:before="20" w:line="240" w:lineRule="auto"/>
+            </w:pPr>
+            <w:hyperlink w:anchor="FUNC01">
+              <w:r>
+                <w:rPr>
+                  <w:color w:val="164F80"/>
+                </w:rPr>
+                <w:t>FUNC01</w:t>
+              </w:r>
+            </w:hyperlink>
+          </w:p>
+        </w:tc>
+        <w:tc>
+          <w:tcPr>
+            <w:tcW w:type="dxa" w:w="1944"/>
+            <w:vAlign w:val="center"/>
+            <w:tcMar>
+              <w:top w:w="85" w:type="dxa"/>
+              <w:left w:w="85" w:type="dxa"/>
+              <w:bottom w:w="85" w:type="dxa"/>
+              <w:right w:w="85" w:type="dxa"/>
+            </w:tcMar>
+            <w:shd w:fill="FFFFFF"/>
+          </w:tcPr>
+          <w:p>
+            <w:pPr>
+              <w:spacing w:after="20" w:before="20" w:line="240" w:lineRule="auto"/>
+            </w:pPr>
+            <w:r>
+              <w:rPr>
+                <w:b w:val="0"/>
+                <w:color w:val="000000"/>
+                <w:sz w:val="18"/>
+              </w:rPr>
+              <w:t>MEDIUM · draft loss</w:t>
+            </w:r>
+          </w:p>
+        </w:tc>
+        <w:tc>
+          <w:tcPr>
+            <w:tcW w:type="dxa" w:w="6480"/>
+            <w:vAlign w:val="center"/>
+            <w:tcMar>
+              <w:top w:w="85" w:type="dxa"/>
+              <w:left w:w="85" w:type="dxa"/>
+              <w:bottom w:w="85" w:type="dxa"/>
+              <w:right w:w="85" w:type="dxa"/>
+            </w:tcMar>
+            <w:shd w:fill="FFFFFF"/>
+          </w:tcPr>
+          <w:p>
+            <w:pPr>
+              <w:spacing w:after="20" w:before="20" w:line="240" w:lineRule="auto"/>
+            </w:pPr>
+            <w:r>
+              <w:rPr>
+                <w:b w:val="0"/>
+                <w:color w:val="000000"/>
+                <w:sz w:val="18"/>
+              </w:rPr>
+              <w:t>Remote save silently discards an unsaved condition</w:t>
+            </w:r>
+          </w:p>
+        </w:tc>
+        <w:tc>
+          <w:tcPr>
+            <w:tcW w:type="dxa" w:w="792"/>
+            <w:vAlign w:val="center"/>
+            <w:tcMar>
+              <w:top w:w="85" w:type="dxa"/>
+              <w:left w:w="85" w:type="dxa"/>
+              <w:bottom w:w="85" w:type="dxa"/>
+              <w:right w:w="85" w:type="dxa"/>
+            </w:tcMar>
+            <w:shd w:fill="FFFFFF"/>
+          </w:tcPr>
+          <w:p>
+            <w:pPr>
+              <w:spacing w:after="20" w:before="20" w:line="240" w:lineRule="auto"/>
+            </w:pPr>
+            <w:r>
+              <w:rPr>
+                <w:b w:val="0"/>
+                <w:color w:val="000000"/>
+                <w:sz w:val="18"/>
+              </w:rPr>
+              <w:t>2</w:t>
+            </w:r>
+          </w:p>
+        </w:tc>
+      </w:tr>
+      <w:tr>
+        <w:trPr>
+          <w:cantSplit/>
+        </w:trPr>
+        <w:tc>
+          <w:tcPr>
+            <w:tcW w:type="dxa" w:w="1008"/>
+            <w:vAlign w:val="center"/>
+            <w:tcMar>
+              <w:top w:w="85" w:type="dxa"/>
+              <w:left w:w="85" w:type="dxa"/>
+              <w:bottom w:w="85" w:type="dxa"/>
+              <w:right w:w="85" w:type="dxa"/>
+            </w:tcMar>
+            <w:shd w:fill="FFFFFF"/>
+          </w:tcPr>
+          <w:p>
+            <w:pPr>
+              <w:spacing w:after="20" w:before="20" w:line="240" w:lineRule="auto"/>
+            </w:pPr>
+            <w:hyperlink w:anchor="FUNC02">
+              <w:r>
+                <w:rPr>
+                  <w:color w:val="164F80"/>
+                </w:rPr>
+                <w:t>FUNC02</w:t>
+              </w:r>
+            </w:hyperlink>
+          </w:p>
+        </w:tc>
+        <w:tc>
+          <w:tcPr>
+            <w:tcW w:type="dxa" w:w="1944"/>
+            <w:vAlign w:val="center"/>
+            <w:tcMar>
+              <w:top w:w="85" w:type="dxa"/>
+              <w:left w:w="85" w:type="dxa"/>
+              <w:bottom w:w="85" w:type="dxa"/>
+              <w:right w:w="85" w:type="dxa"/>
+            </w:tcMar>
+            <w:shd w:fill="FFFFFF"/>
+          </w:tcPr>
+          <w:p>
+            <w:pPr>
+              <w:spacing w:after="20" w:before="20" w:line="240" w:lineRule="auto"/>
+            </w:pPr>
+            <w:r>
+              <w:rPr>
+                <w:b w:val="0"/>
+                <w:color w:val="000000"/>
+                <w:sz w:val="18"/>
+              </w:rPr>
+              <w:t>MEDIUM · SDK values</w:t>
+            </w:r>
+          </w:p>
+        </w:tc>
+        <w:tc>
+          <w:tcPr>
+            <w:tcW w:type="dxa" w:w="6480"/>
+            <w:vAlign w:val="center"/>
+            <w:tcMar>
+              <w:top w:w="85" w:type="dxa"/>
+              <w:left w:w="85" w:type="dxa"/>
+              <w:bottom w:w="85" w:type="dxa"/>
+              <w:right w:w="85" w:type="dxa"/>
+            </w:tcMar>
+            <w:shd w:fill="FFFFFF"/>
+          </w:tcPr>
+          <w:p>
+            <w:pPr>
+              <w:spacing w:after="20" w:before="20" w:line="240" w:lineRule="auto"/>
+            </w:pPr>
+            <w:r>
+              <w:rPr>
+                <w:b w:val="0"/>
+                <w:color w:val="000000"/>
+                <w:sz w:val="18"/>
+              </w:rPr>
+              <w:t>Unbound/deleted locals serialize as explicit None</w:t>
+            </w:r>
+          </w:p>
+        </w:tc>
+        <w:tc>
+          <w:tcPr>
+            <w:tcW w:type="dxa" w:w="792"/>
+            <w:vAlign w:val="center"/>
+            <w:tcMar>
+              <w:top w:w="85" w:type="dxa"/>
+              <w:left w:w="85" w:type="dxa"/>
+              <w:bottom w:w="85" w:type="dxa"/>
+              <w:right w:w="85" w:type="dxa"/>
+            </w:tcMar>
+            <w:shd w:fill="FFFFFF"/>
           </w:tcPr>
           <w:p>
             <w:pPr>
@@ -1226,7 +1444,7 @@
         <w:rPr>
           <w:b w:val="0"/>
         </w:rPr>
-        <w:t>A local Python process check isolates the quickstart syntax. It does not validate the ddtrace-run wrapper, Agent, log ingestion, or a long-running instrumented application.</w:t>
+        <w:t>The early Python command check isolates quickstart syntax. Later browser captures establish the live baseline. A separate actual-package SDK reproduction checks local-variable collection/serialization without transmitting telemetry; it does not inspect the hosted transport payload.</w:t>
       </w:r>
     </w:p>
     <w:p>
@@ -1527,7 +1745,7 @@
         <w:rPr>
           <w:b w:val="0"/>
         </w:rPr>
-        <w:t>The browser viewport is approximately 1180 × 757 pixels. Early local command reproduction used Python 3.12.14; earlier process snapshots used Python 3.13.5. The hosted baseline uses Agent 7.84.2 and ddtrace 4.11.0, with Python series 3.13 requested; its exact patch has not been retrieved. Agent authorization, debugger SDK registration, actual numeric capture and baseline source retrieval are now verified. The earlier recorded Datadog UI build was 35.143254999.</w:t>
+        <w:t>The viewport is approximately 1180 × 757 pixels. Agent 7.84.2 and ddtrace 4.11.0 are used in the hosted tests; Python series 3.13 was requested and its exact hosted patch is not established here. The offline SDK reproduction used Python 3.13.5. The preview UI build visible in the later original screenshots is 35.143306223; earlier captures used 35.143254999. Authorization, SDK registration, actual captures and baseline source retrieval have been verified.</w:t>
       </w:r>
     </w:p>
     <w:p>
@@ -2156,7 +2374,7 @@
                 <w:color w:val="000000"/>
                 <w:sz w:val="18"/>
               </w:rPr>
-              <w:t>Target expiry and retained history are verified; manual stop/re-enable and full cleanup remain open at this checkpoint.</w:t>
+              <w:t>Expiry, explicit resume/stop and child/session hierarchy controls passed; full inventory and unexecuted variants remain open.</w:t>
             </w:r>
           </w:p>
         </w:tc>
@@ -3070,7 +3288,7 @@
         <w:rPr>
           <w:b w:val="0"/>
         </w:rPr>
-        <w:t>63 cases: 10 PASS, 5 FINDING, 19 OPEN and 29 BLOCKED. OPEN comprises 3 in progress and 16 pending. The appendix preserves every original case. The online matrix retains full steps and cleanup. A PASS describes the tested scope, not every variant of the feature.</w:t>
+        <w:t>63 cases: 16 PASS, 7 FINDING, 16 OPEN and 24 BLOCKED. OPEN comprises 8 in progress and 8 pending. Every original definition is preserved. The online matrix retains full steps and cleanup. A PASS describes the executed scope, not every variant of a feature.</w:t>
       </w:r>
     </w:p>
     <w:tbl>
@@ -3202,7 +3420,7 @@
                 <w:color w:val="000000"/>
                 <w:sz w:val="18"/>
               </w:rPr>
-              <w:t>B02/B03/B08/B09/S11</w:t>
+              <w:t>7 case findings</w:t>
             </w:r>
           </w:p>
         </w:tc>
@@ -3254,7 +3472,7 @@
                 <w:color w:val="000000"/>
                 <w:sz w:val="18"/>
               </w:rPr>
-              <w:t>UX02, DOC01, UX03, SCI01 and the Low UX04 direct-event navigation issue</w:t>
+              <w:t>Original-case findings plus the separately verified SDK issue are tracked in a nine-finding index.</w:t>
             </w:r>
           </w:p>
         </w:tc>
@@ -3451,7 +3669,7 @@
                 <w:color w:val="000000"/>
                 <w:sz w:val="18"/>
               </w:rPr>
-              <w:t>F14</w:t>
+              <w:t>Open variants</w:t>
             </w:r>
           </w:p>
         </w:tc>
@@ -3477,7 +3695,7 @@
                 <w:color w:val="000000"/>
                 <w:sz w:val="18"/>
               </w:rPr>
-              <w:t>PENDING</w:t>
+              <w:t>IN PROGRESS</w:t>
             </w:r>
           </w:p>
         </w:tc>
@@ -3503,7 +3721,7 @@
                 <w:color w:val="000000"/>
                 <w:sz w:val="18"/>
               </w:rPr>
-              <w:t>Earlier modal/draft navigation passed; remaining saved-entity variants need direct tests.</w:t>
+              <w:t>Entry, parent/stale controls, complex values and never-called trigger completion remain partial.</w:t>
             </w:r>
           </w:p>
         </w:tc>
@@ -3617,7 +3835,7 @@
                 <w:color w:val="000000"/>
                 <w:sz w:val="18"/>
               </w:rPr>
-              <w:t>F01–03/F11/S02/X04</w:t>
+              <w:t>Runtime controls</w:t>
             </w:r>
           </w:p>
         </w:tc>
@@ -3669,7 +3887,7 @@
                 <w:color w:val="000000"/>
                 <w:sz w:val="18"/>
               </w:rPr>
-              <w:t>Numeric/conditional/no-match controls, exact deployed source and bounded expiry/history checks passed.</w:t>
+              <w:t>Numeric/source/expiry plus resume, redaction, missing-value feedback and sampled request association passed in scoped controls.</w:t>
             </w:r>
           </w:p>
         </w:tc>
@@ -3756,7 +3974,7 @@
         <w:rPr>
           <w:b w:val="0"/>
         </w:rPr>
-        <w:t>Still required: disable and recheck every remaining test session/logpoint, with continuing traffic where available.</w:t>
+        <w:t>Still required: finish the full inventory and outstanding behavior/settings checks; a filtered zero-active list is narrower than account-wide shutdown.</w:t>
       </w:r>
     </w:p>
     <w:p>
@@ -4122,6 +4340,446 @@
       </w:r>
     </w:p>
     <w:p>
+      <w:pPr>
+        <w:pStyle w:val="Heading1"/>
+        <w:pageBreakBefore/>
+      </w:pPr>
+      <w:bookmarkStart w:id="1119" w:name="FUNC01"/>
+      <w:r>
+        <w:t>Remote save erases an unsaved condition</w:t>
+      </w:r>
+      <w:bookmarkEnd w:id="1119"/>
+    </w:p>
+    <w:p>
+      <w:pPr>
+        <w:pStyle w:val="Caption"/>
+      </w:pPr>
+      <w:r>
+        <w:t>MEDIUM · FUNC01 · Two-tab dirty-draft loss · F09</w:t>
+      </w:r>
+    </w:p>
+    <w:p>
+      <w:pPr>
+        <w:pStyle w:val="Normal"/>
+      </w:pPr>
+      <w:r>
+        <w:t>A message-only save in tab A twice erased an unsaved condition in tab B. B visibly reverted from quantity == 3 to the stored quantity == 4, and Apply became disabled. No warning was observed. The saved condition remained correct; conflicting saved writes and capture corruption are not established.</w:t>
+      </w:r>
+    </w:p>
+    <w:p>
+      <w:pPr>
+        <w:keepNext/>
+        <w:spacing w:after="100"/>
+      </w:pPr>
+      <w:r>
+        <w:drawing>
+          <wp:inline xmlns:a="http://schemas.openxmlformats.org/drawingml/2006/main" xmlns:pic="http://schemas.openxmlformats.org/drawingml/2006/picture">
+            <wp:extent cx="5852160" cy="3086728"/>
+            <wp:docPr id="13" name="Evidence image 13" descr="Annotated after-state showing the reverted condition and visible Apply region"/>
+            <wp:cNvGraphicFramePr>
+              <a:graphicFrameLocks noChangeAspect="1"/>
+            </wp:cNvGraphicFramePr>
+            <a:graphic>
+              <a:graphicData uri="http://schemas.openxmlformats.org/drawingml/2006/picture">
+                <pic:pic>
+                  <pic:nvPicPr>
+                    <pic:cNvPr id="14" name="Evidence image 14.png" descr="Annotated after-state showing the reverted condition and visible Apply region"/>
+                    <pic:cNvPicPr/>
+                  </pic:nvPicPr>
+                  <pic:blipFill>
+                    <a:blip r:embed="rId37"/>
+                    <a:stretch>
+                      <a:fillRect/>
+                    </a:stretch>
+                  </pic:blipFill>
+                  <pic:spPr>
+                    <a:xfrm>
+                      <a:off x="0" y="0"/>
+                      <a:ext cx="5852160" cy="3086728"/>
+                    </a:xfrm>
+                    <a:prstGeom prst="rect"/>
+                  </pic:spPr>
+                </pic:pic>
+              </a:graphicData>
+            </a:graphic>
+          </wp:inline>
+        </w:drawing>
+      </w:r>
+    </w:p>
+    <w:p>
+      <w:pPr>
+        <w:pStyle w:val="Caption"/>
+      </w:pPr>
+      <w:r>
+        <w:t>Second reproduction, 13:02:26–13:03:02 UTC. After the remote save, the editor shows TAB_A3 and quantity == 4. Apply is partly clipped; its disabled state was confirmed separately.</w:t>
+      </w:r>
+    </w:p>
+    <w:p>
+      <w:pPr>
+        <w:pStyle w:val="Normal"/>
+      </w:pPr>
+      <w:hyperlink r:id="rId38">
+        <w:r>
+          <w:rPr>
+            <w:color w:val="164F80"/>
+          </w:rPr>
+          <w:t>Full-size annotated before and after plus exact reproduction</w:t>
+        </w:r>
+      </w:hyperlink>
+    </w:p>
+    <w:p>
+      <w:pPr>
+        <w:pStyle w:val="Normal"/>
+      </w:pPr>
+      <w:r>
+        <w:t>Reproduce: open the same logpoint in two tabs; leave a quantity == 3 condition dirty in B; save only a message change in A; return to B. Preserve the draft or explain a reconciliation choice instead of silently discarding it.</w:t>
+      </w:r>
+    </w:p>
+    <w:p>
+      <w:pPr>
+        <w:pStyle w:val="Normal"/>
+      </w:pPr>
+      <w:r>
+        <w:t>Evidence: first reproduction 13:01:13–13:01:59; repeated clean sequence 13:02:26–13:03:02. Rendered pixels/editor text establish the changed value; a briefly stale accessibility value is excluded.</w:t>
+      </w:r>
+    </w:p>
+    <w:p>
+      <w:pPr>
+        <w:pStyle w:val="Normal"/>
+      </w:pPr>
+      <w:r>
+        <w:t>Motion limit: source 13 shows the dirty draft and a subsequent source/INSTRUMENTING view, not a complete foreground editor-overwrite transition. The reviewed before/after stills and interaction chronology support the finding. Further saved-write/reload/capture variants remain unexecuted.</w:t>
+      </w:r>
+    </w:p>
+    <w:p>
+      <w:pPr>
+        <w:pStyle w:val="Heading1"/>
+        <w:pageBreakBefore/>
+      </w:pPr>
+      <w:bookmarkStart w:id="1120" w:name="FUNC02"/>
+      <w:r>
+        <w:t>Unbound Python locals serialize as null</w:t>
+      </w:r>
+      <w:bookmarkEnd w:id="1120"/>
+    </w:p>
+    <w:p>
+      <w:pPr>
+        <w:pStyle w:val="Caption"/>
+      </w:pPr>
+      <w:r>
+        <w:t>MEDIUM · FUNC02 · ddtrace 4.11.0 SDK serialization · Separate verification addendum</w:t>
+      </w:r>
+    </w:p>
+    <w:p>
+      <w:pPr>
+        <w:pStyle w:val="Normal"/>
+      </w:pPr>
+      <w:r>
+        <w:t>An unbound or deleted local is different from a value explicitly assigned None. Actual ddtrace 4.11.0 helpers serialize all three as NoneType with isNull=true, although isDefined is false for absent names and true for explicit None. Assigned 42 and later-assigned 99 controls remain correct.</w:t>
+      </w:r>
+    </w:p>
+    <w:p>
+      <w:pPr>
+        <w:keepNext/>
+        <w:spacing w:after="100"/>
+      </w:pPr>
+      <w:r>
+        <w:drawing>
+          <wp:inline xmlns:a="http://schemas.openxmlformats.org/drawingml/2006/main" xmlns:pic="http://schemas.openxmlformats.org/drawingml/2006/picture">
+            <wp:extent cx="5669280" cy="2990267"/>
+            <wp:docPr id="15" name="Evidence image 15" descr="Annotated absent-local message and null display controls"/>
+            <wp:cNvGraphicFramePr>
+              <a:graphicFrameLocks noChangeAspect="1"/>
+            </wp:cNvGraphicFramePr>
+            <a:graphic>
+              <a:graphicData uri="http://schemas.openxmlformats.org/drawingml/2006/picture">
+                <pic:pic>
+                  <pic:nvPicPr>
+                    <pic:cNvPr id="16" name="Evidence image 16.png" descr="Annotated absent-local message and null display controls"/>
+                    <pic:cNvPicPr/>
+                  </pic:nvPicPr>
+                  <pic:blipFill>
+                    <a:blip r:embed="rId39"/>
+                    <a:stretch>
+                      <a:fillRect/>
+                    </a:stretch>
+                  </pic:blipFill>
+                  <pic:spPr>
+                    <a:xfrm>
+                      <a:off x="0" y="0"/>
+                      <a:ext cx="5669280" cy="2990267"/>
+                    </a:xfrm>
+                    <a:prstGeom prst="rect"/>
+                  </pic:spPr>
+                </pic:pic>
+              </a:graphicData>
+            </a:graphic>
+          </wp:inline>
+        </w:drawing>
+      </w:r>
+    </w:p>
+    <w:p>
+      <w:pPr>
+        <w:pStyle w:val="Caption"/>
+      </w:pPr>
+      <w:r>
+        <w:t>Live optional/deleted-local control before the 13:15 cutoff. The genuine message says defined=False while the values show null. Local SDK verification was confirmed separately at 13:16:33.</w:t>
+      </w:r>
+    </w:p>
+    <w:p>
+      <w:pPr>
+        <w:pStyle w:val="Normal"/>
+      </w:pPr>
+      <w:hyperlink r:id="rId40">
+        <w:r>
+          <w:rPr>
+            <w:color w:val="164F80"/>
+          </w:rPr>
+          <w:t>Full-size evidence, exact offline command, assertions and measured source hashes</w:t>
+        </w:r>
+      </w:hyperlink>
+    </w:p>
+    <w:p>
+      <w:pPr>
+        <w:pStyle w:val="Normal"/>
+      </w:pPr>
+      <w:r>
+        <w:t>Verified with actual ddtrace 4.11.0 on local Python 3.13.5. Both helper files match official version-tagged source byte-for-byte. Collection enumerates compiled names and uses a locals lookup whose missing default is None; the capture helper gives None its null representation.</w:t>
+      </w:r>
+    </w:p>
+    <w:p>
+      <w:pPr>
+        <w:pStyle w:val="Normal"/>
+      </w:pPr>
+      <w:r>
+        <w:t>Scope: three live UI contexts corroborate the discrepancy, with assigned 42/404 controls. The hosted transport payload was not inspected. This is a proven package behavior, not a UI-only attribution or a claim about every language/version. The local patch version does not establish the hosted patch.</w:t>
+      </w:r>
+    </w:p>
+    <w:p>
+      <w:pPr>
+        <w:pStyle w:val="Normal"/>
+      </w:pPr>
+      <w:r>
+        <w:t>Reproduction: tracing/telemetry/RC and related products were disabled in a clean environment; a pre-import audit guard reported zero blocked network/subprocess attempts. Source hashes cover two helpers, not a whole distribution. Preserve absence before serialization or provide a distinct unavailable marker.</w:t>
+      </w:r>
+    </w:p>
+    <w:tbl>
+      <w:tblPr>
+        <w:tblW w:type="auto" w:w="0"/>
+        <w:jc w:val="center"/>
+        <w:tblLayout w:type="fixed"/>
+        <w:tblLook w:firstColumn="1" w:firstRow="1" w:lastColumn="0" w:lastRow="0" w:noHBand="0" w:noVBand="1" w:val="04A0"/>
+        <w:tblBorders>
+          <w:top w:val="single" w:sz="4" w:color="D9D9D9"/>
+          <w:left w:val="single" w:sz="4" w:color="D9D9D9"/>
+          <w:bottom w:val="single" w:sz="4" w:color="D9D9D9"/>
+          <w:right w:val="single" w:sz="4" w:color="D9D9D9"/>
+          <w:insideH w:val="single" w:sz="4" w:color="D9D9D9"/>
+          <w:insideV w:val="single" w:sz="4" w:color="D9D9D9"/>
+        </w:tblBorders>
+      </w:tblPr>
+      <w:tblGrid>
+        <w:gridCol w:w="1656"/>
+        <w:gridCol w:w="8568"/>
+      </w:tblGrid>
+      <w:tr>
+        <w:trPr>
+          <w:tblHeader/>
+          <w:cantSplit/>
+        </w:trPr>
+        <w:tc>
+          <w:tcPr>
+            <w:tcW w:type="dxa" w:w="1656"/>
+            <w:vAlign w:val="center"/>
+            <w:tcMar>
+              <w:top w:w="85" w:type="dxa"/>
+              <w:left w:w="85" w:type="dxa"/>
+              <w:bottom w:w="85" w:type="dxa"/>
+              <w:right w:w="85" w:type="dxa"/>
+            </w:tcMar>
+            <w:shd w:fill="24384B"/>
+          </w:tcPr>
+          <w:p>
+            <w:pPr>
+              <w:spacing w:after="20" w:before="20" w:line="240" w:lineRule="auto"/>
+            </w:pPr>
+            <w:r>
+              <w:rPr>
+                <w:b/>
+                <w:color w:val="FFFFFF"/>
+                <w:sz w:val="18"/>
+              </w:rPr>
+              <w:t>Measured helper</w:t>
+            </w:r>
+          </w:p>
+        </w:tc>
+        <w:tc>
+          <w:tcPr>
+            <w:tcW w:type="dxa" w:w="8568"/>
+            <w:vAlign w:val="center"/>
+            <w:tcMar>
+              <w:top w:w="85" w:type="dxa"/>
+              <w:left w:w="85" w:type="dxa"/>
+              <w:bottom w:w="85" w:type="dxa"/>
+              <w:right w:w="85" w:type="dxa"/>
+            </w:tcMar>
+            <w:shd w:fill="24384B"/>
+          </w:tcPr>
+          <w:p>
+            <w:pPr>
+              <w:spacing w:after="20" w:before="20" w:line="240" w:lineRule="auto"/>
+            </w:pPr>
+            <w:r>
+              <w:rPr>
+                <w:b/>
+                <w:color w:val="FFFFFF"/>
+                <w:sz w:val="18"/>
+              </w:rPr>
+              <w:t>SHA256 of installed and official file</w:t>
+            </w:r>
+          </w:p>
+        </w:tc>
+      </w:tr>
+      <w:tr>
+        <w:trPr>
+          <w:cantSplit/>
+        </w:trPr>
+        <w:tc>
+          <w:tcPr>
+            <w:tcW w:type="dxa" w:w="1656"/>
+            <w:vAlign w:val="center"/>
+            <w:tcMar>
+              <w:top w:w="85" w:type="dxa"/>
+              <w:left w:w="85" w:type="dxa"/>
+              <w:bottom w:w="85" w:type="dxa"/>
+              <w:right w:w="85" w:type="dxa"/>
+            </w:tcMar>
+            <w:shd w:fill="FFFFFF"/>
+          </w:tcPr>
+          <w:p>
+            <w:pPr>
+              <w:spacing w:after="20" w:before="20" w:line="240" w:lineRule="auto"/>
+            </w:pPr>
+            <w:r>
+              <w:rPr>
+                <w:b w:val="0"/>
+                <w:color w:val="000000"/>
+                <w:sz w:val="18"/>
+              </w:rPr>
+              <w:t>safety helper</w:t>
+            </w:r>
+          </w:p>
+        </w:tc>
+        <w:tc>
+          <w:tcPr>
+            <w:tcW w:type="dxa" w:w="8568"/>
+            <w:vAlign w:val="center"/>
+            <w:tcMar>
+              <w:top w:w="85" w:type="dxa"/>
+              <w:left w:w="85" w:type="dxa"/>
+              <w:bottom w:w="85" w:type="dxa"/>
+              <w:right w:w="85" w:type="dxa"/>
+            </w:tcMar>
+            <w:shd w:fill="FFFFFF"/>
+          </w:tcPr>
+          <w:p>
+            <w:pPr>
+              <w:spacing w:after="20" w:before="20" w:line="240" w:lineRule="auto"/>
+            </w:pPr>
+            <w:r>
+              <w:rPr>
+                <w:b w:val="0"/>
+                <w:color w:val="000000"/>
+                <w:sz w:val="18"/>
+              </w:rPr>
+              <w:t>b143433011976416337413e53be18921be0a8c625c8339b1aa3604b5b00ec4ff</w:t>
+            </w:r>
+          </w:p>
+        </w:tc>
+      </w:tr>
+      <w:tr>
+        <w:trPr>
+          <w:cantSplit/>
+        </w:trPr>
+        <w:tc>
+          <w:tcPr>
+            <w:tcW w:type="dxa" w:w="1656"/>
+            <w:vAlign w:val="center"/>
+            <w:tcMar>
+              <w:top w:w="85" w:type="dxa"/>
+              <w:left w:w="85" w:type="dxa"/>
+              <w:bottom w:w="85" w:type="dxa"/>
+              <w:right w:w="85" w:type="dxa"/>
+            </w:tcMar>
+            <w:shd w:fill="F3F5F7"/>
+          </w:tcPr>
+          <w:p>
+            <w:pPr>
+              <w:spacing w:after="20" w:before="20" w:line="240" w:lineRule="auto"/>
+            </w:pPr>
+            <w:r>
+              <w:rPr>
+                <w:b w:val="0"/>
+                <w:color w:val="000000"/>
+                <w:sz w:val="18"/>
+              </w:rPr>
+              <w:t>capture helper</w:t>
+            </w:r>
+          </w:p>
+        </w:tc>
+        <w:tc>
+          <w:tcPr>
+            <w:tcW w:type="dxa" w:w="8568"/>
+            <w:vAlign w:val="center"/>
+            <w:tcMar>
+              <w:top w:w="85" w:type="dxa"/>
+              <w:left w:w="85" w:type="dxa"/>
+              <w:bottom w:w="85" w:type="dxa"/>
+              <w:right w:w="85" w:type="dxa"/>
+            </w:tcMar>
+            <w:shd w:fill="F3F5F7"/>
+          </w:tcPr>
+          <w:p>
+            <w:pPr>
+              <w:spacing w:after="20" w:before="20" w:line="240" w:lineRule="auto"/>
+            </w:pPr>
+            <w:r>
+              <w:rPr>
+                <w:b w:val="0"/>
+                <w:color w:val="000000"/>
+                <w:sz w:val="18"/>
+              </w:rPr>
+              <w:t>a952f392c6b4dd1e1484622941cef12ab4a485024cf873a1b789d7e801f51cb6</w:t>
+            </w:r>
+          </w:p>
+        </w:tc>
+      </w:tr>
+    </w:tbl>
+    <w:p>
+      <w:pPr>
+        <w:pStyle w:val="Normal"/>
+      </w:pPr>
+      <w:hyperlink r:id="rId41">
+        <w:r>
+          <w:rPr>
+            <w:color w:val="164F80"/>
+          </w:rPr>
+          <w:t>Official collection source</w:t>
+        </w:r>
+      </w:hyperlink>
+      <w:r>
+        <w:t xml:space="preserve">  ·  </w:t>
+      </w:r>
+      <w:hyperlink r:id="rId42">
+        <w:r>
+          <w:rPr>
+            <w:color w:val="164F80"/>
+          </w:rPr>
+          <w:t>Official null serialization source</w:t>
+        </w:r>
+      </w:hyperlink>
+    </w:p>
+    <w:p>
       <w:r>
         <w:br w:type="page"/>
       </w:r>
@@ -5552,7 +6210,7 @@
           <w:b w:val="0"/>
           <w:sz w:val="18"/>
         </w:rPr>
-        <w:t>The early clips cover signup and first-run UI only. Source 11 now adds real session creation, captured values and repair preparation; its highlight is 3:32.80. The successful GitHub callback is screenshot-only. Source 12 adds numeric/source/predicate and expiry evidence, with recorded foreground limits. The video catalog gives exact intervals, omissions and availability; highlights overlap their archives.</w:t>
+        <w:t>Sources 01–12 have reviewed archives. The source 12 highlights and the nine-finding web checkpoint are publicly verified at commit 9edb46e. Source 13 was finalized after the live cutoff; its motion review is ongoing. Genuine stills and rendered-UI observations support later findings. Missing foreground transitions are not reconstructed; the video catalog states availability and limits.</w:t>
       </w:r>
     </w:p>
     <w:p>
@@ -8389,7 +9047,7 @@
         <w:rPr>
           <w:b w:val="0"/>
         </w:rPr>
-        <w:t>The additional runtime approval has been received. Hosted Agent authorization and debugger SDK registration are verified, and F01 captures the numeric oracle. After a controlled A-only reinstall, S02 retrieves and follows the exact deployed source. The original session expired with preserved history and a continuing later control; timing is bounded rather than instantaneous. Remaining access identities and fixture variants are separate prerequisites.</w:t>
+        <w:t>G1/G2 support actual baseline capture and source matching. The extra synthetic runtime also supports redaction, complex-value and sampled-overlap checks. Expiry, explicit resume/stop and child/session hierarchy controls have executed. Case-specific access identities, repository boundaries, metadata/deployment and failure-injection variants remain separate prerequisites.</w:t>
       </w:r>
     </w:p>
     <w:tbl>
@@ -8691,7 +9349,7 @@
                 <w:color w:val="000000"/>
                 <w:sz w:val="18"/>
               </w:rPr>
-              <w:t>Additional controlled fixture/deployment/restart/failure variants must be deployed and actually exercised. Offline preparation is not a product test.</w:t>
+              <w:t>G4 is partly met: the extra synthetic fixture produced redaction, complex-value and overlapping-request captures. Other isolated deployment, failure-injection and metadata variants still need their specific setup and execution.</w:t>
             </w:r>
           </w:p>
         </w:tc>
@@ -8774,7 +9432,7 @@
         <w:rPr>
           <w:b w:val="0"/>
         </w:rPr>
-        <w:t>Complete manual stop/re-enable and other lifecycle variants after the verified expiry. Complete the never-granted B boundary and other prerequisite-matched cases. Reconcile active sessions, bounded runtime jobs, retained grants and settings under C01–C02. New optional variants remain separate from the original 63 cases.</w:t>
+        <w:t>Finish the never-granted B boundary and case-specific identity/deployment controls. Complete remaining stale-state, entry-context, filtering and value-depth branches. Reconcile final sessions, bounded runtime jobs, retained grants and settings under C01–C02. Optional variants do not expand the original 63-case denominator.</w:t>
       </w:r>
     </w:p>
     <w:p>
@@ -8790,7 +9448,7 @@
         <w:rPr>
           <w:b w:val="0"/>
         </w:rPr>
-        <w:t>The original no-session/no-App-grant inventory is historical. The original baseline session is expired; control and experimental sessions remain intentional QA assets. The runtime continuation is healthy after handover. The integration remains A-only and B is ungranted. Accounts, synthetic repositories and durable recovery assets remain test assets. Final disable and resource/settings reconciliation remain open.</w:t>
+        <w:t>At the 13:15 cutoff, the hierarchy-test session was stopped and its observed children disabled. At 13:17:59, the later My sessions view showed All 4 / Active 0 / Inactive 4. This is not an account-wide inventory or proof of runtime shutdown. The A-only integration, synthetic repositories and durable evidence remain audit assets; final settings/resource reconciliation is open.</w:t>
       </w:r>
     </w:p>
     <w:p>
@@ -8804,7 +9462,7 @@
           <w:b w:val="0"/>
           <w:sz w:val="18"/>
         </w:rPr>
-        <w:t>63 CASES  |  10 PASS  |  5 FINDING  |  19 OPEN  |  29 BLOCKED</w:t>
+        <w:t>63 CASES  |  16 PASS  |  7 FINDING  |  16 OPEN  |  24 BLOCKED</w:t>
       </w:r>
     </w:p>
     <w:p>
@@ -9703,7 +10361,7 @@
           <w:b w:val="0"/>
           <w:sz w:val="18"/>
         </w:rPr>
-        <w:t>63 CASES  |  10 PASS  |  5 FINDING  |  19 OPEN  |  29 BLOCKED</w:t>
+        <w:t>63 CASES  |  16 PASS  |  7 FINDING  |  16 OPEN  |  24 BLOCKED</w:t>
       </w:r>
     </w:p>
     <w:p>
@@ -9904,7 +10562,7 @@
                 <w:color w:val="000000"/>
                 <w:sz w:val="18"/>
               </w:rPr>
-              <w:t>Expiry/history were observed; manual stop and full session/list guidance still need completion.</w:t>
+              <w:t>Stop/resume and hierarchy controls are verified; full list-view and service-wide guidance branches remain incomplete.</w:t>
             </w:r>
           </w:p>
         </w:tc>
@@ -10210,7 +10868,7 @@
                 <w:color w:val="000000"/>
                 <w:sz w:val="18"/>
               </w:rPr>
-              <w:t>PENDING</w:t>
+              <w:t>FINDING</w:t>
             </w:r>
           </w:p>
         </w:tc>
@@ -10236,7 +10894,7 @@
                 <w:color w:val="000000"/>
                 <w:sz w:val="18"/>
               </w:rPr>
-              <w:t>Earlier draft subchecks are preserved; the remaining runtime or saved-entity requirements are pending.</w:t>
+              <w:t>Invalid conditions/template were rejected and valid corrections worked. Existing UX03 feedback issue is retained.</w:t>
             </w:r>
           </w:p>
         </w:tc>
@@ -10293,7 +10951,7 @@
                 <w:color w:val="000000"/>
                 <w:sz w:val="18"/>
               </w:rPr>
-              <w:t>PENDING</w:t>
+              <w:t>PASS</w:t>
             </w:r>
           </w:p>
         </w:tc>
@@ -10319,7 +10977,7 @@
                 <w:color w:val="000000"/>
                 <w:sz w:val="18"/>
               </w:rPr>
-              <w:t>Working baseline is available; remaining original steps are not yet executed.</w:t>
+              <w:t>Missing expression error, absent isDefined=False and available-local True controls passed; distinct from FUNC02.</w:t>
             </w:r>
           </w:p>
         </w:tc>
@@ -10459,7 +11117,7 @@
                 <w:color w:val="000000"/>
                 <w:sz w:val="18"/>
               </w:rPr>
-              <w:t>PENDING</w:t>
+              <w:t>IN PROGRESS</w:t>
             </w:r>
           </w:p>
         </w:tc>
@@ -10485,7 +11143,7 @@
                 <w:color w:val="000000"/>
                 <w:sz w:val="18"/>
               </w:rPr>
-              <w:t>Earlier draft subchecks are preserved; the remaining runtime or saved-entity requirements are pending.</w:t>
+              <w:t>Function-exit @return and explicit line-context error verified. Entry mode remains untested.</w:t>
             </w:r>
           </w:p>
         </w:tc>
@@ -10602,7 +11260,7 @@
           <w:b w:val="0"/>
           <w:sz w:val="18"/>
         </w:rPr>
-        <w:t>63 CASES  |  10 PASS  |  5 FINDING  |  19 OPEN  |  29 BLOCKED</w:t>
+        <w:t>63 CASES  |  16 PASS  |  7 FINDING  |  16 OPEN  |  24 BLOCKED</w:t>
       </w:r>
     </w:p>
     <w:p>
@@ -10777,7 +11435,7 @@
                 <w:color w:val="000000"/>
                 <w:sz w:val="18"/>
               </w:rPr>
-              <w:t>PENDING</w:t>
+              <w:t>FINDING</w:t>
             </w:r>
           </w:p>
         </w:tc>
@@ -10803,7 +11461,7 @@
                 <w:color w:val="000000"/>
                 <w:sz w:val="18"/>
               </w:rPr>
-              <w:t>Working baseline is available; remaining original steps are not yet executed.</w:t>
+              <w:t>FUNC01: another tab’s message-only save twice erased an unsaved condition. Saved-write branches remain untested.</w:t>
             </w:r>
           </w:p>
         </w:tc>
@@ -10860,7 +11518,7 @@
                 <w:color w:val="000000"/>
                 <w:sz w:val="18"/>
               </w:rPr>
-              <w:t>PENDING</w:t>
+              <w:t>IN PROGRESS</w:t>
             </w:r>
           </w:p>
         </w:tc>
@@ -10886,7 +11544,7 @@
                 <w:color w:val="000000"/>
                 <w:sz w:val="18"/>
               </w:rPr>
-              <w:t>Working baseline is available; remaining original steps are not yet executed.</w:t>
+              <w:t>Individual disabled-draft Apply resumed capture. Session-level stale branch/cleanup and feedback contract remain partial.</w:t>
             </w:r>
           </w:p>
         </w:tc>
@@ -11026,7 +11684,7 @@
                 <w:color w:val="000000"/>
                 <w:sz w:val="18"/>
               </w:rPr>
-              <w:t>PENDING</w:t>
+              <w:t>PASS</w:t>
             </w:r>
           </w:p>
         </w:tc>
@@ -11052,7 +11710,7 @@
                 <w:color w:val="000000"/>
                 <w:sz w:val="18"/>
               </w:rPr>
-              <w:t>Working baseline is available; remaining original steps are not yet executed.</w:t>
+              <w:t>Explicit resume preserved IDs, renewed one hour and produced a fresh SDK-timestamped capture; stopped again.</w:t>
             </w:r>
           </w:p>
         </w:tc>
@@ -11109,7 +11767,7 @@
                 <w:color w:val="000000"/>
                 <w:sz w:val="18"/>
               </w:rPr>
-              <w:t>PENDING</w:t>
+              <w:t>PASS</w:t>
             </w:r>
           </w:p>
         </w:tc>
@@ -11135,7 +11793,7 @@
                 <w:color w:val="000000"/>
                 <w:sz w:val="18"/>
               </w:rPr>
-              <w:t>Working baseline is available; remaining original steps are not yet executed.</w:t>
+              <w:t>Child disable preserved siblings; whole-session stop, child-only enable/capture and final session stop passed.</w:t>
             </w:r>
           </w:p>
         </w:tc>
@@ -11358,7 +12016,7 @@
                 <w:color w:val="000000"/>
                 <w:sz w:val="18"/>
               </w:rPr>
-              <w:t>PENDING</w:t>
+              <w:t>PASS</w:t>
             </w:r>
           </w:p>
         </w:tc>
@@ -11384,7 +12042,7 @@
                 <w:color w:val="000000"/>
                 <w:sz w:val="18"/>
               </w:rPr>
-              <w:t>Working baseline is available; remaining original steps are not yet executed.</w:t>
+              <w:t>New capture-off events were message-only; old event stayed OUTDATED after re-enable and future locals returned.</w:t>
             </w:r>
           </w:p>
         </w:tc>
@@ -11501,7 +12159,7 @@
           <w:b w:val="0"/>
           <w:sz w:val="18"/>
         </w:rPr>
-        <w:t>63 CASES  |  10 PASS  |  5 FINDING  |  19 OPEN  |  29 BLOCKED</w:t>
+        <w:t>63 CASES  |  16 PASS  |  7 FINDING  |  16 OPEN  |  24 BLOCKED</w:t>
       </w:r>
     </w:p>
     <w:p>
@@ -11925,7 +12583,7 @@
                 <w:color w:val="000000"/>
                 <w:sz w:val="18"/>
               </w:rPr>
-              <w:t>BLOCKED</w:t>
+              <w:t>PASS</w:t>
             </w:r>
           </w:p>
         </w:tc>
@@ -11951,7 +12609,7 @@
                 <w:color w:val="000000"/>
                 <w:sz w:val="18"/>
               </w:rPr>
-              <w:t>Additional controlled fixture/deployment variant is not yet exercised: approved synthetic redaction fixture.</w:t>
+              <w:t>Numeric/bool/harmless text visible; dummy sensitive names had explicit name-based redaction. Protection unchanged.</w:t>
             </w:r>
           </w:p>
         </w:tc>
@@ -12008,7 +12666,7 @@
                 <w:color w:val="000000"/>
                 <w:sz w:val="18"/>
               </w:rPr>
-              <w:t>BLOCKED</w:t>
+              <w:t>IN PROGRESS</w:t>
             </w:r>
           </w:p>
         </w:tc>
@@ -12034,7 +12692,7 @@
                 <w:color w:val="000000"/>
                 <w:sz w:val="18"/>
               </w:rPr>
-              <w:t>Additional controlled fixture/deployment variant is not yet exercised: small extra fixture permitted.</w:t>
+              <w:t>Typed empties and nested values observed; long-string/search and exact cycle/depth handling remain incomplete.</w:t>
             </w:r>
           </w:p>
         </w:tc>
@@ -12400,7 +13058,7 @@
           <w:b w:val="0"/>
           <w:sz w:val="18"/>
         </w:rPr>
-        <w:t>63 CASES  |  10 PASS  |  5 FINDING  |  19 OPEN  |  29 BLOCKED</w:t>
+        <w:t>63 CASES  |  16 PASS  |  7 FINDING  |  16 OPEN  |  24 BLOCKED</w:t>
       </w:r>
     </w:p>
     <w:p>
@@ -13299,7 +13957,7 @@
           <w:b w:val="0"/>
           <w:sz w:val="18"/>
         </w:rPr>
-        <w:t>63 CASES  |  10 PASS  |  5 FINDING  |  19 OPEN  |  29 BLOCKED</w:t>
+        <w:t>63 CASES  |  16 PASS  |  7 FINDING  |  16 OPEN  |  24 BLOCKED</w:t>
       </w:r>
     </w:p>
     <w:p>
@@ -13998,7 +14656,7 @@
                 <w:color w:val="000000"/>
                 <w:sz w:val="18"/>
               </w:rPr>
-              <w:t>Intentional test sessions are active. Final disable, direct-link and continued-traffic checks remain open.</w:t>
+              <w:t>Observed hierarchy session was stopped at cutoff. Full inventory/behavior reconciliation remains incomplete.</w:t>
             </w:r>
           </w:p>
         </w:tc>
@@ -14081,7 +14739,7 @@
                 <w:color w:val="000000"/>
                 <w:sz w:val="18"/>
               </w:rPr>
-              <w:t>Hosted runtime, A-only grant and retained fixtures are tracked; final resources/settings reconciliation remains open.</w:t>
+              <w:t>Bounded runtime, A-only grant and retained assets are tracked; full resources/settings reconciliation remains open.</w:t>
             </w:r>
           </w:p>
         </w:tc>
@@ -14198,7 +14856,7 @@
           <w:b w:val="0"/>
           <w:sz w:val="18"/>
         </w:rPr>
-        <w:t>63 CASES  |  10 PASS  |  5 FINDING  |  19 OPEN  |  29 BLOCKED</w:t>
+        <w:t>63 CASES  |  16 PASS  |  7 FINDING  |  16 OPEN  |  24 BLOCKED</w:t>
       </w:r>
     </w:p>
     <w:p>
@@ -14539,7 +15197,7 @@
                 <w:color w:val="000000"/>
                 <w:sz w:val="18"/>
               </w:rPr>
-              <w:t>BLOCKED</w:t>
+              <w:t>IN PROGRESS</w:t>
             </w:r>
           </w:p>
         </w:tc>
@@ -14565,7 +15223,7 @@
                 <w:color w:val="000000"/>
                 <w:sz w:val="18"/>
               </w:rPr>
-              <w:t>Additional controlled fixture/deployment variant is not yet exercised: one healthy function that is never called and one controlled failed installation.</w:t>
+              <w:t>Never-called target waited with zero events while siblings captured; final healthy trigger remains untested.</w:t>
             </w:r>
           </w:p>
         </w:tc>
@@ -14788,7 +15446,7 @@
                 <w:color w:val="000000"/>
                 <w:sz w:val="18"/>
               </w:rPr>
-              <w:t>BLOCKED</w:t>
+              <w:t>PASS</w:t>
             </w:r>
           </w:p>
         </w:tc>
@@ -14814,7 +15472,7 @@
                 <w:color w:val="000000"/>
                 <w:sz w:val="18"/>
               </w:rPr>
-              <w:t>Additional controlled fixture/deployment variant is not yet exercised: approved tiny async fixture variant.</w:t>
+              <w:t>Two sampled overlapping-request members matched locals, trace context and source links; not a complete captured pair.</w:t>
             </w:r>
           </w:p>
         </w:tc>
@@ -14871,7 +15529,7 @@
                 <w:color w:val="000000"/>
                 <w:sz w:val="18"/>
               </w:rPr>
-              <w:t>BLOCKED</w:t>
+              <w:t>IN PROGRESS</w:t>
             </w:r>
           </w:p>
         </w:tc>
@@ -14897,7 +15555,7 @@
                 <w:color w:val="000000"/>
                 <w:sz w:val="18"/>
               </w:rPr>
-              <w:t>Additional controlled fixture/deployment variant is not yet exercised: approved small synthetic data fixture.</w:t>
+              <w:t>Unicode/duplicate-leaf observations and redaction controls exist; nested-sensitive/cycle boundaries remain partial.</w:t>
             </w:r>
           </w:p>
         </w:tc>
@@ -17579,7 +18237,7 @@
         <w:pStyle w:val="Normal"/>
       </w:pPr>
       <w:r>
-        <w:t>SCI01 now has a verified recovery path; its original interrupted-state failure remains scoped. The possible relationship between a template Apply and the revised countdown remains untested. Expiry is verified by screenshots/rendered UI and payload times; the desktop video does not show the active-to-expired transition; it retains an already-expired after-state. B boundaries and remaining lifecycle/functional cases continue.</w:t>
+        <w:t>SCI01 has a verified same-scope repair. Source 12 expiry is supported by separate screenshots/rendered UI and payload times; its movie shows an already-expired after-state rather than the active-to-expired transition. Explicit resume/stop and child/session controls later passed. The never-granted B boundary and remaining functional variants continue.</w:t>
       </w:r>
     </w:p>
     <w:p>
@@ -17611,7 +18269,7 @@
         <w:pStyle w:val="Normal"/>
       </w:pPr>
       <w:r>
-        <w:t>U36–U42 complete the 42-check supplemental inventory. They do not add original cases or imply that every parent-case requirement passed.</w:t>
+        <w:t>U36–U42 retain their earlier scopes. The online supplemental inventory now has 57 separately scoped checks, including later runtime controls and a separately dated SDK verification; they do not add original cases.</w:t>
       </w:r>
     </w:p>
     <w:tbl>
@@ -18313,7 +18971,7 @@
         <w:pStyle w:val="Normal"/>
       </w:pPr>
       <w:r>
-        <w:t>These four topics have no assigned severity and are excluded from the seven finding pages. They are retained for targeted retest, not promoted to confirmed bugs.</w:t>
+        <w:t>Five topics remain unconfirmed and are excluded from the nine findings: initial Enable logs feedback, earlier HTTP 400 guidance, countdown/child lifetimes, invalid-line marker position and disabled-draft Apply reactivation feedback. The previous null-display candidate is now the separately verified SDK finding FUNC02.</w:t>
       </w:r>
     </w:p>
     <w:p>
@@ -18353,7 +19011,7 @@
         <w:pStyle w:val="Normal"/>
       </w:pPr>
       <w:r>
-        <w:t>The Line input naming assessment remains incomplete. The earlier condition-unavailability interpretation was corrected by an ordinary click and successful predicate captures; it is not a product finding.</w:t>
+        <w:t>Applying a pre-disable draft resumed capture after both tabs showed DISABLED. General editing documentation allows modification to instrument code, but does not settle disabled-edit semantics; this remains a feedback/contract question. The Line input naming assessment is incomplete, and the earlier condition-unavailability interpretation was a corrected tooling observation, not a product finding.</w:t>
       </w:r>
     </w:p>
     <w:p>
@@ -18366,6 +19024,919 @@
             <w:color w:val="164F80"/>
           </w:rPr>
           <w:t>Full unconfirmed-observation inventory and retest boundaries</w:t>
+        </w:r>
+      </w:hyperlink>
+    </w:p>
+    <w:p>
+      <w:pPr>
+        <w:pStyle w:val="Heading1"/>
+        <w:pageBreakBefore/>
+      </w:pPr>
+      <w:bookmarkStart w:id="1121" w:name="RUNTIME9"/>
+      <w:r>
+        <w:t>Further runtime controls and remaining scope</w:t>
+      </w:r>
+      <w:bookmarkEnd w:id="1121"/>
+    </w:p>
+    <w:p>
+      <w:pPr>
+        <w:pStyle w:val="Normal"/>
+      </w:pPr>
+      <w:r>
+        <w:t>The following results extend the baseline without changing the 63 original case definitions. Complete steps, evidence links and cleanup limits remain in the online matrix. The 57-check supplemental ledger is separately scoped.</w:t>
+      </w:r>
+    </w:p>
+    <w:tbl>
+      <w:tblPr>
+        <w:tblW w:type="auto" w:w="0"/>
+        <w:jc w:val="center"/>
+        <w:tblLayout w:type="fixed"/>
+        <w:tblLook w:firstColumn="1" w:firstRow="1" w:lastColumn="0" w:lastRow="0" w:noHBand="0" w:noVBand="1" w:val="04A0"/>
+        <w:tblBorders>
+          <w:top w:val="single" w:sz="4" w:color="D9D9D9"/>
+          <w:left w:val="single" w:sz="4" w:color="D9D9D9"/>
+          <w:bottom w:val="single" w:sz="4" w:color="D9D9D9"/>
+          <w:right w:val="single" w:sz="4" w:color="D9D9D9"/>
+          <w:insideH w:val="single" w:sz="4" w:color="D9D9D9"/>
+          <w:insideV w:val="single" w:sz="4" w:color="D9D9D9"/>
+        </w:tblBorders>
+      </w:tblPr>
+      <w:tblGrid>
+        <w:gridCol w:w="2448"/>
+        <w:gridCol w:w="1440"/>
+        <w:gridCol w:w="6336"/>
+      </w:tblGrid>
+      <w:tr>
+        <w:trPr>
+          <w:tblHeader/>
+          <w:cantSplit/>
+        </w:trPr>
+        <w:tc>
+          <w:tcPr>
+            <w:tcW w:type="dxa" w:w="2448"/>
+            <w:vAlign w:val="center"/>
+            <w:tcMar>
+              <w:top w:w="85" w:type="dxa"/>
+              <w:left w:w="85" w:type="dxa"/>
+              <w:bottom w:w="85" w:type="dxa"/>
+              <w:right w:w="85" w:type="dxa"/>
+            </w:tcMar>
+            <w:shd w:fill="24384B"/>
+          </w:tcPr>
+          <w:p>
+            <w:pPr>
+              <w:spacing w:after="20" w:before="20" w:line="240" w:lineRule="auto"/>
+            </w:pPr>
+            <w:r>
+              <w:rPr>
+                <w:b/>
+                <w:color w:val="FFFFFF"/>
+                <w:sz w:val="18"/>
+              </w:rPr>
+              <w:t>Case</w:t>
+            </w:r>
+          </w:p>
+        </w:tc>
+        <w:tc>
+          <w:tcPr>
+            <w:tcW w:type="dxa" w:w="1440"/>
+            <w:vAlign w:val="center"/>
+            <w:tcMar>
+              <w:top w:w="85" w:type="dxa"/>
+              <w:left w:w="85" w:type="dxa"/>
+              <w:bottom w:w="85" w:type="dxa"/>
+              <w:right w:w="85" w:type="dxa"/>
+            </w:tcMar>
+            <w:shd w:fill="24384B"/>
+          </w:tcPr>
+          <w:p>
+            <w:pPr>
+              <w:spacing w:after="20" w:before="20" w:line="240" w:lineRule="auto"/>
+            </w:pPr>
+            <w:r>
+              <w:rPr>
+                <w:b/>
+                <w:color w:val="FFFFFF"/>
+                <w:sz w:val="18"/>
+              </w:rPr>
+              <w:t>Observed UTC</w:t>
+            </w:r>
+          </w:p>
+        </w:tc>
+        <w:tc>
+          <w:tcPr>
+            <w:tcW w:type="dxa" w:w="6336"/>
+            <w:vAlign w:val="center"/>
+            <w:tcMar>
+              <w:top w:w="85" w:type="dxa"/>
+              <w:left w:w="85" w:type="dxa"/>
+              <w:bottom w:w="85" w:type="dxa"/>
+              <w:right w:w="85" w:type="dxa"/>
+            </w:tcMar>
+            <w:shd w:fill="24384B"/>
+          </w:tcPr>
+          <w:p>
+            <w:pPr>
+              <w:spacing w:after="20" w:before="20" w:line="240" w:lineRule="auto"/>
+            </w:pPr>
+            <w:r>
+              <w:rPr>
+                <w:b/>
+                <w:color w:val="FFFFFF"/>
+                <w:sz w:val="18"/>
+              </w:rPr>
+              <w:t>Executed scope</w:t>
+            </w:r>
+          </w:p>
+        </w:tc>
+      </w:tr>
+      <w:tr>
+        <w:trPr>
+          <w:cantSplit/>
+        </w:trPr>
+        <w:tc>
+          <w:tcPr>
+            <w:tcW w:type="dxa" w:w="2448"/>
+            <w:vAlign w:val="center"/>
+            <w:tcMar>
+              <w:top w:w="85" w:type="dxa"/>
+              <w:left w:w="85" w:type="dxa"/>
+              <w:bottom w:w="85" w:type="dxa"/>
+              <w:right w:w="85" w:type="dxa"/>
+            </w:tcMar>
+            <w:shd w:fill="FFFFFF"/>
+          </w:tcPr>
+          <w:p>
+            <w:pPr>
+              <w:spacing w:after="20" w:before="20" w:line="240" w:lineRule="auto"/>
+            </w:pPr>
+            <w:r>
+              <w:rPr>
+                <w:b w:val="0"/>
+                <w:color w:val="000000"/>
+                <w:sz w:val="18"/>
+              </w:rPr>
+              <w:t>F04</w:t>
+            </w:r>
+          </w:p>
+        </w:tc>
+        <w:tc>
+          <w:tcPr>
+            <w:tcW w:type="dxa" w:w="1440"/>
+            <w:vAlign w:val="center"/>
+            <w:tcMar>
+              <w:top w:w="85" w:type="dxa"/>
+              <w:left w:w="85" w:type="dxa"/>
+              <w:bottom w:w="85" w:type="dxa"/>
+              <w:right w:w="85" w:type="dxa"/>
+            </w:tcMar>
+            <w:shd w:fill="FFFFFF"/>
+          </w:tcPr>
+          <w:p>
+            <w:pPr>
+              <w:spacing w:after="20" w:before="20" w:line="240" w:lineRule="auto"/>
+            </w:pPr>
+            <w:r>
+              <w:rPr>
+                <w:b w:val="0"/>
+                <w:color w:val="000000"/>
+                <w:sz w:val="18"/>
+              </w:rPr>
+              <w:t>11:34–11:36</w:t>
+            </w:r>
+          </w:p>
+        </w:tc>
+        <w:tc>
+          <w:tcPr>
+            <w:tcW w:type="dxa" w:w="6336"/>
+            <w:vAlign w:val="center"/>
+            <w:tcMar>
+              <w:top w:w="85" w:type="dxa"/>
+              <w:left w:w="85" w:type="dxa"/>
+              <w:bottom w:w="85" w:type="dxa"/>
+              <w:right w:w="85" w:type="dxa"/>
+            </w:tcMar>
+            <w:shd w:fill="FFFFFF"/>
+          </w:tcPr>
+          <w:p>
+            <w:pPr>
+              <w:spacing w:after="20" w:before="20" w:line="240" w:lineRule="auto"/>
+            </w:pPr>
+            <w:r>
+              <w:rPr>
+                <w:b w:val="0"/>
+                <w:color w:val="000000"/>
+                <w:sz w:val="18"/>
+              </w:rPr>
+              <w:t>Invalid and non-Boolean predicates rejected; valid quantity 2 correction captured. Existing template-feedback finding retained.</w:t>
+            </w:r>
+          </w:p>
+        </w:tc>
+      </w:tr>
+      <w:tr>
+        <w:trPr>
+          <w:cantSplit/>
+        </w:trPr>
+        <w:tc>
+          <w:tcPr>
+            <w:tcW w:type="dxa" w:w="2448"/>
+            <w:vAlign w:val="center"/>
+            <w:tcMar>
+              <w:top w:w="85" w:type="dxa"/>
+              <w:left w:w="85" w:type="dxa"/>
+              <w:bottom w:w="85" w:type="dxa"/>
+              <w:right w:w="85" w:type="dxa"/>
+            </w:tcMar>
+            <w:shd w:fill="F3F5F7"/>
+          </w:tcPr>
+          <w:p>
+            <w:pPr>
+              <w:spacing w:after="20" w:before="20" w:line="240" w:lineRule="auto"/>
+            </w:pPr>
+            <w:r>
+              <w:rPr>
+                <w:b w:val="0"/>
+                <w:color w:val="000000"/>
+                <w:sz w:val="18"/>
+              </w:rPr>
+              <w:t>F05</w:t>
+            </w:r>
+          </w:p>
+        </w:tc>
+        <w:tc>
+          <w:tcPr>
+            <w:tcW w:type="dxa" w:w="1440"/>
+            <w:vAlign w:val="center"/>
+            <w:tcMar>
+              <w:top w:w="85" w:type="dxa"/>
+              <w:left w:w="85" w:type="dxa"/>
+              <w:bottom w:w="85" w:type="dxa"/>
+              <w:right w:w="85" w:type="dxa"/>
+            </w:tcMar>
+            <w:shd w:fill="F3F5F7"/>
+          </w:tcPr>
+          <w:p>
+            <w:pPr>
+              <w:spacing w:after="20" w:before="20" w:line="240" w:lineRule="auto"/>
+            </w:pPr>
+            <w:r>
+              <w:rPr>
+                <w:b w:val="0"/>
+                <w:color w:val="000000"/>
+                <w:sz w:val="18"/>
+              </w:rPr>
+              <w:t>11:38–11:40</w:t>
+            </w:r>
+          </w:p>
+        </w:tc>
+        <w:tc>
+          <w:tcPr>
+            <w:tcW w:type="dxa" w:w="6336"/>
+            <w:vAlign w:val="center"/>
+            <w:tcMar>
+              <w:top w:w="85" w:type="dxa"/>
+              <w:left w:w="85" w:type="dxa"/>
+              <w:bottom w:w="85" w:type="dxa"/>
+              <w:right w:w="85" w:type="dxa"/>
+            </w:tcMar>
+            <w:shd w:fill="F3F5F7"/>
+          </w:tcPr>
+          <w:p>
+            <w:pPr>
+              <w:spacing w:after="20" w:before="20" w:line="240" w:lineRule="auto"/>
+            </w:pPr>
+            <w:r>
+              <w:rPr>
+                <w:b w:val="0"/>
+                <w:color w:val="000000"/>
+                <w:sz w:val="18"/>
+              </w:rPr>
+              <w:t>Missing expression error and absent/present definedness controls distinguished.</w:t>
+            </w:r>
+          </w:p>
+        </w:tc>
+      </w:tr>
+      <w:tr>
+        <w:trPr>
+          <w:cantSplit/>
+        </w:trPr>
+        <w:tc>
+          <w:tcPr>
+            <w:tcW w:type="dxa" w:w="2448"/>
+            <w:vAlign w:val="center"/>
+            <w:tcMar>
+              <w:top w:w="85" w:type="dxa"/>
+              <w:left w:w="85" w:type="dxa"/>
+              <w:bottom w:w="85" w:type="dxa"/>
+              <w:right w:w="85" w:type="dxa"/>
+            </w:tcMar>
+            <w:shd w:fill="FFFFFF"/>
+          </w:tcPr>
+          <w:p>
+            <w:pPr>
+              <w:spacing w:after="20" w:before="20" w:line="240" w:lineRule="auto"/>
+            </w:pPr>
+            <w:r>
+              <w:rPr>
+                <w:b w:val="0"/>
+                <w:color w:val="000000"/>
+                <w:sz w:val="18"/>
+              </w:rPr>
+              <w:t>F12</w:t>
+            </w:r>
+          </w:p>
+        </w:tc>
+        <w:tc>
+          <w:tcPr>
+            <w:tcW w:type="dxa" w:w="1440"/>
+            <w:vAlign w:val="center"/>
+            <w:tcMar>
+              <w:top w:w="85" w:type="dxa"/>
+              <w:left w:w="85" w:type="dxa"/>
+              <w:bottom w:w="85" w:type="dxa"/>
+              <w:right w:w="85" w:type="dxa"/>
+            </w:tcMar>
+            <w:shd w:fill="FFFFFF"/>
+          </w:tcPr>
+          <w:p>
+            <w:pPr>
+              <w:spacing w:after="20" w:before="20" w:line="240" w:lineRule="auto"/>
+            </w:pPr>
+            <w:r>
+              <w:rPr>
+                <w:b w:val="0"/>
+                <w:color w:val="000000"/>
+                <w:sz w:val="18"/>
+              </w:rPr>
+              <w:t>11:29–11:31</w:t>
+            </w:r>
+          </w:p>
+        </w:tc>
+        <w:tc>
+          <w:tcPr>
+            <w:tcW w:type="dxa" w:w="6336"/>
+            <w:vAlign w:val="center"/>
+            <w:tcMar>
+              <w:top w:w="85" w:type="dxa"/>
+              <w:left w:w="85" w:type="dxa"/>
+              <w:bottom w:w="85" w:type="dxa"/>
+              <w:right w:w="85" w:type="dxa"/>
+            </w:tcMar>
+            <w:shd w:fill="FFFFFF"/>
+          </w:tcPr>
+          <w:p>
+            <w:pPr>
+              <w:spacing w:after="20" w:before="20" w:line="240" w:lineRule="auto"/>
+            </w:pPr>
+            <w:r>
+              <w:rPr>
+                <w:b w:val="0"/>
+                <w:color w:val="000000"/>
+                <w:sz w:val="18"/>
+              </w:rPr>
+              <w:t>Explicit resume produced SDK execution 11:29:48.334, same IDs, then explicit stop and inactive reload.</w:t>
+            </w:r>
+          </w:p>
+        </w:tc>
+      </w:tr>
+      <w:tr>
+        <w:trPr>
+          <w:cantSplit/>
+        </w:trPr>
+        <w:tc>
+          <w:tcPr>
+            <w:tcW w:type="dxa" w:w="2448"/>
+            <w:vAlign w:val="center"/>
+            <w:tcMar>
+              <w:top w:w="85" w:type="dxa"/>
+              <w:left w:w="85" w:type="dxa"/>
+              <w:bottom w:w="85" w:type="dxa"/>
+              <w:right w:w="85" w:type="dxa"/>
+            </w:tcMar>
+            <w:shd w:fill="F3F5F7"/>
+          </w:tcPr>
+          <w:p>
+            <w:pPr>
+              <w:spacing w:after="20" w:before="20" w:line="240" w:lineRule="auto"/>
+            </w:pPr>
+            <w:r>
+              <w:rPr>
+                <w:b w:val="0"/>
+                <w:color w:val="000000"/>
+                <w:sz w:val="18"/>
+              </w:rPr>
+              <w:t>F16</w:t>
+            </w:r>
+          </w:p>
+        </w:tc>
+        <w:tc>
+          <w:tcPr>
+            <w:tcW w:type="dxa" w:w="1440"/>
+            <w:vAlign w:val="center"/>
+            <w:tcMar>
+              <w:top w:w="85" w:type="dxa"/>
+              <w:left w:w="85" w:type="dxa"/>
+              <w:bottom w:w="85" w:type="dxa"/>
+              <w:right w:w="85" w:type="dxa"/>
+            </w:tcMar>
+            <w:shd w:fill="F3F5F7"/>
+          </w:tcPr>
+          <w:p>
+            <w:pPr>
+              <w:spacing w:after="20" w:before="20" w:line="240" w:lineRule="auto"/>
+            </w:pPr>
+            <w:r>
+              <w:rPr>
+                <w:b w:val="0"/>
+                <w:color w:val="000000"/>
+                <w:sz w:val="18"/>
+              </w:rPr>
+              <w:t>11:42–11:43</w:t>
+            </w:r>
+          </w:p>
+        </w:tc>
+        <w:tc>
+          <w:tcPr>
+            <w:tcW w:type="dxa" w:w="6336"/>
+            <w:vAlign w:val="center"/>
+            <w:tcMar>
+              <w:top w:w="85" w:type="dxa"/>
+              <w:left w:w="85" w:type="dxa"/>
+              <w:bottom w:w="85" w:type="dxa"/>
+              <w:right w:w="85" w:type="dxa"/>
+            </w:tcMar>
+            <w:shd w:fill="F3F5F7"/>
+          </w:tcPr>
+          <w:p>
+            <w:pPr>
+              <w:spacing w:after="20" w:before="20" w:line="240" w:lineRule="auto"/>
+            </w:pPr>
+            <w:r>
+              <w:rPr>
+                <w:b w:val="0"/>
+                <w:color w:val="000000"/>
+                <w:sz w:val="18"/>
+              </w:rPr>
+              <w:t>Message-only new events with capture off; OUTDATED history and fresh locals after re-enable.</w:t>
+            </w:r>
+          </w:p>
+        </w:tc>
+      </w:tr>
+      <w:tr>
+        <w:trPr>
+          <w:cantSplit/>
+        </w:trPr>
+        <w:tc>
+          <w:tcPr>
+            <w:tcW w:type="dxa" w:w="2448"/>
+            <w:vAlign w:val="center"/>
+            <w:tcMar>
+              <w:top w:w="85" w:type="dxa"/>
+              <w:left w:w="85" w:type="dxa"/>
+              <w:bottom w:w="85" w:type="dxa"/>
+              <w:right w:w="85" w:type="dxa"/>
+            </w:tcMar>
+            <w:shd w:fill="FFFFFF"/>
+          </w:tcPr>
+          <w:p>
+            <w:pPr>
+              <w:spacing w:after="20" w:before="20" w:line="240" w:lineRule="auto"/>
+            </w:pPr>
+            <w:r>
+              <w:rPr>
+                <w:b w:val="0"/>
+                <w:color w:val="000000"/>
+                <w:sz w:val="18"/>
+              </w:rPr>
+              <w:t>F21</w:t>
+            </w:r>
+          </w:p>
+        </w:tc>
+        <w:tc>
+          <w:tcPr>
+            <w:tcW w:type="dxa" w:w="1440"/>
+            <w:vAlign w:val="center"/>
+            <w:tcMar>
+              <w:top w:w="85" w:type="dxa"/>
+              <w:left w:w="85" w:type="dxa"/>
+              <w:bottom w:w="85" w:type="dxa"/>
+              <w:right w:w="85" w:type="dxa"/>
+            </w:tcMar>
+            <w:shd w:fill="FFFFFF"/>
+          </w:tcPr>
+          <w:p>
+            <w:pPr>
+              <w:spacing w:after="20" w:before="20" w:line="240" w:lineRule="auto"/>
+            </w:pPr>
+            <w:r>
+              <w:rPr>
+                <w:b w:val="0"/>
+                <w:color w:val="000000"/>
+                <w:sz w:val="18"/>
+              </w:rPr>
+              <w:t>12:20–12:21</w:t>
+            </w:r>
+          </w:p>
+        </w:tc>
+        <w:tc>
+          <w:tcPr>
+            <w:tcW w:type="dxa" w:w="6336"/>
+            <w:vAlign w:val="center"/>
+            <w:tcMar>
+              <w:top w:w="85" w:type="dxa"/>
+              <w:left w:w="85" w:type="dxa"/>
+              <w:bottom w:w="85" w:type="dxa"/>
+              <w:right w:w="85" w:type="dxa"/>
+            </w:tcMar>
+            <w:shd w:fill="FFFFFF"/>
+          </w:tcPr>
+          <w:p>
+            <w:pPr>
+              <w:spacing w:after="20" w:before="20" w:line="240" w:lineRule="auto"/>
+            </w:pPr>
+            <w:r>
+              <w:rPr>
+                <w:b w:val="0"/>
+                <w:color w:val="000000"/>
+                <w:sz w:val="18"/>
+              </w:rPr>
+              <w:t>Ordinary controls visible and synthetic sensitive names explicitly redacted; mode unchanged.</w:t>
+            </w:r>
+          </w:p>
+        </w:tc>
+      </w:tr>
+      <w:tr>
+        <w:trPr>
+          <w:cantSplit/>
+        </w:trPr>
+        <w:tc>
+          <w:tcPr>
+            <w:tcW w:type="dxa" w:w="2448"/>
+            <w:vAlign w:val="center"/>
+            <w:tcMar>
+              <w:top w:w="85" w:type="dxa"/>
+              <w:left w:w="85" w:type="dxa"/>
+              <w:bottom w:w="85" w:type="dxa"/>
+              <w:right w:w="85" w:type="dxa"/>
+            </w:tcMar>
+            <w:shd w:fill="F3F5F7"/>
+          </w:tcPr>
+          <w:p>
+            <w:pPr>
+              <w:spacing w:after="20" w:before="20" w:line="240" w:lineRule="auto"/>
+            </w:pPr>
+            <w:r>
+              <w:rPr>
+                <w:b w:val="0"/>
+                <w:color w:val="000000"/>
+                <w:sz w:val="18"/>
+              </w:rPr>
+              <w:t>X06</w:t>
+            </w:r>
+          </w:p>
+        </w:tc>
+        <w:tc>
+          <w:tcPr>
+            <w:tcW w:type="dxa" w:w="1440"/>
+            <w:vAlign w:val="center"/>
+            <w:tcMar>
+              <w:top w:w="85" w:type="dxa"/>
+              <w:left w:w="85" w:type="dxa"/>
+              <w:bottom w:w="85" w:type="dxa"/>
+              <w:right w:w="85" w:type="dxa"/>
+            </w:tcMar>
+            <w:shd w:fill="F3F5F7"/>
+          </w:tcPr>
+          <w:p>
+            <w:pPr>
+              <w:spacing w:after="20" w:before="20" w:line="240" w:lineRule="auto"/>
+            </w:pPr>
+            <w:r>
+              <w:rPr>
+                <w:b w:val="0"/>
+                <w:color w:val="000000"/>
+                <w:sz w:val="18"/>
+              </w:rPr>
+              <w:t>12:23 / 12:32</w:t>
+            </w:r>
+          </w:p>
+        </w:tc>
+        <w:tc>
+          <w:tcPr>
+            <w:tcW w:type="dxa" w:w="6336"/>
+            <w:vAlign w:val="center"/>
+            <w:tcMar>
+              <w:top w:w="85" w:type="dxa"/>
+              <w:left w:w="85" w:type="dxa"/>
+              <w:bottom w:w="85" w:type="dxa"/>
+              <w:right w:w="85" w:type="dxa"/>
+            </w:tcMar>
+            <w:shd w:fill="F3F5F7"/>
+          </w:tcPr>
+          <w:p>
+            <w:pPr>
+              <w:spacing w:after="20" w:before="20" w:line="240" w:lineRule="auto"/>
+            </w:pPr>
+            <w:r>
+              <w:rPr>
+                <w:b w:val="0"/>
+                <w:color w:val="000000"/>
+                <w:sz w:val="18"/>
+              </w:rPr>
+              <w:t>Sampled A/B overlap members match values, trace correlation and deployed source links. Different pair indices.</w:t>
+            </w:r>
+          </w:p>
+        </w:tc>
+      </w:tr>
+      <w:tr>
+        <w:trPr>
+          <w:cantSplit/>
+        </w:trPr>
+        <w:tc>
+          <w:tcPr>
+            <w:tcW w:type="dxa" w:w="2448"/>
+            <w:vAlign w:val="center"/>
+            <w:tcMar>
+              <w:top w:w="85" w:type="dxa"/>
+              <w:left w:w="85" w:type="dxa"/>
+              <w:bottom w:w="85" w:type="dxa"/>
+              <w:right w:w="85" w:type="dxa"/>
+            </w:tcMar>
+            <w:shd w:fill="FFFFFF"/>
+          </w:tcPr>
+          <w:p>
+            <w:pPr>
+              <w:spacing w:after="20" w:before="20" w:line="240" w:lineRule="auto"/>
+            </w:pPr>
+            <w:r>
+              <w:rPr>
+                <w:b w:val="0"/>
+                <w:color w:val="000000"/>
+                <w:sz w:val="18"/>
+              </w:rPr>
+              <w:t>F07</w:t>
+            </w:r>
+          </w:p>
+        </w:tc>
+        <w:tc>
+          <w:tcPr>
+            <w:tcW w:type="dxa" w:w="1440"/>
+            <w:vAlign w:val="center"/>
+            <w:tcMar>
+              <w:top w:w="85" w:type="dxa"/>
+              <w:left w:w="85" w:type="dxa"/>
+              <w:bottom w:w="85" w:type="dxa"/>
+              <w:right w:w="85" w:type="dxa"/>
+            </w:tcMar>
+            <w:shd w:fill="FFFFFF"/>
+          </w:tcPr>
+          <w:p>
+            <w:pPr>
+              <w:spacing w:after="20" w:before="20" w:line="240" w:lineRule="auto"/>
+            </w:pPr>
+            <w:r>
+              <w:rPr>
+                <w:b w:val="0"/>
+                <w:color w:val="000000"/>
+                <w:sz w:val="18"/>
+              </w:rPr>
+              <w:t>By 13:12</w:t>
+            </w:r>
+          </w:p>
+        </w:tc>
+        <w:tc>
+          <w:tcPr>
+            <w:tcW w:type="dxa" w:w="6336"/>
+            <w:vAlign w:val="center"/>
+            <w:tcMar>
+              <w:top w:w="85" w:type="dxa"/>
+              <w:left w:w="85" w:type="dxa"/>
+              <w:bottom w:w="85" w:type="dxa"/>
+              <w:right w:w="85" w:type="dxa"/>
+            </w:tcMar>
+            <w:shd w:fill="FFFFFF"/>
+          </w:tcPr>
+          <w:p>
+            <w:pPr>
+              <w:spacing w:after="20" w:before="20" w:line="240" w:lineRule="auto"/>
+            </w:pPr>
+            <w:r>
+              <w:rPr>
+                <w:b w:val="0"/>
+                <w:color w:val="000000"/>
+                <w:sz w:val="18"/>
+              </w:rPr>
+              <w:t>Full function-exit return message and explicit @return-on-line error; entry untested.</w:t>
+            </w:r>
+          </w:p>
+        </w:tc>
+      </w:tr>
+      <w:tr>
+        <w:trPr>
+          <w:cantSplit/>
+        </w:trPr>
+        <w:tc>
+          <w:tcPr>
+            <w:tcW w:type="dxa" w:w="2448"/>
+            <w:vAlign w:val="center"/>
+            <w:tcMar>
+              <w:top w:w="85" w:type="dxa"/>
+              <w:left w:w="85" w:type="dxa"/>
+              <w:bottom w:w="85" w:type="dxa"/>
+              <w:right w:w="85" w:type="dxa"/>
+            </w:tcMar>
+            <w:shd w:fill="F3F5F7"/>
+          </w:tcPr>
+          <w:p>
+            <w:pPr>
+              <w:spacing w:after="20" w:before="20" w:line="240" w:lineRule="auto"/>
+            </w:pPr>
+            <w:r>
+              <w:rPr>
+                <w:b w:val="0"/>
+                <w:color w:val="000000"/>
+                <w:sz w:val="18"/>
+              </w:rPr>
+              <w:t>F13</w:t>
+            </w:r>
+          </w:p>
+        </w:tc>
+        <w:tc>
+          <w:tcPr>
+            <w:tcW w:type="dxa" w:w="1440"/>
+            <w:vAlign w:val="center"/>
+            <w:tcMar>
+              <w:top w:w="85" w:type="dxa"/>
+              <w:left w:w="85" w:type="dxa"/>
+              <w:bottom w:w="85" w:type="dxa"/>
+              <w:right w:w="85" w:type="dxa"/>
+            </w:tcMar>
+            <w:shd w:fill="F3F5F7"/>
+          </w:tcPr>
+          <w:p>
+            <w:pPr>
+              <w:spacing w:after="20" w:before="20" w:line="240" w:lineRule="auto"/>
+            </w:pPr>
+            <w:r>
+              <w:rPr>
+                <w:b w:val="0"/>
+                <w:color w:val="000000"/>
+                <w:sz w:val="18"/>
+              </w:rPr>
+              <w:t>13:10–13:13</w:t>
+            </w:r>
+          </w:p>
+        </w:tc>
+        <w:tc>
+          <w:tcPr>
+            <w:tcW w:type="dxa" w:w="6336"/>
+            <w:vAlign w:val="center"/>
+            <w:tcMar>
+              <w:top w:w="85" w:type="dxa"/>
+              <w:left w:w="85" w:type="dxa"/>
+              <w:bottom w:w="85" w:type="dxa"/>
+              <w:right w:w="85" w:type="dxa"/>
+            </w:tcMar>
+            <w:shd w:fill="F3F5F7"/>
+          </w:tcPr>
+          <w:p>
+            <w:pPr>
+              <w:spacing w:after="20" w:before="20" w:line="240" w:lineRule="auto"/>
+            </w:pPr>
+            <w:r>
+              <w:rPr>
+                <w:b w:val="0"/>
+                <w:color w:val="000000"/>
+                <w:sz w:val="18"/>
+              </w:rPr>
+              <w:t>Child/session hierarchy and child-only capture controls; final session stop 13:13:55.</w:t>
+            </w:r>
+          </w:p>
+        </w:tc>
+      </w:tr>
+      <w:tr>
+        <w:trPr>
+          <w:cantSplit/>
+        </w:trPr>
+        <w:tc>
+          <w:tcPr>
+            <w:tcW w:type="dxa" w:w="2448"/>
+            <w:vAlign w:val="center"/>
+            <w:tcMar>
+              <w:top w:w="85" w:type="dxa"/>
+              <w:left w:w="85" w:type="dxa"/>
+              <w:bottom w:w="85" w:type="dxa"/>
+              <w:right w:w="85" w:type="dxa"/>
+            </w:tcMar>
+            <w:shd w:fill="FFFFFF"/>
+          </w:tcPr>
+          <w:p>
+            <w:pPr>
+              <w:spacing w:after="20" w:before="20" w:line="240" w:lineRule="auto"/>
+            </w:pPr>
+            <w:r>
+              <w:rPr>
+                <w:b w:val="0"/>
+                <w:color w:val="000000"/>
+                <w:sz w:val="18"/>
+              </w:rPr>
+              <w:t>F22/X03/X07</w:t>
+            </w:r>
+          </w:p>
+        </w:tc>
+        <w:tc>
+          <w:tcPr>
+            <w:tcW w:type="dxa" w:w="1440"/>
+            <w:vAlign w:val="center"/>
+            <w:tcMar>
+              <w:top w:w="85" w:type="dxa"/>
+              <w:left w:w="85" w:type="dxa"/>
+              <w:bottom w:w="85" w:type="dxa"/>
+              <w:right w:w="85" w:type="dxa"/>
+            </w:tcMar>
+            <w:shd w:fill="FFFFFF"/>
+          </w:tcPr>
+          <w:p>
+            <w:pPr>
+              <w:spacing w:after="20" w:before="20" w:line="240" w:lineRule="auto"/>
+            </w:pPr>
+            <w:r>
+              <w:rPr>
+                <w:b w:val="0"/>
+                <w:color w:val="000000"/>
+                <w:sz w:val="18"/>
+              </w:rPr>
+              <w:t>At cutoff</w:t>
+            </w:r>
+          </w:p>
+        </w:tc>
+        <w:tc>
+          <w:tcPr>
+            <w:tcW w:type="dxa" w:w="6336"/>
+            <w:vAlign w:val="center"/>
+            <w:tcMar>
+              <w:top w:w="85" w:type="dxa"/>
+              <w:left w:w="85" w:type="dxa"/>
+              <w:bottom w:w="85" w:type="dxa"/>
+              <w:right w:w="85" w:type="dxa"/>
+            </w:tcMar>
+            <w:shd w:fill="FFFFFF"/>
+          </w:tcPr>
+          <w:p>
+            <w:pPr>
+              <w:spacing w:after="20" w:before="20" w:line="240" w:lineRule="auto"/>
+            </w:pPr>
+            <w:r>
+              <w:rPr>
+                <w:b w:val="0"/>
+                <w:color w:val="000000"/>
+                <w:sz w:val="18"/>
+              </w:rPr>
+              <w:t>Complex/cycle, never-called final trigger and nested protection branches remain partial.</w:t>
+            </w:r>
+          </w:p>
+        </w:tc>
+      </w:tr>
+    </w:tbl>
+    <w:p>
+      <w:pPr>
+        <w:pStyle w:val="Normal"/>
+      </w:pPr>
+      <w:r>
+        <w:t>Later unscored inventory: at 13:17:59, My sessions showed All 4 / Active 0 / Inactive 4. This does not establish account-wide inactivity or runtime/settings/grant cleanup. Source 13 was finalized after the scored cutoff; its reviewed media totals were still pending during preparation.</w:t>
+      </w:r>
+    </w:p>
+    <w:p>
+      <w:pPr>
+        <w:pStyle w:val="Normal"/>
+      </w:pPr>
+      <w:r>
+        <w:t>Data boundaries: UI row times are not automatically SDK execution times. The X06 samples are not a complete captured pair. New-event rows are not evidence that an OUTDATED selected pane contains that new event. Screenshots prove only their visible fields.</w:t>
+      </w:r>
+    </w:p>
+    <w:p>
+      <w:pPr>
+        <w:pStyle w:val="Normal"/>
+      </w:pPr>
+      <w:hyperlink r:id="rId28">
+        <w:r>
+          <w:rPr>
+            <w:color w:val="164F80"/>
+          </w:rPr>
+          <w:t>Full original case matrix and separately scoped checks</w:t>
+        </w:r>
+      </w:hyperlink>
+    </w:p>
+    <w:p>
+      <w:pPr>
+        <w:pStyle w:val="Normal"/>
+      </w:pPr>
+      <w:hyperlink r:id="rId27">
+        <w:r>
+          <w:rPr>
+            <w:color w:val="164F80"/>
+          </w:rPr>
+          <w:t>Supplemental execution ledger</w:t>
         </w:r>
       </w:hyperlink>
     </w:p>

</xml_diff>